<commit_message>
PointsCounterMXBean fixed for CompositeDataSupport display, change descrebed in the review
</commit_message>
<xml_diff>
--- a/LAB_4_Соловьёв_P3230.docx
+++ b/LAB_4_Соловьёв_P3230.docx
@@ -455,7 +455,7 @@
           <w:r>
             <w:fldChar w:fldCharType="separate"/>
           </w:r>
-          <w:hyperlink w:anchor="_Toc235625725" w:history="1">
+          <w:hyperlink w:anchor="_Toc237688898" w:history="1">
             <w:r>
               <w:rPr>
                 <w:rStyle w:val="a6"/>
@@ -483,7 +483,7 @@
                 <w:noProof/>
                 <w:webHidden/>
               </w:rPr>
-              <w:instrText xml:space="preserve"> PAGEREF _Toc235625725 \h </w:instrText>
+              <w:instrText xml:space="preserve"> PAGEREF _Toc237688898 \h </w:instrText>
             </w:r>
             <w:r>
               <w:rPr>
@@ -529,13 +529,20 @@
               <w14:ligatures w14:val="standardContextual"/>
             </w:rPr>
           </w:pPr>
-          <w:hyperlink w:anchor="_Toc235625726" w:history="1">
+          <w:hyperlink w:anchor="_Toc237688899" w:history="1">
             <w:r>
               <w:rPr>
                 <w:rStyle w:val="a6"/>
                 <w:noProof/>
               </w:rPr>
-              <w:t>Исходный код разработанных MBean-классов, описаний событий JDK Flight Recorder и сопутствующих классов</w:t>
+              <w:t>Исходный код разработанных MBean-классов, описаний событий JDK Flight Recorder и сопутствующих классо</w:t>
+            </w:r>
+            <w:r>
+              <w:rPr>
+                <w:rStyle w:val="a6"/>
+                <w:noProof/>
+              </w:rPr>
+              <w:t>в</w:t>
             </w:r>
             <w:r>
               <w:rPr>
@@ -556,7 +563,7 @@
                 <w:noProof/>
                 <w:webHidden/>
               </w:rPr>
-              <w:instrText xml:space="preserve"> PAGEREF _Toc235625726 \h </w:instrText>
+              <w:instrText xml:space="preserve"> PAGEREF _Toc237688899 \h </w:instrText>
             </w:r>
             <w:r>
               <w:rPr>
@@ -602,14 +609,14 @@
               <w14:ligatures w14:val="standardContextual"/>
             </w:rPr>
           </w:pPr>
-          <w:hyperlink w:anchor="_Toc235625727" w:history="1">
+          <w:hyperlink w:anchor="_Toc237688900" w:history="1">
             <w:r>
               <w:rPr>
                 <w:rStyle w:val="a6"/>
                 <w:noProof/>
                 <w:lang w:val="ru-RU"/>
               </w:rPr>
-              <w:t>3. Мониторинг и профилирование под нагрузкой</w:t>
+              <w:t>Мониторинг и профилирование под нагрузкой</w:t>
             </w:r>
             <w:r>
               <w:rPr>
@@ -630,7 +637,7 @@
                 <w:noProof/>
                 <w:webHidden/>
               </w:rPr>
-              <w:instrText xml:space="preserve"> PAGEREF _Toc235625727 \h </w:instrText>
+              <w:instrText xml:space="preserve"> PAGEREF _Toc237688900 \h </w:instrText>
             </w:r>
             <w:r>
               <w:rPr>
@@ -650,81 +657,7 @@
                 <w:noProof/>
                 <w:webHidden/>
               </w:rPr>
-              <w:t>15</w:t>
-            </w:r>
-            <w:r>
-              <w:rPr>
-                <w:noProof/>
-                <w:webHidden/>
-              </w:rPr>
-              <w:fldChar w:fldCharType="end"/>
-            </w:r>
-          </w:hyperlink>
-        </w:p>
-        <w:p>
-          <w:pPr>
-            <w:pStyle w:val="20"/>
-            <w:tabs>
-              <w:tab w:val="right" w:leader="dot" w:pos="9350"/>
-            </w:tabs>
-            <w:rPr>
-              <w:rFonts w:asciiTheme="minorHAnsi" w:eastAsiaTheme="minorEastAsia" w:hAnsiTheme="minorHAnsi" w:cstheme="minorBidi"/>
-              <w:noProof/>
-              <w:kern w:val="2"/>
-              <w:szCs w:val="24"/>
-              <w:lang w:val="ru-RU"/>
-              <w14:ligatures w14:val="standardContextual"/>
-            </w:rPr>
-          </w:pPr>
-          <w:hyperlink w:anchor="_Toc235625728" w:history="1">
-            <w:r>
-              <w:rPr>
-                <w:rStyle w:val="a6"/>
-                <w:noProof/>
-                <w:lang w:val="ru-RU"/>
-              </w:rPr>
-              <w:t>Подготовка сценария тестирования</w:t>
-            </w:r>
-            <w:r>
-              <w:rPr>
-                <w:noProof/>
-                <w:webHidden/>
-              </w:rPr>
-              <w:tab/>
-            </w:r>
-            <w:r>
-              <w:rPr>
-                <w:noProof/>
-                <w:webHidden/>
-              </w:rPr>
-              <w:fldChar w:fldCharType="begin"/>
-            </w:r>
-            <w:r>
-              <w:rPr>
-                <w:noProof/>
-                <w:webHidden/>
-              </w:rPr>
-              <w:instrText xml:space="preserve"> PAGEREF _Toc235625728 \h </w:instrText>
-            </w:r>
-            <w:r>
-              <w:rPr>
-                <w:noProof/>
-                <w:webHidden/>
-              </w:rPr>
-            </w:r>
-            <w:r>
-              <w:rPr>
-                <w:noProof/>
-                <w:webHidden/>
-              </w:rPr>
-              <w:fldChar w:fldCharType="separate"/>
-            </w:r>
-            <w:r>
-              <w:rPr>
-                <w:noProof/>
-                <w:webHidden/>
-              </w:rPr>
-              <w:t>15</w:t>
+              <w:t>6</w:t>
             </w:r>
             <w:r>
               <w:rPr>
@@ -750,7 +683,7 @@
               <w14:ligatures w14:val="standardContextual"/>
             </w:rPr>
           </w:pPr>
-          <w:hyperlink w:anchor="_Toc235625729" w:history="1">
+          <w:hyperlink w:anchor="_Toc237688901" w:history="1">
             <w:r>
               <w:rPr>
                 <w:rStyle w:val="a6"/>
@@ -778,7 +711,7 @@
                 <w:noProof/>
                 <w:webHidden/>
               </w:rPr>
-              <w:instrText xml:space="preserve"> PAGEREF _Toc235625729 \h </w:instrText>
+              <w:instrText xml:space="preserve"> PAGEREF _Toc237688901 \h </w:instrText>
             </w:r>
             <w:r>
               <w:rPr>
@@ -798,7 +731,81 @@
                 <w:noProof/>
                 <w:webHidden/>
               </w:rPr>
-              <w:t>16</w:t>
+              <w:t>7</w:t>
+            </w:r>
+            <w:r>
+              <w:rPr>
+                <w:noProof/>
+                <w:webHidden/>
+              </w:rPr>
+              <w:fldChar w:fldCharType="end"/>
+            </w:r>
+          </w:hyperlink>
+        </w:p>
+        <w:p>
+          <w:pPr>
+            <w:pStyle w:val="11"/>
+            <w:tabs>
+              <w:tab w:val="right" w:leader="dot" w:pos="9350"/>
+            </w:tabs>
+            <w:rPr>
+              <w:rFonts w:asciiTheme="minorHAnsi" w:eastAsiaTheme="minorEastAsia" w:hAnsiTheme="minorHAnsi" w:cstheme="minorBidi"/>
+              <w:noProof/>
+              <w:kern w:val="2"/>
+              <w:szCs w:val="24"/>
+              <w:lang w:val="ru-RU"/>
+              <w14:ligatures w14:val="standardContextual"/>
+            </w:rPr>
+          </w:pPr>
+          <w:hyperlink w:anchor="_Toc237688902" w:history="1">
+            <w:r>
+              <w:rPr>
+                <w:rStyle w:val="a6"/>
+                <w:noProof/>
+                <w:lang w:val="ru-RU"/>
+              </w:rPr>
+              <w:t>Ссылки</w:t>
+            </w:r>
+            <w:r>
+              <w:rPr>
+                <w:noProof/>
+                <w:webHidden/>
+              </w:rPr>
+              <w:tab/>
+            </w:r>
+            <w:r>
+              <w:rPr>
+                <w:noProof/>
+                <w:webHidden/>
+              </w:rPr>
+              <w:fldChar w:fldCharType="begin"/>
+            </w:r>
+            <w:r>
+              <w:rPr>
+                <w:noProof/>
+                <w:webHidden/>
+              </w:rPr>
+              <w:instrText xml:space="preserve"> PAGEREF _Toc237688902 \h </w:instrText>
+            </w:r>
+            <w:r>
+              <w:rPr>
+                <w:noProof/>
+                <w:webHidden/>
+              </w:rPr>
+            </w:r>
+            <w:r>
+              <w:rPr>
+                <w:noProof/>
+                <w:webHidden/>
+              </w:rPr>
+              <w:fldChar w:fldCharType="separate"/>
+            </w:r>
+            <w:r>
+              <w:rPr>
+                <w:noProof/>
+                <w:webHidden/>
+              </w:rPr>
+              <w:t>7</w:t>
             </w:r>
             <w:r>
               <w:rPr>
@@ -850,7 +857,7 @@
               <w:lang w:val="ru-RU"/>
             </w:rPr>
           </w:pPr>
-          <w:bookmarkStart w:id="3" w:name="_Toc235625725"/>
+          <w:bookmarkStart w:id="3" w:name="_Toc237688898"/>
           <w:r>
             <w:rPr>
               <w:lang w:val="ru-RU"/>
@@ -1266,7 +1273,7 @@
           <w:lang w:val="ru-RU"/>
         </w:rPr>
       </w:pPr>
-      <w:bookmarkStart w:id="4" w:name="_Toc235625726"/>
+      <w:bookmarkStart w:id="4" w:name="_Toc237688899"/>
       <w:r>
         <w:lastRenderedPageBreak/>
         <w:t>Исходный код разработанных MBean-классов, описаний событий JDK Flight Recorder и сопутствующих классов</w:t>
@@ -1417,7 +1424,7 @@
     <w:p>
       <w:pPr>
         <w:rPr>
-          <w:lang w:val="ru-RU"/>
+          <w:lang w:val="en-US"/>
         </w:rPr>
       </w:pPr>
       <w:proofErr w:type="spellStart"/>
@@ -1489,6 +1496,181 @@
           <w:lang w:val="ru-RU"/>
         </w:rPr>
         <w:t>набора типов также лишает удалённых клиентов требований по наличию специфичных классов.</w:t>
+      </w:r>
+    </w:p>
+    <w:p>
+      <w:pPr>
+        <w:rPr>
+          <w:lang w:val="ru-RU"/>
+        </w:rPr>
+      </w:pPr>
+      <w:r>
+        <w:rPr>
+          <w:lang w:val="ru-RU"/>
+        </w:rPr>
+        <w:t xml:space="preserve">Здесь необходимо отметить, что фреймворк </w:t>
+      </w:r>
+      <w:r>
+        <w:rPr>
+          <w:lang w:val="en-US"/>
+        </w:rPr>
+        <w:t>Spring</w:t>
+      </w:r>
+      <w:r>
+        <w:rPr>
+          <w:lang w:val="ru-RU"/>
+        </w:rPr>
+        <w:t xml:space="preserve"> (сервер исследуемого приложения написан на </w:t>
+      </w:r>
+      <w:r>
+        <w:rPr>
+          <w:lang w:val="en-US"/>
+        </w:rPr>
+        <w:t>Spring</w:t>
+      </w:r>
+      <w:r>
+        <w:rPr>
+          <w:lang w:val="ru-RU"/>
+        </w:rPr>
+        <w:t xml:space="preserve">) автоматически регистрирует </w:t>
+      </w:r>
+      <w:r>
+        <w:rPr>
+          <w:lang w:val="ru-RU"/>
+        </w:rPr>
+        <w:t xml:space="preserve">свои </w:t>
+      </w:r>
+      <w:proofErr w:type="spellStart"/>
+      <w:r>
+        <w:rPr>
+          <w:lang w:val="ru-RU"/>
+        </w:rPr>
+        <w:t>бины</w:t>
+      </w:r>
+      <w:proofErr w:type="spellEnd"/>
+      <w:r>
+        <w:rPr>
+          <w:lang w:val="ru-RU"/>
+        </w:rPr>
+        <w:t xml:space="preserve"> (помеченные аннотацией)</w:t>
+      </w:r>
+      <w:r>
+        <w:rPr>
+          <w:lang w:val="ru-RU"/>
+        </w:rPr>
+        <w:t xml:space="preserve"> с суффиксом </w:t>
+      </w:r>
+      <w:proofErr w:type="spellStart"/>
+      <w:r>
+        <w:rPr>
+          <w:lang w:val="en-US"/>
+        </w:rPr>
+        <w:t>MXBean</w:t>
+      </w:r>
+      <w:proofErr w:type="spellEnd"/>
+      <w:r>
+        <w:rPr>
+          <w:lang w:val="ru-RU"/>
+        </w:rPr>
+        <w:t xml:space="preserve"> </w:t>
+      </w:r>
+      <w:r>
+        <w:rPr>
+          <w:lang w:val="ru-RU"/>
+        </w:rPr>
+        <w:t xml:space="preserve">как </w:t>
+      </w:r>
+      <w:proofErr w:type="spellStart"/>
+      <w:r>
+        <w:rPr>
+          <w:lang w:val="en-US"/>
+        </w:rPr>
+        <w:t>MXBean</w:t>
+      </w:r>
+      <w:proofErr w:type="spellEnd"/>
+      <w:sdt>
+        <w:sdtPr>
+          <w:rPr>
+            <w:lang w:val="en-US"/>
+          </w:rPr>
+          <w:id w:val="6113016"/>
+          <w:citation/>
+        </w:sdtPr>
+        <w:sdtContent>
+          <w:r>
+            <w:rPr>
+              <w:lang w:val="en-US"/>
+            </w:rPr>
+            <w:fldChar w:fldCharType="begin"/>
+          </w:r>
+          <w:r>
+            <w:rPr>
+              <w:lang w:val="ru-RU"/>
+            </w:rPr>
+            <w:instrText xml:space="preserve"> </w:instrText>
+          </w:r>
+          <w:r>
+            <w:rPr>
+              <w:lang w:val="en-US"/>
+            </w:rPr>
+            <w:instrText>CITATION</w:instrText>
+          </w:r>
+          <w:r>
+            <w:rPr>
+              <w:lang w:val="ru-RU"/>
+            </w:rPr>
+            <w:instrText xml:space="preserve"> </w:instrText>
+          </w:r>
+          <w:r>
+            <w:rPr>
+              <w:lang w:val="en-US"/>
+            </w:rPr>
+            <w:instrText>Spr</w:instrText>
+          </w:r>
+          <w:r>
+            <w:rPr>
+              <w:lang w:val="ru-RU"/>
+            </w:rPr>
+            <w:instrText>26 \</w:instrText>
+          </w:r>
+          <w:r>
+            <w:rPr>
+              <w:lang w:val="en-US"/>
+            </w:rPr>
+            <w:instrText>l</w:instrText>
+          </w:r>
+          <w:r>
+            <w:rPr>
+              <w:lang w:val="ru-RU"/>
+            </w:rPr>
+            <w:instrText xml:space="preserve"> 1033 </w:instrText>
+          </w:r>
+          <w:r>
+            <w:rPr>
+              <w:lang w:val="en-US"/>
+            </w:rPr>
+            <w:fldChar w:fldCharType="separate"/>
+          </w:r>
+          <w:r>
+            <w:rPr>
+              <w:noProof/>
+              <w:lang w:val="ru-RU"/>
+            </w:rPr>
+            <w:t xml:space="preserve"> [2]</w:t>
+          </w:r>
+          <w:r>
+            <w:rPr>
+              <w:lang w:val="en-US"/>
+            </w:rPr>
+            <w:fldChar w:fldCharType="end"/>
+          </w:r>
+        </w:sdtContent>
+      </w:sdt>
+      <w:r>
+        <w:rPr>
+          <w:lang w:val="ru-RU"/>
+        </w:rPr>
+        <w:t>.</w:t>
       </w:r>
     </w:p>
     <w:p>
@@ -1586,7 +1768,7 @@
     <w:p>
       <w:pPr>
         <w:rPr>
-          <w:lang w:val="ru-RU"/>
+          <w:lang w:val="en-US"/>
         </w:rPr>
       </w:pPr>
       <w:r>
@@ -1724,15 +1906,284 @@
     </w:p>
     <w:p>
       <w:pPr>
+        <w:rPr>
+          <w:lang w:val="en-US"/>
+        </w:rPr>
+      </w:pPr>
+      <w:r>
+        <w:rPr>
+          <w:lang w:val="ru-RU"/>
+        </w:rPr>
+        <w:t>Здесь</w:t>
+      </w:r>
+      <w:r>
+        <w:rPr>
+          <w:lang w:val="en-US"/>
+        </w:rPr>
+        <w:t xml:space="preserve"> </w:t>
+      </w:r>
+      <w:r>
+        <w:rPr>
+          <w:lang w:val="ru-RU"/>
+        </w:rPr>
+        <w:t>также</w:t>
+      </w:r>
+      <w:r>
+        <w:rPr>
+          <w:lang w:val="en-US"/>
+        </w:rPr>
+        <w:t xml:space="preserve"> </w:t>
+      </w:r>
+      <w:r>
+        <w:rPr>
+          <w:lang w:val="ru-RU"/>
+        </w:rPr>
+        <w:t>сошлюсь</w:t>
+      </w:r>
+      <w:r>
+        <w:rPr>
+          <w:lang w:val="en-US"/>
+        </w:rPr>
+        <w:t xml:space="preserve"> </w:t>
+      </w:r>
+      <w:r>
+        <w:rPr>
+          <w:lang w:val="ru-RU"/>
+        </w:rPr>
+        <w:t>на</w:t>
+      </w:r>
+      <w:r>
+        <w:rPr>
+          <w:lang w:val="en-US"/>
+        </w:rPr>
+        <w:t xml:space="preserve"> </w:t>
+      </w:r>
+      <w:r>
+        <w:rPr>
+          <w:lang w:val="en-US"/>
+        </w:rPr>
+        <w:t>JMX</w:t>
+      </w:r>
+      <w:r>
+        <w:rPr>
+          <w:lang w:val="en-US"/>
+        </w:rPr>
+        <w:t xml:space="preserve"> </w:t>
+      </w:r>
+      <w:r>
+        <w:rPr>
+          <w:lang w:val="en-US"/>
+        </w:rPr>
+        <w:t>Technology</w:t>
+      </w:r>
+      <w:r>
+        <w:rPr>
+          <w:lang w:val="en-US"/>
+        </w:rPr>
+        <w:t xml:space="preserve"> </w:t>
+      </w:r>
+      <w:r>
+        <w:rPr>
+          <w:lang w:val="en-US"/>
+        </w:rPr>
+        <w:t>Tutorial</w:t>
+      </w:r>
+      <w:sdt>
+        <w:sdtPr>
+          <w:rPr>
+            <w:lang w:val="en-US"/>
+          </w:rPr>
+          <w:id w:val="-230389523"/>
+          <w:citation/>
+        </w:sdtPr>
+        <w:sdtContent>
+          <w:r>
+            <w:rPr>
+              <w:lang w:val="en-US"/>
+            </w:rPr>
+            <w:fldChar w:fldCharType="begin"/>
+          </w:r>
+          <w:r>
+            <w:rPr>
+              <w:lang w:val="en-US"/>
+            </w:rPr>
+            <w:instrText xml:space="preserve"> </w:instrText>
+          </w:r>
+          <w:r>
+            <w:rPr>
+              <w:lang w:val="en-US"/>
+            </w:rPr>
+            <w:instrText>CITATION</w:instrText>
+          </w:r>
+          <w:r>
+            <w:rPr>
+              <w:lang w:val="en-US"/>
+            </w:rPr>
+            <w:instrText xml:space="preserve"> </w:instrText>
+          </w:r>
+          <w:r>
+            <w:rPr>
+              <w:lang w:val="en-US"/>
+            </w:rPr>
+            <w:instrText>Ora</w:instrText>
+          </w:r>
+          <w:r>
+            <w:rPr>
+              <w:lang w:val="en-US"/>
+            </w:rPr>
+            <w:instrText>26 \</w:instrText>
+          </w:r>
+          <w:r>
+            <w:rPr>
+              <w:lang w:val="en-US"/>
+            </w:rPr>
+            <w:instrText>l</w:instrText>
+          </w:r>
+          <w:r>
+            <w:rPr>
+              <w:lang w:val="en-US"/>
+            </w:rPr>
+            <w:instrText xml:space="preserve"> 1033 </w:instrText>
+          </w:r>
+          <w:r>
+            <w:rPr>
+              <w:lang w:val="en-US"/>
+            </w:rPr>
+            <w:fldChar w:fldCharType="separate"/>
+          </w:r>
+          <w:r>
+            <w:rPr>
+              <w:noProof/>
+              <w:lang w:val="en-US"/>
+            </w:rPr>
+            <w:t xml:space="preserve"> [3]</w:t>
+          </w:r>
+          <w:r>
+            <w:rPr>
+              <w:lang w:val="en-US"/>
+            </w:rPr>
+            <w:fldChar w:fldCharType="end"/>
+          </w:r>
+        </w:sdtContent>
+      </w:sdt>
+      <w:r>
+        <w:rPr>
+          <w:lang w:val="en-US"/>
+        </w:rPr>
+        <w:t xml:space="preserve">: </w:t>
+      </w:r>
+      <w:r>
+        <w:rPr>
+          <w:lang w:val="ru-RU"/>
+        </w:rPr>
+        <w:t>сложные</w:t>
+      </w:r>
+      <w:r>
+        <w:rPr>
+          <w:lang w:val="en-US"/>
+        </w:rPr>
+        <w:t xml:space="preserve"> </w:t>
+      </w:r>
+      <w:r>
+        <w:rPr>
+          <w:lang w:val="ru-RU"/>
+        </w:rPr>
+        <w:t>типы</w:t>
+      </w:r>
+      <w:r>
+        <w:rPr>
+          <w:lang w:val="en-US"/>
+        </w:rPr>
+        <w:t xml:space="preserve">, </w:t>
+      </w:r>
+      <w:r>
+        <w:rPr>
+          <w:lang w:val="ru-RU"/>
+        </w:rPr>
+        <w:t>внутри</w:t>
+      </w:r>
+      <w:r>
+        <w:rPr>
+          <w:lang w:val="en-US"/>
+        </w:rPr>
+        <w:t xml:space="preserve"> </w:t>
+      </w:r>
+      <w:proofErr w:type="spellStart"/>
+      <w:r>
+        <w:rPr>
+          <w:lang w:val="en-US"/>
+        </w:rPr>
+        <w:t>MXBean</w:t>
+      </w:r>
+      <w:proofErr w:type="spellEnd"/>
+      <w:r>
+        <w:rPr>
+          <w:lang w:val="en-US"/>
+        </w:rPr>
+        <w:t xml:space="preserve"> </w:t>
+      </w:r>
+      <w:r>
+        <w:rPr>
+          <w:lang w:val="ru-RU"/>
+        </w:rPr>
+        <w:t>автоматически</w:t>
+      </w:r>
+      <w:r>
+        <w:rPr>
+          <w:lang w:val="en-US"/>
+        </w:rPr>
+        <w:t xml:space="preserve"> </w:t>
+      </w:r>
+      <w:r>
+        <w:rPr>
+          <w:lang w:val="ru-RU"/>
+        </w:rPr>
+        <w:t>приводятся</w:t>
+      </w:r>
+      <w:r>
+        <w:rPr>
+          <w:lang w:val="en-US"/>
+        </w:rPr>
+        <w:t xml:space="preserve"> </w:t>
+      </w:r>
+      <w:r>
+        <w:rPr>
+          <w:lang w:val="ru-RU"/>
+        </w:rPr>
+        <w:t>к</w:t>
+      </w:r>
+      <w:r>
+        <w:rPr>
+          <w:lang w:val="en-US"/>
+        </w:rPr>
+        <w:t xml:space="preserve"> </w:t>
+      </w:r>
+      <w:proofErr w:type="spellStart"/>
+      <w:r>
+        <w:rPr>
+          <w:lang w:val="en-US"/>
+        </w:rPr>
+        <w:t>CompositeDataSupport</w:t>
+      </w:r>
+      <w:proofErr w:type="spellEnd"/>
+      <w:r>
+        <w:rPr>
+          <w:lang w:val="en-US"/>
+        </w:rPr>
+        <w:t>.</w:t>
+      </w:r>
+    </w:p>
+    <w:p>
+      <w:pPr>
         <w:ind w:firstLine="0"/>
         <w:jc w:val="left"/>
         <w:rPr>
-          <w:lang w:val="ru-RU"/>
-        </w:rPr>
-      </w:pPr>
-      <w:r>
-        <w:rPr>
-          <w:lang w:val="ru-RU"/>
+          <w:lang w:val="en-US"/>
+        </w:rPr>
+      </w:pPr>
+      <w:r>
+        <w:rPr>
+          <w:lang w:val="en-US"/>
         </w:rPr>
         <w:br w:type="page"/>
       </w:r>
@@ -1744,7 +2195,7 @@
           <w:lang w:val="ru-RU"/>
         </w:rPr>
       </w:pPr>
-      <w:bookmarkStart w:id="5" w:name="_Toc235625727"/>
+      <w:bookmarkStart w:id="5" w:name="_Toc237688900"/>
       <w:r>
         <w:rPr>
           <w:lang w:val="ru-RU"/>
@@ -1780,6 +2231,7 @@
           <w:lang w:val="ru-RU"/>
         </w:rPr>
       </w:pPr>
+      <w:bookmarkStart w:id="6" w:name="_Toc237688901"/>
       <w:r>
         <w:rPr>
           <w:lang w:val="ru-RU"/>
@@ -1787,10 +2239,16 @@
         <w:lastRenderedPageBreak/>
         <w:t>Источники</w:t>
       </w:r>
+      <w:bookmarkEnd w:id="6"/>
     </w:p>
+    <w:bookmarkStart w:id="7" w:name="_Toc237688902" w:displacedByCustomXml="next"/>
     <w:sdt>
       <w:sdtPr>
         <w:rPr>
+          <w:b w:val="0"/>
+          <w:bCs w:val="0"/>
+          <w:sz w:val="24"/>
+          <w:szCs w:val="20"/>
           <w:lang w:val="ru-RU"/>
         </w:rPr>
         <w:id w:val="-1825735193"/>
@@ -1801,10 +2259,6 @@
       </w:sdtPr>
       <w:sdtEndPr>
         <w:rPr>
-          <w:b w:val="0"/>
-          <w:bCs w:val="0"/>
-          <w:sz w:val="24"/>
-          <w:szCs w:val="20"/>
           <w:lang w:val="ru"/>
         </w:rPr>
       </w:sdtEndPr>
@@ -1819,6 +2273,7 @@
             </w:rPr>
             <w:t>Ссылки</w:t>
           </w:r>
+          <w:bookmarkEnd w:id="7"/>
         </w:p>
         <w:sdt>
           <w:sdtPr>
@@ -5766,6 +6221,7 @@
   <w:style w:type="character" w:default="1" w:styleId="a0">
     <w:name w:val="Default Paragraph Font"/>
     <w:uiPriority w:val="1"/>
+    <w:semiHidden/>
     <w:unhideWhenUsed/>
   </w:style>
   <w:style w:type="table" w:default="1" w:styleId="a1">
@@ -6296,6 +6752,35 @@
     <b:MonthAccessed>08</b:MonthAccessed>
     <b:DayAccessed>12</b:DayAccessed>
     <b:URL>https://docs.oracle.com/cd/E19698-01/816-7609/openmbean-4/index.html</b:URL>
+    <b:RefOrder>3</b:RefOrder>
+  </b:Source>
+  <b:Source>
+    <b:Tag>Ora26</b:Tag>
+    <b:SourceType>InternetSite</b:SourceType>
+    <b:Guid>{BBFFB6B5-DF5B-4199-80CC-BC0924F19362}</b:Guid>
+    <b:Author>
+      <b:Author>
+        <b:Corporate>Oracle</b:Corporate>
+      </b:Author>
+    </b:Author>
+    <b:Title>Essentials of the JMX API</b:Title>
+    <b:ProductionCompany>Oracle</b:ProductionCompany>
+    <b:YearAccessed>2026</b:YearAccessed>
+    <b:MonthAccessed>08</b:MonthAccessed>
+    <b:DayAccessed>14</b:DayAccessed>
+    <b:URL>https://docs.oracle.com/en/java/javase/17/jmx/essentials-jmx-api.html#GUID-FA3724F5-9E67-4002-82BE-B05716E902C3</b:URL>
+    <b:RefOrder>4</b:RefOrder>
+  </b:Source>
+  <b:Source>
+    <b:Tag>Spr26</b:Tag>
+    <b:SourceType>InternetSite</b:SourceType>
+    <b:Guid>{708BF85E-7618-4E29-975D-457A1C514837}</b:Guid>
+    <b:Title>Spring Framework JMX integration</b:Title>
+    <b:ProductionCompany>Spring</b:ProductionCompany>
+    <b:YearAccessed>2026</b:YearAccessed>
+    <b:MonthAccessed>08</b:MonthAccessed>
+    <b:DayAccessed>14</b:DayAccessed>
+    <b:URL>https://docs.spring.io/spring-framework/reference/integration/jmx.html</b:URL>
     <b:RefOrder>2</b:RefOrder>
   </b:Source>
 </b:Sources>
@@ -6311,7 +6796,7 @@
 </file>
 
 <file path=customXml/itemProps2.xml><?xml version="1.0" encoding="utf-8"?>
-<ds:datastoreItem xmlns:ds="http://schemas.openxmlformats.org/officeDocument/2006/customXml" ds:itemID="{9E91E765-EB74-43A5-9709-1DE04E75681A}">
+<ds:datastoreItem xmlns:ds="http://schemas.openxmlformats.org/officeDocument/2006/customXml" ds:itemID="{A439D359-44AA-44E2-B570-F1F1D90AF7FA}">
   <ds:schemaRefs>
     <ds:schemaRef ds:uri="http://schemas.openxmlformats.org/officeDocument/2006/bibliography"/>
   </ds:schemaRefs>

</xml_diff>

<commit_message>
missPercentageBean added, checked and described
</commit_message>
<xml_diff>
--- a/LAB_4_Соловьёв_P3230.docx
+++ b/LAB_4_Соловьёв_P3230.docx
@@ -455,7 +455,7 @@
           <w:r>
             <w:fldChar w:fldCharType="separate"/>
           </w:r>
-          <w:hyperlink w:anchor="_Toc237688898" w:history="1">
+          <w:hyperlink w:anchor="_Toc237713313" w:history="1">
             <w:r>
               <w:rPr>
                 <w:rStyle w:val="a6"/>
@@ -483,7 +483,7 @@
                 <w:noProof/>
                 <w:webHidden/>
               </w:rPr>
-              <w:instrText xml:space="preserve"> PAGEREF _Toc237688898 \h </w:instrText>
+              <w:instrText xml:space="preserve"> PAGEREF _Toc237713313 \h </w:instrText>
             </w:r>
             <w:r>
               <w:rPr>
@@ -529,20 +529,13 @@
               <w14:ligatures w14:val="standardContextual"/>
             </w:rPr>
           </w:pPr>
-          <w:hyperlink w:anchor="_Toc237688899" w:history="1">
+          <w:hyperlink w:anchor="_Toc237713314" w:history="1">
             <w:r>
               <w:rPr>
                 <w:rStyle w:val="a6"/>
                 <w:noProof/>
               </w:rPr>
-              <w:t>Исходный код разработанных MBean-классов, описаний событий JDK Flight Recorder и сопутствующих классо</w:t>
-            </w:r>
-            <w:r>
-              <w:rPr>
-                <w:rStyle w:val="a6"/>
-                <w:noProof/>
-              </w:rPr>
-              <w:t>в</w:t>
+              <w:t>Исходный код разработанных MBean-классов, описаний событий JDK Flight Recorder и сопутствующих классов</w:t>
             </w:r>
             <w:r>
               <w:rPr>
@@ -563,7 +556,7 @@
                 <w:noProof/>
                 <w:webHidden/>
               </w:rPr>
-              <w:instrText xml:space="preserve"> PAGEREF _Toc237688899 \h </w:instrText>
+              <w:instrText xml:space="preserve"> PAGEREF _Toc237713314 \h </w:instrText>
             </w:r>
             <w:r>
               <w:rPr>
@@ -609,7 +602,7 @@
               <w14:ligatures w14:val="standardContextual"/>
             </w:rPr>
           </w:pPr>
-          <w:hyperlink w:anchor="_Toc237688900" w:history="1">
+          <w:hyperlink w:anchor="_Toc237713315" w:history="1">
             <w:r>
               <w:rPr>
                 <w:rStyle w:val="a6"/>
@@ -637,7 +630,7 @@
                 <w:noProof/>
                 <w:webHidden/>
               </w:rPr>
-              <w:instrText xml:space="preserve"> PAGEREF _Toc237688900 \h </w:instrText>
+              <w:instrText xml:space="preserve"> PAGEREF _Toc237713315 \h </w:instrText>
             </w:r>
             <w:r>
               <w:rPr>
@@ -657,7 +650,7 @@
                 <w:noProof/>
                 <w:webHidden/>
               </w:rPr>
-              <w:t>6</w:t>
+              <w:t>8</w:t>
             </w:r>
             <w:r>
               <w:rPr>
@@ -683,7 +676,7 @@
               <w14:ligatures w14:val="standardContextual"/>
             </w:rPr>
           </w:pPr>
-          <w:hyperlink w:anchor="_Toc237688901" w:history="1">
+          <w:hyperlink w:anchor="_Toc237713316" w:history="1">
             <w:r>
               <w:rPr>
                 <w:rStyle w:val="a6"/>
@@ -711,7 +704,7 @@
                 <w:noProof/>
                 <w:webHidden/>
               </w:rPr>
-              <w:instrText xml:space="preserve"> PAGEREF _Toc237688901 \h </w:instrText>
+              <w:instrText xml:space="preserve"> PAGEREF _Toc237713316 \h </w:instrText>
             </w:r>
             <w:r>
               <w:rPr>
@@ -731,7 +724,7 @@
                 <w:noProof/>
                 <w:webHidden/>
               </w:rPr>
-              <w:t>7</w:t>
+              <w:t>9</w:t>
             </w:r>
             <w:r>
               <w:rPr>
@@ -757,7 +750,7 @@
               <w14:ligatures w14:val="standardContextual"/>
             </w:rPr>
           </w:pPr>
-          <w:hyperlink w:anchor="_Toc237688902" w:history="1">
+          <w:hyperlink w:anchor="_Toc237713317" w:history="1">
             <w:r>
               <w:rPr>
                 <w:rStyle w:val="a6"/>
@@ -785,7 +778,7 @@
                 <w:noProof/>
                 <w:webHidden/>
               </w:rPr>
-              <w:instrText xml:space="preserve"> PAGEREF _Toc237688902 \h </w:instrText>
+              <w:instrText xml:space="preserve"> PAGEREF _Toc237713317 \h </w:instrText>
             </w:r>
             <w:r>
               <w:rPr>
@@ -805,7 +798,7 @@
                 <w:noProof/>
                 <w:webHidden/>
               </w:rPr>
-              <w:t>7</w:t>
+              <w:t>9</w:t>
             </w:r>
             <w:r>
               <w:rPr>
@@ -857,7 +850,7 @@
               <w:lang w:val="ru-RU"/>
             </w:rPr>
           </w:pPr>
-          <w:bookmarkStart w:id="3" w:name="_Toc237688898"/>
+          <w:bookmarkStart w:id="3" w:name="_Toc237713313"/>
           <w:r>
             <w:rPr>
               <w:lang w:val="ru-RU"/>
@@ -1273,7 +1266,7 @@
           <w:lang w:val="ru-RU"/>
         </w:rPr>
       </w:pPr>
-      <w:bookmarkStart w:id="4" w:name="_Toc237688899"/>
+      <w:bookmarkStart w:id="4" w:name="_Toc237713314"/>
       <w:r>
         <w:lastRenderedPageBreak/>
         <w:t>Исходный код разработанных MBean-классов, описаний событий JDK Flight Recorder и сопутствующих классов</w:t>
@@ -1424,7 +1417,7 @@
     <w:p>
       <w:pPr>
         <w:rPr>
-          <w:lang w:val="en-US"/>
+          <w:lang w:val="ru-RU"/>
         </w:rPr>
       </w:pPr>
       <w:proofErr w:type="spellStart"/>
@@ -1768,7 +1761,7 @@
     <w:p>
       <w:pPr>
         <w:rPr>
-          <w:lang w:val="en-US"/>
+          <w:lang w:val="ru-RU"/>
         </w:rPr>
       </w:pPr>
       <w:r>
@@ -1907,7 +1900,7 @@
     <w:p>
       <w:pPr>
         <w:rPr>
-          <w:lang w:val="en-US"/>
+          <w:lang w:val="ru-RU"/>
         </w:rPr>
       </w:pPr>
       <w:r>
@@ -2173,19 +2166,3378 @@
         <w:t>.</w:t>
       </w:r>
     </w:p>
+    <w:tbl>
+      <w:tblPr>
+        <w:tblStyle w:val="aa"/>
+        <w:tblW w:w="0" w:type="auto"/>
+        <w:tblLook w:val="04A0" w:firstRow="1" w:lastRow="0" w:firstColumn="1" w:lastColumn="0" w:noHBand="0" w:noVBand="1"/>
+      </w:tblPr>
+      <w:tblGrid>
+        <w:gridCol w:w="9350"/>
+      </w:tblGrid>
+      <w:tr>
+        <w:tc>
+          <w:tcPr>
+            <w:tcW w:w="9350" w:type="dxa"/>
+            <w:shd w:val="clear" w:color="auto" w:fill="D9D9D9" w:themeFill="background1" w:themeFillShade="D9"/>
+          </w:tcPr>
+          <w:p>
+            <w:pPr>
+              <w:keepNext/>
+              <w:ind w:firstLine="0"/>
+              <w:rPr>
+                <w:rFonts w:ascii="Consolas" w:hAnsi="Consolas"/>
+                <w:lang w:val="en-US"/>
+              </w:rPr>
+            </w:pPr>
+            <w:r>
+              <w:rPr>
+                <w:rFonts w:ascii="Consolas" w:hAnsi="Consolas"/>
+                <w:lang w:val="en-US"/>
+              </w:rPr>
+              <w:t>package ru.ifmo.se.s467549.jmx;</w:t>
+            </w:r>
+          </w:p>
+          <w:p>
+            <w:pPr>
+              <w:keepNext/>
+              <w:ind w:firstLine="0"/>
+              <w:rPr>
+                <w:rFonts w:ascii="Consolas" w:hAnsi="Consolas"/>
+                <w:lang w:val="en-US"/>
+              </w:rPr>
+            </w:pPr>
+          </w:p>
+          <w:p>
+            <w:pPr>
+              <w:keepNext/>
+              <w:ind w:firstLine="0"/>
+              <w:rPr>
+                <w:rFonts w:ascii="Consolas" w:hAnsi="Consolas"/>
+                <w:lang w:val="en-US"/>
+              </w:rPr>
+            </w:pPr>
+            <w:r>
+              <w:rPr>
+                <w:rFonts w:ascii="Consolas" w:hAnsi="Consolas"/>
+                <w:lang w:val="en-US"/>
+              </w:rPr>
+              <w:t xml:space="preserve">import </w:t>
+            </w:r>
+            <w:proofErr w:type="spellStart"/>
+            <w:proofErr w:type="gramStart"/>
+            <w:r>
+              <w:rPr>
+                <w:rFonts w:ascii="Consolas" w:hAnsi="Consolas"/>
+                <w:lang w:val="en-US"/>
+              </w:rPr>
+              <w:t>javax.management</w:t>
+            </w:r>
+            <w:proofErr w:type="gramEnd"/>
+            <w:r>
+              <w:rPr>
+                <w:rFonts w:ascii="Consolas" w:hAnsi="Consolas"/>
+                <w:lang w:val="en-US"/>
+              </w:rPr>
+              <w:t>.MXBean</w:t>
+            </w:r>
+            <w:proofErr w:type="spellEnd"/>
+            <w:r>
+              <w:rPr>
+                <w:rFonts w:ascii="Consolas" w:hAnsi="Consolas"/>
+                <w:lang w:val="en-US"/>
+              </w:rPr>
+              <w:t>;</w:t>
+            </w:r>
+          </w:p>
+          <w:p>
+            <w:pPr>
+              <w:keepNext/>
+              <w:ind w:firstLine="0"/>
+              <w:rPr>
+                <w:rFonts w:ascii="Consolas" w:hAnsi="Consolas"/>
+                <w:lang w:val="en-US"/>
+              </w:rPr>
+            </w:pPr>
+            <w:r>
+              <w:rPr>
+                <w:rFonts w:ascii="Consolas" w:hAnsi="Consolas"/>
+                <w:lang w:val="en-US"/>
+              </w:rPr>
+              <w:t xml:space="preserve">import </w:t>
+            </w:r>
+            <w:proofErr w:type="spellStart"/>
+            <w:proofErr w:type="gramStart"/>
+            <w:r>
+              <w:rPr>
+                <w:rFonts w:ascii="Consolas" w:hAnsi="Consolas"/>
+                <w:lang w:val="en-US"/>
+              </w:rPr>
+              <w:t>javax.management</w:t>
+            </w:r>
+            <w:proofErr w:type="gramEnd"/>
+            <w:r>
+              <w:rPr>
+                <w:rFonts w:ascii="Consolas" w:hAnsi="Consolas"/>
+                <w:lang w:val="en-US"/>
+              </w:rPr>
+              <w:t>.</w:t>
+            </w:r>
+            <w:proofErr w:type="gramStart"/>
+            <w:r>
+              <w:rPr>
+                <w:rFonts w:ascii="Consolas" w:hAnsi="Consolas"/>
+                <w:lang w:val="en-US"/>
+              </w:rPr>
+              <w:t>openmbean.OpenDataException</w:t>
+            </w:r>
+            <w:proofErr w:type="spellEnd"/>
+            <w:proofErr w:type="gramEnd"/>
+            <w:r>
+              <w:rPr>
+                <w:rFonts w:ascii="Consolas" w:hAnsi="Consolas"/>
+                <w:lang w:val="en-US"/>
+              </w:rPr>
+              <w:t>;</w:t>
+            </w:r>
+          </w:p>
+          <w:p>
+            <w:pPr>
+              <w:keepNext/>
+              <w:ind w:firstLine="0"/>
+              <w:rPr>
+                <w:rFonts w:ascii="Consolas" w:hAnsi="Consolas"/>
+                <w:lang w:val="en-US"/>
+              </w:rPr>
+            </w:pPr>
+          </w:p>
+          <w:p>
+            <w:pPr>
+              <w:keepNext/>
+              <w:ind w:firstLine="0"/>
+              <w:rPr>
+                <w:rFonts w:ascii="Consolas" w:hAnsi="Consolas"/>
+                <w:lang w:val="en-US"/>
+              </w:rPr>
+            </w:pPr>
+            <w:proofErr w:type="gramStart"/>
+            <w:r>
+              <w:rPr>
+                <w:rFonts w:ascii="Consolas" w:hAnsi="Consolas"/>
+                <w:lang w:val="en-US"/>
+              </w:rPr>
+              <w:t>@MXBean</w:t>
+            </w:r>
+            <w:proofErr w:type="gramEnd"/>
+          </w:p>
+          <w:p>
+            <w:pPr>
+              <w:keepNext/>
+              <w:ind w:firstLine="0"/>
+              <w:rPr>
+                <w:rFonts w:ascii="Consolas" w:hAnsi="Consolas"/>
+                <w:lang w:val="en-US"/>
+              </w:rPr>
+            </w:pPr>
+            <w:proofErr w:type="gramStart"/>
+            <w:r>
+              <w:rPr>
+                <w:rFonts w:ascii="Consolas" w:hAnsi="Consolas"/>
+                <w:lang w:val="en-US"/>
+              </w:rPr>
+              <w:t>public</w:t>
+            </w:r>
+            <w:proofErr w:type="gramEnd"/>
+            <w:r>
+              <w:rPr>
+                <w:rFonts w:ascii="Consolas" w:hAnsi="Consolas"/>
+                <w:lang w:val="en-US"/>
+              </w:rPr>
+              <w:t xml:space="preserve"> interface </w:t>
+            </w:r>
+            <w:proofErr w:type="spellStart"/>
+            <w:r>
+              <w:rPr>
+                <w:rFonts w:ascii="Consolas" w:hAnsi="Consolas"/>
+                <w:lang w:val="en-US"/>
+              </w:rPr>
+              <w:t>PointsCounterMXBean</w:t>
+            </w:r>
+            <w:proofErr w:type="spellEnd"/>
+            <w:r>
+              <w:rPr>
+                <w:rFonts w:ascii="Consolas" w:hAnsi="Consolas"/>
+                <w:lang w:val="en-US"/>
+              </w:rPr>
+              <w:t xml:space="preserve"> {</w:t>
+            </w:r>
+          </w:p>
+          <w:p>
+            <w:pPr>
+              <w:keepNext/>
+              <w:ind w:firstLine="0"/>
+              <w:rPr>
+                <w:rFonts w:ascii="Consolas" w:hAnsi="Consolas"/>
+                <w:lang w:val="en-US"/>
+              </w:rPr>
+            </w:pPr>
+            <w:r>
+              <w:rPr>
+                <w:rFonts w:ascii="Consolas" w:hAnsi="Consolas"/>
+                <w:lang w:val="en-US"/>
+              </w:rPr>
+              <w:t xml:space="preserve">    int </w:t>
+            </w:r>
+            <w:proofErr w:type="spellStart"/>
+            <w:proofErr w:type="gramStart"/>
+            <w:r>
+              <w:rPr>
+                <w:rFonts w:ascii="Consolas" w:hAnsi="Consolas"/>
+                <w:lang w:val="en-US"/>
+              </w:rPr>
+              <w:t>getPointsCount</w:t>
+            </w:r>
+            <w:proofErr w:type="spellEnd"/>
+            <w:r>
+              <w:rPr>
+                <w:rFonts w:ascii="Consolas" w:hAnsi="Consolas"/>
+                <w:lang w:val="en-US"/>
+              </w:rPr>
+              <w:t>(</w:t>
+            </w:r>
+            <w:proofErr w:type="gramEnd"/>
+            <w:r>
+              <w:rPr>
+                <w:rFonts w:ascii="Consolas" w:hAnsi="Consolas"/>
+                <w:lang w:val="en-US"/>
+              </w:rPr>
+              <w:t>);</w:t>
+            </w:r>
+          </w:p>
+          <w:p>
+            <w:pPr>
+              <w:keepNext/>
+              <w:ind w:firstLine="0"/>
+              <w:rPr>
+                <w:rFonts w:ascii="Consolas" w:hAnsi="Consolas"/>
+                <w:lang w:val="en-US"/>
+              </w:rPr>
+            </w:pPr>
+            <w:r>
+              <w:rPr>
+                <w:rFonts w:ascii="Consolas" w:hAnsi="Consolas"/>
+                <w:lang w:val="en-US"/>
+              </w:rPr>
+              <w:t xml:space="preserve">    int </w:t>
+            </w:r>
+            <w:proofErr w:type="spellStart"/>
+            <w:proofErr w:type="gramStart"/>
+            <w:r>
+              <w:rPr>
+                <w:rFonts w:ascii="Consolas" w:hAnsi="Consolas"/>
+                <w:lang w:val="en-US"/>
+              </w:rPr>
+              <w:t>getMissesCount</w:t>
+            </w:r>
+            <w:proofErr w:type="spellEnd"/>
+            <w:r>
+              <w:rPr>
+                <w:rFonts w:ascii="Consolas" w:hAnsi="Consolas"/>
+                <w:lang w:val="en-US"/>
+              </w:rPr>
+              <w:t>(</w:t>
+            </w:r>
+            <w:proofErr w:type="gramEnd"/>
+            <w:r>
+              <w:rPr>
+                <w:rFonts w:ascii="Consolas" w:hAnsi="Consolas"/>
+                <w:lang w:val="en-US"/>
+              </w:rPr>
+              <w:t>);</w:t>
+            </w:r>
+          </w:p>
+          <w:p>
+            <w:pPr>
+              <w:keepNext/>
+              <w:ind w:firstLine="0"/>
+              <w:rPr>
+                <w:rFonts w:ascii="Consolas" w:hAnsi="Consolas"/>
+                <w:lang w:val="en-US"/>
+              </w:rPr>
+            </w:pPr>
+            <w:r>
+              <w:rPr>
+                <w:rFonts w:ascii="Consolas" w:hAnsi="Consolas"/>
+                <w:lang w:val="en-US"/>
+              </w:rPr>
+              <w:t xml:space="preserve">    </w:t>
+            </w:r>
+          </w:p>
+          <w:p>
+            <w:pPr>
+              <w:keepNext/>
+              <w:ind w:firstLine="0"/>
+              <w:rPr>
+                <w:rFonts w:ascii="Consolas" w:hAnsi="Consolas"/>
+                <w:lang w:val="en-US"/>
+              </w:rPr>
+            </w:pPr>
+            <w:r>
+              <w:rPr>
+                <w:rFonts w:ascii="Consolas" w:hAnsi="Consolas"/>
+                <w:lang w:val="en-US"/>
+              </w:rPr>
+              <w:t xml:space="preserve">    AreaCounter </w:t>
+            </w:r>
+            <w:proofErr w:type="spellStart"/>
+            <w:proofErr w:type="gramStart"/>
+            <w:r>
+              <w:rPr>
+                <w:rFonts w:ascii="Consolas" w:hAnsi="Consolas"/>
+                <w:lang w:val="en-US"/>
+              </w:rPr>
+              <w:t>getAreaCount</w:t>
+            </w:r>
+            <w:proofErr w:type="spellEnd"/>
+            <w:r>
+              <w:rPr>
+                <w:rFonts w:ascii="Consolas" w:hAnsi="Consolas"/>
+                <w:lang w:val="en-US"/>
+              </w:rPr>
+              <w:t>(</w:t>
+            </w:r>
+            <w:proofErr w:type="gramEnd"/>
+            <w:r>
+              <w:rPr>
+                <w:rFonts w:ascii="Consolas" w:hAnsi="Consolas"/>
+                <w:lang w:val="en-US"/>
+              </w:rPr>
+              <w:t xml:space="preserve">) throws </w:t>
+            </w:r>
+            <w:proofErr w:type="spellStart"/>
+            <w:r>
+              <w:rPr>
+                <w:rFonts w:ascii="Consolas" w:hAnsi="Consolas"/>
+                <w:lang w:val="en-US"/>
+              </w:rPr>
+              <w:t>OpenDataException</w:t>
+            </w:r>
+            <w:proofErr w:type="spellEnd"/>
+            <w:r>
+              <w:rPr>
+                <w:rFonts w:ascii="Consolas" w:hAnsi="Consolas"/>
+                <w:lang w:val="en-US"/>
+              </w:rPr>
+              <w:t>;</w:t>
+            </w:r>
+          </w:p>
+          <w:p>
+            <w:pPr>
+              <w:keepNext/>
+              <w:ind w:firstLine="0"/>
+              <w:rPr>
+                <w:rFonts w:ascii="Consolas" w:hAnsi="Consolas"/>
+                <w:lang w:val="en-US"/>
+              </w:rPr>
+            </w:pPr>
+            <w:r>
+              <w:rPr>
+                <w:rFonts w:ascii="Consolas" w:hAnsi="Consolas"/>
+                <w:lang w:val="en-US"/>
+              </w:rPr>
+              <w:t>}</w:t>
+            </w:r>
+          </w:p>
+        </w:tc>
+      </w:tr>
+    </w:tbl>
+    <w:p>
+      <w:pPr>
+        <w:pStyle w:val="ab"/>
+        <w:rPr>
+          <w:lang w:val="ru-RU"/>
+        </w:rPr>
+      </w:pPr>
+      <w:r>
+        <w:rPr>
+          <w:lang w:val="en-US"/>
+        </w:rPr>
+        <w:fldChar w:fldCharType="begin"/>
+      </w:r>
+      <w:r>
+        <w:rPr>
+          <w:lang w:val="ru-RU"/>
+        </w:rPr>
+        <w:instrText xml:space="preserve"> </w:instrText>
+      </w:r>
+      <w:r>
+        <w:rPr>
+          <w:lang w:val="en-US"/>
+        </w:rPr>
+        <w:instrText>SEQ</w:instrText>
+      </w:r>
+      <w:r>
+        <w:rPr>
+          <w:lang w:val="ru-RU"/>
+        </w:rPr>
+        <w:instrText xml:space="preserve"> Формула \* </w:instrText>
+      </w:r>
+      <w:r>
+        <w:rPr>
+          <w:lang w:val="en-US"/>
+        </w:rPr>
+        <w:instrText>ARABIC</w:instrText>
+      </w:r>
+      <w:r>
+        <w:rPr>
+          <w:lang w:val="ru-RU"/>
+        </w:rPr>
+        <w:instrText xml:space="preserve"> </w:instrText>
+      </w:r>
+      <w:r>
+        <w:rPr>
+          <w:lang w:val="en-US"/>
+        </w:rPr>
+        <w:fldChar w:fldCharType="separate"/>
+      </w:r>
+      <w:r>
+        <w:rPr>
+          <w:noProof/>
+          <w:lang w:val="ru-RU"/>
+        </w:rPr>
+        <w:t>1</w:t>
+      </w:r>
+      <w:r>
+        <w:rPr>
+          <w:lang w:val="en-US"/>
+        </w:rPr>
+        <w:fldChar w:fldCharType="end"/>
+      </w:r>
+      <w:r>
+        <w:rPr>
+          <w:lang w:val="ru-RU"/>
+        </w:rPr>
+        <w:t xml:space="preserve"> </w:t>
+      </w:r>
+      <w:r>
+        <w:rPr>
+          <w:lang w:val="ru-RU"/>
+        </w:rPr>
+        <w:t>Исх</w:t>
+      </w:r>
+      <w:r>
+        <w:rPr>
+          <w:lang w:val="ru-RU"/>
+        </w:rPr>
+        <w:t xml:space="preserve">одный код </w:t>
+      </w:r>
+      <w:r>
+        <w:rPr>
+          <w:lang w:val="ru-RU"/>
+        </w:rPr>
+        <w:t xml:space="preserve">интерфейса </w:t>
+      </w:r>
+      <w:proofErr w:type="spellStart"/>
+      <w:r>
+        <w:rPr>
+          <w:lang w:val="en-US"/>
+        </w:rPr>
+        <w:t>M</w:t>
+      </w:r>
+      <w:r>
+        <w:rPr>
+          <w:lang w:val="en-US"/>
+        </w:rPr>
+        <w:t>X</w:t>
+      </w:r>
+      <w:r>
+        <w:rPr>
+          <w:lang w:val="en-US"/>
+        </w:rPr>
+        <w:t>Bean</w:t>
+      </w:r>
+      <w:proofErr w:type="spellEnd"/>
+      <w:r>
+        <w:rPr>
+          <w:lang w:val="ru-RU"/>
+        </w:rPr>
+        <w:t xml:space="preserve"> – счётчика кликов и промахов с поддержкой уведомлений</w:t>
+      </w:r>
+    </w:p>
+    <w:tbl>
+      <w:tblPr>
+        <w:tblStyle w:val="aa"/>
+        <w:tblW w:w="0" w:type="auto"/>
+        <w:tblLook w:val="04A0" w:firstRow="1" w:lastRow="0" w:firstColumn="1" w:lastColumn="0" w:noHBand="0" w:noVBand="1"/>
+      </w:tblPr>
+      <w:tblGrid>
+        <w:gridCol w:w="9350"/>
+      </w:tblGrid>
+      <w:tr>
+        <w:tc>
+          <w:tcPr>
+            <w:tcW w:w="9350" w:type="dxa"/>
+            <w:shd w:val="clear" w:color="auto" w:fill="D9D9D9" w:themeFill="background1" w:themeFillShade="D9"/>
+          </w:tcPr>
+          <w:p>
+            <w:pPr>
+              <w:keepNext/>
+              <w:ind w:firstLine="0"/>
+              <w:rPr>
+                <w:rFonts w:ascii="Consolas" w:hAnsi="Consolas"/>
+                <w:lang w:val="en-US"/>
+              </w:rPr>
+            </w:pPr>
+            <w:r>
+              <w:rPr>
+                <w:rFonts w:ascii="Consolas" w:hAnsi="Consolas"/>
+                <w:lang w:val="en-US"/>
+              </w:rPr>
+              <w:lastRenderedPageBreak/>
+              <w:t>package ru.ifmo.se.s467549.jmx;</w:t>
+            </w:r>
+          </w:p>
+          <w:p>
+            <w:pPr>
+              <w:keepNext/>
+              <w:ind w:firstLine="0"/>
+              <w:rPr>
+                <w:rFonts w:ascii="Consolas" w:hAnsi="Consolas"/>
+                <w:lang w:val="en-US"/>
+              </w:rPr>
+            </w:pPr>
+          </w:p>
+          <w:p>
+            <w:pPr>
+              <w:keepNext/>
+              <w:ind w:firstLine="0"/>
+              <w:rPr>
+                <w:rFonts w:ascii="Consolas" w:hAnsi="Consolas"/>
+                <w:lang w:val="en-US"/>
+              </w:rPr>
+            </w:pPr>
+            <w:r>
+              <w:rPr>
+                <w:rFonts w:ascii="Consolas" w:hAnsi="Consolas"/>
+                <w:lang w:val="en-US"/>
+              </w:rPr>
+              <w:t xml:space="preserve">import </w:t>
+            </w:r>
+            <w:proofErr w:type="spellStart"/>
+            <w:proofErr w:type="gramStart"/>
+            <w:r>
+              <w:rPr>
+                <w:rFonts w:ascii="Consolas" w:hAnsi="Consolas"/>
+                <w:lang w:val="en-US"/>
+              </w:rPr>
+              <w:t>org.springframework</w:t>
+            </w:r>
+            <w:proofErr w:type="gramEnd"/>
+            <w:r>
+              <w:rPr>
+                <w:rFonts w:ascii="Consolas" w:hAnsi="Consolas"/>
+                <w:lang w:val="en-US"/>
+              </w:rPr>
+              <w:t>.</w:t>
+            </w:r>
+            <w:proofErr w:type="gramStart"/>
+            <w:r>
+              <w:rPr>
+                <w:rFonts w:ascii="Consolas" w:hAnsi="Consolas"/>
+                <w:lang w:val="en-US"/>
+              </w:rPr>
+              <w:t>beans.factory</w:t>
+            </w:r>
+            <w:proofErr w:type="gramEnd"/>
+            <w:r>
+              <w:rPr>
+                <w:rFonts w:ascii="Consolas" w:hAnsi="Consolas"/>
+                <w:lang w:val="en-US"/>
+              </w:rPr>
+              <w:t>.</w:t>
+            </w:r>
+            <w:proofErr w:type="gramStart"/>
+            <w:r>
+              <w:rPr>
+                <w:rFonts w:ascii="Consolas" w:hAnsi="Consolas"/>
+                <w:lang w:val="en-US"/>
+              </w:rPr>
+              <w:t>annotation.Autowired</w:t>
+            </w:r>
+            <w:proofErr w:type="spellEnd"/>
+            <w:proofErr w:type="gramEnd"/>
+            <w:r>
+              <w:rPr>
+                <w:rFonts w:ascii="Consolas" w:hAnsi="Consolas"/>
+                <w:lang w:val="en-US"/>
+              </w:rPr>
+              <w:t>;</w:t>
+            </w:r>
+          </w:p>
+          <w:p>
+            <w:pPr>
+              <w:keepNext/>
+              <w:ind w:firstLine="0"/>
+              <w:rPr>
+                <w:rFonts w:ascii="Consolas" w:hAnsi="Consolas"/>
+                <w:lang w:val="ru-RU"/>
+              </w:rPr>
+            </w:pPr>
+            <w:r>
+              <w:rPr>
+                <w:rFonts w:ascii="Consolas" w:hAnsi="Consolas"/>
+                <w:lang w:val="en-US"/>
+              </w:rPr>
+              <w:t xml:space="preserve">import </w:t>
+            </w:r>
+            <w:proofErr w:type="spellStart"/>
+            <w:proofErr w:type="gramStart"/>
+            <w:r>
+              <w:rPr>
+                <w:rFonts w:ascii="Consolas" w:hAnsi="Consolas"/>
+                <w:lang w:val="en-US"/>
+              </w:rPr>
+              <w:t>org.springframework</w:t>
+            </w:r>
+            <w:proofErr w:type="gramEnd"/>
+            <w:r>
+              <w:rPr>
+                <w:rFonts w:ascii="Consolas" w:hAnsi="Consolas"/>
+                <w:lang w:val="en-US"/>
+              </w:rPr>
+              <w:t>.</w:t>
+            </w:r>
+            <w:proofErr w:type="gramStart"/>
+            <w:r>
+              <w:rPr>
+                <w:rFonts w:ascii="Consolas" w:hAnsi="Consolas"/>
+                <w:lang w:val="en-US"/>
+              </w:rPr>
+              <w:t>stereotype.Component</w:t>
+            </w:r>
+            <w:proofErr w:type="spellEnd"/>
+            <w:proofErr w:type="gramEnd"/>
+          </w:p>
+          <w:p>
+            <w:pPr>
+              <w:keepNext/>
+              <w:ind w:firstLine="0"/>
+              <w:rPr>
+                <w:rFonts w:ascii="Consolas" w:hAnsi="Consolas"/>
+                <w:lang w:val="en-US"/>
+              </w:rPr>
+            </w:pPr>
+            <w:r>
+              <w:rPr>
+                <w:rFonts w:ascii="Consolas" w:hAnsi="Consolas"/>
+                <w:lang w:val="en-US"/>
+              </w:rPr>
+              <w:t xml:space="preserve">import </w:t>
+            </w:r>
+            <w:proofErr w:type="spellStart"/>
+            <w:proofErr w:type="gramStart"/>
+            <w:r>
+              <w:rPr>
+                <w:rFonts w:ascii="Consolas" w:hAnsi="Consolas"/>
+                <w:lang w:val="en-US"/>
+              </w:rPr>
+              <w:t>javax.management</w:t>
+            </w:r>
+            <w:proofErr w:type="gramEnd"/>
+            <w:r>
+              <w:rPr>
+                <w:rFonts w:ascii="Consolas" w:hAnsi="Consolas"/>
+                <w:lang w:val="en-US"/>
+              </w:rPr>
+              <w:t>.Notification</w:t>
+            </w:r>
+            <w:proofErr w:type="spellEnd"/>
+            <w:r>
+              <w:rPr>
+                <w:rFonts w:ascii="Consolas" w:hAnsi="Consolas"/>
+                <w:lang w:val="en-US"/>
+              </w:rPr>
+              <w:t>;</w:t>
+            </w:r>
+          </w:p>
+          <w:p>
+            <w:pPr>
+              <w:keepNext/>
+              <w:ind w:firstLine="0"/>
+              <w:rPr>
+                <w:rFonts w:ascii="Consolas" w:hAnsi="Consolas"/>
+                <w:lang w:val="en-US"/>
+              </w:rPr>
+            </w:pPr>
+            <w:r>
+              <w:rPr>
+                <w:rFonts w:ascii="Consolas" w:hAnsi="Consolas"/>
+                <w:lang w:val="en-US"/>
+              </w:rPr>
+              <w:t xml:space="preserve">import </w:t>
+            </w:r>
+            <w:proofErr w:type="spellStart"/>
+            <w:proofErr w:type="gramStart"/>
+            <w:r>
+              <w:rPr>
+                <w:rFonts w:ascii="Consolas" w:hAnsi="Consolas"/>
+                <w:lang w:val="en-US"/>
+              </w:rPr>
+              <w:t>javax.management</w:t>
+            </w:r>
+            <w:proofErr w:type="gramEnd"/>
+            <w:r>
+              <w:rPr>
+                <w:rFonts w:ascii="Consolas" w:hAnsi="Consolas"/>
+                <w:lang w:val="en-US"/>
+              </w:rPr>
+              <w:t>.NotificationBroadcasterSupport</w:t>
+            </w:r>
+            <w:proofErr w:type="spellEnd"/>
+            <w:r>
+              <w:rPr>
+                <w:rFonts w:ascii="Consolas" w:hAnsi="Consolas"/>
+                <w:lang w:val="en-US"/>
+              </w:rPr>
+              <w:t>;</w:t>
+            </w:r>
+          </w:p>
+          <w:p>
+            <w:pPr>
+              <w:keepNext/>
+              <w:ind w:firstLine="0"/>
+              <w:rPr>
+                <w:rFonts w:ascii="Consolas" w:hAnsi="Consolas"/>
+                <w:lang w:val="en-US"/>
+              </w:rPr>
+            </w:pPr>
+            <w:r>
+              <w:rPr>
+                <w:rFonts w:ascii="Consolas" w:hAnsi="Consolas"/>
+                <w:lang w:val="en-US"/>
+              </w:rPr>
+              <w:t xml:space="preserve">import </w:t>
+            </w:r>
+            <w:proofErr w:type="spellStart"/>
+            <w:proofErr w:type="gramStart"/>
+            <w:r>
+              <w:rPr>
+                <w:rFonts w:ascii="Consolas" w:hAnsi="Consolas"/>
+                <w:lang w:val="en-US"/>
+              </w:rPr>
+              <w:t>javax.management</w:t>
+            </w:r>
+            <w:proofErr w:type="gramEnd"/>
+            <w:r>
+              <w:rPr>
+                <w:rFonts w:ascii="Consolas" w:hAnsi="Consolas"/>
+                <w:lang w:val="en-US"/>
+              </w:rPr>
+              <w:t>.</w:t>
+            </w:r>
+            <w:proofErr w:type="gramStart"/>
+            <w:r>
+              <w:rPr>
+                <w:rFonts w:ascii="Consolas" w:hAnsi="Consolas"/>
+                <w:lang w:val="en-US"/>
+              </w:rPr>
+              <w:t>openmbean</w:t>
+            </w:r>
+            <w:proofErr w:type="spellEnd"/>
+            <w:r>
+              <w:rPr>
+                <w:rFonts w:ascii="Consolas" w:hAnsi="Consolas"/>
+                <w:lang w:val="en-US"/>
+              </w:rPr>
+              <w:t>.*</w:t>
+            </w:r>
+            <w:proofErr w:type="gramEnd"/>
+            <w:r>
+              <w:rPr>
+                <w:rFonts w:ascii="Consolas" w:hAnsi="Consolas"/>
+                <w:lang w:val="en-US"/>
+              </w:rPr>
+              <w:t>;</w:t>
+            </w:r>
+          </w:p>
+          <w:p>
+            <w:pPr>
+              <w:keepNext/>
+              <w:ind w:firstLine="0"/>
+              <w:rPr>
+                <w:rFonts w:ascii="Consolas" w:hAnsi="Consolas"/>
+                <w:lang w:val="en-US"/>
+              </w:rPr>
+            </w:pPr>
+          </w:p>
+          <w:p>
+            <w:pPr>
+              <w:keepNext/>
+              <w:ind w:firstLine="0"/>
+              <w:rPr>
+                <w:rFonts w:ascii="Consolas" w:hAnsi="Consolas"/>
+                <w:lang w:val="en-US"/>
+              </w:rPr>
+            </w:pPr>
+            <w:r>
+              <w:rPr>
+                <w:rFonts w:ascii="Consolas" w:hAnsi="Consolas"/>
+                <w:lang w:val="en-US"/>
+              </w:rPr>
+              <w:t>@Component</w:t>
+            </w:r>
+          </w:p>
+          <w:p>
+            <w:pPr>
+              <w:keepNext/>
+              <w:ind w:firstLine="0"/>
+              <w:rPr>
+                <w:rFonts w:ascii="Consolas" w:hAnsi="Consolas"/>
+                <w:lang w:val="en-US"/>
+              </w:rPr>
+            </w:pPr>
+            <w:proofErr w:type="gramStart"/>
+            <w:r>
+              <w:rPr>
+                <w:rFonts w:ascii="Consolas" w:hAnsi="Consolas"/>
+                <w:lang w:val="en-US"/>
+              </w:rPr>
+              <w:t>public</w:t>
+            </w:r>
+            <w:proofErr w:type="gramEnd"/>
+            <w:r>
+              <w:rPr>
+                <w:rFonts w:ascii="Consolas" w:hAnsi="Consolas"/>
+                <w:lang w:val="en-US"/>
+              </w:rPr>
+              <w:t xml:space="preserve"> class </w:t>
+            </w:r>
+            <w:proofErr w:type="spellStart"/>
+            <w:r>
+              <w:rPr>
+                <w:rFonts w:ascii="Consolas" w:hAnsi="Consolas"/>
+                <w:lang w:val="en-US"/>
+              </w:rPr>
+              <w:t>PointsCounter</w:t>
+            </w:r>
+            <w:proofErr w:type="spellEnd"/>
+            <w:r>
+              <w:rPr>
+                <w:rFonts w:ascii="Consolas" w:hAnsi="Consolas"/>
+                <w:lang w:val="en-US"/>
+              </w:rPr>
+              <w:t xml:space="preserve"> extends </w:t>
+            </w:r>
+            <w:proofErr w:type="spellStart"/>
+            <w:r>
+              <w:rPr>
+                <w:rFonts w:ascii="Consolas" w:hAnsi="Consolas"/>
+                <w:lang w:val="en-US"/>
+              </w:rPr>
+              <w:t>NotificationBroadcasterSupport</w:t>
+            </w:r>
+            <w:proofErr w:type="spellEnd"/>
+            <w:r>
+              <w:rPr>
+                <w:rFonts w:ascii="Consolas" w:hAnsi="Consolas"/>
+                <w:lang w:val="en-US"/>
+              </w:rPr>
+              <w:t xml:space="preserve"> implements </w:t>
+            </w:r>
+            <w:proofErr w:type="spellStart"/>
+            <w:r>
+              <w:rPr>
+                <w:rFonts w:ascii="Consolas" w:hAnsi="Consolas"/>
+                <w:lang w:val="en-US"/>
+              </w:rPr>
+              <w:t>PointsCounterMXBean</w:t>
+            </w:r>
+            <w:proofErr w:type="spellEnd"/>
+            <w:r>
+              <w:rPr>
+                <w:rFonts w:ascii="Consolas" w:hAnsi="Consolas"/>
+                <w:lang w:val="en-US"/>
+              </w:rPr>
+              <w:t xml:space="preserve"> {</w:t>
+            </w:r>
+          </w:p>
+          <w:p>
+            <w:pPr>
+              <w:keepNext/>
+              <w:ind w:firstLine="0"/>
+              <w:rPr>
+                <w:rFonts w:ascii="Consolas" w:hAnsi="Consolas"/>
+                <w:lang w:val="en-US"/>
+              </w:rPr>
+            </w:pPr>
+            <w:r>
+              <w:rPr>
+                <w:rFonts w:ascii="Consolas" w:hAnsi="Consolas"/>
+                <w:lang w:val="en-US"/>
+              </w:rPr>
+              <w:t xml:space="preserve">    private int </w:t>
+            </w:r>
+            <w:proofErr w:type="spellStart"/>
+            <w:r>
+              <w:rPr>
+                <w:rFonts w:ascii="Consolas" w:hAnsi="Consolas"/>
+                <w:lang w:val="en-US"/>
+              </w:rPr>
+              <w:t>pointsCount</w:t>
+            </w:r>
+            <w:proofErr w:type="spellEnd"/>
+            <w:r>
+              <w:rPr>
+                <w:rFonts w:ascii="Consolas" w:hAnsi="Consolas"/>
+                <w:lang w:val="en-US"/>
+              </w:rPr>
+              <w:t xml:space="preserve"> = 0;</w:t>
+            </w:r>
+          </w:p>
+          <w:p>
+            <w:pPr>
+              <w:keepNext/>
+              <w:ind w:firstLine="0"/>
+              <w:rPr>
+                <w:rFonts w:ascii="Consolas" w:hAnsi="Consolas"/>
+                <w:lang w:val="en-US"/>
+              </w:rPr>
+            </w:pPr>
+            <w:r>
+              <w:rPr>
+                <w:rFonts w:ascii="Consolas" w:hAnsi="Consolas"/>
+                <w:lang w:val="en-US"/>
+              </w:rPr>
+              <w:t xml:space="preserve">    private int </w:t>
+            </w:r>
+            <w:proofErr w:type="spellStart"/>
+            <w:r>
+              <w:rPr>
+                <w:rFonts w:ascii="Consolas" w:hAnsi="Consolas"/>
+                <w:lang w:val="en-US"/>
+              </w:rPr>
+              <w:t>missesCount</w:t>
+            </w:r>
+            <w:proofErr w:type="spellEnd"/>
+            <w:r>
+              <w:rPr>
+                <w:rFonts w:ascii="Consolas" w:hAnsi="Consolas"/>
+                <w:lang w:val="en-US"/>
+              </w:rPr>
+              <w:t xml:space="preserve"> = 0;</w:t>
+            </w:r>
+          </w:p>
+          <w:p>
+            <w:pPr>
+              <w:keepNext/>
+              <w:ind w:firstLine="0"/>
+              <w:rPr>
+                <w:rFonts w:ascii="Consolas" w:hAnsi="Consolas"/>
+                <w:lang w:val="en-US"/>
+              </w:rPr>
+            </w:pPr>
+            <w:r>
+              <w:rPr>
+                <w:rFonts w:ascii="Consolas" w:hAnsi="Consolas"/>
+                <w:lang w:val="en-US"/>
+              </w:rPr>
+              <w:t xml:space="preserve">    private int </w:t>
+            </w:r>
+            <w:proofErr w:type="spellStart"/>
+            <w:r>
+              <w:rPr>
+                <w:rFonts w:ascii="Consolas" w:hAnsi="Consolas"/>
+                <w:lang w:val="en-US"/>
+              </w:rPr>
+              <w:t>consecutiveMisses</w:t>
+            </w:r>
+            <w:proofErr w:type="spellEnd"/>
+            <w:r>
+              <w:rPr>
+                <w:rFonts w:ascii="Consolas" w:hAnsi="Consolas"/>
+                <w:lang w:val="en-US"/>
+              </w:rPr>
+              <w:t xml:space="preserve"> = 0;</w:t>
+            </w:r>
+          </w:p>
+          <w:p>
+            <w:pPr>
+              <w:keepNext/>
+              <w:ind w:firstLine="0"/>
+              <w:rPr>
+                <w:rFonts w:ascii="Consolas" w:hAnsi="Consolas"/>
+                <w:lang w:val="en-US"/>
+              </w:rPr>
+            </w:pPr>
+            <w:r>
+              <w:rPr>
+                <w:rFonts w:ascii="Consolas" w:hAnsi="Consolas"/>
+                <w:lang w:val="en-US"/>
+              </w:rPr>
+              <w:t xml:space="preserve">    private long </w:t>
+            </w:r>
+            <w:proofErr w:type="spellStart"/>
+            <w:r>
+              <w:rPr>
+                <w:rFonts w:ascii="Consolas" w:hAnsi="Consolas"/>
+                <w:lang w:val="en-US"/>
+              </w:rPr>
+              <w:t>sequenceNumber</w:t>
+            </w:r>
+            <w:proofErr w:type="spellEnd"/>
+            <w:r>
+              <w:rPr>
+                <w:rFonts w:ascii="Consolas" w:hAnsi="Consolas"/>
+                <w:lang w:val="en-US"/>
+              </w:rPr>
+              <w:t xml:space="preserve"> = 1;</w:t>
+            </w:r>
+          </w:p>
+          <w:p>
+            <w:pPr>
+              <w:keepNext/>
+              <w:ind w:firstLine="0"/>
+              <w:rPr>
+                <w:rFonts w:ascii="Consolas" w:hAnsi="Consolas"/>
+                <w:lang w:val="en-US"/>
+              </w:rPr>
+            </w:pPr>
+            <w:r>
+              <w:rPr>
+                <w:rFonts w:ascii="Consolas" w:hAnsi="Consolas"/>
+                <w:lang w:val="en-US"/>
+              </w:rPr>
+              <w:t xml:space="preserve">    private AreaCounter </w:t>
+            </w:r>
+            <w:proofErr w:type="spellStart"/>
+            <w:r>
+              <w:rPr>
+                <w:rFonts w:ascii="Consolas" w:hAnsi="Consolas"/>
+                <w:lang w:val="en-US"/>
+              </w:rPr>
+              <w:t>areaCounter</w:t>
+            </w:r>
+            <w:proofErr w:type="spellEnd"/>
+            <w:r>
+              <w:rPr>
+                <w:rFonts w:ascii="Consolas" w:hAnsi="Consolas"/>
+                <w:lang w:val="en-US"/>
+              </w:rPr>
+              <w:t xml:space="preserve"> = new </w:t>
+            </w:r>
+            <w:proofErr w:type="gramStart"/>
+            <w:r>
+              <w:rPr>
+                <w:rFonts w:ascii="Consolas" w:hAnsi="Consolas"/>
+                <w:lang w:val="en-US"/>
+              </w:rPr>
+              <w:t>AreaCounter(</w:t>
+            </w:r>
+            <w:proofErr w:type="gramEnd"/>
+            <w:r>
+              <w:rPr>
+                <w:rFonts w:ascii="Consolas" w:hAnsi="Consolas"/>
+                <w:lang w:val="en-US"/>
+              </w:rPr>
+              <w:t>);</w:t>
+            </w:r>
+          </w:p>
+          <w:p>
+            <w:pPr>
+              <w:keepNext/>
+              <w:ind w:firstLine="0"/>
+              <w:rPr>
+                <w:rFonts w:ascii="Consolas" w:hAnsi="Consolas"/>
+                <w:lang w:val="en-US"/>
+              </w:rPr>
+            </w:pPr>
+            <w:r>
+              <w:rPr>
+                <w:rFonts w:ascii="Consolas" w:hAnsi="Consolas"/>
+                <w:lang w:val="en-US"/>
+              </w:rPr>
+              <w:t xml:space="preserve">    private </w:t>
+            </w:r>
+            <w:proofErr w:type="spellStart"/>
+            <w:r>
+              <w:rPr>
+                <w:rFonts w:ascii="Consolas" w:hAnsi="Consolas"/>
+                <w:lang w:val="en-US"/>
+              </w:rPr>
+              <w:t>MissPercentage</w:t>
+            </w:r>
+            <w:proofErr w:type="spellEnd"/>
+            <w:r>
+              <w:rPr>
+                <w:rFonts w:ascii="Consolas" w:hAnsi="Consolas"/>
+                <w:lang w:val="en-US"/>
+              </w:rPr>
+              <w:t xml:space="preserve"> </w:t>
+            </w:r>
+            <w:proofErr w:type="spellStart"/>
+            <w:r>
+              <w:rPr>
+                <w:rFonts w:ascii="Consolas" w:hAnsi="Consolas"/>
+                <w:lang w:val="en-US"/>
+              </w:rPr>
+              <w:t>missPercentage</w:t>
+            </w:r>
+            <w:proofErr w:type="spellEnd"/>
+            <w:r>
+              <w:rPr>
+                <w:rFonts w:ascii="Consolas" w:hAnsi="Consolas"/>
+                <w:lang w:val="en-US"/>
+              </w:rPr>
+              <w:t>;</w:t>
+            </w:r>
+          </w:p>
+          <w:p>
+            <w:pPr>
+              <w:keepNext/>
+              <w:ind w:firstLine="0"/>
+              <w:rPr>
+                <w:rFonts w:ascii="Consolas" w:hAnsi="Consolas"/>
+                <w:lang w:val="en-US"/>
+              </w:rPr>
+            </w:pPr>
+          </w:p>
+          <w:p>
+            <w:pPr>
+              <w:keepNext/>
+              <w:ind w:firstLine="0"/>
+              <w:rPr>
+                <w:rFonts w:ascii="Consolas" w:hAnsi="Consolas"/>
+                <w:lang w:val="en-US"/>
+              </w:rPr>
+            </w:pPr>
+            <w:r>
+              <w:rPr>
+                <w:rFonts w:ascii="Consolas" w:hAnsi="Consolas"/>
+                <w:lang w:val="en-US"/>
+              </w:rPr>
+              <w:t xml:space="preserve">    @Autowired</w:t>
+            </w:r>
+          </w:p>
+          <w:p>
+            <w:pPr>
+              <w:keepNext/>
+              <w:ind w:firstLine="0"/>
+              <w:rPr>
+                <w:rFonts w:ascii="Consolas" w:hAnsi="Consolas"/>
+                <w:lang w:val="en-US"/>
+              </w:rPr>
+            </w:pPr>
+            <w:r>
+              <w:rPr>
+                <w:rFonts w:ascii="Consolas" w:hAnsi="Consolas"/>
+                <w:lang w:val="en-US"/>
+              </w:rPr>
+              <w:t xml:space="preserve">    public </w:t>
+            </w:r>
+            <w:proofErr w:type="spellStart"/>
+            <w:proofErr w:type="gramStart"/>
+            <w:r>
+              <w:rPr>
+                <w:rFonts w:ascii="Consolas" w:hAnsi="Consolas"/>
+                <w:lang w:val="en-US"/>
+              </w:rPr>
+              <w:t>PointsCounter</w:t>
+            </w:r>
+            <w:proofErr w:type="spellEnd"/>
+            <w:r>
+              <w:rPr>
+                <w:rFonts w:ascii="Consolas" w:hAnsi="Consolas"/>
+                <w:lang w:val="en-US"/>
+              </w:rPr>
+              <w:t>(</w:t>
+            </w:r>
+            <w:proofErr w:type="spellStart"/>
+            <w:proofErr w:type="gramEnd"/>
+            <w:r>
+              <w:rPr>
+                <w:rFonts w:ascii="Consolas" w:hAnsi="Consolas"/>
+                <w:lang w:val="en-US"/>
+              </w:rPr>
+              <w:t>MissPercentage</w:t>
+            </w:r>
+            <w:proofErr w:type="spellEnd"/>
+            <w:r>
+              <w:rPr>
+                <w:rFonts w:ascii="Consolas" w:hAnsi="Consolas"/>
+                <w:lang w:val="en-US"/>
+              </w:rPr>
+              <w:t xml:space="preserve"> </w:t>
+            </w:r>
+            <w:proofErr w:type="spellStart"/>
+            <w:proofErr w:type="gramStart"/>
+            <w:r>
+              <w:rPr>
+                <w:rFonts w:ascii="Consolas" w:hAnsi="Consolas"/>
+                <w:lang w:val="en-US"/>
+              </w:rPr>
+              <w:t>missPercentage</w:t>
+            </w:r>
+            <w:proofErr w:type="spellEnd"/>
+            <w:r>
+              <w:rPr>
+                <w:rFonts w:ascii="Consolas" w:hAnsi="Consolas"/>
+                <w:lang w:val="en-US"/>
+              </w:rPr>
+              <w:t>){</w:t>
+            </w:r>
+            <w:proofErr w:type="gramEnd"/>
+          </w:p>
+          <w:p>
+            <w:pPr>
+              <w:keepNext/>
+              <w:ind w:firstLine="0"/>
+              <w:rPr>
+                <w:rFonts w:ascii="Consolas" w:hAnsi="Consolas"/>
+                <w:lang w:val="en-US"/>
+              </w:rPr>
+            </w:pPr>
+            <w:r>
+              <w:rPr>
+                <w:rFonts w:ascii="Consolas" w:hAnsi="Consolas"/>
+                <w:lang w:val="en-US"/>
+              </w:rPr>
+              <w:t xml:space="preserve">        </w:t>
+            </w:r>
+            <w:proofErr w:type="spellStart"/>
+            <w:proofErr w:type="gramStart"/>
+            <w:r>
+              <w:rPr>
+                <w:rFonts w:ascii="Consolas" w:hAnsi="Consolas"/>
+                <w:lang w:val="en-US"/>
+              </w:rPr>
+              <w:t>this.missPercentage</w:t>
+            </w:r>
+            <w:proofErr w:type="spellEnd"/>
+            <w:proofErr w:type="gramEnd"/>
+            <w:r>
+              <w:rPr>
+                <w:rFonts w:ascii="Consolas" w:hAnsi="Consolas"/>
+                <w:lang w:val="en-US"/>
+              </w:rPr>
+              <w:t xml:space="preserve"> = </w:t>
+            </w:r>
+            <w:proofErr w:type="spellStart"/>
+            <w:r>
+              <w:rPr>
+                <w:rFonts w:ascii="Consolas" w:hAnsi="Consolas"/>
+                <w:lang w:val="en-US"/>
+              </w:rPr>
+              <w:t>missPercentage</w:t>
+            </w:r>
+            <w:proofErr w:type="spellEnd"/>
+            <w:r>
+              <w:rPr>
+                <w:rFonts w:ascii="Consolas" w:hAnsi="Consolas"/>
+                <w:lang w:val="en-US"/>
+              </w:rPr>
+              <w:t>;</w:t>
+            </w:r>
+          </w:p>
+          <w:p>
+            <w:pPr>
+              <w:keepNext/>
+              <w:ind w:firstLine="0"/>
+              <w:rPr>
+                <w:rFonts w:ascii="Consolas" w:hAnsi="Consolas"/>
+                <w:lang w:val="en-US"/>
+              </w:rPr>
+            </w:pPr>
+            <w:r>
+              <w:rPr>
+                <w:rFonts w:ascii="Consolas" w:hAnsi="Consolas"/>
+                <w:lang w:val="en-US"/>
+              </w:rPr>
+              <w:t xml:space="preserve">    }</w:t>
+            </w:r>
+          </w:p>
+          <w:p>
+            <w:pPr>
+              <w:keepNext/>
+              <w:ind w:firstLine="0"/>
+              <w:rPr>
+                <w:rFonts w:ascii="Consolas" w:hAnsi="Consolas"/>
+                <w:lang w:val="en-US"/>
+              </w:rPr>
+            </w:pPr>
+          </w:p>
+          <w:p>
+            <w:pPr>
+              <w:keepNext/>
+              <w:ind w:firstLine="0"/>
+              <w:rPr>
+                <w:rFonts w:ascii="Consolas" w:hAnsi="Consolas"/>
+                <w:lang w:val="en-US"/>
+              </w:rPr>
+            </w:pPr>
+            <w:r>
+              <w:rPr>
+                <w:rFonts w:ascii="Consolas" w:hAnsi="Consolas"/>
+                <w:lang w:val="en-US"/>
+              </w:rPr>
+              <w:t xml:space="preserve">    public synchronized void </w:t>
+            </w:r>
+            <w:proofErr w:type="spellStart"/>
+            <w:proofErr w:type="gramStart"/>
+            <w:r>
+              <w:rPr>
+                <w:rFonts w:ascii="Consolas" w:hAnsi="Consolas"/>
+                <w:lang w:val="en-US"/>
+              </w:rPr>
+              <w:t>clickMade</w:t>
+            </w:r>
+            <w:proofErr w:type="spellEnd"/>
+            <w:r>
+              <w:rPr>
+                <w:rFonts w:ascii="Consolas" w:hAnsi="Consolas"/>
+                <w:lang w:val="en-US"/>
+              </w:rPr>
+              <w:t>(</w:t>
+            </w:r>
+            <w:proofErr w:type="gramEnd"/>
+            <w:r>
+              <w:rPr>
+                <w:rFonts w:ascii="Consolas" w:hAnsi="Consolas"/>
+                <w:lang w:val="en-US"/>
+              </w:rPr>
+              <w:t xml:space="preserve">Double x, Double y, </w:t>
+            </w:r>
+            <w:proofErr w:type="spellStart"/>
+            <w:r>
+              <w:rPr>
+                <w:rFonts w:ascii="Consolas" w:hAnsi="Consolas"/>
+                <w:lang w:val="en-US"/>
+              </w:rPr>
+              <w:t>boolean</w:t>
+            </w:r>
+            <w:proofErr w:type="spellEnd"/>
+            <w:r>
+              <w:rPr>
+                <w:rFonts w:ascii="Consolas" w:hAnsi="Consolas"/>
+                <w:lang w:val="en-US"/>
+              </w:rPr>
+              <w:t xml:space="preserve"> </w:t>
+            </w:r>
+            <w:proofErr w:type="spellStart"/>
+            <w:proofErr w:type="gramStart"/>
+            <w:r>
+              <w:rPr>
+                <w:rFonts w:ascii="Consolas" w:hAnsi="Consolas"/>
+                <w:lang w:val="en-US"/>
+              </w:rPr>
+              <w:t>isHit</w:t>
+            </w:r>
+            <w:proofErr w:type="spellEnd"/>
+            <w:r>
+              <w:rPr>
+                <w:rFonts w:ascii="Consolas" w:hAnsi="Consolas"/>
+                <w:lang w:val="en-US"/>
+              </w:rPr>
+              <w:t>) {</w:t>
+            </w:r>
+            <w:proofErr w:type="gramEnd"/>
+          </w:p>
+          <w:p>
+            <w:pPr>
+              <w:keepNext/>
+              <w:ind w:firstLine="0"/>
+              <w:rPr>
+                <w:rFonts w:ascii="Consolas" w:hAnsi="Consolas"/>
+                <w:lang w:val="en-US"/>
+              </w:rPr>
+            </w:pPr>
+            <w:r>
+              <w:rPr>
+                <w:rFonts w:ascii="Consolas" w:hAnsi="Consolas"/>
+                <w:lang w:val="en-US"/>
+              </w:rPr>
+              <w:t xml:space="preserve">        </w:t>
+            </w:r>
+            <w:proofErr w:type="spellStart"/>
+            <w:proofErr w:type="gramStart"/>
+            <w:r>
+              <w:rPr>
+                <w:rFonts w:ascii="Consolas" w:hAnsi="Consolas"/>
+                <w:lang w:val="en-US"/>
+              </w:rPr>
+              <w:t>this.pointsCount</w:t>
+            </w:r>
+            <w:proofErr w:type="spellEnd"/>
+            <w:proofErr w:type="gramEnd"/>
+            <w:r>
+              <w:rPr>
+                <w:rFonts w:ascii="Consolas" w:hAnsi="Consolas"/>
+                <w:lang w:val="en-US"/>
+              </w:rPr>
+              <w:t xml:space="preserve"> += 1;</w:t>
+            </w:r>
+          </w:p>
+          <w:p>
+            <w:pPr>
+              <w:keepNext/>
+              <w:ind w:firstLine="0"/>
+              <w:rPr>
+                <w:rFonts w:ascii="Consolas" w:hAnsi="Consolas"/>
+                <w:lang w:val="en-US"/>
+              </w:rPr>
+            </w:pPr>
+          </w:p>
+          <w:p>
+            <w:pPr>
+              <w:keepNext/>
+              <w:ind w:firstLine="0"/>
+              <w:rPr>
+                <w:rFonts w:ascii="Consolas" w:hAnsi="Consolas"/>
+                <w:lang w:val="en-US"/>
+              </w:rPr>
+            </w:pPr>
+            <w:r>
+              <w:rPr>
+                <w:rFonts w:ascii="Consolas" w:hAnsi="Consolas"/>
+                <w:lang w:val="en-US"/>
+              </w:rPr>
+              <w:t xml:space="preserve">        if </w:t>
+            </w:r>
+            <w:proofErr w:type="gramStart"/>
+            <w:r>
+              <w:rPr>
+                <w:rFonts w:ascii="Consolas" w:hAnsi="Consolas"/>
+                <w:lang w:val="en-US"/>
+              </w:rPr>
+              <w:t>(!</w:t>
+            </w:r>
+            <w:proofErr w:type="spellStart"/>
+            <w:r>
+              <w:rPr>
+                <w:rFonts w:ascii="Consolas" w:hAnsi="Consolas"/>
+                <w:lang w:val="en-US"/>
+              </w:rPr>
+              <w:t>isHit</w:t>
+            </w:r>
+            <w:proofErr w:type="spellEnd"/>
+            <w:proofErr w:type="gramEnd"/>
+            <w:r>
+              <w:rPr>
+                <w:rFonts w:ascii="Consolas" w:hAnsi="Consolas"/>
+                <w:lang w:val="en-US"/>
+              </w:rPr>
+              <w:t>) {</w:t>
+            </w:r>
+          </w:p>
+          <w:p>
+            <w:pPr>
+              <w:keepNext/>
+              <w:ind w:firstLine="0"/>
+              <w:rPr>
+                <w:rFonts w:ascii="Consolas" w:hAnsi="Consolas"/>
+                <w:lang w:val="en-US"/>
+              </w:rPr>
+            </w:pPr>
+            <w:r>
+              <w:rPr>
+                <w:rFonts w:ascii="Consolas" w:hAnsi="Consolas"/>
+                <w:lang w:val="en-US"/>
+              </w:rPr>
+              <w:t xml:space="preserve">            </w:t>
+            </w:r>
+            <w:proofErr w:type="spellStart"/>
+            <w:proofErr w:type="gramStart"/>
+            <w:r>
+              <w:rPr>
+                <w:rFonts w:ascii="Consolas" w:hAnsi="Consolas"/>
+                <w:lang w:val="en-US"/>
+              </w:rPr>
+              <w:t>this.missesCount</w:t>
+            </w:r>
+            <w:proofErr w:type="spellEnd"/>
+            <w:proofErr w:type="gramEnd"/>
+            <w:r>
+              <w:rPr>
+                <w:rFonts w:ascii="Consolas" w:hAnsi="Consolas"/>
+                <w:lang w:val="en-US"/>
+              </w:rPr>
+              <w:t xml:space="preserve"> += 1;</w:t>
+            </w:r>
+          </w:p>
+          <w:p>
+            <w:pPr>
+              <w:keepNext/>
+              <w:ind w:firstLine="0"/>
+              <w:rPr>
+                <w:rFonts w:ascii="Consolas" w:hAnsi="Consolas"/>
+                <w:lang w:val="en-US"/>
+              </w:rPr>
+            </w:pPr>
+            <w:r>
+              <w:rPr>
+                <w:rFonts w:ascii="Consolas" w:hAnsi="Consolas"/>
+                <w:lang w:val="en-US"/>
+              </w:rPr>
+              <w:t xml:space="preserve">            </w:t>
+            </w:r>
+            <w:proofErr w:type="spellStart"/>
+            <w:proofErr w:type="gramStart"/>
+            <w:r>
+              <w:rPr>
+                <w:rFonts w:ascii="Consolas" w:hAnsi="Consolas"/>
+                <w:lang w:val="en-US"/>
+              </w:rPr>
+              <w:t>this.consecutiveMisses</w:t>
+            </w:r>
+            <w:proofErr w:type="spellEnd"/>
+            <w:proofErr w:type="gramEnd"/>
+            <w:r>
+              <w:rPr>
+                <w:rFonts w:ascii="Consolas" w:hAnsi="Consolas"/>
+                <w:lang w:val="en-US"/>
+              </w:rPr>
+              <w:t xml:space="preserve"> += 1;</w:t>
+            </w:r>
+          </w:p>
+          <w:p>
+            <w:pPr>
+              <w:keepNext/>
+              <w:ind w:firstLine="0"/>
+              <w:rPr>
+                <w:rFonts w:ascii="Consolas" w:hAnsi="Consolas"/>
+                <w:lang w:val="en-US"/>
+              </w:rPr>
+            </w:pPr>
+          </w:p>
+          <w:p>
+            <w:pPr>
+              <w:keepNext/>
+              <w:ind w:firstLine="0"/>
+              <w:rPr>
+                <w:rFonts w:ascii="Consolas" w:hAnsi="Consolas"/>
+                <w:lang w:val="en-US"/>
+              </w:rPr>
+            </w:pPr>
+            <w:r>
+              <w:rPr>
+                <w:rFonts w:ascii="Consolas" w:hAnsi="Consolas"/>
+                <w:lang w:val="en-US"/>
+              </w:rPr>
+              <w:t xml:space="preserve">            if (</w:t>
+            </w:r>
+            <w:proofErr w:type="spellStart"/>
+            <w:proofErr w:type="gramStart"/>
+            <w:r>
+              <w:rPr>
+                <w:rFonts w:ascii="Consolas" w:hAnsi="Consolas"/>
+                <w:lang w:val="en-US"/>
+              </w:rPr>
+              <w:t>this.consecutiveMisses</w:t>
+            </w:r>
+            <w:proofErr w:type="spellEnd"/>
+            <w:proofErr w:type="gramEnd"/>
+            <w:r>
+              <w:rPr>
+                <w:rFonts w:ascii="Consolas" w:hAnsi="Consolas"/>
+                <w:lang w:val="en-US"/>
+              </w:rPr>
+              <w:t xml:space="preserve"> &gt;= </w:t>
+            </w:r>
+            <w:proofErr w:type="gramStart"/>
+            <w:r>
+              <w:rPr>
+                <w:rFonts w:ascii="Consolas" w:hAnsi="Consolas"/>
+                <w:lang w:val="en-US"/>
+              </w:rPr>
+              <w:t>3) {</w:t>
+            </w:r>
+            <w:proofErr w:type="gramEnd"/>
+          </w:p>
+          <w:p>
+            <w:pPr>
+              <w:keepNext/>
+              <w:ind w:firstLine="0"/>
+              <w:rPr>
+                <w:rFonts w:ascii="Consolas" w:hAnsi="Consolas"/>
+                <w:lang w:val="en-US"/>
+              </w:rPr>
+            </w:pPr>
+            <w:r>
+              <w:rPr>
+                <w:rFonts w:ascii="Consolas" w:hAnsi="Consolas"/>
+                <w:lang w:val="en-US"/>
+              </w:rPr>
+              <w:t xml:space="preserve">                Notification n = new </w:t>
+            </w:r>
+            <w:proofErr w:type="gramStart"/>
+            <w:r>
+              <w:rPr>
+                <w:rFonts w:ascii="Consolas" w:hAnsi="Consolas"/>
+                <w:lang w:val="en-US"/>
+              </w:rPr>
+              <w:t>Notification(</w:t>
+            </w:r>
+            <w:proofErr w:type="gramEnd"/>
+            <w:r>
+              <w:rPr>
+                <w:rFonts w:ascii="Consolas" w:hAnsi="Consolas"/>
+                <w:lang w:val="en-US"/>
+              </w:rPr>
+              <w:t xml:space="preserve">"consecutive misses", this, </w:t>
+            </w:r>
+            <w:proofErr w:type="spellStart"/>
+            <w:r>
+              <w:rPr>
+                <w:rFonts w:ascii="Consolas" w:hAnsi="Consolas"/>
+                <w:lang w:val="en-US"/>
+              </w:rPr>
+              <w:t>sequenceNumber</w:t>
+            </w:r>
+            <w:proofErr w:type="spellEnd"/>
+            <w:r>
+              <w:rPr>
+                <w:rFonts w:ascii="Consolas" w:hAnsi="Consolas"/>
+                <w:lang w:val="en-US"/>
+              </w:rPr>
+              <w:t>++,</w:t>
+            </w:r>
+          </w:p>
+          <w:p>
+            <w:pPr>
+              <w:keepNext/>
+              <w:ind w:firstLine="0"/>
+              <w:rPr>
+                <w:rFonts w:ascii="Consolas" w:hAnsi="Consolas"/>
+                <w:lang w:val="en-US"/>
+              </w:rPr>
+            </w:pPr>
+            <w:r>
+              <w:rPr>
+                <w:rFonts w:ascii="Consolas" w:hAnsi="Consolas"/>
+                <w:lang w:val="en-US"/>
+              </w:rPr>
+              <w:t xml:space="preserve">                        </w:t>
+            </w:r>
+            <w:proofErr w:type="spellStart"/>
+            <w:r>
+              <w:rPr>
+                <w:rFonts w:ascii="Consolas" w:hAnsi="Consolas"/>
+                <w:lang w:val="en-US"/>
+              </w:rPr>
+              <w:t>System.currentTimeMillis</w:t>
+            </w:r>
+            <w:proofErr w:type="spellEnd"/>
+            <w:r>
+              <w:rPr>
+                <w:rFonts w:ascii="Consolas" w:hAnsi="Consolas"/>
+                <w:lang w:val="en-US"/>
+              </w:rPr>
+              <w:t>());</w:t>
+            </w:r>
+          </w:p>
+          <w:p>
+            <w:pPr>
+              <w:keepNext/>
+              <w:ind w:firstLine="0"/>
+              <w:rPr>
+                <w:rFonts w:ascii="Consolas" w:hAnsi="Consolas"/>
+                <w:lang w:val="en-US"/>
+              </w:rPr>
+            </w:pPr>
+          </w:p>
+          <w:p>
+            <w:pPr>
+              <w:keepNext/>
+              <w:ind w:firstLine="0"/>
+              <w:rPr>
+                <w:rFonts w:ascii="Consolas" w:hAnsi="Consolas"/>
+                <w:lang w:val="en-US"/>
+              </w:rPr>
+            </w:pPr>
+            <w:r>
+              <w:rPr>
+                <w:rFonts w:ascii="Consolas" w:hAnsi="Consolas"/>
+                <w:lang w:val="en-US"/>
+              </w:rPr>
+              <w:t xml:space="preserve">                </w:t>
+            </w:r>
+            <w:proofErr w:type="spellStart"/>
+            <w:r>
+              <w:rPr>
+                <w:rFonts w:ascii="Consolas" w:hAnsi="Consolas"/>
+                <w:lang w:val="en-US"/>
+              </w:rPr>
+              <w:t>sendNotification</w:t>
+            </w:r>
+            <w:proofErr w:type="spellEnd"/>
+            <w:r>
+              <w:rPr>
+                <w:rFonts w:ascii="Consolas" w:hAnsi="Consolas"/>
+                <w:lang w:val="en-US"/>
+              </w:rPr>
+              <w:t>(n);</w:t>
+            </w:r>
+          </w:p>
+          <w:p>
+            <w:pPr>
+              <w:keepNext/>
+              <w:ind w:firstLine="0"/>
+              <w:rPr>
+                <w:rFonts w:ascii="Consolas" w:hAnsi="Consolas"/>
+                <w:lang w:val="en-US"/>
+              </w:rPr>
+            </w:pPr>
+          </w:p>
+          <w:p>
+            <w:pPr>
+              <w:keepNext/>
+              <w:ind w:firstLine="0"/>
+              <w:rPr>
+                <w:rFonts w:ascii="Consolas" w:hAnsi="Consolas"/>
+                <w:lang w:val="en-US"/>
+              </w:rPr>
+            </w:pPr>
+            <w:r>
+              <w:rPr>
+                <w:rFonts w:ascii="Consolas" w:hAnsi="Consolas"/>
+                <w:lang w:val="en-US"/>
+              </w:rPr>
+              <w:t xml:space="preserve">                </w:t>
+            </w:r>
+            <w:proofErr w:type="spellStart"/>
+            <w:proofErr w:type="gramStart"/>
+            <w:r>
+              <w:rPr>
+                <w:rFonts w:ascii="Consolas" w:hAnsi="Consolas"/>
+                <w:lang w:val="en-US"/>
+              </w:rPr>
+              <w:t>this.consecutiveMisses</w:t>
+            </w:r>
+            <w:proofErr w:type="spellEnd"/>
+            <w:proofErr w:type="gramEnd"/>
+            <w:r>
+              <w:rPr>
+                <w:rFonts w:ascii="Consolas" w:hAnsi="Consolas"/>
+                <w:lang w:val="en-US"/>
+              </w:rPr>
+              <w:t xml:space="preserve"> = 0;</w:t>
+            </w:r>
+          </w:p>
+          <w:p>
+            <w:pPr>
+              <w:keepNext/>
+              <w:ind w:firstLine="0"/>
+              <w:rPr>
+                <w:rFonts w:ascii="Consolas" w:hAnsi="Consolas"/>
+                <w:lang w:val="en-US"/>
+              </w:rPr>
+            </w:pPr>
+          </w:p>
+          <w:p>
+            <w:pPr>
+              <w:keepNext/>
+              <w:ind w:firstLine="0"/>
+              <w:rPr>
+                <w:rFonts w:ascii="Consolas" w:hAnsi="Consolas"/>
+                <w:lang w:val="en-US"/>
+              </w:rPr>
+            </w:pPr>
+            <w:r>
+              <w:rPr>
+                <w:rFonts w:ascii="Consolas" w:hAnsi="Consolas"/>
+                <w:lang w:val="en-US"/>
+              </w:rPr>
+              <w:t xml:space="preserve">            }</w:t>
+            </w:r>
+          </w:p>
+          <w:p>
+            <w:pPr>
+              <w:keepNext/>
+              <w:ind w:firstLine="0"/>
+              <w:rPr>
+                <w:rFonts w:ascii="Consolas" w:hAnsi="Consolas"/>
+                <w:lang w:val="en-US"/>
+              </w:rPr>
+            </w:pPr>
+          </w:p>
+          <w:p>
+            <w:pPr>
+              <w:keepNext/>
+              <w:ind w:firstLine="0"/>
+              <w:rPr>
+                <w:rFonts w:ascii="Consolas" w:hAnsi="Consolas"/>
+                <w:lang w:val="en-US"/>
+              </w:rPr>
+            </w:pPr>
+            <w:r>
+              <w:rPr>
+                <w:rFonts w:ascii="Consolas" w:hAnsi="Consolas"/>
+                <w:lang w:val="en-US"/>
+              </w:rPr>
+              <w:t xml:space="preserve">        } else {</w:t>
+            </w:r>
+          </w:p>
+          <w:p>
+            <w:pPr>
+              <w:keepNext/>
+              <w:ind w:firstLine="0"/>
+              <w:rPr>
+                <w:rFonts w:ascii="Consolas" w:hAnsi="Consolas"/>
+                <w:lang w:val="en-US"/>
+              </w:rPr>
+            </w:pPr>
+            <w:r>
+              <w:rPr>
+                <w:rFonts w:ascii="Consolas" w:hAnsi="Consolas"/>
+                <w:lang w:val="en-US"/>
+              </w:rPr>
+              <w:t xml:space="preserve">            </w:t>
+            </w:r>
+            <w:proofErr w:type="spellStart"/>
+            <w:proofErr w:type="gramStart"/>
+            <w:r>
+              <w:rPr>
+                <w:rFonts w:ascii="Consolas" w:hAnsi="Consolas"/>
+                <w:lang w:val="en-US"/>
+              </w:rPr>
+              <w:t>this.consecutiveMisses</w:t>
+            </w:r>
+            <w:proofErr w:type="spellEnd"/>
+            <w:proofErr w:type="gramEnd"/>
+            <w:r>
+              <w:rPr>
+                <w:rFonts w:ascii="Consolas" w:hAnsi="Consolas"/>
+                <w:lang w:val="en-US"/>
+              </w:rPr>
+              <w:t xml:space="preserve"> = 0;</w:t>
+            </w:r>
+          </w:p>
+          <w:p>
+            <w:pPr>
+              <w:keepNext/>
+              <w:ind w:firstLine="0"/>
+              <w:rPr>
+                <w:rFonts w:ascii="Consolas" w:hAnsi="Consolas"/>
+                <w:lang w:val="en-US"/>
+              </w:rPr>
+            </w:pPr>
+            <w:r>
+              <w:rPr>
+                <w:rFonts w:ascii="Consolas" w:hAnsi="Consolas"/>
+                <w:lang w:val="en-US"/>
+              </w:rPr>
+              <w:t xml:space="preserve">        }</w:t>
+            </w:r>
+          </w:p>
+          <w:p>
+            <w:pPr>
+              <w:keepNext/>
+              <w:ind w:firstLine="0"/>
+              <w:rPr>
+                <w:rFonts w:ascii="Consolas" w:hAnsi="Consolas"/>
+                <w:lang w:val="en-US"/>
+              </w:rPr>
+            </w:pPr>
+          </w:p>
+          <w:p>
+            <w:pPr>
+              <w:keepNext/>
+              <w:ind w:firstLine="0"/>
+              <w:rPr>
+                <w:rFonts w:ascii="Consolas" w:hAnsi="Consolas"/>
+                <w:lang w:val="en-US"/>
+              </w:rPr>
+            </w:pPr>
+            <w:r>
+              <w:rPr>
+                <w:rFonts w:ascii="Consolas" w:hAnsi="Consolas"/>
+                <w:lang w:val="en-US"/>
+              </w:rPr>
+              <w:lastRenderedPageBreak/>
+              <w:t xml:space="preserve">        </w:t>
+            </w:r>
+            <w:proofErr w:type="spellStart"/>
+            <w:r>
+              <w:rPr>
+                <w:rFonts w:ascii="Consolas" w:hAnsi="Consolas"/>
+                <w:lang w:val="en-US"/>
+              </w:rPr>
+              <w:t>missPercentage.setPercentage</w:t>
+            </w:r>
+            <w:proofErr w:type="spellEnd"/>
+            <w:r>
+              <w:rPr>
+                <w:rFonts w:ascii="Consolas" w:hAnsi="Consolas"/>
+                <w:lang w:val="en-US"/>
+              </w:rPr>
+              <w:t>(</w:t>
+            </w:r>
+            <w:proofErr w:type="spellStart"/>
+            <w:r>
+              <w:rPr>
+                <w:rFonts w:ascii="Consolas" w:hAnsi="Consolas"/>
+                <w:lang w:val="en-US"/>
+              </w:rPr>
+              <w:t>pointsCount</w:t>
+            </w:r>
+            <w:proofErr w:type="spellEnd"/>
+            <w:r>
+              <w:rPr>
+                <w:rFonts w:ascii="Consolas" w:hAnsi="Consolas"/>
+                <w:lang w:val="en-US"/>
+              </w:rPr>
+              <w:t xml:space="preserve">, </w:t>
+            </w:r>
+            <w:proofErr w:type="spellStart"/>
+            <w:r>
+              <w:rPr>
+                <w:rFonts w:ascii="Consolas" w:hAnsi="Consolas"/>
+                <w:lang w:val="en-US"/>
+              </w:rPr>
+              <w:t>missesCount</w:t>
+            </w:r>
+            <w:proofErr w:type="spellEnd"/>
+            <w:r>
+              <w:rPr>
+                <w:rFonts w:ascii="Consolas" w:hAnsi="Consolas"/>
+                <w:lang w:val="en-US"/>
+              </w:rPr>
+              <w:t>);</w:t>
+            </w:r>
+          </w:p>
+          <w:p>
+            <w:pPr>
+              <w:keepNext/>
+              <w:ind w:firstLine="0"/>
+              <w:rPr>
+                <w:rFonts w:ascii="Consolas" w:hAnsi="Consolas"/>
+                <w:lang w:val="en-US"/>
+              </w:rPr>
+            </w:pPr>
+            <w:r>
+              <w:rPr>
+                <w:rFonts w:ascii="Consolas" w:hAnsi="Consolas"/>
+                <w:lang w:val="en-US"/>
+              </w:rPr>
+              <w:t xml:space="preserve">        </w:t>
+            </w:r>
+            <w:proofErr w:type="spellStart"/>
+            <w:r>
+              <w:rPr>
+                <w:rFonts w:ascii="Consolas" w:hAnsi="Consolas"/>
+                <w:lang w:val="en-US"/>
+              </w:rPr>
+              <w:t>areaCounter.click</w:t>
+            </w:r>
+            <w:proofErr w:type="spellEnd"/>
+            <w:r>
+              <w:rPr>
+                <w:rFonts w:ascii="Consolas" w:hAnsi="Consolas"/>
+                <w:lang w:val="en-US"/>
+              </w:rPr>
+              <w:t>(x, y);</w:t>
+            </w:r>
+          </w:p>
+          <w:p>
+            <w:pPr>
+              <w:keepNext/>
+              <w:ind w:firstLine="0"/>
+              <w:rPr>
+                <w:rFonts w:ascii="Consolas" w:hAnsi="Consolas"/>
+                <w:lang w:val="en-US"/>
+              </w:rPr>
+            </w:pPr>
+          </w:p>
+          <w:p>
+            <w:pPr>
+              <w:keepNext/>
+              <w:ind w:firstLine="0"/>
+              <w:rPr>
+                <w:rFonts w:ascii="Consolas" w:hAnsi="Consolas"/>
+                <w:lang w:val="en-US"/>
+              </w:rPr>
+            </w:pPr>
+            <w:r>
+              <w:rPr>
+                <w:rFonts w:ascii="Consolas" w:hAnsi="Consolas"/>
+                <w:lang w:val="en-US"/>
+              </w:rPr>
+              <w:t xml:space="preserve">    }</w:t>
+            </w:r>
+          </w:p>
+          <w:p>
+            <w:pPr>
+              <w:keepNext/>
+              <w:ind w:firstLine="0"/>
+              <w:rPr>
+                <w:rFonts w:ascii="Consolas" w:hAnsi="Consolas"/>
+                <w:lang w:val="en-US"/>
+              </w:rPr>
+            </w:pPr>
+            <w:r>
+              <w:rPr>
+                <w:rFonts w:ascii="Consolas" w:hAnsi="Consolas"/>
+                <w:lang w:val="en-US"/>
+              </w:rPr>
+              <w:t xml:space="preserve">    public int </w:t>
+            </w:r>
+            <w:proofErr w:type="spellStart"/>
+            <w:proofErr w:type="gramStart"/>
+            <w:r>
+              <w:rPr>
+                <w:rFonts w:ascii="Consolas" w:hAnsi="Consolas"/>
+                <w:lang w:val="en-US"/>
+              </w:rPr>
+              <w:t>getPointsCount</w:t>
+            </w:r>
+            <w:proofErr w:type="spellEnd"/>
+            <w:r>
+              <w:rPr>
+                <w:rFonts w:ascii="Consolas" w:hAnsi="Consolas"/>
+                <w:lang w:val="en-US"/>
+              </w:rPr>
+              <w:t>(</w:t>
+            </w:r>
+            <w:proofErr w:type="gramEnd"/>
+            <w:r>
+              <w:rPr>
+                <w:rFonts w:ascii="Consolas" w:hAnsi="Consolas"/>
+                <w:lang w:val="en-US"/>
+              </w:rPr>
+              <w:t>) {</w:t>
+            </w:r>
+          </w:p>
+          <w:p>
+            <w:pPr>
+              <w:keepNext/>
+              <w:ind w:firstLine="0"/>
+              <w:rPr>
+                <w:rFonts w:ascii="Consolas" w:hAnsi="Consolas"/>
+                <w:lang w:val="en-US"/>
+              </w:rPr>
+            </w:pPr>
+            <w:r>
+              <w:rPr>
+                <w:rFonts w:ascii="Consolas" w:hAnsi="Consolas"/>
+                <w:lang w:val="en-US"/>
+              </w:rPr>
+              <w:t xml:space="preserve">        return </w:t>
+            </w:r>
+            <w:proofErr w:type="spellStart"/>
+            <w:r>
+              <w:rPr>
+                <w:rFonts w:ascii="Consolas" w:hAnsi="Consolas"/>
+                <w:lang w:val="en-US"/>
+              </w:rPr>
+              <w:t>pointsCount</w:t>
+            </w:r>
+            <w:proofErr w:type="spellEnd"/>
+            <w:r>
+              <w:rPr>
+                <w:rFonts w:ascii="Consolas" w:hAnsi="Consolas"/>
+                <w:lang w:val="en-US"/>
+              </w:rPr>
+              <w:t>;</w:t>
+            </w:r>
+          </w:p>
+          <w:p>
+            <w:pPr>
+              <w:keepNext/>
+              <w:ind w:firstLine="0"/>
+              <w:rPr>
+                <w:rFonts w:ascii="Consolas" w:hAnsi="Consolas"/>
+                <w:lang w:val="en-US"/>
+              </w:rPr>
+            </w:pPr>
+            <w:r>
+              <w:rPr>
+                <w:rFonts w:ascii="Consolas" w:hAnsi="Consolas"/>
+                <w:lang w:val="en-US"/>
+              </w:rPr>
+              <w:t xml:space="preserve">    }</w:t>
+            </w:r>
+          </w:p>
+          <w:p>
+            <w:pPr>
+              <w:keepNext/>
+              <w:ind w:firstLine="0"/>
+              <w:rPr>
+                <w:rFonts w:ascii="Consolas" w:hAnsi="Consolas"/>
+                <w:lang w:val="en-US"/>
+              </w:rPr>
+            </w:pPr>
+            <w:r>
+              <w:rPr>
+                <w:rFonts w:ascii="Consolas" w:hAnsi="Consolas"/>
+                <w:lang w:val="en-US"/>
+              </w:rPr>
+              <w:t xml:space="preserve">    </w:t>
+            </w:r>
+            <w:proofErr w:type="gramStart"/>
+            <w:r>
+              <w:rPr>
+                <w:rFonts w:ascii="Consolas" w:hAnsi="Consolas"/>
+                <w:lang w:val="en-US"/>
+              </w:rPr>
+              <w:t>public</w:t>
+            </w:r>
+            <w:proofErr w:type="gramEnd"/>
+            <w:r>
+              <w:rPr>
+                <w:rFonts w:ascii="Consolas" w:hAnsi="Consolas"/>
+                <w:lang w:val="en-US"/>
+              </w:rPr>
+              <w:t xml:space="preserve"> int </w:t>
+            </w:r>
+            <w:proofErr w:type="spellStart"/>
+            <w:proofErr w:type="gramStart"/>
+            <w:r>
+              <w:rPr>
+                <w:rFonts w:ascii="Consolas" w:hAnsi="Consolas"/>
+                <w:lang w:val="en-US"/>
+              </w:rPr>
+              <w:t>getMissesCount</w:t>
+            </w:r>
+            <w:proofErr w:type="spellEnd"/>
+            <w:r>
+              <w:rPr>
+                <w:rFonts w:ascii="Consolas" w:hAnsi="Consolas"/>
+                <w:lang w:val="en-US"/>
+              </w:rPr>
+              <w:t>(</w:t>
+            </w:r>
+            <w:proofErr w:type="gramEnd"/>
+            <w:r>
+              <w:rPr>
+                <w:rFonts w:ascii="Consolas" w:hAnsi="Consolas"/>
+                <w:lang w:val="en-US"/>
+              </w:rPr>
+              <w:t>) {</w:t>
+            </w:r>
+          </w:p>
+          <w:p>
+            <w:pPr>
+              <w:keepNext/>
+              <w:ind w:firstLine="0"/>
+              <w:rPr>
+                <w:rFonts w:ascii="Consolas" w:hAnsi="Consolas"/>
+                <w:lang w:val="en-US"/>
+              </w:rPr>
+            </w:pPr>
+            <w:r>
+              <w:rPr>
+                <w:rFonts w:ascii="Consolas" w:hAnsi="Consolas"/>
+                <w:lang w:val="en-US"/>
+              </w:rPr>
+              <w:t xml:space="preserve">        return </w:t>
+            </w:r>
+            <w:proofErr w:type="spellStart"/>
+            <w:r>
+              <w:rPr>
+                <w:rFonts w:ascii="Consolas" w:hAnsi="Consolas"/>
+                <w:lang w:val="en-US"/>
+              </w:rPr>
+              <w:t>missesCount</w:t>
+            </w:r>
+            <w:proofErr w:type="spellEnd"/>
+            <w:r>
+              <w:rPr>
+                <w:rFonts w:ascii="Consolas" w:hAnsi="Consolas"/>
+                <w:lang w:val="en-US"/>
+              </w:rPr>
+              <w:t>;</w:t>
+            </w:r>
+          </w:p>
+          <w:p>
+            <w:pPr>
+              <w:keepNext/>
+              <w:ind w:firstLine="0"/>
+              <w:rPr>
+                <w:rFonts w:ascii="Consolas" w:hAnsi="Consolas"/>
+                <w:lang w:val="en-US"/>
+              </w:rPr>
+            </w:pPr>
+            <w:r>
+              <w:rPr>
+                <w:rFonts w:ascii="Consolas" w:hAnsi="Consolas"/>
+                <w:lang w:val="en-US"/>
+              </w:rPr>
+              <w:t xml:space="preserve">    }</w:t>
+            </w:r>
+          </w:p>
+          <w:p>
+            <w:pPr>
+              <w:keepNext/>
+              <w:ind w:firstLine="0"/>
+              <w:rPr>
+                <w:rFonts w:ascii="Consolas" w:hAnsi="Consolas"/>
+                <w:lang w:val="en-US"/>
+              </w:rPr>
+            </w:pPr>
+            <w:r>
+              <w:rPr>
+                <w:rFonts w:ascii="Consolas" w:hAnsi="Consolas"/>
+                <w:lang w:val="en-US"/>
+              </w:rPr>
+              <w:t xml:space="preserve">    public AreaCounter </w:t>
+            </w:r>
+            <w:proofErr w:type="spellStart"/>
+            <w:proofErr w:type="gramStart"/>
+            <w:r>
+              <w:rPr>
+                <w:rFonts w:ascii="Consolas" w:hAnsi="Consolas"/>
+                <w:lang w:val="en-US"/>
+              </w:rPr>
+              <w:t>getAreaCount</w:t>
+            </w:r>
+            <w:proofErr w:type="spellEnd"/>
+            <w:r>
+              <w:rPr>
+                <w:rFonts w:ascii="Consolas" w:hAnsi="Consolas"/>
+                <w:lang w:val="en-US"/>
+              </w:rPr>
+              <w:t>(</w:t>
+            </w:r>
+            <w:proofErr w:type="gramEnd"/>
+            <w:r>
+              <w:rPr>
+                <w:rFonts w:ascii="Consolas" w:hAnsi="Consolas"/>
+                <w:lang w:val="en-US"/>
+              </w:rPr>
+              <w:t xml:space="preserve">) throws </w:t>
+            </w:r>
+            <w:proofErr w:type="spellStart"/>
+            <w:r>
+              <w:rPr>
+                <w:rFonts w:ascii="Consolas" w:hAnsi="Consolas"/>
+                <w:lang w:val="en-US"/>
+              </w:rPr>
+              <w:t>OpenDataException</w:t>
+            </w:r>
+            <w:proofErr w:type="spellEnd"/>
+            <w:r>
+              <w:rPr>
+                <w:rFonts w:ascii="Consolas" w:hAnsi="Consolas"/>
+                <w:lang w:val="en-US"/>
+              </w:rPr>
+              <w:t xml:space="preserve"> {</w:t>
+            </w:r>
+          </w:p>
+          <w:p>
+            <w:pPr>
+              <w:keepNext/>
+              <w:ind w:firstLine="0"/>
+              <w:rPr>
+                <w:rFonts w:ascii="Consolas" w:hAnsi="Consolas"/>
+                <w:lang w:val="ru-RU"/>
+              </w:rPr>
+            </w:pPr>
+            <w:r>
+              <w:rPr>
+                <w:rFonts w:ascii="Consolas" w:hAnsi="Consolas"/>
+                <w:lang w:val="en-US"/>
+              </w:rPr>
+              <w:t xml:space="preserve">        </w:t>
+            </w:r>
+            <w:proofErr w:type="spellStart"/>
+            <w:r>
+              <w:rPr>
+                <w:rFonts w:ascii="Consolas" w:hAnsi="Consolas"/>
+                <w:lang w:val="ru-RU"/>
+              </w:rPr>
+              <w:t>return</w:t>
+            </w:r>
+            <w:proofErr w:type="spellEnd"/>
+            <w:r>
+              <w:rPr>
+                <w:rFonts w:ascii="Consolas" w:hAnsi="Consolas"/>
+                <w:lang w:val="ru-RU"/>
+              </w:rPr>
+              <w:t xml:space="preserve"> </w:t>
+            </w:r>
+            <w:proofErr w:type="spellStart"/>
+            <w:r>
+              <w:rPr>
+                <w:rFonts w:ascii="Consolas" w:hAnsi="Consolas"/>
+                <w:lang w:val="ru-RU"/>
+              </w:rPr>
+              <w:t>areaCounter</w:t>
+            </w:r>
+            <w:proofErr w:type="spellEnd"/>
+            <w:r>
+              <w:rPr>
+                <w:rFonts w:ascii="Consolas" w:hAnsi="Consolas"/>
+                <w:lang w:val="ru-RU"/>
+              </w:rPr>
+              <w:t>;</w:t>
+            </w:r>
+          </w:p>
+          <w:p>
+            <w:pPr>
+              <w:keepNext/>
+              <w:ind w:firstLine="0"/>
+              <w:rPr>
+                <w:rFonts w:ascii="Consolas" w:hAnsi="Consolas"/>
+                <w:lang w:val="ru-RU"/>
+              </w:rPr>
+            </w:pPr>
+            <w:r>
+              <w:rPr>
+                <w:rFonts w:ascii="Consolas" w:hAnsi="Consolas"/>
+                <w:lang w:val="ru-RU"/>
+              </w:rPr>
+              <w:t xml:space="preserve">    }</w:t>
+            </w:r>
+          </w:p>
+          <w:p>
+            <w:pPr>
+              <w:keepNext/>
+              <w:ind w:firstLine="0"/>
+              <w:rPr>
+                <w:rFonts w:ascii="Consolas" w:hAnsi="Consolas"/>
+                <w:lang w:val="ru-RU"/>
+              </w:rPr>
+            </w:pPr>
+          </w:p>
+          <w:p>
+            <w:pPr>
+              <w:keepNext/>
+              <w:ind w:firstLine="0"/>
+              <w:rPr>
+                <w:rFonts w:ascii="Consolas" w:hAnsi="Consolas"/>
+                <w:lang w:val="ru-RU"/>
+              </w:rPr>
+            </w:pPr>
+            <w:r>
+              <w:rPr>
+                <w:rFonts w:ascii="Consolas" w:hAnsi="Consolas"/>
+                <w:lang w:val="ru-RU"/>
+              </w:rPr>
+              <w:t>}</w:t>
+            </w:r>
+          </w:p>
+        </w:tc>
+      </w:tr>
+    </w:tbl>
+    <w:p>
+      <w:pPr>
+        <w:pStyle w:val="ab"/>
+      </w:pPr>
+      <w:r>
+        <w:fldChar w:fldCharType="begin"/>
+      </w:r>
+      <w:r>
+        <w:instrText xml:space="preserve"> SEQ Формула \* ARABIC </w:instrText>
+      </w:r>
+      <w:r>
+        <w:fldChar w:fldCharType="separate"/>
+      </w:r>
+      <w:r>
+        <w:rPr>
+          <w:noProof/>
+        </w:rPr>
+        <w:t>2</w:t>
+      </w:r>
+      <w:r>
+        <w:fldChar w:fldCharType="end"/>
+      </w:r>
+      <w:r>
+        <w:rPr>
+          <w:lang w:val="ru-RU"/>
+        </w:rPr>
+        <w:t xml:space="preserve"> Реализация интерфейса </w:t>
+      </w:r>
+      <w:proofErr w:type="spellStart"/>
+      <w:r>
+        <w:rPr>
+          <w:lang w:val="en-US"/>
+        </w:rPr>
+        <w:t>PointsCounterMXBean</w:t>
+      </w:r>
+      <w:proofErr w:type="spellEnd"/>
+    </w:p>
+    <w:p>
+      <w:pPr>
+        <w:rPr>
+          <w:lang w:val="ru-RU"/>
+        </w:rPr>
+      </w:pPr>
+      <w:r>
+        <w:rPr>
+          <w:lang w:val="ru-RU"/>
+        </w:rPr>
+        <w:t xml:space="preserve">Второй </w:t>
+      </w:r>
+      <w:proofErr w:type="spellStart"/>
+      <w:r>
+        <w:rPr>
+          <w:lang w:val="en-US"/>
+        </w:rPr>
+        <w:t>MBean</w:t>
+      </w:r>
+      <w:proofErr w:type="spellEnd"/>
+      <w:r>
+        <w:rPr>
+          <w:lang w:val="ru-RU"/>
+        </w:rPr>
+        <w:t xml:space="preserve">, </w:t>
+      </w:r>
+      <w:r>
+        <w:rPr>
+          <w:lang w:val="ru-RU"/>
+        </w:rPr>
+        <w:t xml:space="preserve">определяющий соотношение промахов к общему числу кликов создан с помощью </w:t>
+      </w:r>
+      <w:proofErr w:type="spellStart"/>
+      <w:r>
+        <w:rPr>
+          <w:lang w:val="ru-RU"/>
+        </w:rPr>
+        <w:t>стандарного</w:t>
+      </w:r>
+      <w:proofErr w:type="spellEnd"/>
+      <w:r>
+        <w:rPr>
+          <w:lang w:val="ru-RU"/>
+        </w:rPr>
+        <w:t xml:space="preserve"> </w:t>
+      </w:r>
+      <w:proofErr w:type="spellStart"/>
+      <w:r>
+        <w:rPr>
+          <w:lang w:val="ru-RU"/>
+        </w:rPr>
+        <w:t>мехнизма</w:t>
+      </w:r>
+      <w:proofErr w:type="spellEnd"/>
+      <w:r>
+        <w:rPr>
+          <w:lang w:val="ru-RU"/>
+        </w:rPr>
+        <w:t xml:space="preserve"> </w:t>
+      </w:r>
+      <w:r>
+        <w:rPr>
+          <w:lang w:val="en-US"/>
+        </w:rPr>
+        <w:t>Spring</w:t>
+      </w:r>
+      <w:r>
+        <w:rPr>
+          <w:lang w:val="ru-RU"/>
+        </w:rPr>
+        <w:t xml:space="preserve"> </w:t>
+      </w:r>
+      <w:r>
+        <w:rPr>
+          <w:lang w:val="en-US"/>
+        </w:rPr>
+        <w:t>Boot</w:t>
+      </w:r>
+      <w:sdt>
+        <w:sdtPr>
+          <w:rPr>
+            <w:lang w:val="en-US"/>
+          </w:rPr>
+          <w:id w:val="513428340"/>
+          <w:citation/>
+        </w:sdtPr>
+        <w:sdtContent>
+          <w:r>
+            <w:rPr>
+              <w:lang w:val="en-US"/>
+            </w:rPr>
+            <w:fldChar w:fldCharType="begin"/>
+          </w:r>
+          <w:r>
+            <w:rPr>
+              <w:lang w:val="ru-RU"/>
+            </w:rPr>
+            <w:instrText xml:space="preserve"> </w:instrText>
+          </w:r>
+          <w:r>
+            <w:rPr>
+              <w:lang w:val="en-US"/>
+            </w:rPr>
+            <w:instrText>CITATION</w:instrText>
+          </w:r>
+          <w:r>
+            <w:rPr>
+              <w:lang w:val="ru-RU"/>
+            </w:rPr>
+            <w:instrText xml:space="preserve"> </w:instrText>
+          </w:r>
+          <w:r>
+            <w:rPr>
+              <w:lang w:val="en-US"/>
+            </w:rPr>
+            <w:instrText>Spr</w:instrText>
+          </w:r>
+          <w:r>
+            <w:rPr>
+              <w:lang w:val="ru-RU"/>
+            </w:rPr>
+            <w:instrText>1 \</w:instrText>
+          </w:r>
+          <w:r>
+            <w:rPr>
+              <w:lang w:val="en-US"/>
+            </w:rPr>
+            <w:instrText>l</w:instrText>
+          </w:r>
+          <w:r>
+            <w:rPr>
+              <w:lang w:val="ru-RU"/>
+            </w:rPr>
+            <w:instrText xml:space="preserve"> 1033 </w:instrText>
+          </w:r>
+          <w:r>
+            <w:rPr>
+              <w:lang w:val="en-US"/>
+            </w:rPr>
+            <w:fldChar w:fldCharType="separate"/>
+          </w:r>
+          <w:r>
+            <w:rPr>
+              <w:noProof/>
+              <w:lang w:val="ru-RU"/>
+            </w:rPr>
+            <w:t xml:space="preserve"> [5]</w:t>
+          </w:r>
+          <w:r>
+            <w:rPr>
+              <w:lang w:val="en-US"/>
+            </w:rPr>
+            <w:fldChar w:fldCharType="end"/>
+          </w:r>
+        </w:sdtContent>
+      </w:sdt>
+      <w:r>
+        <w:rPr>
+          <w:lang w:val="ru-RU"/>
+        </w:rPr>
+        <w:t xml:space="preserve"> </w:t>
+      </w:r>
+      <w:r>
+        <w:rPr>
+          <w:lang w:val="ru-RU"/>
+        </w:rPr>
+        <w:t xml:space="preserve">, такой бин становится </w:t>
+      </w:r>
+      <w:proofErr w:type="spellStart"/>
+      <w:r>
+        <w:rPr>
+          <w:lang w:val="en-US"/>
+        </w:rPr>
+        <w:t>ModelMBean</w:t>
+      </w:r>
+      <w:proofErr w:type="spellEnd"/>
+      <w:sdt>
+        <w:sdtPr>
+          <w:rPr>
+            <w:lang w:val="en-US"/>
+          </w:rPr>
+          <w:id w:val="1753625802"/>
+          <w:citation/>
+        </w:sdtPr>
+        <w:sdtContent>
+          <w:r>
+            <w:rPr>
+              <w:lang w:val="en-US"/>
+            </w:rPr>
+            <w:fldChar w:fldCharType="begin"/>
+          </w:r>
+          <w:r>
+            <w:rPr>
+              <w:lang w:val="ru-RU"/>
+            </w:rPr>
+            <w:instrText xml:space="preserve"> </w:instrText>
+          </w:r>
+          <w:r>
+            <w:rPr>
+              <w:lang w:val="en-US"/>
+            </w:rPr>
+            <w:instrText>CITATION</w:instrText>
+          </w:r>
+          <w:r>
+            <w:rPr>
+              <w:lang w:val="ru-RU"/>
+            </w:rPr>
+            <w:instrText xml:space="preserve"> </w:instrText>
+          </w:r>
+          <w:r>
+            <w:rPr>
+              <w:lang w:val="en-US"/>
+            </w:rPr>
+            <w:instrText>Spr</w:instrText>
+          </w:r>
+          <w:r>
+            <w:rPr>
+              <w:lang w:val="ru-RU"/>
+            </w:rPr>
+            <w:instrText xml:space="preserve"> \</w:instrText>
+          </w:r>
+          <w:r>
+            <w:rPr>
+              <w:lang w:val="en-US"/>
+            </w:rPr>
+            <w:instrText>l</w:instrText>
+          </w:r>
+          <w:r>
+            <w:rPr>
+              <w:lang w:val="ru-RU"/>
+            </w:rPr>
+            <w:instrText xml:space="preserve"> 1033 </w:instrText>
+          </w:r>
+          <w:r>
+            <w:rPr>
+              <w:lang w:val="en-US"/>
+            </w:rPr>
+            <w:fldChar w:fldCharType="separate"/>
+          </w:r>
+          <w:r>
+            <w:rPr>
+              <w:noProof/>
+              <w:lang w:val="ru-RU"/>
+            </w:rPr>
+            <w:t xml:space="preserve"> [5]</w:t>
+          </w:r>
+          <w:r>
+            <w:rPr>
+              <w:lang w:val="en-US"/>
+            </w:rPr>
+            <w:fldChar w:fldCharType="end"/>
+          </w:r>
+        </w:sdtContent>
+      </w:sdt>
+      <w:r>
+        <w:rPr>
+          <w:lang w:val="ru-RU"/>
+        </w:rPr>
+        <w:t xml:space="preserve">, этот класс наследуется от </w:t>
+      </w:r>
+      <w:proofErr w:type="spellStart"/>
+      <w:r>
+        <w:rPr>
+          <w:lang w:val="en-US"/>
+        </w:rPr>
+        <w:t>DynamicMBean</w:t>
+      </w:r>
+      <w:proofErr w:type="spellEnd"/>
+      <w:r>
+        <w:rPr>
+          <w:lang w:val="ru-RU"/>
+        </w:rPr>
+        <w:t>.</w:t>
+      </w:r>
+    </w:p>
     <w:p>
       <w:pPr>
         <w:ind w:firstLine="0"/>
         <w:jc w:val="left"/>
         <w:rPr>
+          <w:lang w:val="ru-RU"/>
+        </w:rPr>
+      </w:pPr>
+    </w:p>
+    <w:tbl>
+      <w:tblPr>
+        <w:tblStyle w:val="aa"/>
+        <w:tblW w:w="0" w:type="auto"/>
+        <w:tblLook w:val="04A0" w:firstRow="1" w:lastRow="0" w:firstColumn="1" w:lastColumn="0" w:noHBand="0" w:noVBand="1"/>
+      </w:tblPr>
+      <w:tblGrid>
+        <w:gridCol w:w="9350"/>
+      </w:tblGrid>
+      <w:tr>
+        <w:tc>
+          <w:tcPr>
+            <w:tcW w:w="9350" w:type="dxa"/>
+            <w:shd w:val="clear" w:color="auto" w:fill="D9D9D9" w:themeFill="background1" w:themeFillShade="D9"/>
+          </w:tcPr>
+          <w:p>
+            <w:pPr>
+              <w:ind w:firstLine="0"/>
+              <w:rPr>
+                <w:rFonts w:ascii="Consolas" w:hAnsi="Consolas"/>
+                <w:lang w:val="en-US"/>
+              </w:rPr>
+            </w:pPr>
+            <w:r>
+              <w:rPr>
+                <w:rFonts w:ascii="Consolas" w:hAnsi="Consolas"/>
+                <w:lang w:val="en-US"/>
+              </w:rPr>
+              <w:t>package ru.ifmo.se.s467549.jmx;</w:t>
+            </w:r>
+          </w:p>
+          <w:p>
+            <w:pPr>
+              <w:ind w:firstLine="0"/>
+              <w:rPr>
+                <w:rFonts w:ascii="Consolas" w:hAnsi="Consolas"/>
+                <w:lang w:val="en-US"/>
+              </w:rPr>
+            </w:pPr>
+          </w:p>
+          <w:p>
+            <w:pPr>
+              <w:ind w:firstLine="0"/>
+              <w:rPr>
+                <w:rFonts w:ascii="Consolas" w:hAnsi="Consolas"/>
+                <w:lang w:val="en-US"/>
+              </w:rPr>
+            </w:pPr>
+            <w:r>
+              <w:rPr>
+                <w:rFonts w:ascii="Consolas" w:hAnsi="Consolas"/>
+                <w:lang w:val="en-US"/>
+              </w:rPr>
+              <w:t xml:space="preserve">import </w:t>
+            </w:r>
+            <w:proofErr w:type="spellStart"/>
+            <w:proofErr w:type="gramStart"/>
+            <w:r>
+              <w:rPr>
+                <w:rFonts w:ascii="Consolas" w:hAnsi="Consolas"/>
+                <w:lang w:val="en-US"/>
+              </w:rPr>
+              <w:t>org.springframework.jmx.export</w:t>
+            </w:r>
+            <w:proofErr w:type="gramEnd"/>
+            <w:r>
+              <w:rPr>
+                <w:rFonts w:ascii="Consolas" w:hAnsi="Consolas"/>
+                <w:lang w:val="en-US"/>
+              </w:rPr>
+              <w:t>.</w:t>
+            </w:r>
+            <w:proofErr w:type="gramStart"/>
+            <w:r>
+              <w:rPr>
+                <w:rFonts w:ascii="Consolas" w:hAnsi="Consolas"/>
+                <w:lang w:val="en-US"/>
+              </w:rPr>
+              <w:t>annotation.ManagedAttribute</w:t>
+            </w:r>
+            <w:proofErr w:type="spellEnd"/>
+            <w:proofErr w:type="gramEnd"/>
+            <w:r>
+              <w:rPr>
+                <w:rFonts w:ascii="Consolas" w:hAnsi="Consolas"/>
+                <w:lang w:val="en-US"/>
+              </w:rPr>
+              <w:t>;</w:t>
+            </w:r>
+          </w:p>
+          <w:p>
+            <w:pPr>
+              <w:ind w:firstLine="0"/>
+              <w:rPr>
+                <w:rFonts w:ascii="Consolas" w:hAnsi="Consolas"/>
+                <w:lang w:val="en-US"/>
+              </w:rPr>
+            </w:pPr>
+            <w:r>
+              <w:rPr>
+                <w:rFonts w:ascii="Consolas" w:hAnsi="Consolas"/>
+                <w:lang w:val="en-US"/>
+              </w:rPr>
+              <w:t xml:space="preserve">import </w:t>
+            </w:r>
+            <w:proofErr w:type="spellStart"/>
+            <w:proofErr w:type="gramStart"/>
+            <w:r>
+              <w:rPr>
+                <w:rFonts w:ascii="Consolas" w:hAnsi="Consolas"/>
+                <w:lang w:val="en-US"/>
+              </w:rPr>
+              <w:t>org.springframework.jmx.export</w:t>
+            </w:r>
+            <w:proofErr w:type="gramEnd"/>
+            <w:r>
+              <w:rPr>
+                <w:rFonts w:ascii="Consolas" w:hAnsi="Consolas"/>
+                <w:lang w:val="en-US"/>
+              </w:rPr>
+              <w:t>.</w:t>
+            </w:r>
+            <w:proofErr w:type="gramStart"/>
+            <w:r>
+              <w:rPr>
+                <w:rFonts w:ascii="Consolas" w:hAnsi="Consolas"/>
+                <w:lang w:val="en-US"/>
+              </w:rPr>
+              <w:t>annotation.ManagedResource</w:t>
+            </w:r>
+            <w:proofErr w:type="spellEnd"/>
+            <w:proofErr w:type="gramEnd"/>
+            <w:r>
+              <w:rPr>
+                <w:rFonts w:ascii="Consolas" w:hAnsi="Consolas"/>
+                <w:lang w:val="en-US"/>
+              </w:rPr>
+              <w:t>;</w:t>
+            </w:r>
+          </w:p>
+          <w:p>
+            <w:pPr>
+              <w:ind w:firstLine="0"/>
+              <w:rPr>
+                <w:rFonts w:ascii="Consolas" w:hAnsi="Consolas"/>
+                <w:lang w:val="en-US"/>
+              </w:rPr>
+            </w:pPr>
+            <w:r>
+              <w:rPr>
+                <w:rFonts w:ascii="Consolas" w:hAnsi="Consolas"/>
+                <w:lang w:val="en-US"/>
+              </w:rPr>
+              <w:t xml:space="preserve">import </w:t>
+            </w:r>
+            <w:proofErr w:type="spellStart"/>
+            <w:proofErr w:type="gramStart"/>
+            <w:r>
+              <w:rPr>
+                <w:rFonts w:ascii="Consolas" w:hAnsi="Consolas"/>
+                <w:lang w:val="en-US"/>
+              </w:rPr>
+              <w:t>org.springframework</w:t>
+            </w:r>
+            <w:proofErr w:type="gramEnd"/>
+            <w:r>
+              <w:rPr>
+                <w:rFonts w:ascii="Consolas" w:hAnsi="Consolas"/>
+                <w:lang w:val="en-US"/>
+              </w:rPr>
+              <w:t>.</w:t>
+            </w:r>
+            <w:proofErr w:type="gramStart"/>
+            <w:r>
+              <w:rPr>
+                <w:rFonts w:ascii="Consolas" w:hAnsi="Consolas"/>
+                <w:lang w:val="en-US"/>
+              </w:rPr>
+              <w:t>stereotype.Component</w:t>
+            </w:r>
+            <w:proofErr w:type="spellEnd"/>
+            <w:proofErr w:type="gramEnd"/>
+            <w:r>
+              <w:rPr>
+                <w:rFonts w:ascii="Consolas" w:hAnsi="Consolas"/>
+                <w:lang w:val="en-US"/>
+              </w:rPr>
+              <w:t>;</w:t>
+            </w:r>
+          </w:p>
+          <w:p>
+            <w:pPr>
+              <w:ind w:firstLine="0"/>
+              <w:rPr>
+                <w:rFonts w:ascii="Consolas" w:hAnsi="Consolas"/>
+                <w:lang w:val="en-US"/>
+              </w:rPr>
+            </w:pPr>
+          </w:p>
+          <w:p>
+            <w:pPr>
+              <w:ind w:firstLine="0"/>
+              <w:rPr>
+                <w:rFonts w:ascii="Consolas" w:hAnsi="Consolas"/>
+                <w:lang w:val="en-US"/>
+              </w:rPr>
+            </w:pPr>
+            <w:r>
+              <w:rPr>
+                <w:rFonts w:ascii="Consolas" w:hAnsi="Consolas"/>
+                <w:lang w:val="en-US"/>
+              </w:rPr>
+              <w:t>@Component</w:t>
+            </w:r>
+          </w:p>
+          <w:p>
+            <w:pPr>
+              <w:ind w:firstLine="0"/>
+              <w:rPr>
+                <w:rFonts w:ascii="Consolas" w:hAnsi="Consolas"/>
+                <w:lang w:val="ru-RU"/>
+              </w:rPr>
+            </w:pPr>
+            <w:r>
+              <w:rPr>
+                <w:rFonts w:ascii="Consolas" w:hAnsi="Consolas"/>
+                <w:lang w:val="en-US"/>
+              </w:rPr>
+              <w:t>@ManagedResource</w:t>
+            </w:r>
+          </w:p>
+          <w:p>
+            <w:pPr>
+              <w:ind w:firstLine="0"/>
+              <w:rPr>
+                <w:rFonts w:ascii="Consolas" w:hAnsi="Consolas"/>
+                <w:lang w:val="en-US"/>
+              </w:rPr>
+            </w:pPr>
+            <w:proofErr w:type="gramStart"/>
+            <w:r>
+              <w:rPr>
+                <w:rFonts w:ascii="Consolas" w:hAnsi="Consolas"/>
+                <w:lang w:val="en-US"/>
+              </w:rPr>
+              <w:t>public</w:t>
+            </w:r>
+            <w:proofErr w:type="gramEnd"/>
+            <w:r>
+              <w:rPr>
+                <w:rFonts w:ascii="Consolas" w:hAnsi="Consolas"/>
+                <w:lang w:val="en-US"/>
+              </w:rPr>
+              <w:t xml:space="preserve"> class </w:t>
+            </w:r>
+            <w:proofErr w:type="spellStart"/>
+            <w:proofErr w:type="gramStart"/>
+            <w:r>
+              <w:rPr>
+                <w:rFonts w:ascii="Consolas" w:hAnsi="Consolas"/>
+                <w:lang w:val="en-US"/>
+              </w:rPr>
+              <w:t>MissPercentage</w:t>
+            </w:r>
+            <w:proofErr w:type="spellEnd"/>
+            <w:r>
+              <w:rPr>
+                <w:rFonts w:ascii="Consolas" w:hAnsi="Consolas"/>
+                <w:lang w:val="en-US"/>
+              </w:rPr>
+              <w:t>{</w:t>
+            </w:r>
+            <w:proofErr w:type="gramEnd"/>
+          </w:p>
+          <w:p>
+            <w:pPr>
+              <w:ind w:firstLine="0"/>
+              <w:rPr>
+                <w:rFonts w:ascii="Consolas" w:hAnsi="Consolas"/>
+                <w:lang w:val="en-US"/>
+              </w:rPr>
+            </w:pPr>
+            <w:r>
+              <w:rPr>
+                <w:rFonts w:ascii="Consolas" w:hAnsi="Consolas"/>
+                <w:lang w:val="en-US"/>
+              </w:rPr>
+              <w:t xml:space="preserve">    private double percentage = 0;</w:t>
+            </w:r>
+          </w:p>
+          <w:p>
+            <w:pPr>
+              <w:ind w:firstLine="0"/>
+              <w:rPr>
+                <w:rFonts w:ascii="Consolas" w:hAnsi="Consolas"/>
+                <w:lang w:val="en-US"/>
+              </w:rPr>
+            </w:pPr>
+            <w:r>
+              <w:rPr>
+                <w:rFonts w:ascii="Consolas" w:hAnsi="Consolas"/>
+                <w:lang w:val="en-US"/>
+              </w:rPr>
+              <w:t xml:space="preserve">    public void </w:t>
+            </w:r>
+            <w:proofErr w:type="spellStart"/>
+            <w:proofErr w:type="gramStart"/>
+            <w:r>
+              <w:rPr>
+                <w:rFonts w:ascii="Consolas" w:hAnsi="Consolas"/>
+                <w:lang w:val="en-US"/>
+              </w:rPr>
+              <w:t>setPercentage</w:t>
+            </w:r>
+            <w:proofErr w:type="spellEnd"/>
+            <w:r>
+              <w:rPr>
+                <w:rFonts w:ascii="Consolas" w:hAnsi="Consolas"/>
+                <w:lang w:val="en-US"/>
+              </w:rPr>
+              <w:t>(</w:t>
+            </w:r>
+            <w:proofErr w:type="gramEnd"/>
+            <w:r>
+              <w:rPr>
+                <w:rFonts w:ascii="Consolas" w:hAnsi="Consolas"/>
+                <w:lang w:val="en-US"/>
+              </w:rPr>
+              <w:t xml:space="preserve">int clicks, int </w:t>
+            </w:r>
+            <w:proofErr w:type="gramStart"/>
+            <w:r>
+              <w:rPr>
+                <w:rFonts w:ascii="Consolas" w:hAnsi="Consolas"/>
+                <w:lang w:val="en-US"/>
+              </w:rPr>
+              <w:t>misses){</w:t>
+            </w:r>
+            <w:proofErr w:type="gramEnd"/>
+          </w:p>
+          <w:p>
+            <w:pPr>
+              <w:ind w:firstLine="0"/>
+              <w:rPr>
+                <w:rFonts w:ascii="Consolas" w:hAnsi="Consolas"/>
+                <w:lang w:val="en-US"/>
+              </w:rPr>
+            </w:pPr>
+            <w:r>
+              <w:rPr>
+                <w:rFonts w:ascii="Consolas" w:hAnsi="Consolas"/>
+                <w:lang w:val="en-US"/>
+              </w:rPr>
+              <w:t xml:space="preserve">        if (clicks == </w:t>
+            </w:r>
+            <w:proofErr w:type="gramStart"/>
+            <w:r>
+              <w:rPr>
+                <w:rFonts w:ascii="Consolas" w:hAnsi="Consolas"/>
+                <w:lang w:val="en-US"/>
+              </w:rPr>
+              <w:t>0) {</w:t>
+            </w:r>
+            <w:proofErr w:type="gramEnd"/>
+          </w:p>
+          <w:p>
+            <w:pPr>
+              <w:ind w:firstLine="0"/>
+              <w:rPr>
+                <w:rFonts w:ascii="Consolas" w:hAnsi="Consolas"/>
+                <w:lang w:val="en-US"/>
+              </w:rPr>
+            </w:pPr>
+            <w:r>
+              <w:rPr>
+                <w:rFonts w:ascii="Consolas" w:hAnsi="Consolas"/>
+                <w:lang w:val="en-US"/>
+              </w:rPr>
+              <w:t xml:space="preserve">            // </w:t>
+            </w:r>
+            <w:proofErr w:type="spellStart"/>
+            <w:r>
+              <w:rPr>
+                <w:rFonts w:ascii="Consolas" w:hAnsi="Consolas"/>
+                <w:lang w:val="en-US"/>
+              </w:rPr>
+              <w:t>its</w:t>
+            </w:r>
+            <w:proofErr w:type="spellEnd"/>
+            <w:r>
+              <w:rPr>
+                <w:rFonts w:ascii="Consolas" w:hAnsi="Consolas"/>
+                <w:lang w:val="en-US"/>
+              </w:rPr>
+              <w:t xml:space="preserve"> impossible, but safe</w:t>
+            </w:r>
+          </w:p>
+          <w:p>
+            <w:pPr>
+              <w:ind w:firstLine="0"/>
+              <w:rPr>
+                <w:rFonts w:ascii="Consolas" w:hAnsi="Consolas"/>
+                <w:lang w:val="en-US"/>
+              </w:rPr>
+            </w:pPr>
+            <w:r>
+              <w:rPr>
+                <w:rFonts w:ascii="Consolas" w:hAnsi="Consolas"/>
+                <w:lang w:val="en-US"/>
+              </w:rPr>
+              <w:t xml:space="preserve">            </w:t>
+            </w:r>
+            <w:proofErr w:type="spellStart"/>
+            <w:proofErr w:type="gramStart"/>
+            <w:r>
+              <w:rPr>
+                <w:rFonts w:ascii="Consolas" w:hAnsi="Consolas"/>
+                <w:lang w:val="en-US"/>
+              </w:rPr>
+              <w:t>this.percentage</w:t>
+            </w:r>
+            <w:proofErr w:type="spellEnd"/>
+            <w:proofErr w:type="gramEnd"/>
+            <w:r>
+              <w:rPr>
+                <w:rFonts w:ascii="Consolas" w:hAnsi="Consolas"/>
+                <w:lang w:val="en-US"/>
+              </w:rPr>
+              <w:t xml:space="preserve"> = 0;</w:t>
+            </w:r>
+          </w:p>
+          <w:p>
+            <w:pPr>
+              <w:ind w:firstLine="0"/>
+              <w:rPr>
+                <w:rFonts w:ascii="Consolas" w:hAnsi="Consolas"/>
+                <w:lang w:val="en-US"/>
+              </w:rPr>
+            </w:pPr>
+            <w:r>
+              <w:rPr>
+                <w:rFonts w:ascii="Consolas" w:hAnsi="Consolas"/>
+                <w:lang w:val="en-US"/>
+              </w:rPr>
+              <w:t xml:space="preserve">        }</w:t>
+            </w:r>
+          </w:p>
+          <w:p>
+            <w:pPr>
+              <w:ind w:firstLine="0"/>
+              <w:rPr>
+                <w:rFonts w:ascii="Consolas" w:hAnsi="Consolas"/>
+                <w:lang w:val="en-US"/>
+              </w:rPr>
+            </w:pPr>
+            <w:r>
+              <w:rPr>
+                <w:rFonts w:ascii="Consolas" w:hAnsi="Consolas"/>
+                <w:lang w:val="en-US"/>
+              </w:rPr>
+              <w:t xml:space="preserve">        else {</w:t>
+            </w:r>
+          </w:p>
+          <w:p>
+            <w:pPr>
+              <w:ind w:firstLine="0"/>
+              <w:rPr>
+                <w:rFonts w:ascii="Consolas" w:hAnsi="Consolas"/>
+                <w:lang w:val="en-US"/>
+              </w:rPr>
+            </w:pPr>
+            <w:r>
+              <w:rPr>
+                <w:rFonts w:ascii="Consolas" w:hAnsi="Consolas"/>
+                <w:lang w:val="en-US"/>
+              </w:rPr>
+              <w:t xml:space="preserve">            </w:t>
+            </w:r>
+            <w:proofErr w:type="spellStart"/>
+            <w:proofErr w:type="gramStart"/>
+            <w:r>
+              <w:rPr>
+                <w:rFonts w:ascii="Consolas" w:hAnsi="Consolas"/>
+                <w:lang w:val="en-US"/>
+              </w:rPr>
+              <w:t>this.percentage</w:t>
+            </w:r>
+            <w:proofErr w:type="spellEnd"/>
+            <w:proofErr w:type="gramEnd"/>
+            <w:r>
+              <w:rPr>
+                <w:rFonts w:ascii="Consolas" w:hAnsi="Consolas"/>
+                <w:lang w:val="en-US"/>
+              </w:rPr>
+              <w:t xml:space="preserve"> = (double) 100 * misses / clicks;</w:t>
+            </w:r>
+          </w:p>
+          <w:p>
+            <w:pPr>
+              <w:ind w:firstLine="0"/>
+              <w:rPr>
+                <w:rFonts w:ascii="Consolas" w:hAnsi="Consolas"/>
+                <w:lang w:val="en-US"/>
+              </w:rPr>
+            </w:pPr>
+            <w:r>
+              <w:rPr>
+                <w:rFonts w:ascii="Consolas" w:hAnsi="Consolas"/>
+                <w:lang w:val="en-US"/>
+              </w:rPr>
+              <w:t xml:space="preserve">        }</w:t>
+            </w:r>
+          </w:p>
+          <w:p>
+            <w:pPr>
+              <w:ind w:firstLine="0"/>
+              <w:rPr>
+                <w:rFonts w:ascii="Consolas" w:hAnsi="Consolas"/>
+                <w:lang w:val="en-US"/>
+              </w:rPr>
+            </w:pPr>
+            <w:r>
+              <w:rPr>
+                <w:rFonts w:ascii="Consolas" w:hAnsi="Consolas"/>
+                <w:lang w:val="en-US"/>
+              </w:rPr>
+              <w:t xml:space="preserve">    }</w:t>
+            </w:r>
+          </w:p>
+          <w:p>
+            <w:pPr>
+              <w:ind w:firstLine="0"/>
+              <w:rPr>
+                <w:rFonts w:ascii="Consolas" w:hAnsi="Consolas"/>
+                <w:lang w:val="en-US"/>
+              </w:rPr>
+            </w:pPr>
+            <w:r>
+              <w:rPr>
+                <w:rFonts w:ascii="Consolas" w:hAnsi="Consolas"/>
+                <w:lang w:val="en-US"/>
+              </w:rPr>
+              <w:t xml:space="preserve">    @ManagedAttribute</w:t>
+            </w:r>
+          </w:p>
+          <w:p>
+            <w:pPr>
+              <w:ind w:firstLine="0"/>
+              <w:rPr>
+                <w:rFonts w:ascii="Consolas" w:hAnsi="Consolas"/>
+                <w:lang w:val="en-US"/>
+              </w:rPr>
+            </w:pPr>
+            <w:r>
+              <w:rPr>
+                <w:rFonts w:ascii="Consolas" w:hAnsi="Consolas"/>
+                <w:lang w:val="en-US"/>
+              </w:rPr>
+              <w:t xml:space="preserve">    public double </w:t>
+            </w:r>
+            <w:proofErr w:type="spellStart"/>
+            <w:proofErr w:type="gramStart"/>
+            <w:r>
+              <w:rPr>
+                <w:rFonts w:ascii="Consolas" w:hAnsi="Consolas"/>
+                <w:lang w:val="en-US"/>
+              </w:rPr>
+              <w:t>getPercentage</w:t>
+            </w:r>
+            <w:proofErr w:type="spellEnd"/>
+            <w:r>
+              <w:rPr>
+                <w:rFonts w:ascii="Consolas" w:hAnsi="Consolas"/>
+                <w:lang w:val="en-US"/>
+              </w:rPr>
+              <w:t>(</w:t>
+            </w:r>
+            <w:proofErr w:type="gramEnd"/>
+            <w:r>
+              <w:rPr>
+                <w:rFonts w:ascii="Consolas" w:hAnsi="Consolas"/>
+                <w:lang w:val="en-US"/>
+              </w:rPr>
+              <w:t>) {</w:t>
+            </w:r>
+          </w:p>
+          <w:p>
+            <w:pPr>
+              <w:ind w:firstLine="0"/>
+              <w:rPr>
+                <w:rFonts w:ascii="Consolas" w:hAnsi="Consolas"/>
+                <w:lang w:val="en-US"/>
+              </w:rPr>
+            </w:pPr>
+            <w:r>
+              <w:rPr>
+                <w:rFonts w:ascii="Consolas" w:hAnsi="Consolas"/>
+                <w:lang w:val="en-US"/>
+              </w:rPr>
+              <w:t xml:space="preserve">        return percentage;</w:t>
+            </w:r>
+          </w:p>
+          <w:p>
+            <w:pPr>
+              <w:ind w:firstLine="0"/>
+              <w:rPr>
+                <w:rFonts w:ascii="Consolas" w:hAnsi="Consolas"/>
+                <w:lang w:val="en-US"/>
+              </w:rPr>
+            </w:pPr>
+            <w:r>
+              <w:rPr>
+                <w:rFonts w:ascii="Consolas" w:hAnsi="Consolas"/>
+                <w:lang w:val="en-US"/>
+              </w:rPr>
+              <w:t xml:space="preserve">    }</w:t>
+            </w:r>
+          </w:p>
+          <w:p>
+            <w:pPr>
+              <w:keepNext/>
+              <w:ind w:firstLine="0"/>
+              <w:rPr>
+                <w:rFonts w:ascii="Consolas" w:hAnsi="Consolas"/>
+                <w:lang w:val="en-US"/>
+              </w:rPr>
+            </w:pPr>
+            <w:r>
+              <w:rPr>
+                <w:rFonts w:ascii="Consolas" w:hAnsi="Consolas"/>
+                <w:lang w:val="en-US"/>
+              </w:rPr>
+              <w:t>}</w:t>
+            </w:r>
+          </w:p>
+        </w:tc>
+      </w:tr>
+    </w:tbl>
+    <w:p>
+      <w:pPr>
+        <w:pStyle w:val="ab"/>
+      </w:pPr>
+      <w:r>
+        <w:fldChar w:fldCharType="begin"/>
+      </w:r>
+      <w:r>
+        <w:instrText xml:space="preserve"> SEQ Формула \* ARABIC </w:instrText>
+      </w:r>
+      <w:r>
+        <w:fldChar w:fldCharType="separate"/>
+      </w:r>
+      <w:r>
+        <w:rPr>
+          <w:noProof/>
+        </w:rPr>
+        <w:t>3</w:t>
+      </w:r>
+      <w:r>
+        <w:fldChar w:fldCharType="end"/>
+      </w:r>
+      <w:r>
+        <w:rPr>
+          <w:lang w:val="ru-RU"/>
+        </w:rPr>
+        <w:t xml:space="preserve"> </w:t>
+      </w:r>
+      <w:proofErr w:type="spellStart"/>
+      <w:r>
+        <w:rPr>
           <w:lang w:val="en-US"/>
         </w:rPr>
-      </w:pPr>
+        <w:t>ManagedResource</w:t>
+      </w:r>
+      <w:proofErr w:type="spellEnd"/>
+      <w:r>
+        <w:rPr>
+          <w:lang w:val="ru-RU"/>
+        </w:rPr>
+        <w:t xml:space="preserve"> </w:t>
+      </w:r>
+      <w:r>
+        <w:rPr>
+          <w:lang w:val="ru-RU"/>
+        </w:rPr>
+        <w:t xml:space="preserve">для </w:t>
+      </w:r>
+      <w:proofErr w:type="spellStart"/>
       <w:r>
         <w:rPr>
           <w:lang w:val="en-US"/>
         </w:rPr>
-        <w:br w:type="page"/>
+        <w:t>MBean</w:t>
+      </w:r>
+      <w:proofErr w:type="spellEnd"/>
+      <w:r>
+        <w:rPr>
+          <w:lang w:val="ru-RU"/>
+        </w:rPr>
+        <w:t>, отображающего соотношение промахов и кликов</w:t>
       </w:r>
     </w:p>
     <w:p>
@@ -2195,7 +5547,7 @@
           <w:lang w:val="ru-RU"/>
         </w:rPr>
       </w:pPr>
-      <w:bookmarkStart w:id="5" w:name="_Toc237688900"/>
+      <w:bookmarkStart w:id="5" w:name="_Toc237713315"/>
       <w:r>
         <w:rPr>
           <w:lang w:val="ru-RU"/>
@@ -2231,7 +5583,7 @@
           <w:lang w:val="ru-RU"/>
         </w:rPr>
       </w:pPr>
-      <w:bookmarkStart w:id="6" w:name="_Toc237688901"/>
+      <w:bookmarkStart w:id="6" w:name="_Toc237713316"/>
       <w:r>
         <w:rPr>
           <w:lang w:val="ru-RU"/>
@@ -2241,7 +5593,7 @@
       </w:r>
       <w:bookmarkEnd w:id="6"/>
     </w:p>
-    <w:bookmarkStart w:id="7" w:name="_Toc237688902" w:displacedByCustomXml="next"/>
+    <w:bookmarkStart w:id="7" w:name="_Toc237713317" w:displacedByCustomXml="next"/>
     <w:sdt>
       <w:sdtPr>
         <w:rPr>
@@ -2318,7 +5670,7 @@
               </w:tblGrid>
               <w:tr>
                 <w:trPr>
-                  <w:divId w:val="2076659614"/>
+                  <w:divId w:val="450172493"/>
                   <w:tblCellSpacing w:w="15" w:type="dxa"/>
                 </w:trPr>
                 <w:tc>
@@ -2393,7 +5745,7 @@
               </w:tr>
               <w:tr>
                 <w:trPr>
-                  <w:divId w:val="2076659614"/>
+                  <w:divId w:val="450172493"/>
                   <w:tblCellSpacing w:w="15" w:type="dxa"/>
                 </w:trPr>
                 <w:tc>
@@ -2413,6 +5765,85 @@
                         <w:noProof/>
                       </w:rPr>
                       <w:t xml:space="preserve">[2] </w:t>
+                    </w:r>
+                  </w:p>
+                </w:tc>
+                <w:tc>
+                  <w:tcPr>
+                    <w:tcW w:w="0" w:type="auto"/>
+                    <w:hideMark/>
+                  </w:tcPr>
+                  <w:p>
+                    <w:pPr>
+                      <w:pStyle w:val="a9"/>
+                      <w:rPr>
+                        <w:noProof/>
+                      </w:rPr>
+                    </w:pPr>
+                    <w:r>
+                      <w:rPr>
+                        <w:noProof/>
+                        <w:lang w:val="en-US"/>
+                      </w:rPr>
+                      <w:t>«Spring Framework JMX integration,» Spring, [</w:t>
+                    </w:r>
+                    <w:r>
+                      <w:rPr>
+                        <w:noProof/>
+                      </w:rPr>
+                      <w:t>В</w:t>
+                    </w:r>
+                    <w:r>
+                      <w:rPr>
+                        <w:noProof/>
+                        <w:lang w:val="en-US"/>
+                      </w:rPr>
+                      <w:t xml:space="preserve"> </w:t>
+                    </w:r>
+                    <w:r>
+                      <w:rPr>
+                        <w:noProof/>
+                      </w:rPr>
+                      <w:t>Интернете</w:t>
+                    </w:r>
+                    <w:r>
+                      <w:rPr>
+                        <w:noProof/>
+                        <w:lang w:val="en-US"/>
+                      </w:rPr>
+                      <w:t xml:space="preserve">]. </w:t>
+                    </w:r>
+                    <w:r>
+                      <w:rPr>
+                        <w:noProof/>
+                      </w:rPr>
+                      <w:t>Available: https://docs.spring.io/spring-framework/reference/integration/jmx.html. [Дата обращения: 14 08 2026].</w:t>
+                    </w:r>
+                  </w:p>
+                </w:tc>
+              </w:tr>
+              <w:tr>
+                <w:trPr>
+                  <w:divId w:val="450172493"/>
+                  <w:tblCellSpacing w:w="15" w:type="dxa"/>
+                </w:trPr>
+                <w:tc>
+                  <w:tcPr>
+                    <w:tcW w:w="50" w:type="pct"/>
+                    <w:hideMark/>
+                  </w:tcPr>
+                  <w:p>
+                    <w:pPr>
+                      <w:pStyle w:val="a9"/>
+                      <w:rPr>
+                        <w:noProof/>
+                      </w:rPr>
+                    </w:pPr>
+                    <w:r>
+                      <w:rPr>
+                        <w:noProof/>
+                      </w:rPr>
+                      <w:t xml:space="preserve">[3] </w:t>
                     </w:r>
                   </w:p>
                 </w:tc>
@@ -2470,13 +5901,241 @@
                   </w:p>
                 </w:tc>
               </w:tr>
+              <w:tr>
+                <w:trPr>
+                  <w:divId w:val="450172493"/>
+                  <w:tblCellSpacing w:w="15" w:type="dxa"/>
+                </w:trPr>
+                <w:tc>
+                  <w:tcPr>
+                    <w:tcW w:w="50" w:type="pct"/>
+                    <w:hideMark/>
+                  </w:tcPr>
+                  <w:p>
+                    <w:pPr>
+                      <w:pStyle w:val="a9"/>
+                      <w:rPr>
+                        <w:noProof/>
+                      </w:rPr>
+                    </w:pPr>
+                    <w:r>
+                      <w:rPr>
+                        <w:noProof/>
+                      </w:rPr>
+                      <w:t xml:space="preserve">[4] </w:t>
+                    </w:r>
+                  </w:p>
+                </w:tc>
+                <w:tc>
+                  <w:tcPr>
+                    <w:tcW w:w="0" w:type="auto"/>
+                    <w:hideMark/>
+                  </w:tcPr>
+                  <w:p>
+                    <w:pPr>
+                      <w:pStyle w:val="a9"/>
+                      <w:rPr>
+                        <w:noProof/>
+                      </w:rPr>
+                    </w:pPr>
+                    <w:r>
+                      <w:rPr>
+                        <w:noProof/>
+                        <w:lang w:val="en-US"/>
+                      </w:rPr>
+                      <w:t>Oracle, «Essentials of the JMX API,» Oracle, [</w:t>
+                    </w:r>
+                    <w:r>
+                      <w:rPr>
+                        <w:noProof/>
+                      </w:rPr>
+                      <w:t>В</w:t>
+                    </w:r>
+                    <w:r>
+                      <w:rPr>
+                        <w:noProof/>
+                        <w:lang w:val="en-US"/>
+                      </w:rPr>
+                      <w:t xml:space="preserve"> </w:t>
+                    </w:r>
+                    <w:r>
+                      <w:rPr>
+                        <w:noProof/>
+                      </w:rPr>
+                      <w:t>Интернете</w:t>
+                    </w:r>
+                    <w:r>
+                      <w:rPr>
+                        <w:noProof/>
+                        <w:lang w:val="en-US"/>
+                      </w:rPr>
+                      <w:t xml:space="preserve">]. Available: https://docs.oracle.com/en/java/javase/17/jmx/essentials-jmx-api.html#GUID-FA3724F5-9E67-4002-82BE-B05716E902C3. </w:t>
+                    </w:r>
+                    <w:r>
+                      <w:rPr>
+                        <w:noProof/>
+                      </w:rPr>
+                      <w:t>[Дата обращения: 14 08 2026].</w:t>
+                    </w:r>
+                  </w:p>
+                </w:tc>
+              </w:tr>
+              <w:tr>
+                <w:trPr>
+                  <w:divId w:val="450172493"/>
+                  <w:tblCellSpacing w:w="15" w:type="dxa"/>
+                </w:trPr>
+                <w:tc>
+                  <w:tcPr>
+                    <w:tcW w:w="50" w:type="pct"/>
+                    <w:hideMark/>
+                  </w:tcPr>
+                  <w:p>
+                    <w:pPr>
+                      <w:pStyle w:val="a9"/>
+                      <w:rPr>
+                        <w:noProof/>
+                      </w:rPr>
+                    </w:pPr>
+                    <w:r>
+                      <w:rPr>
+                        <w:noProof/>
+                      </w:rPr>
+                      <w:t xml:space="preserve">[5] </w:t>
+                    </w:r>
+                  </w:p>
+                </w:tc>
+                <w:tc>
+                  <w:tcPr>
+                    <w:tcW w:w="0" w:type="auto"/>
+                    <w:hideMark/>
+                  </w:tcPr>
+                  <w:p>
+                    <w:pPr>
+                      <w:pStyle w:val="a9"/>
+                      <w:rPr>
+                        <w:noProof/>
+                        <w:lang w:val="en-US"/>
+                      </w:rPr>
+                    </w:pPr>
+                    <w:r>
+                      <w:rPr>
+                        <w:noProof/>
+                        <w:lang w:val="en-US"/>
+                      </w:rPr>
+                      <w:t>Spring, «Monitoring and Management over JMX,» [</w:t>
+                    </w:r>
+                    <w:r>
+                      <w:rPr>
+                        <w:noProof/>
+                      </w:rPr>
+                      <w:t>В</w:t>
+                    </w:r>
+                    <w:r>
+                      <w:rPr>
+                        <w:noProof/>
+                        <w:lang w:val="en-US"/>
+                      </w:rPr>
+                      <w:t xml:space="preserve"> </w:t>
+                    </w:r>
+                    <w:r>
+                      <w:rPr>
+                        <w:noProof/>
+                      </w:rPr>
+                      <w:t>Интернете</w:t>
+                    </w:r>
+                    <w:r>
+                      <w:rPr>
+                        <w:noProof/>
+                        <w:lang w:val="en-US"/>
+                      </w:rPr>
+                      <w:t>]. Available: https://docs.spring.io/spring-boot/reference/actuator/jmx.html.</w:t>
+                    </w:r>
+                  </w:p>
+                </w:tc>
+              </w:tr>
+              <w:tr>
+                <w:trPr>
+                  <w:divId w:val="450172493"/>
+                  <w:tblCellSpacing w:w="15" w:type="dxa"/>
+                </w:trPr>
+                <w:tc>
+                  <w:tcPr>
+                    <w:tcW w:w="50" w:type="pct"/>
+                    <w:hideMark/>
+                  </w:tcPr>
+                  <w:p>
+                    <w:pPr>
+                      <w:pStyle w:val="a9"/>
+                      <w:rPr>
+                        <w:noProof/>
+                      </w:rPr>
+                    </w:pPr>
+                    <w:r>
+                      <w:rPr>
+                        <w:noProof/>
+                      </w:rPr>
+                      <w:t xml:space="preserve">[6] </w:t>
+                    </w:r>
+                  </w:p>
+                </w:tc>
+                <w:tc>
+                  <w:tcPr>
+                    <w:tcW w:w="0" w:type="auto"/>
+                    <w:hideMark/>
+                  </w:tcPr>
+                  <w:p>
+                    <w:pPr>
+                      <w:pStyle w:val="a9"/>
+                      <w:rPr>
+                        <w:noProof/>
+                        <w:lang w:val="en-US"/>
+                      </w:rPr>
+                    </w:pPr>
+                    <w:r>
+                      <w:rPr>
+                        <w:noProof/>
+                        <w:lang w:val="en-US"/>
+                      </w:rPr>
+                      <w:t>Spring, «AnnotationMBeanExporter,» [</w:t>
+                    </w:r>
+                    <w:r>
+                      <w:rPr>
+                        <w:noProof/>
+                      </w:rPr>
+                      <w:t>В</w:t>
+                    </w:r>
+                    <w:r>
+                      <w:rPr>
+                        <w:noProof/>
+                        <w:lang w:val="en-US"/>
+                      </w:rPr>
+                      <w:t xml:space="preserve"> </w:t>
+                    </w:r>
+                    <w:r>
+                      <w:rPr>
+                        <w:noProof/>
+                      </w:rPr>
+                      <w:t>Интернете</w:t>
+                    </w:r>
+                    <w:r>
+                      <w:rPr>
+                        <w:noProof/>
+                        <w:lang w:val="en-US"/>
+                      </w:rPr>
+                      <w:t>]. Available: https://docs.spring.io/spring-framework/docs/current/javadoc-api/org/springframework/jmx/export/annotation/AnnotationMBeanExporter.html.</w:t>
+                    </w:r>
+                  </w:p>
+                </w:tc>
+              </w:tr>
             </w:tbl>
             <w:p>
               <w:pPr>
-                <w:divId w:val="2076659614"/>
+                <w:divId w:val="450172493"/>
                 <w:rPr>
                   <w:rFonts w:eastAsia="Times New Roman"/>
                   <w:noProof/>
+                  <w:lang w:val="en-US"/>
                 </w:rPr>
               </w:pPr>
             </w:p>
@@ -6083,7 +9742,7 @@
   <w:style w:type="paragraph" w:default="1" w:styleId="a">
     <w:name w:val="Normal"/>
     <w:qFormat/>
-    <w:rsid w:val="00604964"/>
+    <w:rsid w:val="00044C29"/>
     <w:pPr>
       <w:ind w:firstLine="567"/>
       <w:jc w:val="both"/>
@@ -6398,6 +10057,41 @@
     <w:uiPriority w:val="37"/>
     <w:unhideWhenUsed/>
     <w:rsid w:val="009A6A0C"/>
+  </w:style>
+  <w:style w:type="table" w:styleId="aa">
+    <w:name w:val="Table Grid"/>
+    <w:basedOn w:val="a1"/>
+    <w:uiPriority w:val="39"/>
+    <w:rsid w:val="00044C29"/>
+    <w:tblPr>
+      <w:tblBorders>
+        <w:top w:val="single" w:sz="4" w:space="0" w:color="auto"/>
+        <w:left w:val="single" w:sz="4" w:space="0" w:color="auto"/>
+        <w:bottom w:val="single" w:sz="4" w:space="0" w:color="auto"/>
+        <w:right w:val="single" w:sz="4" w:space="0" w:color="auto"/>
+        <w:insideH w:val="single" w:sz="4" w:space="0" w:color="auto"/>
+        <w:insideV w:val="single" w:sz="4" w:space="0" w:color="auto"/>
+      </w:tblBorders>
+    </w:tblPr>
+  </w:style>
+  <w:style w:type="paragraph" w:styleId="ab">
+    <w:name w:val="caption"/>
+    <w:basedOn w:val="a"/>
+    <w:next w:val="a"/>
+    <w:uiPriority w:val="35"/>
+    <w:unhideWhenUsed/>
+    <w:qFormat/>
+    <w:rsid w:val="00044C29"/>
+    <w:pPr>
+      <w:spacing w:after="200"/>
+    </w:pPr>
+    <w:rPr>
+      <w:i/>
+      <w:iCs/>
+      <w:color w:val="1F497D" w:themeColor="text2"/>
+      <w:sz w:val="18"/>
+      <w:szCs w:val="18"/>
+    </w:rPr>
   </w:style>
 </w:styles>
 </file>
@@ -6783,6 +10477,36 @@
     <b:URL>https://docs.spring.io/spring-framework/reference/integration/jmx.html</b:URL>
     <b:RefOrder>2</b:RefOrder>
   </b:Source>
+  <b:Source>
+    <b:Tag>Spr</b:Tag>
+    <b:SourceType>InternetSite</b:SourceType>
+    <b:Guid>{B4297086-8865-4EE4-AC7A-61C44A6E4A1F}</b:Guid>
+    <b:Author>
+      <b:Author>
+        <b:Corporate>Spring</b:Corporate>
+      </b:Author>
+    </b:Author>
+    <b:Title>AnnotationMBeanExporter</b:Title>
+    <b:MonthAccessed>08</b:MonthAccessed>
+    <b:DayAccessed>15</b:DayAccessed>
+    <b:URL>https://docs.spring.io/spring-framework/docs/current/javadoc-api/org/springframework/jmx/export/annotation/AnnotationMBeanExporter.html</b:URL>
+    <b:RefOrder>6</b:RefOrder>
+  </b:Source>
+  <b:Source>
+    <b:Tag>Spr1</b:Tag>
+    <b:SourceType>InternetSite</b:SourceType>
+    <b:Guid>{B9A0ED4B-56E0-4246-9676-52598FAC50B5}</b:Guid>
+    <b:Author>
+      <b:Author>
+        <b:Corporate>Spring</b:Corporate>
+      </b:Author>
+    </b:Author>
+    <b:Title>Monitoring and Management over JMX</b:Title>
+    <b:MonthAccessed>08</b:MonthAccessed>
+    <b:DayAccessed>15</b:DayAccessed>
+    <b:URL>https://docs.spring.io/spring-boot/reference/actuator/jmx.html</b:URL>
+    <b:RefOrder>5</b:RefOrder>
+  </b:Source>
 </b:Sources>
 </file>
 
@@ -6796,7 +10520,7 @@
 </file>
 
 <file path=customXml/itemProps2.xml><?xml version="1.0" encoding="utf-8"?>
-<ds:datastoreItem xmlns:ds="http://schemas.openxmlformats.org/officeDocument/2006/customXml" ds:itemID="{A439D359-44AA-44E2-B570-F1F1D90AF7FA}">
+<ds:datastoreItem xmlns:ds="http://schemas.openxmlformats.org/officeDocument/2006/customXml" ds:itemID="{604B239D-ABBC-4787-9D78-DD0EC5AEFBC3}">
   <ds:schemaRefs>
     <ds:schemaRef ds:uri="http://schemas.openxmlformats.org/officeDocument/2006/bibliography"/>
   </ds:schemaRefs>

</xml_diff>

<commit_message>
jdk jfr events described and checked in jms
</commit_message>
<xml_diff>
--- a/LAB_4_Соловьёв_P3230.docx
+++ b/LAB_4_Соловьёв_P3230.docx
@@ -1900,7 +1900,7 @@
     <w:p>
       <w:pPr>
         <w:rPr>
-          <w:lang w:val="en-US"/>
+          <w:lang w:val="ru-RU"/>
         </w:rPr>
       </w:pPr>
       <w:r>
@@ -2169,7 +2169,7 @@
     <w:p>
       <w:pPr>
         <w:rPr>
-          <w:lang w:val="en-US"/>
+          <w:lang w:val="ru-RU"/>
         </w:rPr>
       </w:pPr>
     </w:p>
@@ -5590,7 +5590,7 @@
         <w:ind w:firstLine="0"/>
         <w:jc w:val="left"/>
         <w:rPr>
-          <w:lang w:val="en-US"/>
+          <w:lang w:val="ru-RU"/>
         </w:rPr>
       </w:pPr>
       <w:bookmarkStart w:id="5" w:name="_Toc237713315"/>
@@ -5600,7 +5600,7 @@
         <w:ind w:firstLine="0"/>
         <w:jc w:val="left"/>
         <w:rPr>
-          <w:lang w:val="en-US"/>
+          <w:lang w:val="ru-RU"/>
         </w:rPr>
       </w:pPr>
       <w:r>
@@ -6374,6 +6374,894 @@
         </w:tc>
       </w:tr>
     </w:tbl>
+    <w:p>
+      <w:pPr>
+        <w:ind w:firstLine="0"/>
+        <w:jc w:val="left"/>
+        <w:rPr>
+          <w:lang w:val="ru-RU"/>
+        </w:rPr>
+      </w:pPr>
+    </w:p>
+    <w:p>
+      <w:pPr>
+        <w:ind w:firstLine="0"/>
+        <w:jc w:val="left"/>
+        <w:rPr>
+          <w:lang w:val="en-US"/>
+        </w:rPr>
+      </w:pPr>
+      <w:r>
+        <w:rPr>
+          <w:lang w:val="ru-RU"/>
+        </w:rPr>
+        <w:t>События</w:t>
+      </w:r>
+      <w:r>
+        <w:rPr>
+          <w:lang w:val="ru-RU"/>
+        </w:rPr>
+        <w:t xml:space="preserve"> </w:t>
+      </w:r>
+      <w:r>
+        <w:rPr>
+          <w:lang w:val="en-US"/>
+        </w:rPr>
+        <w:t>JDK</w:t>
+      </w:r>
+      <w:r>
+        <w:rPr>
+          <w:lang w:val="ru-RU"/>
+        </w:rPr>
+        <w:t xml:space="preserve"> </w:t>
+      </w:r>
+      <w:r>
+        <w:rPr>
+          <w:lang w:val="en-US"/>
+        </w:rPr>
+        <w:t>Flight</w:t>
+      </w:r>
+      <w:r>
+        <w:rPr>
+          <w:lang w:val="ru-RU"/>
+        </w:rPr>
+        <w:t xml:space="preserve"> </w:t>
+      </w:r>
+      <w:r>
+        <w:rPr>
+          <w:lang w:val="en-US"/>
+        </w:rPr>
+        <w:t>Recorder</w:t>
+      </w:r>
+      <w:r>
+        <w:rPr>
+          <w:lang w:val="ru-RU"/>
+        </w:rPr>
+        <w:t xml:space="preserve">: </w:t>
+      </w:r>
+      <w:r>
+        <w:rPr>
+          <w:lang w:val="ru-RU"/>
+        </w:rPr>
+        <w:t xml:space="preserve">измерение события «точка установлена» проводится от начала обработки запроса в </w:t>
+      </w:r>
+      <w:proofErr w:type="spellStart"/>
+      <w:r>
+        <w:rPr>
+          <w:lang w:val="en-US"/>
+        </w:rPr>
+        <w:t>ResultController</w:t>
+      </w:r>
+      <w:proofErr w:type="spellEnd"/>
+      <w:r>
+        <w:rPr>
+          <w:lang w:val="ru-RU"/>
+        </w:rPr>
+        <w:t xml:space="preserve"> </w:t>
+      </w:r>
+      <w:r>
+        <w:rPr>
+          <w:lang w:val="ru-RU"/>
+        </w:rPr>
+        <w:t xml:space="preserve">до завершения записи в БД, событие «промах» считается мгновенным и </w:t>
+      </w:r>
+      <w:r>
+        <w:rPr>
+          <w:lang w:val="ru-RU"/>
+        </w:rPr>
+        <w:t xml:space="preserve">происходит уже после проверки промаха в методе </w:t>
+      </w:r>
+      <w:proofErr w:type="spellStart"/>
+      <w:r>
+        <w:rPr>
+          <w:lang w:val="en-US"/>
+        </w:rPr>
+        <w:t>PointCounter</w:t>
+      </w:r>
+      <w:proofErr w:type="spellEnd"/>
+      <w:r>
+        <w:rPr>
+          <w:lang w:val="ru-RU"/>
+        </w:rPr>
+        <w:t>.</w:t>
+      </w:r>
+      <w:proofErr w:type="spellStart"/>
+      <w:r>
+        <w:rPr>
+          <w:lang w:val="en-US"/>
+        </w:rPr>
+        <w:t>clickMade</w:t>
+      </w:r>
+      <w:proofErr w:type="spellEnd"/>
+      <w:r>
+        <w:rPr>
+          <w:lang w:val="ru-RU"/>
+        </w:rPr>
+        <w:t>()</w:t>
+      </w:r>
+    </w:p>
+    <w:p>
+      <w:pPr>
+        <w:ind w:firstLine="0"/>
+        <w:jc w:val="left"/>
+        <w:rPr>
+          <w:lang w:val="en-US"/>
+        </w:rPr>
+      </w:pPr>
+    </w:p>
+    <w:tbl>
+      <w:tblPr>
+        <w:tblStyle w:val="aa"/>
+        <w:tblW w:w="0" w:type="auto"/>
+        <w:tblLook w:val="04A0" w:firstRow="1" w:lastRow="0" w:firstColumn="1" w:lastColumn="0" w:noHBand="0" w:noVBand="1"/>
+      </w:tblPr>
+      <w:tblGrid>
+        <w:gridCol w:w="9350"/>
+      </w:tblGrid>
+      <w:tr>
+        <w:tc>
+          <w:tcPr>
+            <w:tcW w:w="9350" w:type="dxa"/>
+            <w:shd w:val="clear" w:color="auto" w:fill="D9D9D9" w:themeFill="background1" w:themeFillShade="D9"/>
+          </w:tcPr>
+          <w:p>
+            <w:pPr>
+              <w:keepNext/>
+              <w:ind w:firstLine="0"/>
+              <w:jc w:val="left"/>
+              <w:rPr>
+                <w:rFonts w:ascii="Consolas" w:hAnsi="Consolas"/>
+                <w:lang w:val="en-US"/>
+              </w:rPr>
+            </w:pPr>
+            <w:r>
+              <w:rPr>
+                <w:rFonts w:ascii="Consolas" w:hAnsi="Consolas"/>
+                <w:lang w:val="en-US"/>
+              </w:rPr>
+              <w:t>package ru.ifmo.se.s467549.jmx;</w:t>
+            </w:r>
+          </w:p>
+          <w:p>
+            <w:pPr>
+              <w:keepNext/>
+              <w:ind w:firstLine="0"/>
+              <w:jc w:val="left"/>
+              <w:rPr>
+                <w:rFonts w:ascii="Consolas" w:hAnsi="Consolas"/>
+                <w:lang w:val="en-US"/>
+              </w:rPr>
+            </w:pPr>
+          </w:p>
+          <w:p>
+            <w:pPr>
+              <w:keepNext/>
+              <w:ind w:firstLine="0"/>
+              <w:jc w:val="left"/>
+              <w:rPr>
+                <w:rFonts w:ascii="Consolas" w:hAnsi="Consolas"/>
+                <w:lang w:val="en-US"/>
+              </w:rPr>
+            </w:pPr>
+            <w:r>
+              <w:rPr>
+                <w:rFonts w:ascii="Consolas" w:hAnsi="Consolas"/>
+                <w:lang w:val="en-US"/>
+              </w:rPr>
+              <w:t xml:space="preserve">import </w:t>
+            </w:r>
+            <w:proofErr w:type="spellStart"/>
+            <w:proofErr w:type="gramStart"/>
+            <w:r>
+              <w:rPr>
+                <w:rFonts w:ascii="Consolas" w:hAnsi="Consolas"/>
+                <w:lang w:val="en-US"/>
+              </w:rPr>
+              <w:t>jdk.jfr.Category</w:t>
+            </w:r>
+            <w:proofErr w:type="spellEnd"/>
+            <w:proofErr w:type="gramEnd"/>
+            <w:r>
+              <w:rPr>
+                <w:rFonts w:ascii="Consolas" w:hAnsi="Consolas"/>
+                <w:lang w:val="en-US"/>
+              </w:rPr>
+              <w:t>;</w:t>
+            </w:r>
+          </w:p>
+          <w:p>
+            <w:pPr>
+              <w:keepNext/>
+              <w:ind w:firstLine="0"/>
+              <w:jc w:val="left"/>
+              <w:rPr>
+                <w:rFonts w:ascii="Consolas" w:hAnsi="Consolas"/>
+                <w:lang w:val="en-US"/>
+              </w:rPr>
+            </w:pPr>
+            <w:r>
+              <w:rPr>
+                <w:rFonts w:ascii="Consolas" w:hAnsi="Consolas"/>
+                <w:lang w:val="en-US"/>
+              </w:rPr>
+              <w:t xml:space="preserve">import </w:t>
+            </w:r>
+            <w:proofErr w:type="spellStart"/>
+            <w:proofErr w:type="gramStart"/>
+            <w:r>
+              <w:rPr>
+                <w:rFonts w:ascii="Consolas" w:hAnsi="Consolas"/>
+                <w:lang w:val="en-US"/>
+              </w:rPr>
+              <w:t>jdk.jfr.Event</w:t>
+            </w:r>
+            <w:proofErr w:type="spellEnd"/>
+            <w:proofErr w:type="gramEnd"/>
+            <w:r>
+              <w:rPr>
+                <w:rFonts w:ascii="Consolas" w:hAnsi="Consolas"/>
+                <w:lang w:val="en-US"/>
+              </w:rPr>
+              <w:t>;</w:t>
+            </w:r>
+          </w:p>
+          <w:p>
+            <w:pPr>
+              <w:keepNext/>
+              <w:ind w:firstLine="0"/>
+              <w:jc w:val="left"/>
+              <w:rPr>
+                <w:rFonts w:ascii="Consolas" w:hAnsi="Consolas"/>
+                <w:lang w:val="en-US"/>
+              </w:rPr>
+            </w:pPr>
+            <w:r>
+              <w:rPr>
+                <w:rFonts w:ascii="Consolas" w:hAnsi="Consolas"/>
+                <w:lang w:val="en-US"/>
+              </w:rPr>
+              <w:t xml:space="preserve">import </w:t>
+            </w:r>
+            <w:proofErr w:type="spellStart"/>
+            <w:proofErr w:type="gramStart"/>
+            <w:r>
+              <w:rPr>
+                <w:rFonts w:ascii="Consolas" w:hAnsi="Consolas"/>
+                <w:lang w:val="en-US"/>
+              </w:rPr>
+              <w:t>jdk.jfr.Label</w:t>
+            </w:r>
+            <w:proofErr w:type="spellEnd"/>
+            <w:proofErr w:type="gramEnd"/>
+            <w:r>
+              <w:rPr>
+                <w:rFonts w:ascii="Consolas" w:hAnsi="Consolas"/>
+                <w:lang w:val="en-US"/>
+              </w:rPr>
+              <w:t>;</w:t>
+            </w:r>
+          </w:p>
+          <w:p>
+            <w:pPr>
+              <w:keepNext/>
+              <w:ind w:firstLine="0"/>
+              <w:jc w:val="left"/>
+              <w:rPr>
+                <w:rFonts w:ascii="Consolas" w:hAnsi="Consolas"/>
+                <w:lang w:val="en-US"/>
+              </w:rPr>
+            </w:pPr>
+            <w:r>
+              <w:rPr>
+                <w:rFonts w:ascii="Consolas" w:hAnsi="Consolas"/>
+                <w:lang w:val="en-US"/>
+              </w:rPr>
+              <w:t xml:space="preserve">import </w:t>
+            </w:r>
+            <w:proofErr w:type="spellStart"/>
+            <w:proofErr w:type="gramStart"/>
+            <w:r>
+              <w:rPr>
+                <w:rFonts w:ascii="Consolas" w:hAnsi="Consolas"/>
+                <w:lang w:val="en-US"/>
+              </w:rPr>
+              <w:t>jdk.jfr.Threshold</w:t>
+            </w:r>
+            <w:proofErr w:type="spellEnd"/>
+            <w:proofErr w:type="gramEnd"/>
+            <w:r>
+              <w:rPr>
+                <w:rFonts w:ascii="Consolas" w:hAnsi="Consolas"/>
+                <w:lang w:val="en-US"/>
+              </w:rPr>
+              <w:t>;</w:t>
+            </w:r>
+          </w:p>
+          <w:p>
+            <w:pPr>
+              <w:keepNext/>
+              <w:ind w:firstLine="0"/>
+              <w:jc w:val="left"/>
+              <w:rPr>
+                <w:rFonts w:ascii="Consolas" w:hAnsi="Consolas"/>
+                <w:lang w:val="en-US"/>
+              </w:rPr>
+            </w:pPr>
+          </w:p>
+          <w:p>
+            <w:pPr>
+              <w:keepNext/>
+              <w:ind w:firstLine="0"/>
+              <w:jc w:val="left"/>
+              <w:rPr>
+                <w:rFonts w:ascii="Consolas" w:hAnsi="Consolas"/>
+                <w:lang w:val="en-US"/>
+              </w:rPr>
+            </w:pPr>
+            <w:r>
+              <w:rPr>
+                <w:rFonts w:ascii="Consolas" w:hAnsi="Consolas"/>
+                <w:lang w:val="en-US"/>
+              </w:rPr>
+              <w:t>@</w:t>
+            </w:r>
+            <w:proofErr w:type="gramStart"/>
+            <w:r>
+              <w:rPr>
+                <w:rFonts w:ascii="Consolas" w:hAnsi="Consolas"/>
+                <w:lang w:val="en-US"/>
+              </w:rPr>
+              <w:t>Category(</w:t>
+            </w:r>
+            <w:proofErr w:type="gramEnd"/>
+            <w:r>
+              <w:rPr>
+                <w:rFonts w:ascii="Consolas" w:hAnsi="Consolas"/>
+                <w:lang w:val="en-US"/>
+              </w:rPr>
+              <w:t>{"Lab event", "</w:t>
+            </w:r>
+            <w:proofErr w:type="spellStart"/>
+            <w:r>
+              <w:rPr>
+                <w:rFonts w:ascii="Consolas" w:hAnsi="Consolas"/>
+                <w:lang w:val="en-US"/>
+              </w:rPr>
+              <w:t>PointMiss</w:t>
+            </w:r>
+            <w:proofErr w:type="spellEnd"/>
+            <w:r>
+              <w:rPr>
+                <w:rFonts w:ascii="Consolas" w:hAnsi="Consolas"/>
+                <w:lang w:val="en-US"/>
+              </w:rPr>
+              <w:t>"})</w:t>
+            </w:r>
+          </w:p>
+          <w:p>
+            <w:pPr>
+              <w:keepNext/>
+              <w:ind w:firstLine="0"/>
+              <w:jc w:val="left"/>
+              <w:rPr>
+                <w:rFonts w:ascii="Consolas" w:hAnsi="Consolas"/>
+                <w:lang w:val="en-US"/>
+              </w:rPr>
+            </w:pPr>
+            <w:proofErr w:type="gramStart"/>
+            <w:r>
+              <w:rPr>
+                <w:rFonts w:ascii="Consolas" w:hAnsi="Consolas"/>
+                <w:lang w:val="en-US"/>
+              </w:rPr>
+              <w:t>@Label</w:t>
+            </w:r>
+            <w:proofErr w:type="gramEnd"/>
+            <w:r>
+              <w:rPr>
+                <w:rFonts w:ascii="Consolas" w:hAnsi="Consolas"/>
+                <w:lang w:val="en-US"/>
+              </w:rPr>
+              <w:t>("PointMiss")</w:t>
+            </w:r>
+          </w:p>
+          <w:p>
+            <w:pPr>
+              <w:keepNext/>
+              <w:ind w:firstLine="0"/>
+              <w:jc w:val="left"/>
+              <w:rPr>
+                <w:rFonts w:ascii="Consolas" w:hAnsi="Consolas"/>
+                <w:lang w:val="en-US"/>
+              </w:rPr>
+            </w:pPr>
+            <w:r>
+              <w:rPr>
+                <w:rFonts w:ascii="Consolas" w:hAnsi="Consolas"/>
+                <w:lang w:val="en-US"/>
+              </w:rPr>
+              <w:t>@</w:t>
+            </w:r>
+            <w:proofErr w:type="gramStart"/>
+            <w:r>
+              <w:rPr>
+                <w:rFonts w:ascii="Consolas" w:hAnsi="Consolas"/>
+                <w:lang w:val="en-US"/>
+              </w:rPr>
+              <w:t>Threshold(</w:t>
+            </w:r>
+            <w:proofErr w:type="gramEnd"/>
+            <w:r>
+              <w:rPr>
+                <w:rFonts w:ascii="Consolas" w:hAnsi="Consolas"/>
+                <w:lang w:val="en-US"/>
+              </w:rPr>
+              <w:t xml:space="preserve">"0 </w:t>
+            </w:r>
+            <w:proofErr w:type="spellStart"/>
+            <w:r>
+              <w:rPr>
+                <w:rFonts w:ascii="Consolas" w:hAnsi="Consolas"/>
+                <w:lang w:val="en-US"/>
+              </w:rPr>
+              <w:t>ms</w:t>
+            </w:r>
+            <w:proofErr w:type="spellEnd"/>
+            <w:r>
+              <w:rPr>
+                <w:rFonts w:ascii="Consolas" w:hAnsi="Consolas"/>
+                <w:lang w:val="en-US"/>
+              </w:rPr>
+              <w:t>")</w:t>
+            </w:r>
+          </w:p>
+          <w:p>
+            <w:pPr>
+              <w:keepNext/>
+              <w:ind w:firstLine="0"/>
+              <w:jc w:val="left"/>
+              <w:rPr>
+                <w:rFonts w:ascii="Consolas" w:hAnsi="Consolas"/>
+                <w:lang w:val="en-US"/>
+              </w:rPr>
+            </w:pPr>
+            <w:r>
+              <w:rPr>
+                <w:rFonts w:ascii="Consolas" w:hAnsi="Consolas"/>
+                <w:lang w:val="en-US"/>
+              </w:rPr>
+              <w:t xml:space="preserve">public class </w:t>
+            </w:r>
+            <w:proofErr w:type="spellStart"/>
+            <w:r>
+              <w:rPr>
+                <w:rFonts w:ascii="Consolas" w:hAnsi="Consolas"/>
+                <w:lang w:val="en-US"/>
+              </w:rPr>
+              <w:t>PointMissEvent</w:t>
+            </w:r>
+            <w:proofErr w:type="spellEnd"/>
+            <w:r>
+              <w:rPr>
+                <w:rFonts w:ascii="Consolas" w:hAnsi="Consolas"/>
+                <w:lang w:val="en-US"/>
+              </w:rPr>
+              <w:t xml:space="preserve"> extends Event {}</w:t>
+            </w:r>
+          </w:p>
+        </w:tc>
+      </w:tr>
+    </w:tbl>
+    <w:p>
+      <w:pPr>
+        <w:ind w:firstLine="0"/>
+        <w:jc w:val="left"/>
+        <w:rPr>
+          <w:lang w:val="en-US"/>
+        </w:rPr>
+      </w:pPr>
+    </w:p>
+    <w:tbl>
+      <w:tblPr>
+        <w:tblStyle w:val="aa"/>
+        <w:tblW w:w="0" w:type="auto"/>
+        <w:tblLook w:val="04A0" w:firstRow="1" w:lastRow="0" w:firstColumn="1" w:lastColumn="0" w:noHBand="0" w:noVBand="1"/>
+      </w:tblPr>
+      <w:tblGrid>
+        <w:gridCol w:w="9350"/>
+      </w:tblGrid>
+      <w:tr>
+        <w:tc>
+          <w:tcPr>
+            <w:tcW w:w="9350" w:type="dxa"/>
+            <w:shd w:val="clear" w:color="auto" w:fill="D9D9D9" w:themeFill="background1" w:themeFillShade="D9"/>
+          </w:tcPr>
+          <w:p>
+            <w:pPr>
+              <w:keepNext/>
+              <w:ind w:firstLine="0"/>
+              <w:jc w:val="left"/>
+              <w:rPr>
+                <w:rFonts w:ascii="Consolas" w:hAnsi="Consolas"/>
+                <w:lang w:val="en-US"/>
+              </w:rPr>
+            </w:pPr>
+            <w:r>
+              <w:rPr>
+                <w:rFonts w:ascii="Consolas" w:hAnsi="Consolas"/>
+                <w:lang w:val="en-US"/>
+              </w:rPr>
+              <w:t>package ru.ifmo.se.s467549.jmx;</w:t>
+            </w:r>
+          </w:p>
+          <w:p>
+            <w:pPr>
+              <w:keepNext/>
+              <w:ind w:firstLine="0"/>
+              <w:jc w:val="left"/>
+              <w:rPr>
+                <w:rFonts w:ascii="Consolas" w:hAnsi="Consolas"/>
+                <w:lang w:val="en-US"/>
+              </w:rPr>
+            </w:pPr>
+          </w:p>
+          <w:p>
+            <w:pPr>
+              <w:keepNext/>
+              <w:ind w:firstLine="0"/>
+              <w:jc w:val="left"/>
+              <w:rPr>
+                <w:rFonts w:ascii="Consolas" w:hAnsi="Consolas"/>
+                <w:lang w:val="en-US"/>
+              </w:rPr>
+            </w:pPr>
+            <w:r>
+              <w:rPr>
+                <w:rFonts w:ascii="Consolas" w:hAnsi="Consolas"/>
+                <w:lang w:val="en-US"/>
+              </w:rPr>
+              <w:t xml:space="preserve">import </w:t>
+            </w:r>
+            <w:proofErr w:type="spellStart"/>
+            <w:proofErr w:type="gramStart"/>
+            <w:r>
+              <w:rPr>
+                <w:rFonts w:ascii="Consolas" w:hAnsi="Consolas"/>
+                <w:lang w:val="en-US"/>
+              </w:rPr>
+              <w:t>jdk.jfr.Category</w:t>
+            </w:r>
+            <w:proofErr w:type="spellEnd"/>
+            <w:proofErr w:type="gramEnd"/>
+            <w:r>
+              <w:rPr>
+                <w:rFonts w:ascii="Consolas" w:hAnsi="Consolas"/>
+                <w:lang w:val="en-US"/>
+              </w:rPr>
+              <w:t>;</w:t>
+            </w:r>
+          </w:p>
+          <w:p>
+            <w:pPr>
+              <w:keepNext/>
+              <w:ind w:firstLine="0"/>
+              <w:jc w:val="left"/>
+              <w:rPr>
+                <w:rFonts w:ascii="Consolas" w:hAnsi="Consolas"/>
+                <w:lang w:val="en-US"/>
+              </w:rPr>
+            </w:pPr>
+            <w:r>
+              <w:rPr>
+                <w:rFonts w:ascii="Consolas" w:hAnsi="Consolas"/>
+                <w:lang w:val="en-US"/>
+              </w:rPr>
+              <w:t xml:space="preserve">import </w:t>
+            </w:r>
+            <w:proofErr w:type="spellStart"/>
+            <w:proofErr w:type="gramStart"/>
+            <w:r>
+              <w:rPr>
+                <w:rFonts w:ascii="Consolas" w:hAnsi="Consolas"/>
+                <w:lang w:val="en-US"/>
+              </w:rPr>
+              <w:t>jdk.jfr.Event</w:t>
+            </w:r>
+            <w:proofErr w:type="spellEnd"/>
+            <w:proofErr w:type="gramEnd"/>
+            <w:r>
+              <w:rPr>
+                <w:rFonts w:ascii="Consolas" w:hAnsi="Consolas"/>
+                <w:lang w:val="en-US"/>
+              </w:rPr>
+              <w:t>;</w:t>
+            </w:r>
+          </w:p>
+          <w:p>
+            <w:pPr>
+              <w:keepNext/>
+              <w:ind w:firstLine="0"/>
+              <w:jc w:val="left"/>
+              <w:rPr>
+                <w:rFonts w:ascii="Consolas" w:hAnsi="Consolas"/>
+                <w:lang w:val="en-US"/>
+              </w:rPr>
+            </w:pPr>
+            <w:r>
+              <w:rPr>
+                <w:rFonts w:ascii="Consolas" w:hAnsi="Consolas"/>
+                <w:lang w:val="en-US"/>
+              </w:rPr>
+              <w:t xml:space="preserve">import </w:t>
+            </w:r>
+            <w:proofErr w:type="spellStart"/>
+            <w:proofErr w:type="gramStart"/>
+            <w:r>
+              <w:rPr>
+                <w:rFonts w:ascii="Consolas" w:hAnsi="Consolas"/>
+                <w:lang w:val="en-US"/>
+              </w:rPr>
+              <w:t>jdk.jfr.Label</w:t>
+            </w:r>
+            <w:proofErr w:type="spellEnd"/>
+            <w:proofErr w:type="gramEnd"/>
+            <w:r>
+              <w:rPr>
+                <w:rFonts w:ascii="Consolas" w:hAnsi="Consolas"/>
+                <w:lang w:val="en-US"/>
+              </w:rPr>
+              <w:t>;</w:t>
+            </w:r>
+          </w:p>
+          <w:p>
+            <w:pPr>
+              <w:keepNext/>
+              <w:ind w:firstLine="0"/>
+              <w:jc w:val="left"/>
+              <w:rPr>
+                <w:rFonts w:ascii="Consolas" w:hAnsi="Consolas"/>
+                <w:lang w:val="en-US"/>
+              </w:rPr>
+            </w:pPr>
+            <w:r>
+              <w:rPr>
+                <w:rFonts w:ascii="Consolas" w:hAnsi="Consolas"/>
+                <w:lang w:val="en-US"/>
+              </w:rPr>
+              <w:t xml:space="preserve">import </w:t>
+            </w:r>
+            <w:proofErr w:type="spellStart"/>
+            <w:proofErr w:type="gramStart"/>
+            <w:r>
+              <w:rPr>
+                <w:rFonts w:ascii="Consolas" w:hAnsi="Consolas"/>
+                <w:lang w:val="en-US"/>
+              </w:rPr>
+              <w:t>jdk.jfr.Threshold</w:t>
+            </w:r>
+            <w:proofErr w:type="spellEnd"/>
+            <w:proofErr w:type="gramEnd"/>
+            <w:r>
+              <w:rPr>
+                <w:rFonts w:ascii="Consolas" w:hAnsi="Consolas"/>
+                <w:lang w:val="en-US"/>
+              </w:rPr>
+              <w:t>;</w:t>
+            </w:r>
+          </w:p>
+          <w:p>
+            <w:pPr>
+              <w:keepNext/>
+              <w:ind w:firstLine="0"/>
+              <w:jc w:val="left"/>
+              <w:rPr>
+                <w:rFonts w:ascii="Consolas" w:hAnsi="Consolas"/>
+                <w:lang w:val="en-US"/>
+              </w:rPr>
+            </w:pPr>
+          </w:p>
+          <w:p>
+            <w:pPr>
+              <w:keepNext/>
+              <w:ind w:firstLine="0"/>
+              <w:jc w:val="left"/>
+              <w:rPr>
+                <w:rFonts w:ascii="Consolas" w:hAnsi="Consolas"/>
+                <w:lang w:val="en-US"/>
+              </w:rPr>
+            </w:pPr>
+            <w:r>
+              <w:rPr>
+                <w:rFonts w:ascii="Consolas" w:hAnsi="Consolas"/>
+                <w:lang w:val="en-US"/>
+              </w:rPr>
+              <w:t>@</w:t>
+            </w:r>
+            <w:proofErr w:type="gramStart"/>
+            <w:r>
+              <w:rPr>
+                <w:rFonts w:ascii="Consolas" w:hAnsi="Consolas"/>
+                <w:lang w:val="en-US"/>
+              </w:rPr>
+              <w:t>Category(</w:t>
+            </w:r>
+            <w:proofErr w:type="gramEnd"/>
+            <w:r>
+              <w:rPr>
+                <w:rFonts w:ascii="Consolas" w:hAnsi="Consolas"/>
+                <w:lang w:val="en-US"/>
+              </w:rPr>
+              <w:t>{"Lab event", "</w:t>
+            </w:r>
+            <w:proofErr w:type="spellStart"/>
+            <w:r>
+              <w:rPr>
+                <w:rFonts w:ascii="Consolas" w:hAnsi="Consolas"/>
+                <w:lang w:val="en-US"/>
+              </w:rPr>
+              <w:t>PointSet</w:t>
+            </w:r>
+            <w:proofErr w:type="spellEnd"/>
+            <w:r>
+              <w:rPr>
+                <w:rFonts w:ascii="Consolas" w:hAnsi="Consolas"/>
+                <w:lang w:val="en-US"/>
+              </w:rPr>
+              <w:t>"})</w:t>
+            </w:r>
+          </w:p>
+          <w:p>
+            <w:pPr>
+              <w:keepNext/>
+              <w:ind w:firstLine="0"/>
+              <w:jc w:val="left"/>
+              <w:rPr>
+                <w:rFonts w:ascii="Consolas" w:hAnsi="Consolas"/>
+                <w:lang w:val="en-US"/>
+              </w:rPr>
+            </w:pPr>
+            <w:proofErr w:type="gramStart"/>
+            <w:r>
+              <w:rPr>
+                <w:rFonts w:ascii="Consolas" w:hAnsi="Consolas"/>
+                <w:lang w:val="en-US"/>
+              </w:rPr>
+              <w:t>@Label</w:t>
+            </w:r>
+            <w:proofErr w:type="gramEnd"/>
+            <w:r>
+              <w:rPr>
+                <w:rFonts w:ascii="Consolas" w:hAnsi="Consolas"/>
+                <w:lang w:val="en-US"/>
+              </w:rPr>
+              <w:t>("PointSet")</w:t>
+            </w:r>
+          </w:p>
+          <w:p>
+            <w:pPr>
+              <w:keepNext/>
+              <w:ind w:firstLine="0"/>
+              <w:jc w:val="left"/>
+              <w:rPr>
+                <w:rFonts w:ascii="Consolas" w:hAnsi="Consolas"/>
+                <w:lang w:val="en-US"/>
+              </w:rPr>
+            </w:pPr>
+            <w:r>
+              <w:rPr>
+                <w:rFonts w:ascii="Consolas" w:hAnsi="Consolas"/>
+                <w:lang w:val="en-US"/>
+              </w:rPr>
+              <w:t>@</w:t>
+            </w:r>
+            <w:proofErr w:type="gramStart"/>
+            <w:r>
+              <w:rPr>
+                <w:rFonts w:ascii="Consolas" w:hAnsi="Consolas"/>
+                <w:lang w:val="en-US"/>
+              </w:rPr>
+              <w:t>Threshold(</w:t>
+            </w:r>
+            <w:proofErr w:type="gramEnd"/>
+            <w:r>
+              <w:rPr>
+                <w:rFonts w:ascii="Consolas" w:hAnsi="Consolas"/>
+                <w:lang w:val="en-US"/>
+              </w:rPr>
+              <w:t xml:space="preserve">"0 </w:t>
+            </w:r>
+            <w:proofErr w:type="spellStart"/>
+            <w:r>
+              <w:rPr>
+                <w:rFonts w:ascii="Consolas" w:hAnsi="Consolas"/>
+                <w:lang w:val="en-US"/>
+              </w:rPr>
+              <w:t>ms</w:t>
+            </w:r>
+            <w:proofErr w:type="spellEnd"/>
+            <w:r>
+              <w:rPr>
+                <w:rFonts w:ascii="Consolas" w:hAnsi="Consolas"/>
+                <w:lang w:val="en-US"/>
+              </w:rPr>
+              <w:t>")</w:t>
+            </w:r>
+          </w:p>
+          <w:p>
+            <w:pPr>
+              <w:keepNext/>
+              <w:ind w:firstLine="0"/>
+              <w:jc w:val="left"/>
+              <w:rPr>
+                <w:rFonts w:ascii="Consolas" w:hAnsi="Consolas"/>
+                <w:lang w:val="en-US"/>
+              </w:rPr>
+            </w:pPr>
+            <w:proofErr w:type="gramStart"/>
+            <w:r>
+              <w:rPr>
+                <w:rFonts w:ascii="Consolas" w:hAnsi="Consolas"/>
+                <w:lang w:val="en-US"/>
+              </w:rPr>
+              <w:t>public</w:t>
+            </w:r>
+            <w:proofErr w:type="gramEnd"/>
+            <w:r>
+              <w:rPr>
+                <w:rFonts w:ascii="Consolas" w:hAnsi="Consolas"/>
+                <w:lang w:val="en-US"/>
+              </w:rPr>
+              <w:t xml:space="preserve"> class </w:t>
+            </w:r>
+            <w:proofErr w:type="spellStart"/>
+            <w:r>
+              <w:rPr>
+                <w:rFonts w:ascii="Consolas" w:hAnsi="Consolas"/>
+                <w:lang w:val="en-US"/>
+              </w:rPr>
+              <w:t>PointSetEvent</w:t>
+            </w:r>
+            <w:proofErr w:type="spellEnd"/>
+            <w:r>
+              <w:rPr>
+                <w:rFonts w:ascii="Consolas" w:hAnsi="Consolas"/>
+                <w:lang w:val="en-US"/>
+              </w:rPr>
+              <w:t xml:space="preserve"> extends Event {}</w:t>
+            </w:r>
+          </w:p>
+        </w:tc>
+      </w:tr>
+    </w:tbl>
+    <w:p>
+      <w:pPr>
+        <w:ind w:firstLine="0"/>
+        <w:jc w:val="left"/>
+        <w:rPr>
+          <w:lang w:val="en-US"/>
+        </w:rPr>
+      </w:pPr>
+    </w:p>
     <w:p>
       <w:pPr>
         <w:ind w:firstLine="0"/>
@@ -10639,7 +11527,7 @@
   <w:style w:type="paragraph" w:default="1" w:styleId="a">
     <w:name w:val="Normal"/>
     <w:qFormat/>
-    <w:rsid w:val="0031083F"/>
+    <w:rsid w:val="00307AFD"/>
     <w:pPr>
       <w:ind w:firstLine="567"/>
       <w:jc w:val="both"/>
@@ -11314,12 +12202,6 @@
 </file>
 
 <file path=customXml/item1.xml><?xml version="1.0" encoding="utf-8"?>
-<go:gDocsCustomXmlDataStorage xmlns:go="http://customooxmlschemas.google.com/" xmlns:r="http://schemas.openxmlformats.org/officeDocument/2006/relationships" uri="GoogleDocsCustomDataVersion2">
-  <go:docsCustomData xmlns:go="http://customooxmlschemas.google.com/" roundtripDataSignature="AMtx7mjP1okz7Ui6Y3xV14nF1n6ZHVRn0A==">CgMxLjAyDmguYjNwcXZoaHJpcjd6Mg5oLjY3dzdjZ2pmMjRpYjIOaC55ZGptY2Yzc2NubzgyDmguanRwd2M3MmlvNXRxMg1oLjN2dWplMzFmd2NlMg5oLndmbDE4NWRvZ3kycjgAciExd19QLU9BTFl4Sm5yME9tTEdPUlVsTzVkTjVrMC1JeWE=</go:docsCustomData>
-</go:gDocsCustomXmlDataStorage>
-</file>
-
-<file path=customXml/item2.xml><?xml version="1.0" encoding="utf-8"?>
 <b:Sources xmlns:b="http://schemas.openxmlformats.org/officeDocument/2006/bibliography" xmlns="http://schemas.openxmlformats.org/officeDocument/2006/bibliography" SelectedStyle="\IEEE2006OfficeOnline.xsl" StyleName="IEEE" Version="2006">
   <b:Source>
     <b:Tag>Mon26</b:Tag>
@@ -11423,19 +12305,25 @@
 </b:Sources>
 </file>
 
+<file path=customXml/item2.xml><?xml version="1.0" encoding="utf-8"?>
+<go:gDocsCustomXmlDataStorage xmlns:go="http://customooxmlschemas.google.com/" xmlns:r="http://schemas.openxmlformats.org/officeDocument/2006/relationships" uri="GoogleDocsCustomDataVersion2">
+  <go:docsCustomData xmlns:go="http://customooxmlschemas.google.com/" roundtripDataSignature="AMtx7mjP1okz7Ui6Y3xV14nF1n6ZHVRn0A==">CgMxLjAyDmguYjNwcXZoaHJpcjd6Mg5oLjY3dzdjZ2pmMjRpYjIOaC55ZGptY2Yzc2NubzgyDmguanRwd2M3MmlvNXRxMg1oLjN2dWplMzFmd2NlMg5oLndmbDE4NWRvZ3kycjgAciExd19QLU9BTFl4Sm5yME9tTEdPUlVsTzVkTjVrMC1JeWE=</go:docsCustomData>
+</go:gDocsCustomXmlDataStorage>
+</file>
+
 <file path=customXml/itemProps1.xml><?xml version="1.0" encoding="utf-8"?>
+<ds:datastoreItem xmlns:ds="http://schemas.openxmlformats.org/officeDocument/2006/customXml" ds:itemID="{1C97FB63-7111-452E-BCAF-366C6317719B}">
+  <ds:schemaRefs>
+    <ds:schemaRef ds:uri="http://schemas.openxmlformats.org/officeDocument/2006/bibliography"/>
+  </ds:schemaRefs>
+</ds:datastoreItem>
+</file>
+
+<file path=customXml/itemProps2.xml><?xml version="1.0" encoding="utf-8"?>
 <ds:datastoreItem xmlns:ds="http://schemas.openxmlformats.org/officeDocument/2006/customXml" ds:itemID="{11111111-1234-1234-1234-123412341234}">
   <ds:schemaRefs>
     <ds:schemaRef ds:uri="http://customooxmlschemas.google.com/"/>
     <ds:schemaRef ds:uri="http://schemas.openxmlformats.org/officeDocument/2006/relationships"/>
   </ds:schemaRefs>
 </ds:datastoreItem>
-</file>
-
-<file path=customXml/itemProps2.xml><?xml version="1.0" encoding="utf-8"?>
-<ds:datastoreItem xmlns:ds="http://schemas.openxmlformats.org/officeDocument/2006/customXml" ds:itemID="{1C97FB63-7111-452E-BCAF-366C6317719B}">
-  <ds:schemaRefs>
-    <ds:schemaRef ds:uri="http://schemas.openxmlformats.org/officeDocument/2006/bibliography"/>
-  </ds:schemaRefs>
-</ds:datastoreItem>
 </file>
</xml_diff>

<commit_message>
remote monitoring and passsword files acess added, tested but havent described yet
</commit_message>
<xml_diff>
--- a/LAB_4_Соловьёв_P3230.docx
+++ b/LAB_4_Соловьёв_P3230.docx
@@ -2209,8 +2209,13 @@
               <w:t xml:space="preserve">import </w:t>
             </w:r>
             <w:proofErr w:type="spellStart"/>
-            <w:r>
-              <w:t>javax.management.MXBean</w:t>
+            <w:proofErr w:type="gramStart"/>
+            <w:r>
+              <w:t>javax.management</w:t>
+            </w:r>
+            <w:proofErr w:type="gramEnd"/>
+            <w:r>
+              <w:t>.MXBean</w:t>
             </w:r>
             <w:proofErr w:type="spellEnd"/>
             <w:r>
@@ -2225,10 +2230,20 @@
               <w:t xml:space="preserve">import </w:t>
             </w:r>
             <w:proofErr w:type="spellStart"/>
-            <w:r>
-              <w:t>javax.management.openmbean.OpenDataException</w:t>
+            <w:proofErr w:type="gramStart"/>
+            <w:r>
+              <w:t>javax.management</w:t>
+            </w:r>
+            <w:proofErr w:type="gramEnd"/>
+            <w:r>
+              <w:t>.</w:t>
+            </w:r>
+            <w:proofErr w:type="gramStart"/>
+            <w:r>
+              <w:t>openmbean.OpenDataException</w:t>
             </w:r>
             <w:proofErr w:type="spellEnd"/>
+            <w:proofErr w:type="gramEnd"/>
             <w:r>
               <w:t>;</w:t>
             </w:r>
@@ -2242,16 +2257,23 @@
             <w:pPr>
               <w:pStyle w:val="ac"/>
             </w:pPr>
+            <w:proofErr w:type="gramStart"/>
             <w:r>
               <w:t>@MXBean</w:t>
             </w:r>
-          </w:p>
-          <w:p>
-            <w:pPr>
-              <w:pStyle w:val="ac"/>
-            </w:pPr>
-            <w:r>
-              <w:t xml:space="preserve">public interface </w:t>
+            <w:proofErr w:type="gramEnd"/>
+          </w:p>
+          <w:p>
+            <w:pPr>
+              <w:pStyle w:val="ac"/>
+            </w:pPr>
+            <w:proofErr w:type="gramStart"/>
+            <w:r>
+              <w:t>public</w:t>
+            </w:r>
+            <w:proofErr w:type="gramEnd"/>
+            <w:r>
+              <w:t xml:space="preserve"> interface </w:t>
             </w:r>
             <w:proofErr w:type="spellStart"/>
             <w:r>
@@ -2270,12 +2292,17 @@
               <w:t xml:space="preserve">    int </w:t>
             </w:r>
             <w:proofErr w:type="spellStart"/>
+            <w:proofErr w:type="gramStart"/>
             <w:r>
               <w:t>getPointsCount</w:t>
             </w:r>
             <w:proofErr w:type="spellEnd"/>
             <w:r>
-              <w:t>();</w:t>
+              <w:t>(</w:t>
+            </w:r>
+            <w:proofErr w:type="gramEnd"/>
+            <w:r>
+              <w:t>);</w:t>
             </w:r>
           </w:p>
           <w:p>
@@ -2286,12 +2313,17 @@
               <w:t xml:space="preserve">    int </w:t>
             </w:r>
             <w:proofErr w:type="spellStart"/>
+            <w:proofErr w:type="gramStart"/>
             <w:r>
               <w:t>getMissesCount</w:t>
             </w:r>
             <w:proofErr w:type="spellEnd"/>
             <w:r>
-              <w:t>();</w:t>
+              <w:t>(</w:t>
+            </w:r>
+            <w:proofErr w:type="gramEnd"/>
+            <w:r>
+              <w:t>);</w:t>
             </w:r>
           </w:p>
           <w:p>
@@ -2310,12 +2342,17 @@
               <w:t xml:space="preserve">    AreaCounter </w:t>
             </w:r>
             <w:proofErr w:type="spellStart"/>
+            <w:proofErr w:type="gramStart"/>
             <w:r>
               <w:t>getAreaCount</w:t>
             </w:r>
             <w:proofErr w:type="spellEnd"/>
             <w:r>
-              <w:t xml:space="preserve">() throws </w:t>
+              <w:t>(</w:t>
+            </w:r>
+            <w:proofErr w:type="gramEnd"/>
+            <w:r>
+              <w:t xml:space="preserve">) throws </w:t>
             </w:r>
             <w:proofErr w:type="spellStart"/>
             <w:r>
@@ -2457,10 +2494,28 @@
               <w:t xml:space="preserve">import </w:t>
             </w:r>
             <w:proofErr w:type="spellStart"/>
-            <w:r>
-              <w:t>org.springframework.beans.factory.annotation.Autowired</w:t>
+            <w:proofErr w:type="gramStart"/>
+            <w:r>
+              <w:t>org.springframework</w:t>
+            </w:r>
+            <w:proofErr w:type="gramEnd"/>
+            <w:r>
+              <w:t>.</w:t>
+            </w:r>
+            <w:proofErr w:type="gramStart"/>
+            <w:r>
+              <w:t>beans.factory</w:t>
+            </w:r>
+            <w:proofErr w:type="gramEnd"/>
+            <w:r>
+              <w:t>.</w:t>
+            </w:r>
+            <w:proofErr w:type="gramStart"/>
+            <w:r>
+              <w:t>annotation.Autowired</w:t>
             </w:r>
             <w:proofErr w:type="spellEnd"/>
+            <w:proofErr w:type="gramEnd"/>
             <w:r>
               <w:t>;</w:t>
             </w:r>
@@ -2473,10 +2528,20 @@
               <w:t xml:space="preserve">import </w:t>
             </w:r>
             <w:proofErr w:type="spellStart"/>
-            <w:r>
-              <w:t>org.springframework.stereotype.Component</w:t>
+            <w:proofErr w:type="gramStart"/>
+            <w:r>
+              <w:t>org.springframework</w:t>
+            </w:r>
+            <w:proofErr w:type="gramEnd"/>
+            <w:r>
+              <w:t>.</w:t>
+            </w:r>
+            <w:proofErr w:type="gramStart"/>
+            <w:r>
+              <w:t>stereotype.Component</w:t>
             </w:r>
             <w:proofErr w:type="spellEnd"/>
+            <w:proofErr w:type="gramEnd"/>
             <w:r>
               <w:t>;</w:t>
             </w:r>
@@ -2494,8 +2559,13 @@
               <w:t xml:space="preserve">import </w:t>
             </w:r>
             <w:proofErr w:type="spellStart"/>
-            <w:r>
-              <w:t>javax.management.Notification</w:t>
+            <w:proofErr w:type="gramStart"/>
+            <w:r>
+              <w:t>javax.management</w:t>
+            </w:r>
+            <w:proofErr w:type="gramEnd"/>
+            <w:r>
+              <w:t>.Notification</w:t>
             </w:r>
             <w:proofErr w:type="spellEnd"/>
             <w:r>
@@ -2510,8 +2580,13 @@
               <w:t xml:space="preserve">import </w:t>
             </w:r>
             <w:proofErr w:type="spellStart"/>
-            <w:r>
-              <w:t>javax.management.NotificationBroadcasterSupport</w:t>
+            <w:proofErr w:type="gramStart"/>
+            <w:r>
+              <w:t>javax.management</w:t>
+            </w:r>
+            <w:proofErr w:type="gramEnd"/>
+            <w:r>
+              <w:t>.NotificationBroadcasterSupport</w:t>
             </w:r>
             <w:proofErr w:type="spellEnd"/>
             <w:r>
@@ -2526,12 +2601,25 @@
               <w:t xml:space="preserve">import </w:t>
             </w:r>
             <w:proofErr w:type="spellStart"/>
-            <w:r>
-              <w:t>javax.management.openmbean</w:t>
+            <w:proofErr w:type="gramStart"/>
+            <w:r>
+              <w:t>javax.management</w:t>
+            </w:r>
+            <w:proofErr w:type="gramEnd"/>
+            <w:r>
+              <w:t>.</w:t>
+            </w:r>
+            <w:proofErr w:type="gramStart"/>
+            <w:r>
+              <w:t>openmbean</w:t>
             </w:r>
             <w:proofErr w:type="spellEnd"/>
             <w:r>
-              <w:t>.*;</w:t>
+              <w:t>.*</w:t>
+            </w:r>
+            <w:proofErr w:type="gramEnd"/>
+            <w:r>
+              <w:t>;</w:t>
             </w:r>
           </w:p>
           <w:p>
@@ -2551,8 +2639,13 @@
             <w:pPr>
               <w:pStyle w:val="ac"/>
             </w:pPr>
-            <w:r>
-              <w:t xml:space="preserve">public class </w:t>
+            <w:proofErr w:type="gramStart"/>
+            <w:r>
+              <w:t>public</w:t>
+            </w:r>
+            <w:proofErr w:type="gramEnd"/>
+            <w:r>
+              <w:t xml:space="preserve"> class </w:t>
             </w:r>
             <w:proofErr w:type="spellStart"/>
             <w:r>
@@ -2656,7 +2749,15 @@
             </w:r>
             <w:proofErr w:type="spellEnd"/>
             <w:r>
-              <w:t xml:space="preserve"> = new AreaCounter();</w:t>
+              <w:t xml:space="preserve"> = new </w:t>
+            </w:r>
+            <w:proofErr w:type="gramStart"/>
+            <w:r>
+              <w:t>AreaCounter(</w:t>
+            </w:r>
+            <w:proofErr w:type="gramEnd"/>
+            <w:r>
+              <w:t>);</w:t>
             </w:r>
           </w:p>
           <w:p>
@@ -2704,6 +2805,7 @@
               <w:t xml:space="preserve">    public </w:t>
             </w:r>
             <w:proofErr w:type="spellStart"/>
+            <w:proofErr w:type="gramStart"/>
             <w:r>
               <w:t>PointsCounter</w:t>
             </w:r>
@@ -2712,6 +2814,7 @@
               <w:t>(</w:t>
             </w:r>
             <w:proofErr w:type="spellStart"/>
+            <w:proofErr w:type="gramEnd"/>
             <w:r>
               <w:t>MissPercentage</w:t>
             </w:r>
@@ -2720,6 +2823,7 @@
               <w:t xml:space="preserve"> </w:t>
             </w:r>
             <w:proofErr w:type="spellStart"/>
+            <w:proofErr w:type="gramStart"/>
             <w:r>
               <w:t>missPercentage</w:t>
             </w:r>
@@ -2727,6 +2831,7 @@
             <w:r>
               <w:t>) {</w:t>
             </w:r>
+            <w:proofErr w:type="gramEnd"/>
           </w:p>
           <w:p>
             <w:pPr>
@@ -2736,10 +2841,12 @@
               <w:t xml:space="preserve">        </w:t>
             </w:r>
             <w:proofErr w:type="spellStart"/>
+            <w:proofErr w:type="gramStart"/>
             <w:r>
               <w:t>this.missPercentage</w:t>
             </w:r>
             <w:proofErr w:type="spellEnd"/>
+            <w:proofErr w:type="gramEnd"/>
             <w:r>
               <w:t xml:space="preserve"> = </w:t>
             </w:r>
@@ -2773,12 +2880,17 @@
               <w:t xml:space="preserve">    public synchronized void </w:t>
             </w:r>
             <w:proofErr w:type="spellStart"/>
+            <w:proofErr w:type="gramStart"/>
             <w:r>
               <w:t>clickMade</w:t>
             </w:r>
             <w:proofErr w:type="spellEnd"/>
             <w:r>
-              <w:t xml:space="preserve">(Double x, Double y, </w:t>
+              <w:t>(</w:t>
+            </w:r>
+            <w:proofErr w:type="gramEnd"/>
+            <w:r>
+              <w:t xml:space="preserve">Double x, Double y, </w:t>
             </w:r>
             <w:proofErr w:type="spellStart"/>
             <w:r>
@@ -2789,6 +2901,7 @@
               <w:t xml:space="preserve"> </w:t>
             </w:r>
             <w:proofErr w:type="spellStart"/>
+            <w:proofErr w:type="gramStart"/>
             <w:r>
               <w:t>isHit</w:t>
             </w:r>
@@ -2796,6 +2909,7 @@
             <w:r>
               <w:t>) {</w:t>
             </w:r>
+            <w:proofErr w:type="gramEnd"/>
           </w:p>
           <w:p>
             <w:pPr>
@@ -2805,10 +2919,12 @@
               <w:t xml:space="preserve">        </w:t>
             </w:r>
             <w:proofErr w:type="spellStart"/>
+            <w:proofErr w:type="gramStart"/>
             <w:r>
               <w:t>this.pointsCount</w:t>
             </w:r>
             <w:proofErr w:type="spellEnd"/>
+            <w:proofErr w:type="gramEnd"/>
             <w:r>
               <w:t xml:space="preserve"> += 1;</w:t>
             </w:r>
@@ -2823,13 +2939,18 @@
               <w:pStyle w:val="ac"/>
             </w:pPr>
             <w:r>
-              <w:t xml:space="preserve">        if (!</w:t>
+              <w:t xml:space="preserve">        if </w:t>
+            </w:r>
+            <w:proofErr w:type="gramStart"/>
+            <w:r>
+              <w:t>(!</w:t>
             </w:r>
             <w:proofErr w:type="spellStart"/>
             <w:r>
               <w:t>isHit</w:t>
             </w:r>
             <w:proofErr w:type="spellEnd"/>
+            <w:proofErr w:type="gramEnd"/>
             <w:r>
               <w:t>) {</w:t>
             </w:r>
@@ -2842,10 +2963,12 @@
               <w:t xml:space="preserve">            </w:t>
             </w:r>
             <w:proofErr w:type="spellStart"/>
+            <w:proofErr w:type="gramStart"/>
             <w:r>
               <w:t>this.missesCount</w:t>
             </w:r>
             <w:proofErr w:type="spellEnd"/>
+            <w:proofErr w:type="gramEnd"/>
             <w:r>
               <w:t xml:space="preserve"> += 1;</w:t>
             </w:r>
@@ -2858,10 +2981,12 @@
               <w:t xml:space="preserve">            </w:t>
             </w:r>
             <w:proofErr w:type="spellStart"/>
+            <w:proofErr w:type="gramStart"/>
             <w:r>
               <w:t>this.consecutiveMisses</w:t>
             </w:r>
             <w:proofErr w:type="spellEnd"/>
+            <w:proofErr w:type="gramEnd"/>
             <w:r>
               <w:t xml:space="preserve"> += 1;</w:t>
             </w:r>
@@ -2879,20 +3004,35 @@
               <w:t xml:space="preserve">            if (</w:t>
             </w:r>
             <w:proofErr w:type="spellStart"/>
+            <w:proofErr w:type="gramStart"/>
             <w:r>
               <w:t>this.consecutiveMisses</w:t>
             </w:r>
             <w:proofErr w:type="spellEnd"/>
-            <w:r>
-              <w:t xml:space="preserve"> == 3) {</w:t>
-            </w:r>
-          </w:p>
-          <w:p>
-            <w:pPr>
-              <w:pStyle w:val="ac"/>
-            </w:pPr>
-            <w:r>
-              <w:t xml:space="preserve">                Notification n = new Notification("consecutive misses", this, </w:t>
+            <w:proofErr w:type="gramEnd"/>
+            <w:r>
+              <w:t xml:space="preserve"> == </w:t>
+            </w:r>
+            <w:proofErr w:type="gramStart"/>
+            <w:r>
+              <w:t>3) {</w:t>
+            </w:r>
+            <w:proofErr w:type="gramEnd"/>
+          </w:p>
+          <w:p>
+            <w:pPr>
+              <w:pStyle w:val="ac"/>
+            </w:pPr>
+            <w:r>
+              <w:t xml:space="preserve">                Notification n = new </w:t>
+            </w:r>
+            <w:proofErr w:type="gramStart"/>
+            <w:r>
+              <w:t>Notification(</w:t>
+            </w:r>
+            <w:proofErr w:type="gramEnd"/>
+            <w:r>
+              <w:t xml:space="preserve">"consecutive misses", this, </w:t>
             </w:r>
             <w:proofErr w:type="spellStart"/>
             <w:r>
@@ -2961,10 +3101,12 @@
               <w:t xml:space="preserve">            </w:t>
             </w:r>
             <w:proofErr w:type="spellStart"/>
+            <w:proofErr w:type="gramStart"/>
             <w:r>
               <w:t>this.consecutiveMisses</w:t>
             </w:r>
             <w:proofErr w:type="spellEnd"/>
+            <w:proofErr w:type="gramEnd"/>
             <w:r>
               <w:t xml:space="preserve"> = 0;</w:t>
             </w:r>
@@ -3057,12 +3199,17 @@
               <w:t xml:space="preserve">    public int </w:t>
             </w:r>
             <w:proofErr w:type="spellStart"/>
+            <w:proofErr w:type="gramStart"/>
             <w:r>
               <w:t>getPointsCount</w:t>
             </w:r>
             <w:proofErr w:type="spellEnd"/>
             <w:r>
-              <w:t>() {</w:t>
+              <w:t>(</w:t>
+            </w:r>
+            <w:proofErr w:type="gramEnd"/>
+            <w:r>
+              <w:t>) {</w:t>
             </w:r>
           </w:p>
           <w:p>
@@ -3073,10 +3220,12 @@
               <w:t xml:space="preserve">        return </w:t>
             </w:r>
             <w:proofErr w:type="spellStart"/>
+            <w:proofErr w:type="gramStart"/>
             <w:r>
               <w:t>this.pointsCount</w:t>
             </w:r>
             <w:proofErr w:type="spellEnd"/>
+            <w:proofErr w:type="gramEnd"/>
             <w:r>
               <w:t>;</w:t>
             </w:r>
@@ -3099,15 +3248,80 @@
               <w:pStyle w:val="ac"/>
             </w:pPr>
             <w:r>
+              <w:t xml:space="preserve">    </w:t>
+            </w:r>
+            <w:proofErr w:type="gramStart"/>
+            <w:r>
+              <w:t>public</w:t>
+            </w:r>
+            <w:proofErr w:type="gramEnd"/>
+            <w:r>
+              <w:t xml:space="preserve"> int </w:t>
+            </w:r>
+            <w:proofErr w:type="spellStart"/>
+            <w:proofErr w:type="gramStart"/>
+            <w:r>
+              <w:t>getMissesCount</w:t>
+            </w:r>
+            <w:proofErr w:type="spellEnd"/>
+            <w:r>
+              <w:t>(</w:t>
+            </w:r>
+            <w:proofErr w:type="gramEnd"/>
+            <w:r>
+              <w:t>) {</w:t>
+            </w:r>
+          </w:p>
+          <w:p>
+            <w:pPr>
+              <w:pStyle w:val="ac"/>
+            </w:pPr>
+            <w:r>
+              <w:t xml:space="preserve">        return </w:t>
+            </w:r>
+            <w:proofErr w:type="spellStart"/>
+            <w:proofErr w:type="gramStart"/>
+            <w:r>
+              <w:t>this.missesCount</w:t>
+            </w:r>
+            <w:proofErr w:type="spellEnd"/>
+            <w:proofErr w:type="gramEnd"/>
+            <w:r>
+              <w:t>;</w:t>
+            </w:r>
+          </w:p>
+          <w:p>
+            <w:pPr>
+              <w:pStyle w:val="ac"/>
+            </w:pPr>
+            <w:r>
+              <w:t xml:space="preserve">    }</w:t>
+            </w:r>
+          </w:p>
+          <w:p>
+            <w:pPr>
+              <w:pStyle w:val="ac"/>
+            </w:pPr>
+          </w:p>
+          <w:p>
+            <w:pPr>
+              <w:pStyle w:val="ac"/>
+            </w:pPr>
+            <w:r>
               <w:t xml:space="preserve">    public int </w:t>
             </w:r>
             <w:proofErr w:type="spellStart"/>
-            <w:r>
-              <w:t>getMissesCount</w:t>
+            <w:proofErr w:type="gramStart"/>
+            <w:r>
+              <w:t>getConsecutiveMisses</w:t>
             </w:r>
             <w:proofErr w:type="spellEnd"/>
             <w:r>
-              <w:t>() {</w:t>
+              <w:t>(</w:t>
+            </w:r>
+            <w:proofErr w:type="gramEnd"/>
+            <w:r>
+              <w:t>) {</w:t>
             </w:r>
           </w:p>
           <w:p>
@@ -3118,10 +3332,12 @@
               <w:t xml:space="preserve">        return </w:t>
             </w:r>
             <w:proofErr w:type="spellStart"/>
-            <w:r>
-              <w:t>this.missesCount</w:t>
+            <w:proofErr w:type="gramStart"/>
+            <w:r>
+              <w:t>this.consecutiveMisses</w:t>
             </w:r>
             <w:proofErr w:type="spellEnd"/>
+            <w:proofErr w:type="gramEnd"/>
             <w:r>
               <w:t>;</w:t>
             </w:r>
@@ -3144,60 +3360,20 @@
               <w:pStyle w:val="ac"/>
             </w:pPr>
             <w:r>
-              <w:t xml:space="preserve">    public int </w:t>
+              <w:t xml:space="preserve">    public AreaCounter </w:t>
             </w:r>
             <w:proofErr w:type="spellStart"/>
-            <w:r>
-              <w:t>getConsecutiveMisses</w:t>
+            <w:proofErr w:type="gramStart"/>
+            <w:r>
+              <w:t>getAreaCount</w:t>
             </w:r>
             <w:proofErr w:type="spellEnd"/>
             <w:r>
-              <w:t>() {</w:t>
-            </w:r>
-          </w:p>
-          <w:p>
-            <w:pPr>
-              <w:pStyle w:val="ac"/>
-            </w:pPr>
-            <w:r>
-              <w:t xml:space="preserve">        return </w:t>
-            </w:r>
-            <w:proofErr w:type="spellStart"/>
-            <w:r>
-              <w:t>this.consecutiveMisses</w:t>
-            </w:r>
-            <w:proofErr w:type="spellEnd"/>
-            <w:r>
-              <w:t>;</w:t>
-            </w:r>
-          </w:p>
-          <w:p>
-            <w:pPr>
-              <w:pStyle w:val="ac"/>
-            </w:pPr>
-            <w:r>
-              <w:t xml:space="preserve">    }</w:t>
-            </w:r>
-          </w:p>
-          <w:p>
-            <w:pPr>
-              <w:pStyle w:val="ac"/>
-            </w:pPr>
-          </w:p>
-          <w:p>
-            <w:pPr>
-              <w:pStyle w:val="ac"/>
-            </w:pPr>
-            <w:r>
-              <w:t xml:space="preserve">    public AreaCounter </w:t>
-            </w:r>
-            <w:proofErr w:type="spellStart"/>
-            <w:r>
-              <w:t>getAreaCount</w:t>
-            </w:r>
-            <w:proofErr w:type="spellEnd"/>
-            <w:r>
-              <w:t xml:space="preserve">() throws </w:t>
+              <w:t>(</w:t>
+            </w:r>
+            <w:proofErr w:type="gramEnd"/>
+            <w:r>
+              <w:t xml:space="preserve">) throws </w:t>
             </w:r>
             <w:proofErr w:type="spellStart"/>
             <w:r>
@@ -3255,14 +3431,25 @@
       <w:pPr>
         <w:pStyle w:val="ab"/>
       </w:pPr>
-      <w:fldSimple w:instr=" SEQ Формула \* ARABIC ">
-        <w:r>
-          <w:rPr>
-            <w:noProof/>
-          </w:rPr>
-          <w:t>2</w:t>
-        </w:r>
-      </w:fldSimple>
+      <w:r>
+        <w:lastRenderedPageBreak/>
+        <w:fldChar w:fldCharType="begin"/>
+      </w:r>
+      <w:r>
+        <w:instrText xml:space="preserve"> SEQ Формула \* ARABIC </w:instrText>
+      </w:r>
+      <w:r>
+        <w:fldChar w:fldCharType="separate"/>
+      </w:r>
+      <w:r>
+        <w:rPr>
+          <w:noProof/>
+        </w:rPr>
+        <w:t>2</w:t>
+      </w:r>
+      <w:r>
+        <w:fldChar w:fldCharType="end"/>
+      </w:r>
       <w:r>
         <w:rPr>
           <w:lang w:val="ru-RU"/>
@@ -3614,10 +3801,20 @@
               <w:t xml:space="preserve">import </w:t>
             </w:r>
             <w:proofErr w:type="spellStart"/>
-            <w:r>
-              <w:t>org.springframework.jmx.export.annotation.ManagedAttribute</w:t>
+            <w:proofErr w:type="gramStart"/>
+            <w:r>
+              <w:t>org.springframework.jmx.export</w:t>
+            </w:r>
+            <w:proofErr w:type="gramEnd"/>
+            <w:r>
+              <w:t>.</w:t>
+            </w:r>
+            <w:proofErr w:type="gramStart"/>
+            <w:r>
+              <w:t>annotation.ManagedAttribute</w:t>
             </w:r>
             <w:proofErr w:type="spellEnd"/>
+            <w:proofErr w:type="gramEnd"/>
             <w:r>
               <w:t>;</w:t>
             </w:r>
@@ -3630,10 +3827,20 @@
               <w:t xml:space="preserve">import </w:t>
             </w:r>
             <w:proofErr w:type="spellStart"/>
-            <w:r>
-              <w:t>org.springframework.jmx.export.annotation.ManagedResource</w:t>
+            <w:proofErr w:type="gramStart"/>
+            <w:r>
+              <w:t>org.springframework.jmx.export</w:t>
+            </w:r>
+            <w:proofErr w:type="gramEnd"/>
+            <w:r>
+              <w:t>.</w:t>
+            </w:r>
+            <w:proofErr w:type="gramStart"/>
+            <w:r>
+              <w:t>annotation.ManagedResource</w:t>
             </w:r>
             <w:proofErr w:type="spellEnd"/>
+            <w:proofErr w:type="gramEnd"/>
             <w:r>
               <w:t>;</w:t>
             </w:r>
@@ -3646,10 +3853,20 @@
               <w:t xml:space="preserve">import </w:t>
             </w:r>
             <w:proofErr w:type="spellStart"/>
-            <w:r>
-              <w:t>org.springframework.stereotype.Component</w:t>
+            <w:proofErr w:type="gramStart"/>
+            <w:r>
+              <w:t>org.springframework</w:t>
+            </w:r>
+            <w:proofErr w:type="gramEnd"/>
+            <w:r>
+              <w:t>.</w:t>
+            </w:r>
+            <w:proofErr w:type="gramStart"/>
+            <w:r>
+              <w:t>stereotype.Component</w:t>
             </w:r>
             <w:proofErr w:type="spellEnd"/>
+            <w:proofErr w:type="gramEnd"/>
             <w:r>
               <w:t>;</w:t>
             </w:r>
@@ -3679,10 +3896,16 @@
             <w:pPr>
               <w:pStyle w:val="ac"/>
             </w:pPr>
-            <w:r>
-              <w:t xml:space="preserve">public class </w:t>
+            <w:proofErr w:type="gramStart"/>
+            <w:r>
+              <w:t>public</w:t>
+            </w:r>
+            <w:proofErr w:type="gramEnd"/>
+            <w:r>
+              <w:t xml:space="preserve"> class </w:t>
             </w:r>
             <w:proofErr w:type="spellStart"/>
+            <w:proofErr w:type="gramStart"/>
             <w:r>
               <w:t>MissPercentage</w:t>
             </w:r>
@@ -3690,6 +3913,7 @@
             <w:r>
               <w:t>{</w:t>
             </w:r>
+            <w:proofErr w:type="gramEnd"/>
           </w:p>
           <w:p>
             <w:pPr>
@@ -3707,21 +3931,36 @@
               <w:t xml:space="preserve">    public void </w:t>
             </w:r>
             <w:proofErr w:type="spellStart"/>
+            <w:proofErr w:type="gramStart"/>
             <w:r>
               <w:t>setPercentage</w:t>
             </w:r>
             <w:proofErr w:type="spellEnd"/>
             <w:r>
-              <w:t>(int clicks, int misses){</w:t>
-            </w:r>
-          </w:p>
-          <w:p>
-            <w:pPr>
-              <w:pStyle w:val="ac"/>
-            </w:pPr>
-            <w:r>
-              <w:t xml:space="preserve">        if (clicks == 0) {</w:t>
-            </w:r>
+              <w:t>(</w:t>
+            </w:r>
+            <w:proofErr w:type="gramEnd"/>
+            <w:r>
+              <w:t xml:space="preserve">int clicks, int </w:t>
+            </w:r>
+            <w:proofErr w:type="gramStart"/>
+            <w:r>
+              <w:t>misses){</w:t>
+            </w:r>
+            <w:proofErr w:type="gramEnd"/>
+          </w:p>
+          <w:p>
+            <w:pPr>
+              <w:pStyle w:val="ac"/>
+            </w:pPr>
+            <w:r>
+              <w:t xml:space="preserve">        if (clicks == </w:t>
+            </w:r>
+            <w:proofErr w:type="gramStart"/>
+            <w:r>
+              <w:t>0) {</w:t>
+            </w:r>
+            <w:proofErr w:type="gramEnd"/>
           </w:p>
           <w:p>
             <w:pPr>
@@ -3747,10 +3986,12 @@
               <w:t xml:space="preserve">            </w:t>
             </w:r>
             <w:proofErr w:type="spellStart"/>
+            <w:proofErr w:type="gramStart"/>
             <w:r>
               <w:t>this.percentage</w:t>
             </w:r>
             <w:proofErr w:type="spellEnd"/>
+            <w:proofErr w:type="gramEnd"/>
             <w:r>
               <w:t xml:space="preserve"> = 0;</w:t>
             </w:r>
@@ -3779,10 +4020,12 @@
               <w:t xml:space="preserve">            </w:t>
             </w:r>
             <w:proofErr w:type="spellStart"/>
+            <w:proofErr w:type="gramStart"/>
             <w:r>
               <w:t>this.percentage</w:t>
             </w:r>
             <w:proofErr w:type="spellEnd"/>
+            <w:proofErr w:type="gramEnd"/>
             <w:r>
               <w:t xml:space="preserve"> = (double) 100 * misses / clicks;</w:t>
             </w:r>
@@ -3819,12 +4062,17 @@
               <w:t xml:space="preserve">    public double </w:t>
             </w:r>
             <w:proofErr w:type="spellStart"/>
+            <w:proofErr w:type="gramStart"/>
             <w:r>
               <w:t>getPercentage</w:t>
             </w:r>
             <w:proofErr w:type="spellEnd"/>
             <w:r>
-              <w:t>() {</w:t>
+              <w:t>(</w:t>
+            </w:r>
+            <w:proofErr w:type="gramEnd"/>
+            <w:r>
+              <w:t>) {</w:t>
             </w:r>
           </w:p>
           <w:p>
@@ -3858,14 +4106,24 @@
       <w:pPr>
         <w:pStyle w:val="ab"/>
       </w:pPr>
-      <w:fldSimple w:instr=" SEQ Формула \* ARABIC ">
-        <w:r>
-          <w:rPr>
-            <w:noProof/>
-          </w:rPr>
-          <w:t>3</w:t>
-        </w:r>
-      </w:fldSimple>
+      <w:r>
+        <w:fldChar w:fldCharType="begin"/>
+      </w:r>
+      <w:r>
+        <w:instrText xml:space="preserve"> SEQ Формула \* ARABIC </w:instrText>
+      </w:r>
+      <w:r>
+        <w:fldChar w:fldCharType="separate"/>
+      </w:r>
+      <w:r>
+        <w:rPr>
+          <w:noProof/>
+        </w:rPr>
+        <w:t>3</w:t>
+      </w:r>
+      <w:r>
+        <w:fldChar w:fldCharType="end"/>
+      </w:r>
       <w:r>
         <w:rPr>
           <w:lang w:val="ru-RU"/>
@@ -4061,12 +4319,17 @@
               <w:t xml:space="preserve"> = new </w:t>
             </w:r>
             <w:proofErr w:type="spellStart"/>
+            <w:proofErr w:type="gramStart"/>
             <w:r>
               <w:t>GaugeMonitor</w:t>
             </w:r>
             <w:proofErr w:type="spellEnd"/>
             <w:r>
-              <w:t>();</w:t>
+              <w:t>(</w:t>
+            </w:r>
+            <w:proofErr w:type="gramEnd"/>
+            <w:r>
+              <w:t>);</w:t>
             </w:r>
           </w:p>
           <w:p>
@@ -4079,7 +4342,15 @@
             </w:r>
             <w:proofErr w:type="spellEnd"/>
             <w:r>
-              <w:t xml:space="preserve"> object = ObjectName.getInstance("ru.ifmo.se.s467549.jmx:name=pointsCounter,type=PointsCounter");</w:t>
+              <w:t xml:space="preserve"> object = ObjectName.getInstance("ru.ifmo.se.s467549.jmx:name=</w:t>
+            </w:r>
+            <w:proofErr w:type="gramStart"/>
+            <w:r>
+              <w:t>pointsCounter,type</w:t>
+            </w:r>
+            <w:proofErr w:type="gramEnd"/>
+            <w:r>
+              <w:t>=PointsCounter");</w:t>
             </w:r>
           </w:p>
           <w:p>
@@ -4232,12 +4503,17 @@
               <w:t xml:space="preserve"> = new </w:t>
             </w:r>
             <w:proofErr w:type="spellStart"/>
+            <w:proofErr w:type="gramStart"/>
             <w:r>
               <w:t>CounterMonitor</w:t>
             </w:r>
             <w:proofErr w:type="spellEnd"/>
             <w:r>
-              <w:t>();</w:t>
+              <w:t>(</w:t>
+            </w:r>
+            <w:proofErr w:type="gramEnd"/>
+            <w:r>
+              <w:t>);</w:t>
             </w:r>
           </w:p>
           <w:p>
@@ -4258,7 +4534,15 @@
             </w:r>
             <w:proofErr w:type="spellEnd"/>
             <w:r>
-              <w:t xml:space="preserve"> = ObjectName.getInstance("ru.ifmo.se.s467549.jmx:name=pointsCounter,type=PointsCounter");</w:t>
+              <w:t xml:space="preserve"> = ObjectName.getInstance("ru.ifmo.se.s467549.jmx:name=</w:t>
+            </w:r>
+            <w:proofErr w:type="gramStart"/>
+            <w:r>
+              <w:t>pointsCounter,type</w:t>
+            </w:r>
+            <w:proofErr w:type="gramEnd"/>
+            <w:r>
+              <w:t>=PointsCounter");</w:t>
             </w:r>
           </w:p>
           <w:p>
@@ -4318,7 +4602,15 @@
             </w:r>
             <w:proofErr w:type="spellEnd"/>
             <w:r>
-              <w:t>(100)cons;</w:t>
+              <w:t>(</w:t>
+            </w:r>
+            <w:proofErr w:type="gramStart"/>
+            <w:r>
+              <w:t>100)cons</w:t>
+            </w:r>
+            <w:proofErr w:type="gramEnd"/>
+            <w:r>
+              <w:t>;</w:t>
             </w:r>
           </w:p>
           <w:p>
@@ -4521,10 +4813,12 @@
               <w:t xml:space="preserve">import </w:t>
             </w:r>
             <w:proofErr w:type="spellStart"/>
+            <w:proofErr w:type="gramStart"/>
             <w:r>
               <w:t>jdk.jfr.Category</w:t>
             </w:r>
             <w:proofErr w:type="spellEnd"/>
+            <w:proofErr w:type="gramEnd"/>
             <w:r>
               <w:t>;</w:t>
             </w:r>
@@ -4537,10 +4831,12 @@
               <w:t xml:space="preserve">import </w:t>
             </w:r>
             <w:proofErr w:type="spellStart"/>
+            <w:proofErr w:type="gramStart"/>
             <w:r>
               <w:t>jdk.jfr.Event</w:t>
             </w:r>
             <w:proofErr w:type="spellEnd"/>
+            <w:proofErr w:type="gramEnd"/>
             <w:r>
               <w:t>;</w:t>
             </w:r>
@@ -4553,10 +4849,12 @@
               <w:t xml:space="preserve">import </w:t>
             </w:r>
             <w:proofErr w:type="spellStart"/>
+            <w:proofErr w:type="gramStart"/>
             <w:r>
               <w:t>jdk.jfr.Label</w:t>
             </w:r>
             <w:proofErr w:type="spellEnd"/>
+            <w:proofErr w:type="gramEnd"/>
             <w:r>
               <w:t>;</w:t>
             </w:r>
@@ -4569,10 +4867,12 @@
               <w:t xml:space="preserve">import </w:t>
             </w:r>
             <w:proofErr w:type="spellStart"/>
+            <w:proofErr w:type="gramStart"/>
             <w:r>
               <w:t>jdk.jfr.Threshold</w:t>
             </w:r>
             <w:proofErr w:type="spellEnd"/>
+            <w:proofErr w:type="gramEnd"/>
             <w:r>
               <w:t>;</w:t>
             </w:r>
@@ -4587,7 +4887,15 @@
               <w:pStyle w:val="ac"/>
             </w:pPr>
             <w:r>
-              <w:t>@Category({"Lab event", "</w:t>
+              <w:t>@</w:t>
+            </w:r>
+            <w:proofErr w:type="gramStart"/>
+            <w:r>
+              <w:t>Category(</w:t>
+            </w:r>
+            <w:proofErr w:type="gramEnd"/>
+            <w:r>
+              <w:t>{"Lab event", "</w:t>
             </w:r>
             <w:proofErr w:type="spellStart"/>
             <w:r>
@@ -4602,16 +4910,29 @@
             <w:pPr>
               <w:pStyle w:val="ac"/>
             </w:pPr>
-            <w:r>
-              <w:t>@Label("PointMiss")</w:t>
-            </w:r>
-          </w:p>
-          <w:p>
-            <w:pPr>
-              <w:pStyle w:val="ac"/>
-            </w:pPr>
-            <w:r>
-              <w:t xml:space="preserve">@Threshold("0 </w:t>
+            <w:proofErr w:type="gramStart"/>
+            <w:r>
+              <w:t>@Label</w:t>
+            </w:r>
+            <w:proofErr w:type="gramEnd"/>
+            <w:r>
+              <w:t>("PointMiss")</w:t>
+            </w:r>
+          </w:p>
+          <w:p>
+            <w:pPr>
+              <w:pStyle w:val="ac"/>
+            </w:pPr>
+            <w:r>
+              <w:t>@</w:t>
+            </w:r>
+            <w:proofErr w:type="gramStart"/>
+            <w:r>
+              <w:t>Threshold(</w:t>
+            </w:r>
+            <w:proofErr w:type="gramEnd"/>
+            <w:r>
+              <w:t xml:space="preserve">"0 </w:t>
             </w:r>
             <w:proofErr w:type="spellStart"/>
             <w:r>
@@ -4686,10 +5007,12 @@
               <w:t xml:space="preserve">import </w:t>
             </w:r>
             <w:proofErr w:type="spellStart"/>
+            <w:proofErr w:type="gramStart"/>
             <w:r>
               <w:t>jdk.jfr.Category</w:t>
             </w:r>
             <w:proofErr w:type="spellEnd"/>
+            <w:proofErr w:type="gramEnd"/>
             <w:r>
               <w:t>;</w:t>
             </w:r>
@@ -4702,10 +5025,12 @@
               <w:t xml:space="preserve">import </w:t>
             </w:r>
             <w:proofErr w:type="spellStart"/>
+            <w:proofErr w:type="gramStart"/>
             <w:r>
               <w:t>jdk.jfr.Event</w:t>
             </w:r>
             <w:proofErr w:type="spellEnd"/>
+            <w:proofErr w:type="gramEnd"/>
             <w:r>
               <w:t>;</w:t>
             </w:r>
@@ -4718,10 +5043,12 @@
               <w:t xml:space="preserve">import </w:t>
             </w:r>
             <w:proofErr w:type="spellStart"/>
+            <w:proofErr w:type="gramStart"/>
             <w:r>
               <w:t>jdk.jfr.Label</w:t>
             </w:r>
             <w:proofErr w:type="spellEnd"/>
+            <w:proofErr w:type="gramEnd"/>
             <w:r>
               <w:t>;</w:t>
             </w:r>
@@ -4734,10 +5061,12 @@
               <w:t xml:space="preserve">import </w:t>
             </w:r>
             <w:proofErr w:type="spellStart"/>
+            <w:proofErr w:type="gramStart"/>
             <w:r>
               <w:t>jdk.jfr.Threshold</w:t>
             </w:r>
             <w:proofErr w:type="spellEnd"/>
+            <w:proofErr w:type="gramEnd"/>
             <w:r>
               <w:t>;</w:t>
             </w:r>
@@ -4752,7 +5081,15 @@
               <w:pStyle w:val="ac"/>
             </w:pPr>
             <w:r>
-              <w:t>@Category({"Lab event", "</w:t>
+              <w:t>@</w:t>
+            </w:r>
+            <w:proofErr w:type="gramStart"/>
+            <w:r>
+              <w:t>Category(</w:t>
+            </w:r>
+            <w:proofErr w:type="gramEnd"/>
+            <w:r>
+              <w:t>{"Lab event", "</w:t>
             </w:r>
             <w:proofErr w:type="spellStart"/>
             <w:r>
@@ -4767,16 +5104,29 @@
             <w:pPr>
               <w:pStyle w:val="ac"/>
             </w:pPr>
-            <w:r>
-              <w:t>@Label("PointSet")</w:t>
-            </w:r>
-          </w:p>
-          <w:p>
-            <w:pPr>
-              <w:pStyle w:val="ac"/>
-            </w:pPr>
-            <w:r>
-              <w:t xml:space="preserve">@Threshold("0 </w:t>
+            <w:proofErr w:type="gramStart"/>
+            <w:r>
+              <w:t>@Label</w:t>
+            </w:r>
+            <w:proofErr w:type="gramEnd"/>
+            <w:r>
+              <w:t>("PointSet")</w:t>
+            </w:r>
+          </w:p>
+          <w:p>
+            <w:pPr>
+              <w:pStyle w:val="ac"/>
+            </w:pPr>
+            <w:r>
+              <w:t>@</w:t>
+            </w:r>
+            <w:proofErr w:type="gramStart"/>
+            <w:r>
+              <w:t>Threshold(</w:t>
+            </w:r>
+            <w:proofErr w:type="gramEnd"/>
+            <w:r>
+              <w:t xml:space="preserve">"0 </w:t>
             </w:r>
             <w:proofErr w:type="spellStart"/>
             <w:r>
@@ -4791,8 +5141,13 @@
             <w:pPr>
               <w:pStyle w:val="ac"/>
             </w:pPr>
-            <w:r>
-              <w:t xml:space="preserve">public class </w:t>
+            <w:proofErr w:type="gramStart"/>
+            <w:r>
+              <w:t>public</w:t>
+            </w:r>
+            <w:proofErr w:type="gramEnd"/>
+            <w:r>
+              <w:t xml:space="preserve"> class </w:t>
             </w:r>
             <w:proofErr w:type="spellStart"/>
             <w:r>
@@ -5180,12 +5535,534 @@
     </w:p>
     <w:p>
       <w:pPr>
+        <w:pStyle w:val="2"/>
+        <w:rPr>
+          <w:lang w:val="ru-RU"/>
+        </w:rPr>
+      </w:pPr>
+      <w:bookmarkStart w:id="6" w:name="_Toc237713316"/>
+      <w:r>
+        <w:rPr>
+          <w:lang w:val="ru-RU"/>
+        </w:rPr>
+        <w:lastRenderedPageBreak/>
+        <w:t>Удалённый мониторинг</w:t>
+      </w:r>
+    </w:p>
+    <w:p>
+      <w:pPr>
+        <w:pStyle w:val="3"/>
+        <w:rPr>
+          <w:lang w:val="ru-RU"/>
+        </w:rPr>
+      </w:pPr>
+      <w:r>
+        <w:rPr>
+          <w:lang w:val="ru-RU"/>
+        </w:rPr>
+        <w:t>Подключение без защиты соединения</w:t>
+      </w:r>
+    </w:p>
+    <w:p>
+      <w:pPr>
+        <w:pStyle w:val="ae"/>
+      </w:pPr>
+      <w:r>
+        <w:t>Для удалённого подключения приложение было размещено в контейнере. Дополнительных файлов конфигурации удалённое незащищённое подключение не требует. Конфигурация JVM задаётся следующим набором флагов</w:t>
+      </w:r>
+      <w:r>
+        <w:t>:</w:t>
+      </w:r>
+    </w:p>
+    <w:p>
+      <w:pPr>
+        <w:pStyle w:val="ae"/>
+        <w:numPr>
+          <w:ilvl w:val="0"/>
+          <w:numId w:val="29"/>
+        </w:numPr>
+        <w:jc w:val="left"/>
+      </w:pPr>
+      <w:proofErr w:type="gramStart"/>
+      <w:r>
+        <w:t>-</w:t>
+      </w:r>
+      <w:proofErr w:type="spellStart"/>
+      <w:r>
+        <w:rPr>
+          <w:lang w:val="en-US"/>
+        </w:rPr>
+        <w:t>Dcom</w:t>
+      </w:r>
+      <w:proofErr w:type="spellEnd"/>
+      <w:r>
+        <w:t>.</w:t>
+      </w:r>
+      <w:r>
+        <w:rPr>
+          <w:lang w:val="en-US"/>
+        </w:rPr>
+        <w:t>sun</w:t>
+      </w:r>
+      <w:r>
+        <w:t>.</w:t>
+      </w:r>
+      <w:r>
+        <w:rPr>
+          <w:lang w:val="en-US"/>
+        </w:rPr>
+        <w:t>management</w:t>
+      </w:r>
+      <w:r>
+        <w:t>.</w:t>
+      </w:r>
+      <w:proofErr w:type="spellStart"/>
+      <w:r>
+        <w:rPr>
+          <w:lang w:val="en-US"/>
+        </w:rPr>
+        <w:t>jmxremote</w:t>
+      </w:r>
+      <w:proofErr w:type="spellEnd"/>
+      <w:proofErr w:type="gramEnd"/>
+      <w:r>
+        <w:t>.</w:t>
+      </w:r>
+      <w:r>
+        <w:rPr>
+          <w:lang w:val="en-US"/>
+        </w:rPr>
+        <w:t>port</w:t>
+      </w:r>
+      <w:r>
+        <w:t>=8888</w:t>
+      </w:r>
+      <w:r>
+        <w:t xml:space="preserve"> </w:t>
+      </w:r>
+      <w:r>
+        <w:t>порт</w:t>
+      </w:r>
+      <w:r>
+        <w:t xml:space="preserve"> </w:t>
+      </w:r>
+      <w:r>
+        <w:t xml:space="preserve">реестра для получения </w:t>
+      </w:r>
+      <w:r>
+        <w:t xml:space="preserve">коннектора </w:t>
+      </w:r>
+      <w:proofErr w:type="spellStart"/>
+      <w:r>
+        <w:rPr>
+          <w:lang w:val="en-US"/>
+        </w:rPr>
+        <w:t>jmxrmi</w:t>
+      </w:r>
+      <w:proofErr w:type="spellEnd"/>
+    </w:p>
+    <w:p>
+      <w:pPr>
+        <w:pStyle w:val="ae"/>
+        <w:numPr>
+          <w:ilvl w:val="0"/>
+          <w:numId w:val="29"/>
+        </w:numPr>
+        <w:jc w:val="left"/>
+      </w:pPr>
+      <w:r>
+        <w:t>-</w:t>
+      </w:r>
+      <w:proofErr w:type="spellStart"/>
+      <w:r>
+        <w:rPr>
+          <w:lang w:val="en-US"/>
+        </w:rPr>
+        <w:t>Dcom</w:t>
+      </w:r>
+      <w:proofErr w:type="spellEnd"/>
+      <w:r>
+        <w:t>.</w:t>
+      </w:r>
+      <w:r>
+        <w:rPr>
+          <w:lang w:val="en-US"/>
+        </w:rPr>
+        <w:t>sun</w:t>
+      </w:r>
+      <w:r>
+        <w:t>.</w:t>
+      </w:r>
+      <w:r>
+        <w:rPr>
+          <w:lang w:val="en-US"/>
+        </w:rPr>
+        <w:t>management</w:t>
+      </w:r>
+      <w:r>
+        <w:t>.</w:t>
+      </w:r>
+      <w:proofErr w:type="spellStart"/>
+      <w:r>
+        <w:rPr>
+          <w:lang w:val="en-US"/>
+        </w:rPr>
+        <w:t>jmxremote</w:t>
+      </w:r>
+      <w:proofErr w:type="spellEnd"/>
+      <w:r>
+        <w:t>.</w:t>
+      </w:r>
+      <w:proofErr w:type="spellStart"/>
+      <w:r>
+        <w:rPr>
+          <w:lang w:val="en-US"/>
+        </w:rPr>
+        <w:t>rmi</w:t>
+      </w:r>
+      <w:proofErr w:type="spellEnd"/>
+      <w:r>
+        <w:t>.</w:t>
+      </w:r>
+      <w:r>
+        <w:rPr>
+          <w:lang w:val="en-US"/>
+        </w:rPr>
+        <w:t>port</w:t>
+      </w:r>
+      <w:r>
+        <w:t>=8889</w:t>
+      </w:r>
+      <w:r>
+        <w:t xml:space="preserve"> </w:t>
+      </w:r>
+      <w:r>
+        <w:t>порт для обмена данными</w:t>
+      </w:r>
+      <w:r>
+        <w:t xml:space="preserve"> </w:t>
+      </w:r>
+      <w:proofErr w:type="spellStart"/>
+      <w:r>
+        <w:rPr>
+          <w:lang w:val="en-US"/>
+        </w:rPr>
+        <w:t>rmi</w:t>
+      </w:r>
+      <w:proofErr w:type="spellEnd"/>
+      <w:r>
+        <w:t xml:space="preserve"> </w:t>
+      </w:r>
+      <w:r>
+        <w:rPr>
+          <w:lang w:val="en-US"/>
+        </w:rPr>
+        <w:t>connector</w:t>
+      </w:r>
+    </w:p>
+    <w:p>
+      <w:pPr>
+        <w:pStyle w:val="ae"/>
+        <w:numPr>
+          <w:ilvl w:val="0"/>
+          <w:numId w:val="29"/>
+        </w:numPr>
+        <w:jc w:val="left"/>
+      </w:pPr>
+      <w:proofErr w:type="gramStart"/>
+      <w:r>
+        <w:t>-</w:t>
+      </w:r>
+      <w:proofErr w:type="spellStart"/>
+      <w:r>
+        <w:rPr>
+          <w:lang w:val="en-US"/>
+        </w:rPr>
+        <w:t>Dcom</w:t>
+      </w:r>
+      <w:proofErr w:type="spellEnd"/>
+      <w:r>
+        <w:t>.</w:t>
+      </w:r>
+      <w:r>
+        <w:rPr>
+          <w:lang w:val="en-US"/>
+        </w:rPr>
+        <w:t>sun</w:t>
+      </w:r>
+      <w:r>
+        <w:t>.</w:t>
+      </w:r>
+      <w:r>
+        <w:rPr>
+          <w:lang w:val="en-US"/>
+        </w:rPr>
+        <w:t>management</w:t>
+      </w:r>
+      <w:r>
+        <w:t>.</w:t>
+      </w:r>
+      <w:proofErr w:type="spellStart"/>
+      <w:r>
+        <w:rPr>
+          <w:lang w:val="en-US"/>
+        </w:rPr>
+        <w:t>jmxremote</w:t>
+      </w:r>
+      <w:proofErr w:type="spellEnd"/>
+      <w:proofErr w:type="gramEnd"/>
+      <w:r>
+        <w:t>.</w:t>
+      </w:r>
+      <w:r>
+        <w:rPr>
+          <w:lang w:val="en-US"/>
+        </w:rPr>
+        <w:t>authenticate</w:t>
+      </w:r>
+      <w:r>
+        <w:t>=</w:t>
+      </w:r>
+      <w:r>
+        <w:rPr>
+          <w:lang w:val="en-US"/>
+        </w:rPr>
+        <w:t>false</w:t>
+      </w:r>
+      <w:r>
+        <w:t xml:space="preserve"> </w:t>
+      </w:r>
+      <w:r>
+        <w:t>отмена</w:t>
+      </w:r>
+      <w:r>
+        <w:t xml:space="preserve"> </w:t>
+      </w:r>
+      <w:r>
+        <w:t>подключения</w:t>
+      </w:r>
+      <w:r>
+        <w:t xml:space="preserve"> </w:t>
+      </w:r>
+      <w:r>
+        <w:t>по</w:t>
+      </w:r>
+      <w:r>
+        <w:t xml:space="preserve"> </w:t>
+      </w:r>
+      <w:r>
+        <w:t>паролю</w:t>
+      </w:r>
+    </w:p>
+    <w:p>
+      <w:pPr>
+        <w:pStyle w:val="ae"/>
+        <w:numPr>
+          <w:ilvl w:val="0"/>
+          <w:numId w:val="29"/>
+        </w:numPr>
+        <w:jc w:val="left"/>
+      </w:pPr>
+      <w:r>
+        <w:t>-</w:t>
+      </w:r>
+      <w:proofErr w:type="spellStart"/>
+      <w:r>
+        <w:rPr>
+          <w:lang w:val="en-US"/>
+        </w:rPr>
+        <w:t>Dcom</w:t>
+      </w:r>
+      <w:proofErr w:type="spellEnd"/>
+      <w:r>
+        <w:t>.</w:t>
+      </w:r>
+      <w:r>
+        <w:rPr>
+          <w:lang w:val="en-US"/>
+        </w:rPr>
+        <w:t>sun</w:t>
+      </w:r>
+      <w:r>
+        <w:t>.</w:t>
+      </w:r>
+      <w:r>
+        <w:rPr>
+          <w:lang w:val="en-US"/>
+        </w:rPr>
+        <w:t>management</w:t>
+      </w:r>
+      <w:r>
+        <w:t>.</w:t>
+      </w:r>
+      <w:proofErr w:type="spellStart"/>
+      <w:r>
+        <w:rPr>
+          <w:lang w:val="en-US"/>
+        </w:rPr>
+        <w:t>jmxremote</w:t>
+      </w:r>
+      <w:proofErr w:type="spellEnd"/>
+      <w:r>
+        <w:t>.</w:t>
+      </w:r>
+      <w:proofErr w:type="spellStart"/>
+      <w:r>
+        <w:rPr>
+          <w:lang w:val="en-US"/>
+        </w:rPr>
+        <w:t>ssl</w:t>
+      </w:r>
+      <w:proofErr w:type="spellEnd"/>
+      <w:r>
+        <w:t>=</w:t>
+      </w:r>
+      <w:r>
+        <w:rPr>
+          <w:lang w:val="en-US"/>
+        </w:rPr>
+        <w:t>false</w:t>
+      </w:r>
+      <w:r>
+        <w:t xml:space="preserve"> </w:t>
+      </w:r>
+      <w:r>
+        <w:t>отмена</w:t>
+      </w:r>
+      <w:r>
+        <w:t xml:space="preserve"> </w:t>
+      </w:r>
+      <w:r>
+        <w:t xml:space="preserve">подключения по </w:t>
+      </w:r>
+      <w:proofErr w:type="spellStart"/>
+      <w:r>
+        <w:rPr>
+          <w:lang w:val="en-US"/>
+        </w:rPr>
+        <w:t>ssl</w:t>
+      </w:r>
+      <w:proofErr w:type="spellEnd"/>
+    </w:p>
+    <w:p>
+      <w:pPr>
+        <w:pStyle w:val="ae"/>
+        <w:numPr>
+          <w:ilvl w:val="0"/>
+          <w:numId w:val="29"/>
+        </w:numPr>
+        <w:jc w:val="left"/>
+      </w:pPr>
+      <w:proofErr w:type="gramStart"/>
+      <w:r>
+        <w:t>-</w:t>
+      </w:r>
+      <w:proofErr w:type="spellStart"/>
+      <w:r>
+        <w:rPr>
+          <w:lang w:val="en-US"/>
+        </w:rPr>
+        <w:t>Djava</w:t>
+      </w:r>
+      <w:proofErr w:type="spellEnd"/>
+      <w:r>
+        <w:t>.</w:t>
+      </w:r>
+      <w:proofErr w:type="spellStart"/>
+      <w:r>
+        <w:rPr>
+          <w:lang w:val="en-US"/>
+        </w:rPr>
+        <w:t>rmi</w:t>
+      </w:r>
+      <w:proofErr w:type="spellEnd"/>
+      <w:r>
+        <w:t>.</w:t>
+      </w:r>
+      <w:r>
+        <w:rPr>
+          <w:lang w:val="en-US"/>
+        </w:rPr>
+        <w:t>server</w:t>
+      </w:r>
+      <w:r>
+        <w:t>.</w:t>
+      </w:r>
+      <w:r>
+        <w:rPr>
+          <w:lang w:val="en-US"/>
+        </w:rPr>
+        <w:t>hostname</w:t>
+      </w:r>
+      <w:proofErr w:type="gramEnd"/>
+      <w:r>
+        <w:t>=127.0.0.1</w:t>
+      </w:r>
+      <w:r>
+        <w:t xml:space="preserve"> </w:t>
+      </w:r>
+      <w:r>
+        <w:t>для</w:t>
+      </w:r>
+      <w:r>
+        <w:t xml:space="preserve"> </w:t>
+      </w:r>
+      <w:r>
+        <w:t>того</w:t>
+      </w:r>
+      <w:r>
+        <w:t xml:space="preserve">, </w:t>
+      </w:r>
+      <w:r>
+        <w:t>чтобы</w:t>
+      </w:r>
+      <w:r>
+        <w:t xml:space="preserve"> </w:t>
+      </w:r>
+      <w:r>
+        <w:rPr>
+          <w:lang w:val="en-US"/>
+        </w:rPr>
+        <w:t>remote</w:t>
+      </w:r>
+      <w:r>
+        <w:t xml:space="preserve"> </w:t>
+      </w:r>
+      <w:r>
+        <w:rPr>
+          <w:lang w:val="en-US"/>
+        </w:rPr>
+        <w:t>stub</w:t>
+      </w:r>
+      <w:r>
+        <w:t xml:space="preserve"> был указан реальный адрес, а не адрес сети </w:t>
+      </w:r>
+      <w:r>
+        <w:rPr>
+          <w:lang w:val="en-US"/>
+        </w:rPr>
+        <w:t>Docker</w:t>
+      </w:r>
+    </w:p>
+    <w:p>
+      <w:pPr>
+        <w:pStyle w:val="ae"/>
+        <w:rPr>
+          <w:sz w:val="48"/>
+          <w:szCs w:val="48"/>
+        </w:rPr>
+      </w:pPr>
+      <w:r>
+        <w:br w:type="page"/>
+      </w:r>
+    </w:p>
+    <w:p>
+      <w:pPr>
         <w:pStyle w:val="1"/>
         <w:rPr>
           <w:lang w:val="ru-RU"/>
         </w:rPr>
       </w:pPr>
-      <w:bookmarkStart w:id="6" w:name="_Toc237713316"/>
       <w:r>
         <w:rPr>
           <w:lang w:val="ru-RU"/>
@@ -7178,6 +8055,119 @@
     </w:lvl>
   </w:abstractNum>
   <w:abstractNum w:abstractNumId="11" w15:restartNumberingAfterBreak="0">
+    <w:nsid w:val="423661A6"/>
+    <w:multiLevelType w:val="hybridMultilevel"/>
+    <w:tmpl w:val="C7823DF2"/>
+    <w:lvl w:ilvl="0" w:tplc="E8A6E778">
+      <w:start w:val="1"/>
+      <w:numFmt w:val="bullet"/>
+      <w:lvlText w:val=""/>
+      <w:lvlJc w:val="left"/>
+      <w:pPr>
+        <w:ind w:left="1287" w:hanging="360"/>
+      </w:pPr>
+      <w:rPr>
+        <w:rFonts w:ascii="Symbol" w:hAnsi="Symbol" w:hint="default"/>
+      </w:rPr>
+    </w:lvl>
+    <w:lvl w:ilvl="1" w:tplc="04190003" w:tentative="1">
+      <w:start w:val="1"/>
+      <w:numFmt w:val="bullet"/>
+      <w:lvlText w:val="o"/>
+      <w:lvlJc w:val="left"/>
+      <w:pPr>
+        <w:ind w:left="2007" w:hanging="360"/>
+      </w:pPr>
+      <w:rPr>
+        <w:rFonts w:ascii="Courier New" w:hAnsi="Courier New" w:cs="Courier New" w:hint="default"/>
+      </w:rPr>
+    </w:lvl>
+    <w:lvl w:ilvl="2" w:tplc="04190005" w:tentative="1">
+      <w:start w:val="1"/>
+      <w:numFmt w:val="bullet"/>
+      <w:lvlText w:val=""/>
+      <w:lvlJc w:val="left"/>
+      <w:pPr>
+        <w:ind w:left="2727" w:hanging="360"/>
+      </w:pPr>
+      <w:rPr>
+        <w:rFonts w:ascii="Wingdings" w:hAnsi="Wingdings" w:hint="default"/>
+      </w:rPr>
+    </w:lvl>
+    <w:lvl w:ilvl="3" w:tplc="04190001" w:tentative="1">
+      <w:start w:val="1"/>
+      <w:numFmt w:val="bullet"/>
+      <w:lvlText w:val=""/>
+      <w:lvlJc w:val="left"/>
+      <w:pPr>
+        <w:ind w:left="3447" w:hanging="360"/>
+      </w:pPr>
+      <w:rPr>
+        <w:rFonts w:ascii="Symbol" w:hAnsi="Symbol" w:hint="default"/>
+      </w:rPr>
+    </w:lvl>
+    <w:lvl w:ilvl="4" w:tplc="04190003" w:tentative="1">
+      <w:start w:val="1"/>
+      <w:numFmt w:val="bullet"/>
+      <w:lvlText w:val="o"/>
+      <w:lvlJc w:val="left"/>
+      <w:pPr>
+        <w:ind w:left="4167" w:hanging="360"/>
+      </w:pPr>
+      <w:rPr>
+        <w:rFonts w:ascii="Courier New" w:hAnsi="Courier New" w:cs="Courier New" w:hint="default"/>
+      </w:rPr>
+    </w:lvl>
+    <w:lvl w:ilvl="5" w:tplc="04190005" w:tentative="1">
+      <w:start w:val="1"/>
+      <w:numFmt w:val="bullet"/>
+      <w:lvlText w:val=""/>
+      <w:lvlJc w:val="left"/>
+      <w:pPr>
+        <w:ind w:left="4887" w:hanging="360"/>
+      </w:pPr>
+      <w:rPr>
+        <w:rFonts w:ascii="Wingdings" w:hAnsi="Wingdings" w:hint="default"/>
+      </w:rPr>
+    </w:lvl>
+    <w:lvl w:ilvl="6" w:tplc="04190001" w:tentative="1">
+      <w:start w:val="1"/>
+      <w:numFmt w:val="bullet"/>
+      <w:lvlText w:val=""/>
+      <w:lvlJc w:val="left"/>
+      <w:pPr>
+        <w:ind w:left="5607" w:hanging="360"/>
+      </w:pPr>
+      <w:rPr>
+        <w:rFonts w:ascii="Symbol" w:hAnsi="Symbol" w:hint="default"/>
+      </w:rPr>
+    </w:lvl>
+    <w:lvl w:ilvl="7" w:tplc="04190003" w:tentative="1">
+      <w:start w:val="1"/>
+      <w:numFmt w:val="bullet"/>
+      <w:lvlText w:val="o"/>
+      <w:lvlJc w:val="left"/>
+      <w:pPr>
+        <w:ind w:left="6327" w:hanging="360"/>
+      </w:pPr>
+      <w:rPr>
+        <w:rFonts w:ascii="Courier New" w:hAnsi="Courier New" w:cs="Courier New" w:hint="default"/>
+      </w:rPr>
+    </w:lvl>
+    <w:lvl w:ilvl="8" w:tplc="04190005" w:tentative="1">
+      <w:start w:val="1"/>
+      <w:numFmt w:val="bullet"/>
+      <w:lvlText w:val=""/>
+      <w:lvlJc w:val="left"/>
+      <w:pPr>
+        <w:ind w:left="7047" w:hanging="360"/>
+      </w:pPr>
+      <w:rPr>
+        <w:rFonts w:ascii="Wingdings" w:hAnsi="Wingdings" w:hint="default"/>
+      </w:rPr>
+    </w:lvl>
+  </w:abstractNum>
+  <w:abstractNum w:abstractNumId="12" w15:restartNumberingAfterBreak="0">
     <w:nsid w:val="538150BF"/>
     <w:multiLevelType w:val="multilevel"/>
     <w:tmpl w:val="0BF4CB60"/>
@@ -7308,7 +8298,7 @@
       </w:rPr>
     </w:lvl>
   </w:abstractNum>
-  <w:abstractNum w:abstractNumId="12" w15:restartNumberingAfterBreak="0">
+  <w:abstractNum w:abstractNumId="13" w15:restartNumberingAfterBreak="0">
     <w:nsid w:val="55F96F06"/>
     <w:multiLevelType w:val="multilevel"/>
     <w:tmpl w:val="2A58F858"/>
@@ -7439,7 +8429,7 @@
       </w:rPr>
     </w:lvl>
   </w:abstractNum>
-  <w:abstractNum w:abstractNumId="13" w15:restartNumberingAfterBreak="0">
+  <w:abstractNum w:abstractNumId="14" w15:restartNumberingAfterBreak="0">
     <w:nsid w:val="5C230728"/>
     <w:multiLevelType w:val="multilevel"/>
     <w:tmpl w:val="6F1602FC"/>
@@ -7570,7 +8560,7 @@
       </w:rPr>
     </w:lvl>
   </w:abstractNum>
-  <w:abstractNum w:abstractNumId="14" w15:restartNumberingAfterBreak="0">
+  <w:abstractNum w:abstractNumId="15" w15:restartNumberingAfterBreak="0">
     <w:nsid w:val="5D624DE7"/>
     <w:multiLevelType w:val="hybridMultilevel"/>
     <w:tmpl w:val="D2302FE0"/>
@@ -7659,7 +8649,7 @@
       </w:pPr>
     </w:lvl>
   </w:abstractNum>
-  <w:abstractNum w:abstractNumId="15" w15:restartNumberingAfterBreak="0">
+  <w:abstractNum w:abstractNumId="16" w15:restartNumberingAfterBreak="0">
     <w:nsid w:val="5E4D76F0"/>
     <w:multiLevelType w:val="hybridMultilevel"/>
     <w:tmpl w:val="830A7DEC"/>
@@ -7748,7 +8738,7 @@
       </w:pPr>
     </w:lvl>
   </w:abstractNum>
-  <w:abstractNum w:abstractNumId="16" w15:restartNumberingAfterBreak="0">
+  <w:abstractNum w:abstractNumId="17" w15:restartNumberingAfterBreak="0">
     <w:nsid w:val="600C73CC"/>
     <w:multiLevelType w:val="hybridMultilevel"/>
     <w:tmpl w:val="27C2C122"/>
@@ -7834,7 +8824,7 @@
       </w:pPr>
     </w:lvl>
   </w:abstractNum>
-  <w:abstractNum w:abstractNumId="17" w15:restartNumberingAfterBreak="0">
+  <w:abstractNum w:abstractNumId="18" w15:restartNumberingAfterBreak="0">
     <w:nsid w:val="654146B1"/>
     <w:multiLevelType w:val="multilevel"/>
     <w:tmpl w:val="5F222CA2"/>
@@ -7965,7 +8955,7 @@
       </w:rPr>
     </w:lvl>
   </w:abstractNum>
-  <w:abstractNum w:abstractNumId="18" w15:restartNumberingAfterBreak="0">
+  <w:abstractNum w:abstractNumId="19" w15:restartNumberingAfterBreak="0">
     <w:nsid w:val="669A5D30"/>
     <w:multiLevelType w:val="multilevel"/>
     <w:tmpl w:val="65F8530A"/>
@@ -8096,7 +9086,7 @@
       </w:rPr>
     </w:lvl>
   </w:abstractNum>
-  <w:abstractNum w:abstractNumId="19" w15:restartNumberingAfterBreak="0">
+  <w:abstractNum w:abstractNumId="20" w15:restartNumberingAfterBreak="0">
     <w:nsid w:val="681A03BB"/>
     <w:multiLevelType w:val="hybridMultilevel"/>
     <w:tmpl w:val="27C2C122"/>
@@ -8182,7 +9172,120 @@
       </w:pPr>
     </w:lvl>
   </w:abstractNum>
-  <w:abstractNum w:abstractNumId="20" w15:restartNumberingAfterBreak="0">
+  <w:abstractNum w:abstractNumId="21" w15:restartNumberingAfterBreak="0">
+    <w:nsid w:val="6841526B"/>
+    <w:multiLevelType w:val="hybridMultilevel"/>
+    <w:tmpl w:val="126E895A"/>
+    <w:lvl w:ilvl="0" w:tplc="E8A6E778">
+      <w:start w:val="1"/>
+      <w:numFmt w:val="bullet"/>
+      <w:lvlText w:val=""/>
+      <w:lvlJc w:val="left"/>
+      <w:pPr>
+        <w:ind w:left="1854" w:hanging="360"/>
+      </w:pPr>
+      <w:rPr>
+        <w:rFonts w:ascii="Symbol" w:hAnsi="Symbol" w:hint="default"/>
+      </w:rPr>
+    </w:lvl>
+    <w:lvl w:ilvl="1" w:tplc="04190003" w:tentative="1">
+      <w:start w:val="1"/>
+      <w:numFmt w:val="bullet"/>
+      <w:lvlText w:val="o"/>
+      <w:lvlJc w:val="left"/>
+      <w:pPr>
+        <w:ind w:left="2007" w:hanging="360"/>
+      </w:pPr>
+      <w:rPr>
+        <w:rFonts w:ascii="Courier New" w:hAnsi="Courier New" w:cs="Courier New" w:hint="default"/>
+      </w:rPr>
+    </w:lvl>
+    <w:lvl w:ilvl="2" w:tplc="04190005" w:tentative="1">
+      <w:start w:val="1"/>
+      <w:numFmt w:val="bullet"/>
+      <w:lvlText w:val=""/>
+      <w:lvlJc w:val="left"/>
+      <w:pPr>
+        <w:ind w:left="2727" w:hanging="360"/>
+      </w:pPr>
+      <w:rPr>
+        <w:rFonts w:ascii="Wingdings" w:hAnsi="Wingdings" w:hint="default"/>
+      </w:rPr>
+    </w:lvl>
+    <w:lvl w:ilvl="3" w:tplc="04190001" w:tentative="1">
+      <w:start w:val="1"/>
+      <w:numFmt w:val="bullet"/>
+      <w:lvlText w:val=""/>
+      <w:lvlJc w:val="left"/>
+      <w:pPr>
+        <w:ind w:left="3447" w:hanging="360"/>
+      </w:pPr>
+      <w:rPr>
+        <w:rFonts w:ascii="Symbol" w:hAnsi="Symbol" w:hint="default"/>
+      </w:rPr>
+    </w:lvl>
+    <w:lvl w:ilvl="4" w:tplc="04190003" w:tentative="1">
+      <w:start w:val="1"/>
+      <w:numFmt w:val="bullet"/>
+      <w:lvlText w:val="o"/>
+      <w:lvlJc w:val="left"/>
+      <w:pPr>
+        <w:ind w:left="4167" w:hanging="360"/>
+      </w:pPr>
+      <w:rPr>
+        <w:rFonts w:ascii="Courier New" w:hAnsi="Courier New" w:cs="Courier New" w:hint="default"/>
+      </w:rPr>
+    </w:lvl>
+    <w:lvl w:ilvl="5" w:tplc="04190005" w:tentative="1">
+      <w:start w:val="1"/>
+      <w:numFmt w:val="bullet"/>
+      <w:lvlText w:val=""/>
+      <w:lvlJc w:val="left"/>
+      <w:pPr>
+        <w:ind w:left="4887" w:hanging="360"/>
+      </w:pPr>
+      <w:rPr>
+        <w:rFonts w:ascii="Wingdings" w:hAnsi="Wingdings" w:hint="default"/>
+      </w:rPr>
+    </w:lvl>
+    <w:lvl w:ilvl="6" w:tplc="04190001" w:tentative="1">
+      <w:start w:val="1"/>
+      <w:numFmt w:val="bullet"/>
+      <w:lvlText w:val=""/>
+      <w:lvlJc w:val="left"/>
+      <w:pPr>
+        <w:ind w:left="5607" w:hanging="360"/>
+      </w:pPr>
+      <w:rPr>
+        <w:rFonts w:ascii="Symbol" w:hAnsi="Symbol" w:hint="default"/>
+      </w:rPr>
+    </w:lvl>
+    <w:lvl w:ilvl="7" w:tplc="04190003" w:tentative="1">
+      <w:start w:val="1"/>
+      <w:numFmt w:val="bullet"/>
+      <w:lvlText w:val="o"/>
+      <w:lvlJc w:val="left"/>
+      <w:pPr>
+        <w:ind w:left="6327" w:hanging="360"/>
+      </w:pPr>
+      <w:rPr>
+        <w:rFonts w:ascii="Courier New" w:hAnsi="Courier New" w:cs="Courier New" w:hint="default"/>
+      </w:rPr>
+    </w:lvl>
+    <w:lvl w:ilvl="8" w:tplc="04190005" w:tentative="1">
+      <w:start w:val="1"/>
+      <w:numFmt w:val="bullet"/>
+      <w:lvlText w:val=""/>
+      <w:lvlJc w:val="left"/>
+      <w:pPr>
+        <w:ind w:left="7047" w:hanging="360"/>
+      </w:pPr>
+      <w:rPr>
+        <w:rFonts w:ascii="Wingdings" w:hAnsi="Wingdings" w:hint="default"/>
+      </w:rPr>
+    </w:lvl>
+  </w:abstractNum>
+  <w:abstractNum w:abstractNumId="22" w15:restartNumberingAfterBreak="0">
     <w:nsid w:val="69007247"/>
     <w:multiLevelType w:val="hybridMultilevel"/>
     <w:tmpl w:val="DD98B71A"/>
@@ -8271,7 +9374,7 @@
       </w:pPr>
     </w:lvl>
   </w:abstractNum>
-  <w:abstractNum w:abstractNumId="21" w15:restartNumberingAfterBreak="0">
+  <w:abstractNum w:abstractNumId="23" w15:restartNumberingAfterBreak="0">
     <w:nsid w:val="699E2746"/>
     <w:multiLevelType w:val="multilevel"/>
     <w:tmpl w:val="CA18793C"/>
@@ -8402,7 +9505,7 @@
       </w:rPr>
     </w:lvl>
   </w:abstractNum>
-  <w:abstractNum w:abstractNumId="22" w15:restartNumberingAfterBreak="0">
+  <w:abstractNum w:abstractNumId="24" w15:restartNumberingAfterBreak="0">
     <w:nsid w:val="6A946B74"/>
     <w:multiLevelType w:val="hybridMultilevel"/>
     <w:tmpl w:val="07E656A4"/>
@@ -8491,7 +9594,7 @@
       </w:pPr>
     </w:lvl>
   </w:abstractNum>
-  <w:abstractNum w:abstractNumId="23" w15:restartNumberingAfterBreak="0">
+  <w:abstractNum w:abstractNumId="25" w15:restartNumberingAfterBreak="0">
     <w:nsid w:val="6D76215D"/>
     <w:multiLevelType w:val="hybridMultilevel"/>
     <w:tmpl w:val="4D4AA414"/>
@@ -8580,7 +9683,7 @@
       </w:pPr>
     </w:lvl>
   </w:abstractNum>
-  <w:abstractNum w:abstractNumId="24" w15:restartNumberingAfterBreak="0">
+  <w:abstractNum w:abstractNumId="26" w15:restartNumberingAfterBreak="0">
     <w:nsid w:val="74C62E50"/>
     <w:multiLevelType w:val="multilevel"/>
     <w:tmpl w:val="F87A2104"/>
@@ -8693,7 +9796,7 @@
       </w:pPr>
     </w:lvl>
   </w:abstractNum>
-  <w:abstractNum w:abstractNumId="25" w15:restartNumberingAfterBreak="0">
+  <w:abstractNum w:abstractNumId="27" w15:restartNumberingAfterBreak="0">
     <w:nsid w:val="7A5F5611"/>
     <w:multiLevelType w:val="hybridMultilevel"/>
     <w:tmpl w:val="7856ECB6"/>
@@ -8782,7 +9885,7 @@
       </w:pPr>
     </w:lvl>
   </w:abstractNum>
-  <w:abstractNum w:abstractNumId="26" w15:restartNumberingAfterBreak="0">
+  <w:abstractNum w:abstractNumId="28" w15:restartNumberingAfterBreak="0">
     <w:nsid w:val="7FA249F5"/>
     <w:multiLevelType w:val="multilevel"/>
     <w:tmpl w:val="CCC0A192"/>
@@ -8914,28 +10017,28 @@
     </w:lvl>
   </w:abstractNum>
   <w:num w:numId="1" w16cid:durableId="1999378837">
-    <w:abstractNumId w:val="26"/>
+    <w:abstractNumId w:val="28"/>
   </w:num>
   <w:num w:numId="2" w16cid:durableId="560865871">
     <w:abstractNumId w:val="7"/>
   </w:num>
   <w:num w:numId="3" w16cid:durableId="96944711">
-    <w:abstractNumId w:val="17"/>
+    <w:abstractNumId w:val="18"/>
   </w:num>
   <w:num w:numId="4" w16cid:durableId="765734255">
-    <w:abstractNumId w:val="18"/>
+    <w:abstractNumId w:val="19"/>
   </w:num>
   <w:num w:numId="5" w16cid:durableId="364214395">
-    <w:abstractNumId w:val="21"/>
+    <w:abstractNumId w:val="23"/>
   </w:num>
   <w:num w:numId="6" w16cid:durableId="983006827">
-    <w:abstractNumId w:val="13"/>
+    <w:abstractNumId w:val="14"/>
   </w:num>
   <w:num w:numId="7" w16cid:durableId="40449276">
     <w:abstractNumId w:val="2"/>
   </w:num>
   <w:num w:numId="8" w16cid:durableId="1622570543">
-    <w:abstractNumId w:val="11"/>
+    <w:abstractNumId w:val="12"/>
   </w:num>
   <w:num w:numId="9" w16cid:durableId="1945454787">
     <w:abstractNumId w:val="9"/>
@@ -8953,22 +10056,22 @@
     <w:abstractNumId w:val="3"/>
   </w:num>
   <w:num w:numId="14" w16cid:durableId="252321112">
-    <w:abstractNumId w:val="12"/>
+    <w:abstractNumId w:val="13"/>
   </w:num>
   <w:num w:numId="15" w16cid:durableId="1133449001">
     <w:abstractNumId w:val="1"/>
   </w:num>
   <w:num w:numId="16" w16cid:durableId="2045400755">
-    <w:abstractNumId w:val="16"/>
+    <w:abstractNumId w:val="17"/>
   </w:num>
   <w:num w:numId="17" w16cid:durableId="14042416">
-    <w:abstractNumId w:val="24"/>
+    <w:abstractNumId w:val="26"/>
   </w:num>
   <w:num w:numId="18" w16cid:durableId="1325234939">
-    <w:abstractNumId w:val="19"/>
+    <w:abstractNumId w:val="20"/>
   </w:num>
   <w:num w:numId="19" w16cid:durableId="1436248162">
-    <w:abstractNumId w:val="25"/>
+    <w:abstractNumId w:val="27"/>
   </w:num>
   <w:num w:numId="20" w16cid:durableId="1917131090">
     <w:abstractNumId w:val="5"/>
@@ -8977,22 +10080,28 @@
     <w:abstractNumId w:val="4"/>
   </w:num>
   <w:num w:numId="22" w16cid:durableId="1553617140">
-    <w:abstractNumId w:val="14"/>
+    <w:abstractNumId w:val="15"/>
   </w:num>
   <w:num w:numId="23" w16cid:durableId="1617638332">
-    <w:abstractNumId w:val="20"/>
+    <w:abstractNumId w:val="22"/>
   </w:num>
   <w:num w:numId="24" w16cid:durableId="1908373224">
-    <w:abstractNumId w:val="22"/>
+    <w:abstractNumId w:val="24"/>
   </w:num>
   <w:num w:numId="25" w16cid:durableId="1564485418">
     <w:abstractNumId w:val="6"/>
   </w:num>
   <w:num w:numId="26" w16cid:durableId="169492261">
-    <w:abstractNumId w:val="23"/>
+    <w:abstractNumId w:val="25"/>
   </w:num>
   <w:num w:numId="27" w16cid:durableId="1590576651">
-    <w:abstractNumId w:val="15"/>
+    <w:abstractNumId w:val="16"/>
+  </w:num>
+  <w:num w:numId="28" w16cid:durableId="916786424">
+    <w:abstractNumId w:val="11"/>
+  </w:num>
+  <w:num w:numId="29" w16cid:durableId="906647289">
+    <w:abstractNumId w:val="21"/>
   </w:num>
 </w:numbering>
 </file>
@@ -9527,7 +10636,6 @@
   <w:style w:type="character" w:default="1" w:styleId="a0">
     <w:name w:val="Default Paragraph Font"/>
     <w:uiPriority w:val="1"/>
-    <w:semiHidden/>
     <w:unhideWhenUsed/>
   </w:style>
   <w:style w:type="table" w:default="1" w:styleId="a1">
@@ -9773,9 +10881,33 @@
     <w:basedOn w:val="a"/>
     <w:autoRedefine/>
     <w:qFormat/>
-    <w:rsid w:val="00275D77"/>
+    <w:rsid w:val="009D62F0"/>
     <w:rPr>
       <w:lang w:val="ru-RU"/>
+    </w:rPr>
+  </w:style>
+  <w:style w:type="paragraph" w:styleId="HTML">
+    <w:name w:val="HTML Preformatted"/>
+    <w:basedOn w:val="a"/>
+    <w:link w:val="HTML0"/>
+    <w:uiPriority w:val="99"/>
+    <w:semiHidden/>
+    <w:unhideWhenUsed/>
+    <w:rsid w:val="009D62F0"/>
+    <w:rPr>
+      <w:rFonts w:ascii="Consolas" w:hAnsi="Consolas"/>
+      <w:sz w:val="20"/>
+    </w:rPr>
+  </w:style>
+  <w:style w:type="character" w:customStyle="1" w:styleId="HTML0">
+    <w:name w:val="Стандартный HTML Знак"/>
+    <w:basedOn w:val="a0"/>
+    <w:link w:val="HTML"/>
+    <w:uiPriority w:val="99"/>
+    <w:semiHidden/>
+    <w:rsid w:val="009D62F0"/>
+    <w:rPr>
+      <w:rFonts w:ascii="Consolas" w:hAnsi="Consolas"/>
     </w:rPr>
   </w:style>
 </w:styles>

</xml_diff>

<commit_message>
password authentication described in th review,acces file experiment
</commit_message>
<xml_diff>
--- a/LAB_4_Соловьёв_P3230.docx
+++ b/LAB_4_Соловьёв_P3230.docx
@@ -455,7 +455,7 @@
           <w:r>
             <w:fldChar w:fldCharType="separate"/>
           </w:r>
-          <w:hyperlink w:anchor="_Toc237713313" w:history="1">
+          <w:hyperlink w:anchor="_Toc237943184" w:history="1">
             <w:r>
               <w:rPr>
                 <w:rStyle w:val="a6"/>
@@ -483,7 +483,7 @@
                 <w:noProof/>
                 <w:webHidden/>
               </w:rPr>
-              <w:instrText xml:space="preserve"> PAGEREF _Toc237713313 \h </w:instrText>
+              <w:instrText xml:space="preserve"> PAGEREF _Toc237943184 \h </w:instrText>
             </w:r>
             <w:r>
               <w:rPr>
@@ -529,7 +529,7 @@
               <w14:ligatures w14:val="standardContextual"/>
             </w:rPr>
           </w:pPr>
-          <w:hyperlink w:anchor="_Toc237713314" w:history="1">
+          <w:hyperlink w:anchor="_Toc237943185" w:history="1">
             <w:r>
               <w:rPr>
                 <w:rStyle w:val="a6"/>
@@ -556,7 +556,7 @@
                 <w:noProof/>
                 <w:webHidden/>
               </w:rPr>
-              <w:instrText xml:space="preserve"> PAGEREF _Toc237713314 \h </w:instrText>
+              <w:instrText xml:space="preserve"> PAGEREF _Toc237943185 \h </w:instrText>
             </w:r>
             <w:r>
               <w:rPr>
@@ -602,14 +602,29 @@
               <w14:ligatures w14:val="standardContextual"/>
             </w:rPr>
           </w:pPr>
-          <w:hyperlink w:anchor="_Toc237713315" w:history="1">
+          <w:hyperlink w:anchor="_Toc237943186" w:history="1">
+            <w:r>
+              <w:rPr>
+                <w:rStyle w:val="a6"/>
+                <w:noProof/>
+              </w:rPr>
+              <w:t>Мониторинг</w:t>
+            </w:r>
             <w:r>
               <w:rPr>
                 <w:rStyle w:val="a6"/>
                 <w:noProof/>
                 <w:lang w:val="ru-RU"/>
               </w:rPr>
-              <w:t>Мониторинг и профилирование под нагрузкой</w:t>
+              <w:t xml:space="preserve"> с помощью </w:t>
+            </w:r>
+            <w:r>
+              <w:rPr>
+                <w:rStyle w:val="a6"/>
+                <w:noProof/>
+                <w:lang w:val="en-US"/>
+              </w:rPr>
+              <w:t>jconsole</w:t>
             </w:r>
             <w:r>
               <w:rPr>
@@ -630,7 +645,7 @@
                 <w:noProof/>
                 <w:webHidden/>
               </w:rPr>
-              <w:instrText xml:space="preserve"> PAGEREF _Toc237713315 \h </w:instrText>
+              <w:instrText xml:space="preserve"> PAGEREF _Toc237943186 \h </w:instrText>
             </w:r>
             <w:r>
               <w:rPr>
@@ -650,7 +665,311 @@
                 <w:noProof/>
                 <w:webHidden/>
               </w:rPr>
-              <w:t>8</w:t>
+              <w:t>10</w:t>
+            </w:r>
+            <w:r>
+              <w:rPr>
+                <w:noProof/>
+                <w:webHidden/>
+              </w:rPr>
+              <w:fldChar w:fldCharType="end"/>
+            </w:r>
+          </w:hyperlink>
+        </w:p>
+        <w:p>
+          <w:pPr>
+            <w:pStyle w:val="20"/>
+            <w:tabs>
+              <w:tab w:val="right" w:leader="dot" w:pos="9350"/>
+            </w:tabs>
+            <w:rPr>
+              <w:rFonts w:asciiTheme="minorHAnsi" w:eastAsiaTheme="minorEastAsia" w:hAnsiTheme="minorHAnsi" w:cstheme="minorBidi"/>
+              <w:noProof/>
+              <w:kern w:val="2"/>
+              <w:szCs w:val="24"/>
+              <w:lang w:val="ru-RU"/>
+              <w14:ligatures w14:val="standardContextual"/>
+            </w:rPr>
+          </w:pPr>
+          <w:hyperlink w:anchor="_Toc237943187" w:history="1">
+            <w:r>
+              <w:rPr>
+                <w:rStyle w:val="a6"/>
+                <w:noProof/>
+                <w:lang w:val="ru-RU"/>
+              </w:rPr>
+              <w:t>Локальный мониторинг</w:t>
+            </w:r>
+            <w:r>
+              <w:rPr>
+                <w:noProof/>
+                <w:webHidden/>
+              </w:rPr>
+              <w:tab/>
+            </w:r>
+            <w:r>
+              <w:rPr>
+                <w:noProof/>
+                <w:webHidden/>
+              </w:rPr>
+              <w:fldChar w:fldCharType="begin"/>
+            </w:r>
+            <w:r>
+              <w:rPr>
+                <w:noProof/>
+                <w:webHidden/>
+              </w:rPr>
+              <w:instrText xml:space="preserve"> PAGEREF _Toc237943187 \h </w:instrText>
+            </w:r>
+            <w:r>
+              <w:rPr>
+                <w:noProof/>
+                <w:webHidden/>
+              </w:rPr>
+            </w:r>
+            <w:r>
+              <w:rPr>
+                <w:noProof/>
+                <w:webHidden/>
+              </w:rPr>
+              <w:fldChar w:fldCharType="separate"/>
+            </w:r>
+            <w:r>
+              <w:rPr>
+                <w:noProof/>
+                <w:webHidden/>
+              </w:rPr>
+              <w:t>10</w:t>
+            </w:r>
+            <w:r>
+              <w:rPr>
+                <w:noProof/>
+                <w:webHidden/>
+              </w:rPr>
+              <w:fldChar w:fldCharType="end"/>
+            </w:r>
+          </w:hyperlink>
+        </w:p>
+        <w:p>
+          <w:pPr>
+            <w:pStyle w:val="20"/>
+            <w:tabs>
+              <w:tab w:val="right" w:leader="dot" w:pos="9350"/>
+            </w:tabs>
+            <w:rPr>
+              <w:rFonts w:asciiTheme="minorHAnsi" w:eastAsiaTheme="minorEastAsia" w:hAnsiTheme="minorHAnsi" w:cstheme="minorBidi"/>
+              <w:noProof/>
+              <w:kern w:val="2"/>
+              <w:szCs w:val="24"/>
+              <w:lang w:val="ru-RU"/>
+              <w14:ligatures w14:val="standardContextual"/>
+            </w:rPr>
+          </w:pPr>
+          <w:hyperlink w:anchor="_Toc237943188" w:history="1">
+            <w:r>
+              <w:rPr>
+                <w:rStyle w:val="a6"/>
+                <w:noProof/>
+                <w:lang w:val="ru-RU"/>
+              </w:rPr>
+              <w:t>Удалённый мониторинг</w:t>
+            </w:r>
+            <w:r>
+              <w:rPr>
+                <w:noProof/>
+                <w:webHidden/>
+              </w:rPr>
+              <w:tab/>
+            </w:r>
+            <w:r>
+              <w:rPr>
+                <w:noProof/>
+                <w:webHidden/>
+              </w:rPr>
+              <w:fldChar w:fldCharType="begin"/>
+            </w:r>
+            <w:r>
+              <w:rPr>
+                <w:noProof/>
+                <w:webHidden/>
+              </w:rPr>
+              <w:instrText xml:space="preserve"> PAGEREF _Toc237943188 \h </w:instrText>
+            </w:r>
+            <w:r>
+              <w:rPr>
+                <w:noProof/>
+                <w:webHidden/>
+              </w:rPr>
+            </w:r>
+            <w:r>
+              <w:rPr>
+                <w:noProof/>
+                <w:webHidden/>
+              </w:rPr>
+              <w:fldChar w:fldCharType="separate"/>
+            </w:r>
+            <w:r>
+              <w:rPr>
+                <w:noProof/>
+                <w:webHidden/>
+              </w:rPr>
+              <w:t>13</w:t>
+            </w:r>
+            <w:r>
+              <w:rPr>
+                <w:noProof/>
+                <w:webHidden/>
+              </w:rPr>
+              <w:fldChar w:fldCharType="end"/>
+            </w:r>
+          </w:hyperlink>
+        </w:p>
+        <w:p>
+          <w:pPr>
+            <w:pStyle w:val="30"/>
+            <w:tabs>
+              <w:tab w:val="right" w:leader="dot" w:pos="9350"/>
+            </w:tabs>
+            <w:rPr>
+              <w:rFonts w:asciiTheme="minorHAnsi" w:eastAsiaTheme="minorEastAsia" w:hAnsiTheme="minorHAnsi" w:cstheme="minorBidi"/>
+              <w:noProof/>
+              <w:kern w:val="2"/>
+              <w:szCs w:val="24"/>
+              <w:lang w:val="ru-RU"/>
+              <w14:ligatures w14:val="standardContextual"/>
+            </w:rPr>
+          </w:pPr>
+          <w:hyperlink w:anchor="_Toc237943189" w:history="1">
+            <w:r>
+              <w:rPr>
+                <w:rStyle w:val="a6"/>
+                <w:noProof/>
+                <w:lang w:val="ru-RU"/>
+              </w:rPr>
+              <w:t>Подключение без защиты соединения</w:t>
+            </w:r>
+            <w:r>
+              <w:rPr>
+                <w:noProof/>
+                <w:webHidden/>
+              </w:rPr>
+              <w:tab/>
+            </w:r>
+            <w:r>
+              <w:rPr>
+                <w:noProof/>
+                <w:webHidden/>
+              </w:rPr>
+              <w:fldChar w:fldCharType="begin"/>
+            </w:r>
+            <w:r>
+              <w:rPr>
+                <w:noProof/>
+                <w:webHidden/>
+              </w:rPr>
+              <w:instrText xml:space="preserve"> PAGEREF _Toc237943189 \h </w:instrText>
+            </w:r>
+            <w:r>
+              <w:rPr>
+                <w:noProof/>
+                <w:webHidden/>
+              </w:rPr>
+            </w:r>
+            <w:r>
+              <w:rPr>
+                <w:noProof/>
+                <w:webHidden/>
+              </w:rPr>
+              <w:fldChar w:fldCharType="separate"/>
+            </w:r>
+            <w:r>
+              <w:rPr>
+                <w:noProof/>
+                <w:webHidden/>
+              </w:rPr>
+              <w:t>13</w:t>
+            </w:r>
+            <w:r>
+              <w:rPr>
+                <w:noProof/>
+                <w:webHidden/>
+              </w:rPr>
+              <w:fldChar w:fldCharType="end"/>
+            </w:r>
+          </w:hyperlink>
+        </w:p>
+        <w:p>
+          <w:pPr>
+            <w:pStyle w:val="30"/>
+            <w:tabs>
+              <w:tab w:val="right" w:leader="dot" w:pos="9350"/>
+            </w:tabs>
+            <w:rPr>
+              <w:rFonts w:asciiTheme="minorHAnsi" w:eastAsiaTheme="minorEastAsia" w:hAnsiTheme="minorHAnsi" w:cstheme="minorBidi"/>
+              <w:noProof/>
+              <w:kern w:val="2"/>
+              <w:szCs w:val="24"/>
+              <w:lang w:val="ru-RU"/>
+              <w14:ligatures w14:val="standardContextual"/>
+            </w:rPr>
+          </w:pPr>
+          <w:hyperlink w:anchor="_Toc237943190" w:history="1">
+            <w:r>
+              <w:rPr>
+                <w:rStyle w:val="a6"/>
+                <w:noProof/>
+                <w:lang w:val="ru-RU"/>
+              </w:rPr>
+              <w:t>Подключение</w:t>
+            </w:r>
+            <w:r>
+              <w:rPr>
+                <w:rStyle w:val="a6"/>
+                <w:noProof/>
+                <w:lang w:val="en-US"/>
+              </w:rPr>
+              <w:t xml:space="preserve"> File-Based Password Authentication</w:t>
+            </w:r>
+            <w:r>
+              <w:rPr>
+                <w:noProof/>
+                <w:webHidden/>
+              </w:rPr>
+              <w:tab/>
+            </w:r>
+            <w:r>
+              <w:rPr>
+                <w:noProof/>
+                <w:webHidden/>
+              </w:rPr>
+              <w:fldChar w:fldCharType="begin"/>
+            </w:r>
+            <w:r>
+              <w:rPr>
+                <w:noProof/>
+                <w:webHidden/>
+              </w:rPr>
+              <w:instrText xml:space="preserve"> PAGEREF _Toc237943190 \h </w:instrText>
+            </w:r>
+            <w:r>
+              <w:rPr>
+                <w:noProof/>
+                <w:webHidden/>
+              </w:rPr>
+            </w:r>
+            <w:r>
+              <w:rPr>
+                <w:noProof/>
+                <w:webHidden/>
+              </w:rPr>
+              <w:fldChar w:fldCharType="separate"/>
+            </w:r>
+            <w:r>
+              <w:rPr>
+                <w:noProof/>
+                <w:webHidden/>
+              </w:rPr>
+              <w:t>13</w:t>
             </w:r>
             <w:r>
               <w:rPr>
@@ -676,7 +995,7 @@
               <w14:ligatures w14:val="standardContextual"/>
             </w:rPr>
           </w:pPr>
-          <w:hyperlink w:anchor="_Toc237713316" w:history="1">
+          <w:hyperlink w:anchor="_Toc237943191" w:history="1">
             <w:r>
               <w:rPr>
                 <w:rStyle w:val="a6"/>
@@ -704,7 +1023,7 @@
                 <w:noProof/>
                 <w:webHidden/>
               </w:rPr>
-              <w:instrText xml:space="preserve"> PAGEREF _Toc237713316 \h </w:instrText>
+              <w:instrText xml:space="preserve"> PAGEREF _Toc237943191 \h </w:instrText>
             </w:r>
             <w:r>
               <w:rPr>
@@ -724,7 +1043,7 @@
                 <w:noProof/>
                 <w:webHidden/>
               </w:rPr>
-              <w:t>9</w:t>
+              <w:t>15</w:t>
             </w:r>
             <w:r>
               <w:rPr>
@@ -750,7 +1069,7 @@
               <w14:ligatures w14:val="standardContextual"/>
             </w:rPr>
           </w:pPr>
-          <w:hyperlink w:anchor="_Toc237713317" w:history="1">
+          <w:hyperlink w:anchor="_Toc237943192" w:history="1">
             <w:r>
               <w:rPr>
                 <w:rStyle w:val="a6"/>
@@ -778,7 +1097,7 @@
                 <w:noProof/>
                 <w:webHidden/>
               </w:rPr>
-              <w:instrText xml:space="preserve"> PAGEREF _Toc237713317 \h </w:instrText>
+              <w:instrText xml:space="preserve"> PAGEREF _Toc237943192 \h </w:instrText>
             </w:r>
             <w:r>
               <w:rPr>
@@ -798,7 +1117,7 @@
                 <w:noProof/>
                 <w:webHidden/>
               </w:rPr>
-              <w:t>9</w:t>
+              <w:t>15</w:t>
             </w:r>
             <w:r>
               <w:rPr>
@@ -850,7 +1169,7 @@
               <w:lang w:val="ru-RU"/>
             </w:rPr>
           </w:pPr>
-          <w:bookmarkStart w:id="3" w:name="_Toc237713313"/>
+          <w:bookmarkStart w:id="3" w:name="_Toc237943184"/>
           <w:r>
             <w:rPr>
               <w:lang w:val="ru-RU"/>
@@ -1266,7 +1585,7 @@
           <w:lang w:val="ru-RU"/>
         </w:rPr>
       </w:pPr>
-      <w:bookmarkStart w:id="4" w:name="_Toc237713314"/>
+      <w:bookmarkStart w:id="4" w:name="_Toc237943185"/>
       <w:r>
         <w:lastRenderedPageBreak/>
         <w:t>Исходный код разработанных MBean-классов, описаний событий JDK Flight Recorder и сопутствующих классов</w:t>
@@ -4173,7 +4492,6 @@
           <w:lang w:val="ru-RU"/>
         </w:rPr>
       </w:pPr>
-      <w:bookmarkStart w:id="5" w:name="_Toc237713315"/>
     </w:p>
     <w:p>
       <w:pPr>
@@ -5196,6 +5514,7 @@
           <w:lang w:val="en-US"/>
         </w:rPr>
       </w:pPr>
+      <w:bookmarkStart w:id="5" w:name="_Toc237943186"/>
       <w:r>
         <w:lastRenderedPageBreak/>
         <w:t>Мониторинг</w:t>
@@ -5206,35 +5525,37 @@
         </w:rPr>
         <w:t xml:space="preserve"> </w:t>
       </w:r>
+      <w:r>
+        <w:rPr>
+          <w:lang w:val="ru-RU"/>
+        </w:rPr>
+        <w:t xml:space="preserve">с помощью </w:t>
+      </w:r>
+      <w:proofErr w:type="spellStart"/>
+      <w:r>
+        <w:rPr>
+          <w:lang w:val="en-US"/>
+        </w:rPr>
+        <w:t>jconsole</w:t>
+      </w:r>
       <w:bookmarkEnd w:id="5"/>
-      <w:r>
-        <w:rPr>
-          <w:lang w:val="ru-RU"/>
-        </w:rPr>
-        <w:t xml:space="preserve">с помощью </w:t>
-      </w:r>
-      <w:proofErr w:type="spellStart"/>
-      <w:r>
-        <w:rPr>
-          <w:lang w:val="en-US"/>
-        </w:rPr>
-        <w:t>jconsole</w:t>
-      </w:r>
       <w:proofErr w:type="spellEnd"/>
     </w:p>
     <w:p>
       <w:pPr>
-        <w:pStyle w:val="3"/>
-        <w:rPr>
-          <w:lang w:val="ru-RU"/>
-        </w:rPr>
-      </w:pPr>
+        <w:pStyle w:val="2"/>
+        <w:rPr>
+          <w:lang w:val="ru-RU"/>
+        </w:rPr>
+      </w:pPr>
+      <w:bookmarkStart w:id="6" w:name="_Toc237943187"/>
       <w:r>
         <w:rPr>
           <w:lang w:val="ru-RU"/>
         </w:rPr>
         <w:t>Локальный мониторинг</w:t>
       </w:r>
+      <w:bookmarkEnd w:id="6"/>
     </w:p>
     <w:p>
       <w:pPr>
@@ -5540,7 +5861,7 @@
           <w:lang w:val="ru-RU"/>
         </w:rPr>
       </w:pPr>
-      <w:bookmarkStart w:id="6" w:name="_Toc237713316"/>
+      <w:bookmarkStart w:id="7" w:name="_Toc237943188"/>
       <w:r>
         <w:rPr>
           <w:lang w:val="ru-RU"/>
@@ -5548,6 +5869,7 @@
         <w:lastRenderedPageBreak/>
         <w:t>Удалённый мониторинг</w:t>
       </w:r>
+      <w:bookmarkEnd w:id="7"/>
     </w:p>
     <w:p>
       <w:pPr>
@@ -5556,12 +5878,14 @@
           <w:lang w:val="ru-RU"/>
         </w:rPr>
       </w:pPr>
+      <w:bookmarkStart w:id="8" w:name="_Toc237943189"/>
       <w:r>
         <w:rPr>
           <w:lang w:val="ru-RU"/>
         </w:rPr>
         <w:t>Подключение без защиты соединения</w:t>
       </w:r>
+      <w:bookmarkEnd w:id="8"/>
     </w:p>
     <w:p>
       <w:pPr>
@@ -6046,6 +6370,704 @@
     </w:p>
     <w:p>
       <w:pPr>
+        <w:pStyle w:val="3"/>
+        <w:rPr>
+          <w:lang w:val="en-US"/>
+        </w:rPr>
+      </w:pPr>
+      <w:bookmarkStart w:id="9" w:name="_Toc237943190"/>
+      <w:r>
+        <w:rPr>
+          <w:lang w:val="ru-RU"/>
+        </w:rPr>
+        <w:t>Подключение</w:t>
+      </w:r>
+      <w:r>
+        <w:rPr>
+          <w:lang w:val="en-US"/>
+        </w:rPr>
+        <w:t xml:space="preserve"> </w:t>
+      </w:r>
+      <w:r>
+        <w:rPr>
+          <w:lang w:val="en-US"/>
+        </w:rPr>
+        <w:t>File-Based Password Authentication</w:t>
+      </w:r>
+      <w:bookmarkEnd w:id="9"/>
+    </w:p>
+    <w:p>
+      <w:pPr>
+        <w:pStyle w:val="ae"/>
+        <w:rPr>
+          <w:lang w:val="en-US"/>
+        </w:rPr>
+      </w:pPr>
+      <w:r>
+        <w:t>Аутентификация п</w:t>
+      </w:r>
+      <w:r>
+        <w:t>о паролю включена по умолчанию</w:t>
+      </w:r>
+      <w:sdt>
+        <w:sdtPr>
+          <w:id w:val="1410887048"/>
+          <w:citation/>
+        </w:sdtPr>
+        <w:sdtContent>
+          <w:r>
+            <w:fldChar w:fldCharType="begin"/>
+          </w:r>
+          <w:r>
+            <w:instrText xml:space="preserve"> CITATION Ora262 \l 1049 </w:instrText>
+          </w:r>
+          <w:r>
+            <w:fldChar w:fldCharType="separate"/>
+          </w:r>
+          <w:r>
+            <w:rPr>
+              <w:noProof/>
+            </w:rPr>
+            <w:t xml:space="preserve"> </w:t>
+          </w:r>
+          <w:r>
+            <w:rPr>
+              <w:noProof/>
+            </w:rPr>
+            <w:t>[8]</w:t>
+          </w:r>
+          <w:r>
+            <w:fldChar w:fldCharType="end"/>
+          </w:r>
+        </w:sdtContent>
+      </w:sdt>
+      <w:r>
+        <w:t>.</w:t>
+      </w:r>
+    </w:p>
+    <w:p>
+      <w:pPr>
+        <w:pStyle w:val="ae"/>
+      </w:pPr>
+      <w:r>
+        <w:t xml:space="preserve">Необходимо скопировать шаблон файла паролей из </w:t>
+      </w:r>
+      <w:r>
+        <w:t>%</w:t>
+      </w:r>
+      <w:r>
+        <w:rPr>
+          <w:lang w:val="en-US"/>
+        </w:rPr>
+        <w:t>JDK</w:t>
+      </w:r>
+      <w:r>
+        <w:t>_</w:t>
+      </w:r>
+      <w:r>
+        <w:rPr>
+          <w:lang w:val="en-US"/>
+        </w:rPr>
+        <w:t>HOME</w:t>
+      </w:r>
+      <w:r>
+        <w:t>%</w:t>
+      </w:r>
+      <w:r>
+        <w:t>, задать пароли, это файл обязан иметь права 600 (читать и писать может только владелец).</w:t>
+      </w:r>
+      <w:r>
+        <w:t xml:space="preserve"> </w:t>
+      </w:r>
+      <w:r>
+        <w:t xml:space="preserve">Также важен файл </w:t>
+      </w:r>
+      <w:proofErr w:type="spellStart"/>
+      <w:proofErr w:type="gramStart"/>
+      <w:r>
+        <w:rPr>
+          <w:lang w:val="en-US"/>
+        </w:rPr>
+        <w:t>jmxremote</w:t>
+      </w:r>
+      <w:proofErr w:type="spellEnd"/>
+      <w:r>
+        <w:t>.</w:t>
+      </w:r>
+      <w:r>
+        <w:rPr>
+          <w:lang w:val="en-US"/>
+        </w:rPr>
+        <w:t>access</w:t>
+      </w:r>
+      <w:proofErr w:type="gramEnd"/>
+      <w:r>
+        <w:t xml:space="preserve">, он существует по умолчанию в </w:t>
+      </w:r>
+      <w:r>
+        <w:t>%</w:t>
+      </w:r>
+      <w:r>
+        <w:rPr>
+          <w:lang w:val="en-US"/>
+        </w:rPr>
+        <w:t>JDK</w:t>
+      </w:r>
+      <w:r>
+        <w:t>_</w:t>
+      </w:r>
+      <w:r>
+        <w:rPr>
+          <w:lang w:val="en-US"/>
+        </w:rPr>
+        <w:t>HOME</w:t>
+      </w:r>
+      <w:r>
+        <w:t>%</w:t>
+      </w:r>
+      <w:r>
+        <w:t xml:space="preserve">, пароли в файле </w:t>
+      </w:r>
+      <w:proofErr w:type="spellStart"/>
+      <w:proofErr w:type="gramStart"/>
+      <w:r>
+        <w:rPr>
+          <w:lang w:val="en-US"/>
+        </w:rPr>
+        <w:t>jmxremote</w:t>
+      </w:r>
+      <w:proofErr w:type="spellEnd"/>
+      <w:r>
+        <w:t>.</w:t>
+      </w:r>
+      <w:r>
+        <w:rPr>
+          <w:lang w:val="en-US"/>
+        </w:rPr>
+        <w:t>password</w:t>
+      </w:r>
+      <w:proofErr w:type="gramEnd"/>
+      <w:r>
+        <w:t xml:space="preserve"> </w:t>
+      </w:r>
+      <w:r>
+        <w:t xml:space="preserve">задаются именно для ролей из </w:t>
+      </w:r>
+      <w:proofErr w:type="spellStart"/>
+      <w:proofErr w:type="gramStart"/>
+      <w:r>
+        <w:rPr>
+          <w:lang w:val="en-US"/>
+        </w:rPr>
+        <w:t>jmxremote</w:t>
+      </w:r>
+      <w:proofErr w:type="spellEnd"/>
+      <w:r>
+        <w:t>.</w:t>
+      </w:r>
+      <w:r>
+        <w:rPr>
+          <w:lang w:val="en-US"/>
+        </w:rPr>
+        <w:t>access</w:t>
+      </w:r>
+      <w:proofErr w:type="gramEnd"/>
+      <w:r>
+        <w:t>.</w:t>
+      </w:r>
+    </w:p>
+    <w:p>
+      <w:pPr>
+        <w:pStyle w:val="ae"/>
+      </w:pPr>
+      <w:r>
+        <w:rPr>
+          <w:noProof/>
+        </w:rPr>
+        <w:drawing>
+          <wp:inline distT="0" distB="0" distL="0" distR="0" wp14:anchorId="0A66EDC0" wp14:editId="25DEF381">
+            <wp:extent cx="5943600" cy="3343275"/>
+            <wp:effectExtent l="0" t="0" r="0" b="9525"/>
+            <wp:docPr id="1575539218" name="Рисунок 1"/>
+            <wp:cNvGraphicFramePr>
+              <a:graphicFrameLocks xmlns:a="http://schemas.openxmlformats.org/drawingml/2006/main" noChangeAspect="1"/>
+            </wp:cNvGraphicFramePr>
+            <a:graphic xmlns:a="http://schemas.openxmlformats.org/drawingml/2006/main">
+              <a:graphicData uri="http://schemas.openxmlformats.org/drawingml/2006/picture">
+                <pic:pic xmlns:pic="http://schemas.openxmlformats.org/drawingml/2006/picture">
+                  <pic:nvPicPr>
+                    <pic:cNvPr id="1575539218" name=""/>
+                    <pic:cNvPicPr/>
+                  </pic:nvPicPr>
+                  <pic:blipFill>
+                    <a:blip r:embed="rId15"/>
+                    <a:stretch>
+                      <a:fillRect/>
+                    </a:stretch>
+                  </pic:blipFill>
+                  <pic:spPr>
+                    <a:xfrm>
+                      <a:off x="0" y="0"/>
+                      <a:ext cx="5943600" cy="3343275"/>
+                    </a:xfrm>
+                    <a:prstGeom prst="rect">
+                      <a:avLst/>
+                    </a:prstGeom>
+                  </pic:spPr>
+                </pic:pic>
+              </a:graphicData>
+            </a:graphic>
+          </wp:inline>
+        </w:drawing>
+      </w:r>
+    </w:p>
+    <w:p>
+      <w:pPr>
+        <w:ind w:firstLine="0"/>
+        <w:jc w:val="left"/>
+        <w:rPr>
+          <w:lang w:val="ru-RU"/>
+        </w:rPr>
+      </w:pPr>
+      <w:r>
+        <w:br w:type="page"/>
+      </w:r>
+    </w:p>
+    <w:p>
+      <w:pPr>
+        <w:pStyle w:val="ae"/>
+      </w:pPr>
+      <w:r>
+        <w:lastRenderedPageBreak/>
+        <w:t xml:space="preserve">Конфигурация </w:t>
+      </w:r>
+      <w:proofErr w:type="spellStart"/>
+      <w:r>
+        <w:rPr>
+          <w:lang w:val="en-US"/>
+        </w:rPr>
+        <w:t>jvm</w:t>
+      </w:r>
+      <w:proofErr w:type="spellEnd"/>
+      <w:r>
+        <w:t xml:space="preserve"> </w:t>
+      </w:r>
+      <w:r>
+        <w:t>задаётся следующим набором:</w:t>
+      </w:r>
+    </w:p>
+    <w:p>
+      <w:pPr>
+        <w:pStyle w:val="ae"/>
+        <w:numPr>
+          <w:ilvl w:val="0"/>
+          <w:numId w:val="29"/>
+        </w:numPr>
+        <w:jc w:val="left"/>
+      </w:pPr>
+      <w:proofErr w:type="gramStart"/>
+      <w:r>
+        <w:t>-</w:t>
+      </w:r>
+      <w:proofErr w:type="spellStart"/>
+      <w:r>
+        <w:rPr>
+          <w:lang w:val="en-US"/>
+        </w:rPr>
+        <w:t>Dcom</w:t>
+      </w:r>
+      <w:proofErr w:type="spellEnd"/>
+      <w:r>
+        <w:t>.</w:t>
+      </w:r>
+      <w:r>
+        <w:rPr>
+          <w:lang w:val="en-US"/>
+        </w:rPr>
+        <w:t>sun</w:t>
+      </w:r>
+      <w:r>
+        <w:t>.</w:t>
+      </w:r>
+      <w:r>
+        <w:rPr>
+          <w:lang w:val="en-US"/>
+        </w:rPr>
+        <w:t>management</w:t>
+      </w:r>
+      <w:r>
+        <w:t>.</w:t>
+      </w:r>
+      <w:proofErr w:type="spellStart"/>
+      <w:r>
+        <w:rPr>
+          <w:lang w:val="en-US"/>
+        </w:rPr>
+        <w:t>jmxremote</w:t>
+      </w:r>
+      <w:proofErr w:type="spellEnd"/>
+      <w:proofErr w:type="gramEnd"/>
+      <w:r>
+        <w:t>.</w:t>
+      </w:r>
+      <w:r>
+        <w:rPr>
+          <w:lang w:val="en-US"/>
+        </w:rPr>
+        <w:t>port</w:t>
+      </w:r>
+      <w:r>
+        <w:t xml:space="preserve">=8888 </w:t>
+      </w:r>
+      <w:r>
+        <w:t>порт</w:t>
+      </w:r>
+      <w:r>
+        <w:t xml:space="preserve"> </w:t>
+      </w:r>
+      <w:r>
+        <w:t xml:space="preserve">реестра для получения коннектора </w:t>
+      </w:r>
+      <w:proofErr w:type="spellStart"/>
+      <w:r>
+        <w:rPr>
+          <w:lang w:val="en-US"/>
+        </w:rPr>
+        <w:t>jmxrmi</w:t>
+      </w:r>
+      <w:proofErr w:type="spellEnd"/>
+    </w:p>
+    <w:p>
+      <w:pPr>
+        <w:pStyle w:val="ae"/>
+        <w:numPr>
+          <w:ilvl w:val="0"/>
+          <w:numId w:val="29"/>
+        </w:numPr>
+        <w:jc w:val="left"/>
+      </w:pPr>
+      <w:r>
+        <w:t>-</w:t>
+      </w:r>
+      <w:proofErr w:type="spellStart"/>
+      <w:r>
+        <w:rPr>
+          <w:lang w:val="en-US"/>
+        </w:rPr>
+        <w:t>Dcom</w:t>
+      </w:r>
+      <w:proofErr w:type="spellEnd"/>
+      <w:r>
+        <w:t>.</w:t>
+      </w:r>
+      <w:r>
+        <w:rPr>
+          <w:lang w:val="en-US"/>
+        </w:rPr>
+        <w:t>sun</w:t>
+      </w:r>
+      <w:r>
+        <w:t>.</w:t>
+      </w:r>
+      <w:r>
+        <w:rPr>
+          <w:lang w:val="en-US"/>
+        </w:rPr>
+        <w:t>management</w:t>
+      </w:r>
+      <w:r>
+        <w:t>.</w:t>
+      </w:r>
+      <w:proofErr w:type="spellStart"/>
+      <w:r>
+        <w:rPr>
+          <w:lang w:val="en-US"/>
+        </w:rPr>
+        <w:t>jmxremote</w:t>
+      </w:r>
+      <w:proofErr w:type="spellEnd"/>
+      <w:r>
+        <w:t>.</w:t>
+      </w:r>
+      <w:proofErr w:type="spellStart"/>
+      <w:r>
+        <w:rPr>
+          <w:lang w:val="en-US"/>
+        </w:rPr>
+        <w:t>rmi</w:t>
+      </w:r>
+      <w:proofErr w:type="spellEnd"/>
+      <w:r>
+        <w:t>.</w:t>
+      </w:r>
+      <w:r>
+        <w:rPr>
+          <w:lang w:val="en-US"/>
+        </w:rPr>
+        <w:t>port</w:t>
+      </w:r>
+      <w:r>
+        <w:t xml:space="preserve">=8889 </w:t>
+      </w:r>
+      <w:r>
+        <w:t>порт для обмена данными</w:t>
+      </w:r>
+      <w:r>
+        <w:t xml:space="preserve"> </w:t>
+      </w:r>
+      <w:proofErr w:type="spellStart"/>
+      <w:r>
+        <w:rPr>
+          <w:lang w:val="en-US"/>
+        </w:rPr>
+        <w:t>rmi</w:t>
+      </w:r>
+      <w:proofErr w:type="spellEnd"/>
+      <w:r>
+        <w:t xml:space="preserve"> </w:t>
+      </w:r>
+      <w:r>
+        <w:rPr>
+          <w:lang w:val="en-US"/>
+        </w:rPr>
+        <w:t>connector</w:t>
+      </w:r>
+    </w:p>
+    <w:p>
+      <w:pPr>
+        <w:pStyle w:val="ae"/>
+        <w:numPr>
+          <w:ilvl w:val="0"/>
+          <w:numId w:val="29"/>
+        </w:numPr>
+        <w:jc w:val="left"/>
+      </w:pPr>
+      <w:r>
+        <w:t>-</w:t>
+      </w:r>
+      <w:proofErr w:type="spellStart"/>
+      <w:r>
+        <w:rPr>
+          <w:lang w:val="en-US"/>
+        </w:rPr>
+        <w:t>Dcom</w:t>
+      </w:r>
+      <w:proofErr w:type="spellEnd"/>
+      <w:r>
+        <w:t>.</w:t>
+      </w:r>
+      <w:r>
+        <w:rPr>
+          <w:lang w:val="en-US"/>
+        </w:rPr>
+        <w:t>sun</w:t>
+      </w:r>
+      <w:r>
+        <w:t>.</w:t>
+      </w:r>
+      <w:r>
+        <w:rPr>
+          <w:lang w:val="en-US"/>
+        </w:rPr>
+        <w:t>management</w:t>
+      </w:r>
+      <w:r>
+        <w:t>.</w:t>
+      </w:r>
+      <w:proofErr w:type="spellStart"/>
+      <w:r>
+        <w:rPr>
+          <w:lang w:val="en-US"/>
+        </w:rPr>
+        <w:t>jmxremote</w:t>
+      </w:r>
+      <w:proofErr w:type="spellEnd"/>
+      <w:r>
+        <w:t>.</w:t>
+      </w:r>
+      <w:proofErr w:type="spellStart"/>
+      <w:r>
+        <w:rPr>
+          <w:lang w:val="en-US"/>
+        </w:rPr>
+        <w:t>ssl</w:t>
+      </w:r>
+      <w:proofErr w:type="spellEnd"/>
+      <w:r>
+        <w:t>=</w:t>
+      </w:r>
+      <w:r>
+        <w:rPr>
+          <w:lang w:val="en-US"/>
+        </w:rPr>
+        <w:t>false</w:t>
+      </w:r>
+      <w:r>
+        <w:t xml:space="preserve"> </w:t>
+      </w:r>
+      <w:r>
+        <w:t>отмена</w:t>
+      </w:r>
+      <w:r>
+        <w:t xml:space="preserve"> </w:t>
+      </w:r>
+      <w:r>
+        <w:t xml:space="preserve">подключения по </w:t>
+      </w:r>
+      <w:proofErr w:type="spellStart"/>
+      <w:r>
+        <w:rPr>
+          <w:lang w:val="en-US"/>
+        </w:rPr>
+        <w:t>ssl</w:t>
+      </w:r>
+      <w:proofErr w:type="spellEnd"/>
+    </w:p>
+    <w:p>
+      <w:pPr>
+        <w:pStyle w:val="ae"/>
+        <w:numPr>
+          <w:ilvl w:val="0"/>
+          <w:numId w:val="29"/>
+        </w:numPr>
+        <w:jc w:val="left"/>
+      </w:pPr>
+      <w:proofErr w:type="gramStart"/>
+      <w:r>
+        <w:t>-</w:t>
+      </w:r>
+      <w:proofErr w:type="spellStart"/>
+      <w:r>
+        <w:rPr>
+          <w:lang w:val="en-US"/>
+        </w:rPr>
+        <w:t>Djava</w:t>
+      </w:r>
+      <w:proofErr w:type="spellEnd"/>
+      <w:r>
+        <w:t>.</w:t>
+      </w:r>
+      <w:proofErr w:type="spellStart"/>
+      <w:r>
+        <w:rPr>
+          <w:lang w:val="en-US"/>
+        </w:rPr>
+        <w:t>rmi</w:t>
+      </w:r>
+      <w:proofErr w:type="spellEnd"/>
+      <w:r>
+        <w:t>.</w:t>
+      </w:r>
+      <w:r>
+        <w:rPr>
+          <w:lang w:val="en-US"/>
+        </w:rPr>
+        <w:t>server</w:t>
+      </w:r>
+      <w:r>
+        <w:t>.</w:t>
+      </w:r>
+      <w:r>
+        <w:rPr>
+          <w:lang w:val="en-US"/>
+        </w:rPr>
+        <w:t>hostname</w:t>
+      </w:r>
+      <w:proofErr w:type="gramEnd"/>
+      <w:r>
+        <w:t xml:space="preserve">=127.0.0.1 </w:t>
+      </w:r>
+      <w:r>
+        <w:t xml:space="preserve">указание реального адреса для </w:t>
+      </w:r>
+      <w:r>
+        <w:rPr>
+          <w:lang w:val="en-US"/>
+        </w:rPr>
+        <w:t>remote</w:t>
+      </w:r>
+      <w:r>
+        <w:t xml:space="preserve"> </w:t>
+      </w:r>
+      <w:r>
+        <w:rPr>
+          <w:lang w:val="en-US"/>
+        </w:rPr>
+        <w:t>stub</w:t>
+      </w:r>
+      <w:r>
+        <w:t xml:space="preserve"> </w:t>
+      </w:r>
+      <w:r>
+        <w:t xml:space="preserve">во избежание указание </w:t>
+      </w:r>
+      <w:r>
+        <w:t>адрес</w:t>
+      </w:r>
+      <w:r>
+        <w:t>а</w:t>
+      </w:r>
+      <w:r>
+        <w:t xml:space="preserve"> сети </w:t>
+      </w:r>
+      <w:r>
+        <w:rPr>
+          <w:lang w:val="en-US"/>
+        </w:rPr>
+        <w:t>Docker</w:t>
+      </w:r>
+    </w:p>
+    <w:p>
+      <w:pPr>
+        <w:pStyle w:val="ae"/>
+        <w:numPr>
+          <w:ilvl w:val="0"/>
+          <w:numId w:val="29"/>
+        </w:numPr>
+      </w:pPr>
+      <w:proofErr w:type="gramStart"/>
+      <w:r>
+        <w:t>-</w:t>
+      </w:r>
+      <w:r>
+        <w:rPr>
+          <w:lang w:val="en-US"/>
+        </w:rPr>
+        <w:t>D</w:t>
+      </w:r>
+      <w:proofErr w:type="spellStart"/>
+      <w:r>
+        <w:t>com.sun.management.jmxremote</w:t>
+      </w:r>
+      <w:proofErr w:type="gramEnd"/>
+      <w:r>
+        <w:t>.</w:t>
+      </w:r>
+      <w:proofErr w:type="gramStart"/>
+      <w:r>
+        <w:t>password.file</w:t>
+      </w:r>
+      <w:proofErr w:type="spellEnd"/>
+      <w:proofErr w:type="gramEnd"/>
+      <w:r>
+        <w:t>=</w:t>
+      </w:r>
+      <w:proofErr w:type="spellStart"/>
+      <w:proofErr w:type="gramStart"/>
+      <w:r>
+        <w:t>jmxremote.password</w:t>
+      </w:r>
+      <w:proofErr w:type="spellEnd"/>
+      <w:proofErr w:type="gramEnd"/>
+      <w:r>
+        <w:t xml:space="preserve"> </w:t>
+      </w:r>
+      <w:r>
+        <w:t>указание адреса файла с паролями</w:t>
+      </w:r>
+    </w:p>
+    <w:p>
+      <w:pPr>
         <w:pStyle w:val="ae"/>
         <w:rPr>
           <w:sz w:val="48"/>
@@ -6063,6 +7085,7 @@
           <w:lang w:val="ru-RU"/>
         </w:rPr>
       </w:pPr>
+      <w:bookmarkStart w:id="10" w:name="_Toc237943191"/>
       <w:r>
         <w:rPr>
           <w:lang w:val="ru-RU"/>
@@ -6070,9 +7093,9 @@
         <w:lastRenderedPageBreak/>
         <w:t>Источники</w:t>
       </w:r>
-      <w:bookmarkEnd w:id="6"/>
+      <w:bookmarkEnd w:id="10"/>
     </w:p>
-    <w:bookmarkStart w:id="7" w:name="_Toc237713317" w:displacedByCustomXml="next"/>
+    <w:bookmarkStart w:id="11" w:name="_Toc237943192" w:displacedByCustomXml="next"/>
     <w:sdt>
       <w:sdtPr>
         <w:rPr>
@@ -6104,7 +7127,7 @@
             </w:rPr>
             <w:t>Ссылки</w:t>
           </w:r>
-          <w:bookmarkEnd w:id="7"/>
+          <w:bookmarkEnd w:id="11"/>
         </w:p>
         <w:sdt>
           <w:sdtPr>
@@ -6683,7 +7706,7 @@
       </w:sdtContent>
     </w:sdt>
     <w:sectPr>
-      <w:headerReference w:type="default" r:id="rId15"/>
+      <w:headerReference w:type="default" r:id="rId16"/>
       <w:pgSz w:w="12240" w:h="15840"/>
       <w:pgMar w:top="1440" w:right="1440" w:bottom="1440" w:left="1440" w:header="720" w:footer="720" w:gutter="0"/>
       <w:pgNumType w:start="1"/>
@@ -9175,7 +10198,7 @@
   <w:abstractNum w:abstractNumId="21" w15:restartNumberingAfterBreak="0">
     <w:nsid w:val="6841526B"/>
     <w:multiLevelType w:val="hybridMultilevel"/>
-    <w:tmpl w:val="126E895A"/>
+    <w:tmpl w:val="0AD2897A"/>
     <w:lvl w:ilvl="0" w:tplc="E8A6E778">
       <w:start w:val="1"/>
       <w:numFmt w:val="bullet"/>
@@ -10910,6 +11933,19 @@
       <w:rFonts w:ascii="Consolas" w:hAnsi="Consolas"/>
     </w:rPr>
   </w:style>
+  <w:style w:type="paragraph" w:styleId="30">
+    <w:name w:val="toc 3"/>
+    <w:basedOn w:val="a"/>
+    <w:next w:val="a"/>
+    <w:autoRedefine/>
+    <w:uiPriority w:val="39"/>
+    <w:unhideWhenUsed/>
+    <w:rsid w:val="00D43E74"/>
+    <w:pPr>
+      <w:spacing w:after="100"/>
+      <w:ind w:left="480"/>
+    </w:pPr>
+  </w:style>
 </w:styles>
 </file>
 
@@ -11340,6 +12376,22 @@
     <b:URL>https://docs.oracle.com/en/java/javase/26/docs/api/java.management/javax/management/monitor/MonitorMBean.html</b:URL>
     <b:RefOrder>7</b:RefOrder>
   </b:Source>
+  <b:Source>
+    <b:Tag>Ora262</b:Tag>
+    <b:SourceType>InternetSite</b:SourceType>
+    <b:Guid>{AA148D37-2610-4257-A761-4A65C82D47E9}</b:Guid>
+    <b:Author>
+      <b:Author>
+        <b:Corporate>Oracle</b:Corporate>
+      </b:Author>
+    </b:Author>
+    <b:Title>Monitoring and Management using JConsole</b:Title>
+    <b:YearAccessed>2026</b:YearAccessed>
+    <b:MonthAccessed>Август</b:MonthAccessed>
+    <b:DayAccessed>17</b:DayAccessed>
+    <b:URL>https://docs.oracle.com/en/java/javase/17/management/monitoring-and-management-using-jmx-technology.html#GUID-096EA656-4D07-4B09-A493-9EDEF83ABF28</b:URL>
+    <b:RefOrder>8</b:RefOrder>
+  </b:Source>
 </b:Sources>
 </file>
 
@@ -11353,7 +12405,7 @@
 </file>
 
 <file path=customXml/itemProps2.xml><?xml version="1.0" encoding="utf-8"?>
-<ds:datastoreItem xmlns:ds="http://schemas.openxmlformats.org/officeDocument/2006/customXml" ds:itemID="{1C97FB63-7111-452E-BCAF-366C6317719B}">
+<ds:datastoreItem xmlns:ds="http://schemas.openxmlformats.org/officeDocument/2006/customXml" ds:itemID="{0BF69276-862B-45F9-A83E-E30FB959E766}">
   <ds:schemaRefs>
     <ds:schemaRef ds:uri="http://schemas.openxmlformats.org/officeDocument/2006/bibliography"/>
   </ds:schemaRefs>

</xml_diff>

<commit_message>
SSL connectiona dded and described in the review
</commit_message>
<xml_diff>
--- a/LAB_4_Соловьёв_P3230.docx
+++ b/LAB_4_Соловьёв_P3230.docx
@@ -455,7 +455,7 @@
           <w:r>
             <w:fldChar w:fldCharType="separate"/>
           </w:r>
-          <w:hyperlink w:anchor="_Toc237943184" w:history="1">
+          <w:hyperlink w:anchor="_Toc237951991" w:history="1">
             <w:r>
               <w:rPr>
                 <w:rStyle w:val="a6"/>
@@ -483,7 +483,7 @@
                 <w:noProof/>
                 <w:webHidden/>
               </w:rPr>
-              <w:instrText xml:space="preserve"> PAGEREF _Toc237943184 \h </w:instrText>
+              <w:instrText xml:space="preserve"> PAGEREF _Toc237951991 \h </w:instrText>
             </w:r>
             <w:r>
               <w:rPr>
@@ -529,7 +529,7 @@
               <w14:ligatures w14:val="standardContextual"/>
             </w:rPr>
           </w:pPr>
-          <w:hyperlink w:anchor="_Toc237943185" w:history="1">
+          <w:hyperlink w:anchor="_Toc237951992" w:history="1">
             <w:r>
               <w:rPr>
                 <w:rStyle w:val="a6"/>
@@ -556,7 +556,7 @@
                 <w:noProof/>
                 <w:webHidden/>
               </w:rPr>
-              <w:instrText xml:space="preserve"> PAGEREF _Toc237943185 \h </w:instrText>
+              <w:instrText xml:space="preserve"> PAGEREF _Toc237951992 \h </w:instrText>
             </w:r>
             <w:r>
               <w:rPr>
@@ -602,7 +602,7 @@
               <w14:ligatures w14:val="standardContextual"/>
             </w:rPr>
           </w:pPr>
-          <w:hyperlink w:anchor="_Toc237943186" w:history="1">
+          <w:hyperlink w:anchor="_Toc237951993" w:history="1">
             <w:r>
               <w:rPr>
                 <w:rStyle w:val="a6"/>
@@ -645,7 +645,7 @@
                 <w:noProof/>
                 <w:webHidden/>
               </w:rPr>
-              <w:instrText xml:space="preserve"> PAGEREF _Toc237943186 \h </w:instrText>
+              <w:instrText xml:space="preserve"> PAGEREF _Toc237951993 \h </w:instrText>
             </w:r>
             <w:r>
               <w:rPr>
@@ -691,7 +691,7 @@
               <w14:ligatures w14:val="standardContextual"/>
             </w:rPr>
           </w:pPr>
-          <w:hyperlink w:anchor="_Toc237943187" w:history="1">
+          <w:hyperlink w:anchor="_Toc237951994" w:history="1">
             <w:r>
               <w:rPr>
                 <w:rStyle w:val="a6"/>
@@ -719,7 +719,7 @@
                 <w:noProof/>
                 <w:webHidden/>
               </w:rPr>
-              <w:instrText xml:space="preserve"> PAGEREF _Toc237943187 \h </w:instrText>
+              <w:instrText xml:space="preserve"> PAGEREF _Toc237951994 \h </w:instrText>
             </w:r>
             <w:r>
               <w:rPr>
@@ -765,7 +765,7 @@
               <w14:ligatures w14:val="standardContextual"/>
             </w:rPr>
           </w:pPr>
-          <w:hyperlink w:anchor="_Toc237943188" w:history="1">
+          <w:hyperlink w:anchor="_Toc237951995" w:history="1">
             <w:r>
               <w:rPr>
                 <w:rStyle w:val="a6"/>
@@ -793,7 +793,7 @@
                 <w:noProof/>
                 <w:webHidden/>
               </w:rPr>
-              <w:instrText xml:space="preserve"> PAGEREF _Toc237943188 \h </w:instrText>
+              <w:instrText xml:space="preserve"> PAGEREF _Toc237951995 \h </w:instrText>
             </w:r>
             <w:r>
               <w:rPr>
@@ -826,7 +826,7 @@
         </w:p>
         <w:p>
           <w:pPr>
-            <w:pStyle w:val="30"/>
+            <w:pStyle w:val="31"/>
             <w:tabs>
               <w:tab w:val="right" w:leader="dot" w:pos="9350"/>
             </w:tabs>
@@ -839,7 +839,7 @@
               <w14:ligatures w14:val="standardContextual"/>
             </w:rPr>
           </w:pPr>
-          <w:hyperlink w:anchor="_Toc237943189" w:history="1">
+          <w:hyperlink w:anchor="_Toc237951996" w:history="1">
             <w:r>
               <w:rPr>
                 <w:rStyle w:val="a6"/>
@@ -867,7 +867,7 @@
                 <w:noProof/>
                 <w:webHidden/>
               </w:rPr>
-              <w:instrText xml:space="preserve"> PAGEREF _Toc237943189 \h </w:instrText>
+              <w:instrText xml:space="preserve"> PAGEREF _Toc237951996 \h </w:instrText>
             </w:r>
             <w:r>
               <w:rPr>
@@ -900,7 +900,7 @@
         </w:p>
         <w:p>
           <w:pPr>
-            <w:pStyle w:val="30"/>
+            <w:pStyle w:val="31"/>
             <w:tabs>
               <w:tab w:val="right" w:leader="dot" w:pos="9350"/>
             </w:tabs>
@@ -913,14 +913,14 @@
               <w14:ligatures w14:val="standardContextual"/>
             </w:rPr>
           </w:pPr>
-          <w:hyperlink w:anchor="_Toc237943190" w:history="1">
+          <w:hyperlink w:anchor="_Toc237951997" w:history="1">
             <w:r>
               <w:rPr>
                 <w:rStyle w:val="a6"/>
                 <w:noProof/>
                 <w:lang w:val="ru-RU"/>
               </w:rPr>
-              <w:t>Подключение</w:t>
+              <w:t xml:space="preserve">Подключение </w:t>
             </w:r>
             <w:r>
               <w:rPr>
@@ -928,7 +928,55 @@
                 <w:noProof/>
                 <w:lang w:val="en-US"/>
               </w:rPr>
-              <w:t xml:space="preserve"> File-Based Password Authentication</w:t>
+              <w:t>File</w:t>
+            </w:r>
+            <w:r>
+              <w:rPr>
+                <w:rStyle w:val="a6"/>
+                <w:noProof/>
+                <w:lang w:val="ru-RU"/>
+              </w:rPr>
+              <w:t>-</w:t>
+            </w:r>
+            <w:r>
+              <w:rPr>
+                <w:rStyle w:val="a6"/>
+                <w:noProof/>
+                <w:lang w:val="en-US"/>
+              </w:rPr>
+              <w:t>Based</w:t>
+            </w:r>
+            <w:r>
+              <w:rPr>
+                <w:rStyle w:val="a6"/>
+                <w:noProof/>
+                <w:lang w:val="ru-RU"/>
+              </w:rPr>
+              <w:t xml:space="preserve"> </w:t>
+            </w:r>
+            <w:r>
+              <w:rPr>
+                <w:rStyle w:val="a6"/>
+                <w:noProof/>
+                <w:lang w:val="en-US"/>
+              </w:rPr>
+              <w:t>Password</w:t>
+            </w:r>
+            <w:r>
+              <w:rPr>
+                <w:rStyle w:val="a6"/>
+                <w:noProof/>
+                <w:lang w:val="ru-RU"/>
+              </w:rPr>
+              <w:t xml:space="preserve"> </w:t>
+            </w:r>
+            <w:r>
+              <w:rPr>
+                <w:rStyle w:val="a6"/>
+                <w:noProof/>
+                <w:lang w:val="en-US"/>
+              </w:rPr>
+              <w:t>Authentication</w:t>
             </w:r>
             <w:r>
               <w:rPr>
@@ -949,7 +997,7 @@
                 <w:noProof/>
                 <w:webHidden/>
               </w:rPr>
-              <w:instrText xml:space="preserve"> PAGEREF _Toc237943190 \h </w:instrText>
+              <w:instrText xml:space="preserve"> PAGEREF _Toc237951997 \h </w:instrText>
             </w:r>
             <w:r>
               <w:rPr>
@@ -970,6 +1018,120 @@
                 <w:webHidden/>
               </w:rPr>
               <w:t>13</w:t>
+            </w:r>
+            <w:r>
+              <w:rPr>
+                <w:noProof/>
+                <w:webHidden/>
+              </w:rPr>
+              <w:fldChar w:fldCharType="end"/>
+            </w:r>
+          </w:hyperlink>
+        </w:p>
+        <w:p>
+          <w:pPr>
+            <w:pStyle w:val="31"/>
+            <w:tabs>
+              <w:tab w:val="right" w:leader="dot" w:pos="9350"/>
+            </w:tabs>
+            <w:rPr>
+              <w:rFonts w:asciiTheme="minorHAnsi" w:eastAsiaTheme="minorEastAsia" w:hAnsiTheme="minorHAnsi" w:cstheme="minorBidi"/>
+              <w:noProof/>
+              <w:kern w:val="2"/>
+              <w:szCs w:val="24"/>
+              <w:lang w:val="ru-RU"/>
+              <w14:ligatures w14:val="standardContextual"/>
+            </w:rPr>
+          </w:pPr>
+          <w:hyperlink w:anchor="_Toc237951998" w:history="1">
+            <w:r>
+              <w:rPr>
+                <w:rStyle w:val="a6"/>
+                <w:noProof/>
+                <w:lang w:val="ru-RU"/>
+              </w:rPr>
+              <w:t xml:space="preserve">Подключение с помощью </w:t>
+            </w:r>
+            <w:r>
+              <w:rPr>
+                <w:rStyle w:val="a6"/>
+                <w:noProof/>
+                <w:lang w:val="en-US"/>
+              </w:rPr>
+              <w:t>Secure</w:t>
+            </w:r>
+            <w:r>
+              <w:rPr>
+                <w:rStyle w:val="a6"/>
+                <w:noProof/>
+                <w:lang w:val="ru-RU"/>
+              </w:rPr>
+              <w:t xml:space="preserve"> </w:t>
+            </w:r>
+            <w:r>
+              <w:rPr>
+                <w:rStyle w:val="a6"/>
+                <w:noProof/>
+                <w:lang w:val="en-US"/>
+              </w:rPr>
+              <w:t>Socket</w:t>
+            </w:r>
+            <w:r>
+              <w:rPr>
+                <w:rStyle w:val="a6"/>
+                <w:noProof/>
+                <w:lang w:val="ru-RU"/>
+              </w:rPr>
+              <w:t xml:space="preserve"> </w:t>
+            </w:r>
+            <w:r>
+              <w:rPr>
+                <w:rStyle w:val="a6"/>
+                <w:noProof/>
+                <w:lang w:val="en-US"/>
+              </w:rPr>
+              <w:t>Layer</w:t>
+            </w:r>
+            <w:r>
+              <w:rPr>
+                <w:noProof/>
+                <w:webHidden/>
+              </w:rPr>
+              <w:tab/>
+            </w:r>
+            <w:r>
+              <w:rPr>
+                <w:noProof/>
+                <w:webHidden/>
+              </w:rPr>
+              <w:fldChar w:fldCharType="begin"/>
+            </w:r>
+            <w:r>
+              <w:rPr>
+                <w:noProof/>
+                <w:webHidden/>
+              </w:rPr>
+              <w:instrText xml:space="preserve"> PAGEREF _Toc237951998 \h </w:instrText>
+            </w:r>
+            <w:r>
+              <w:rPr>
+                <w:noProof/>
+                <w:webHidden/>
+              </w:rPr>
+            </w:r>
+            <w:r>
+              <w:rPr>
+                <w:noProof/>
+                <w:webHidden/>
+              </w:rPr>
+              <w:fldChar w:fldCharType="separate"/>
+            </w:r>
+            <w:r>
+              <w:rPr>
+                <w:noProof/>
+                <w:webHidden/>
+              </w:rPr>
+              <w:t>14</w:t>
             </w:r>
             <w:r>
               <w:rPr>
@@ -995,81 +1157,7 @@
               <w14:ligatures w14:val="standardContextual"/>
             </w:rPr>
           </w:pPr>
-          <w:hyperlink w:anchor="_Toc237943191" w:history="1">
-            <w:r>
-              <w:rPr>
-                <w:rStyle w:val="a6"/>
-                <w:noProof/>
-                <w:lang w:val="ru-RU"/>
-              </w:rPr>
-              <w:t>Источники</w:t>
-            </w:r>
-            <w:r>
-              <w:rPr>
-                <w:noProof/>
-                <w:webHidden/>
-              </w:rPr>
-              <w:tab/>
-            </w:r>
-            <w:r>
-              <w:rPr>
-                <w:noProof/>
-                <w:webHidden/>
-              </w:rPr>
-              <w:fldChar w:fldCharType="begin"/>
-            </w:r>
-            <w:r>
-              <w:rPr>
-                <w:noProof/>
-                <w:webHidden/>
-              </w:rPr>
-              <w:instrText xml:space="preserve"> PAGEREF _Toc237943191 \h </w:instrText>
-            </w:r>
-            <w:r>
-              <w:rPr>
-                <w:noProof/>
-                <w:webHidden/>
-              </w:rPr>
-            </w:r>
-            <w:r>
-              <w:rPr>
-                <w:noProof/>
-                <w:webHidden/>
-              </w:rPr>
-              <w:fldChar w:fldCharType="separate"/>
-            </w:r>
-            <w:r>
-              <w:rPr>
-                <w:noProof/>
-                <w:webHidden/>
-              </w:rPr>
-              <w:t>15</w:t>
-            </w:r>
-            <w:r>
-              <w:rPr>
-                <w:noProof/>
-                <w:webHidden/>
-              </w:rPr>
-              <w:fldChar w:fldCharType="end"/>
-            </w:r>
-          </w:hyperlink>
-        </w:p>
-        <w:p>
-          <w:pPr>
-            <w:pStyle w:val="11"/>
-            <w:tabs>
-              <w:tab w:val="right" w:leader="dot" w:pos="9350"/>
-            </w:tabs>
-            <w:rPr>
-              <w:rFonts w:asciiTheme="minorHAnsi" w:eastAsiaTheme="minorEastAsia" w:hAnsiTheme="minorHAnsi" w:cstheme="minorBidi"/>
-              <w:noProof/>
-              <w:kern w:val="2"/>
-              <w:szCs w:val="24"/>
-              <w:lang w:val="ru-RU"/>
-              <w14:ligatures w14:val="standardContextual"/>
-            </w:rPr>
-          </w:pPr>
-          <w:hyperlink w:anchor="_Toc237943192" w:history="1">
+          <w:hyperlink w:anchor="_Toc237951999" w:history="1">
             <w:r>
               <w:rPr>
                 <w:rStyle w:val="a6"/>
@@ -1097,7 +1185,7 @@
                 <w:noProof/>
                 <w:webHidden/>
               </w:rPr>
-              <w:instrText xml:space="preserve"> PAGEREF _Toc237943192 \h </w:instrText>
+              <w:instrText xml:space="preserve"> PAGEREF _Toc237951999 \h </w:instrText>
             </w:r>
             <w:r>
               <w:rPr>
@@ -1169,7 +1257,7 @@
               <w:lang w:val="ru-RU"/>
             </w:rPr>
           </w:pPr>
-          <w:bookmarkStart w:id="3" w:name="_Toc237943184"/>
+          <w:bookmarkStart w:id="3" w:name="_Toc237951991"/>
           <w:r>
             <w:rPr>
               <w:lang w:val="ru-RU"/>
@@ -1585,7 +1673,7 @@
           <w:lang w:val="ru-RU"/>
         </w:rPr>
       </w:pPr>
-      <w:bookmarkStart w:id="4" w:name="_Toc237943185"/>
+      <w:bookmarkStart w:id="4" w:name="_Toc237951992"/>
       <w:r>
         <w:lastRenderedPageBreak/>
         <w:t>Исходный код разработанных MBean-классов, описаний событий JDK Flight Recorder и сопутствующих классов</w:t>
@@ -3750,25 +3838,14 @@
       <w:pPr>
         <w:pStyle w:val="ab"/>
       </w:pPr>
-      <w:r>
-        <w:lastRenderedPageBreak/>
-        <w:fldChar w:fldCharType="begin"/>
-      </w:r>
-      <w:r>
-        <w:instrText xml:space="preserve"> SEQ Формула \* ARABIC </w:instrText>
-      </w:r>
-      <w:r>
-        <w:fldChar w:fldCharType="separate"/>
-      </w:r>
-      <w:r>
-        <w:rPr>
-          <w:noProof/>
-        </w:rPr>
-        <w:t>2</w:t>
-      </w:r>
-      <w:r>
-        <w:fldChar w:fldCharType="end"/>
-      </w:r>
+      <w:fldSimple w:instr=" SEQ Формула \* ARABIC ">
+        <w:r>
+          <w:rPr>
+            <w:noProof/>
+          </w:rPr>
+          <w:t>2</w:t>
+        </w:r>
+      </w:fldSimple>
       <w:r>
         <w:rPr>
           <w:lang w:val="ru-RU"/>
@@ -4286,15 +4363,7 @@
               <w:pStyle w:val="ac"/>
             </w:pPr>
             <w:r>
-              <w:t xml:space="preserve">            // </w:t>
-            </w:r>
-            <w:proofErr w:type="spellStart"/>
-            <w:r>
-              <w:t>its</w:t>
-            </w:r>
-            <w:proofErr w:type="spellEnd"/>
-            <w:r>
-              <w:t xml:space="preserve"> impossible, but safe</w:t>
+              <w:t xml:space="preserve">            // its impossible, but safe</w:t>
             </w:r>
           </w:p>
           <w:p>
@@ -4425,24 +4494,14 @@
       <w:pPr>
         <w:pStyle w:val="ab"/>
       </w:pPr>
-      <w:r>
-        <w:fldChar w:fldCharType="begin"/>
-      </w:r>
-      <w:r>
-        <w:instrText xml:space="preserve"> SEQ Формула \* ARABIC </w:instrText>
-      </w:r>
-      <w:r>
-        <w:fldChar w:fldCharType="separate"/>
-      </w:r>
-      <w:r>
-        <w:rPr>
-          <w:noProof/>
-        </w:rPr>
-        <w:t>3</w:t>
-      </w:r>
-      <w:r>
-        <w:fldChar w:fldCharType="end"/>
-      </w:r>
+      <w:fldSimple w:instr=" SEQ Формула \* ARABIC ">
+        <w:r>
+          <w:rPr>
+            <w:noProof/>
+          </w:rPr>
+          <w:t>3</w:t>
+        </w:r>
+      </w:fldSimple>
       <w:r>
         <w:rPr>
           <w:lang w:val="ru-RU"/>
@@ -5511,10 +5570,10 @@
       <w:pPr>
         <w:pStyle w:val="1"/>
         <w:rPr>
-          <w:lang w:val="en-US"/>
-        </w:rPr>
-      </w:pPr>
-      <w:bookmarkStart w:id="5" w:name="_Toc237943186"/>
+          <w:lang w:val="ru-RU"/>
+        </w:rPr>
+      </w:pPr>
+      <w:bookmarkStart w:id="5" w:name="_Toc237951993"/>
       <w:r>
         <w:lastRenderedPageBreak/>
         <w:t>Мониторинг</w:t>
@@ -5548,7 +5607,7 @@
           <w:lang w:val="ru-RU"/>
         </w:rPr>
       </w:pPr>
-      <w:bookmarkStart w:id="6" w:name="_Toc237943187"/>
+      <w:bookmarkStart w:id="6" w:name="_Toc237951994"/>
       <w:r>
         <w:rPr>
           <w:lang w:val="ru-RU"/>
@@ -5567,6 +5626,7 @@
       </w:pPr>
       <w:r>
         <w:rPr>
+          <w:noProof/>
           <w:lang w:val="en-US"/>
         </w:rPr>
         <w:drawing>
@@ -5616,6 +5676,7 @@
       </w:pPr>
       <w:r>
         <w:rPr>
+          <w:noProof/>
           <w:lang w:val="en-US"/>
         </w:rPr>
         <w:drawing>
@@ -5665,6 +5726,7 @@
       </w:pPr>
       <w:r>
         <w:rPr>
+          <w:noProof/>
           <w:lang w:val="ru-RU"/>
         </w:rPr>
         <w:lastRenderedPageBreak/>
@@ -5715,6 +5777,7 @@
       </w:pPr>
       <w:r>
         <w:rPr>
+          <w:noProof/>
           <w:lang w:val="ru-RU"/>
         </w:rPr>
         <w:drawing>
@@ -5768,6 +5831,7 @@
       </w:pPr>
       <w:r>
         <w:rPr>
+          <w:noProof/>
           <w:lang w:val="ru-RU"/>
         </w:rPr>
         <w:lastRenderedPageBreak/>
@@ -5809,6 +5873,7 @@
       </w:r>
       <w:r>
         <w:rPr>
+          <w:noProof/>
           <w:lang w:val="ru-RU"/>
         </w:rPr>
         <w:drawing>
@@ -5861,7 +5926,7 @@
           <w:lang w:val="ru-RU"/>
         </w:rPr>
       </w:pPr>
-      <w:bookmarkStart w:id="7" w:name="_Toc237943188"/>
+      <w:bookmarkStart w:id="7" w:name="_Toc237951995"/>
       <w:r>
         <w:rPr>
           <w:lang w:val="ru-RU"/>
@@ -5878,7 +5943,7 @@
           <w:lang w:val="ru-RU"/>
         </w:rPr>
       </w:pPr>
-      <w:bookmarkStart w:id="8" w:name="_Toc237943189"/>
+      <w:bookmarkStart w:id="8" w:name="_Toc237951996"/>
       <w:r>
         <w:rPr>
           <w:lang w:val="ru-RU"/>
@@ -5959,10 +6024,7 @@
         <w:t>port</w:t>
       </w:r>
       <w:r>
-        <w:t>=8888</w:t>
-      </w:r>
-      <w:r>
-        <w:t xml:space="preserve"> </w:t>
+        <w:t xml:space="preserve">=8888 </w:t>
       </w:r>
       <w:r>
         <w:t>порт</w:t>
@@ -6055,10 +6117,7 @@
         <w:t>port</w:t>
       </w:r>
       <w:r>
-        <w:t>=8889</w:t>
-      </w:r>
-      <w:r>
-        <w:t xml:space="preserve"> </w:t>
+        <w:t xml:space="preserve">=8889 </w:t>
       </w:r>
       <w:r>
         <w:t>порт для обмена данными</w:t>
@@ -6320,10 +6379,7 @@
       </w:r>
       <w:proofErr w:type="gramEnd"/>
       <w:r>
-        <w:t>=127.0.0.1</w:t>
-      </w:r>
-      <w:r>
-        <w:t xml:space="preserve"> </w:t>
+        <w:t xml:space="preserve">=127.0.0.1 </w:t>
       </w:r>
       <w:r>
         <w:t>для</w:t>
@@ -6372,10 +6428,10 @@
       <w:pPr>
         <w:pStyle w:val="3"/>
         <w:rPr>
-          <w:lang w:val="en-US"/>
-        </w:rPr>
-      </w:pPr>
-      <w:bookmarkStart w:id="9" w:name="_Toc237943190"/>
+          <w:lang w:val="ru-RU"/>
+        </w:rPr>
+      </w:pPr>
+      <w:bookmarkStart w:id="9" w:name="_Toc237951997"/>
       <w:r>
         <w:rPr>
           <w:lang w:val="ru-RU"/>
@@ -6384,7 +6440,7 @@
       </w:r>
       <w:r>
         <w:rPr>
-          <w:lang w:val="en-US"/>
+          <w:lang w:val="ru-RU"/>
         </w:rPr>
         <w:t xml:space="preserve"> </w:t>
       </w:r>
@@ -6392,7 +6448,43 @@
         <w:rPr>
           <w:lang w:val="en-US"/>
         </w:rPr>
-        <w:t>File-Based Password Authentication</w:t>
+        <w:t>File</w:t>
+      </w:r>
+      <w:r>
+        <w:rPr>
+          <w:lang w:val="ru-RU"/>
+        </w:rPr>
+        <w:t>-</w:t>
+      </w:r>
+      <w:r>
+        <w:rPr>
+          <w:lang w:val="en-US"/>
+        </w:rPr>
+        <w:t>Based</w:t>
+      </w:r>
+      <w:r>
+        <w:rPr>
+          <w:lang w:val="ru-RU"/>
+        </w:rPr>
+        <w:t xml:space="preserve"> </w:t>
+      </w:r>
+      <w:r>
+        <w:rPr>
+          <w:lang w:val="en-US"/>
+        </w:rPr>
+        <w:t>Password</w:t>
+      </w:r>
+      <w:r>
+        <w:rPr>
+          <w:lang w:val="ru-RU"/>
+        </w:rPr>
+        <w:t xml:space="preserve"> </w:t>
+      </w:r>
+      <w:r>
+        <w:rPr>
+          <w:lang w:val="en-US"/>
+        </w:rPr>
+        <w:t>Authentication</w:t>
       </w:r>
       <w:bookmarkEnd w:id="9"/>
     </w:p>
@@ -6404,10 +6496,7 @@
         </w:rPr>
       </w:pPr>
       <w:r>
-        <w:t>Аутентификация п</w:t>
-      </w:r>
-      <w:r>
-        <w:t>о паролю включена по умолчанию</w:t>
+        <w:t>Аутентификация по паролю включена по умолчанию</w:t>
       </w:r>
       <w:sdt>
         <w:sdtPr>
@@ -6996,19 +7085,7 @@
         <w:t>stub</w:t>
       </w:r>
       <w:r>
-        <w:t xml:space="preserve"> </w:t>
-      </w:r>
-      <w:r>
-        <w:t xml:space="preserve">во избежание указание </w:t>
-      </w:r>
-      <w:r>
-        <w:t>адрес</w:t>
-      </w:r>
-      <w:r>
-        <w:t>а</w:t>
-      </w:r>
-      <w:r>
-        <w:t xml:space="preserve"> сети </w:t>
+        <w:t xml:space="preserve"> во избежание указание адреса сети </w:t>
       </w:r>
       <w:r>
         <w:rPr>
@@ -7068,7 +7145,746 @@
     </w:p>
     <w:p>
       <w:pPr>
+        <w:pStyle w:val="3"/>
+        <w:rPr>
+          <w:lang w:val="en-US"/>
+        </w:rPr>
+      </w:pPr>
+      <w:bookmarkStart w:id="10" w:name="_Toc237951998"/>
+      <w:r>
+        <w:rPr>
+          <w:lang w:val="ru-RU"/>
+        </w:rPr>
+        <w:t>Подключение</w:t>
+      </w:r>
+      <w:r>
+        <w:rPr>
+          <w:lang w:val="ru-RU"/>
+        </w:rPr>
+        <w:t xml:space="preserve"> </w:t>
+      </w:r>
+      <w:r>
+        <w:rPr>
+          <w:lang w:val="ru-RU"/>
+        </w:rPr>
+        <w:t xml:space="preserve">с помощью </w:t>
+      </w:r>
+      <w:r>
+        <w:rPr>
+          <w:lang w:val="en-US"/>
+        </w:rPr>
+        <w:t>Secure</w:t>
+      </w:r>
+      <w:r>
+        <w:rPr>
+          <w:lang w:val="ru-RU"/>
+        </w:rPr>
+        <w:t xml:space="preserve"> </w:t>
+      </w:r>
+      <w:r>
+        <w:rPr>
+          <w:lang w:val="en-US"/>
+        </w:rPr>
+        <w:t>Socket</w:t>
+      </w:r>
+      <w:r>
+        <w:rPr>
+          <w:lang w:val="ru-RU"/>
+        </w:rPr>
+        <w:t xml:space="preserve"> </w:t>
+      </w:r>
+      <w:r>
+        <w:rPr>
+          <w:lang w:val="en-US"/>
+        </w:rPr>
+        <w:t>Layer</w:t>
+      </w:r>
+      <w:bookmarkEnd w:id="10"/>
+    </w:p>
+    <w:p>
+      <w:pPr>
+        <w:rPr>
+          <w:lang w:val="ru-RU"/>
+        </w:rPr>
+      </w:pPr>
+      <w:r>
+        <w:rPr>
+          <w:lang w:val="en-US"/>
+        </w:rPr>
+        <w:t>SSL</w:t>
+      </w:r>
+      <w:r>
+        <w:rPr>
+          <w:lang w:val="ru-RU"/>
+        </w:rPr>
+        <w:t xml:space="preserve"> </w:t>
+      </w:r>
+      <w:r>
+        <w:rPr>
+          <w:lang w:val="ru-RU"/>
+        </w:rPr>
+        <w:t>подключен по умолчанию при разрешении удалённого мониторинга. Для подключения аутентификации необходимо создать пару ключей</w:t>
+      </w:r>
+      <w:r>
+        <w:rPr>
+          <w:lang w:val="ru-RU"/>
+        </w:rPr>
+        <w:t xml:space="preserve"> </w:t>
+      </w:r>
+      <w:r>
+        <w:rPr>
+          <w:lang w:val="ru-RU"/>
+        </w:rPr>
+        <w:t xml:space="preserve">и подписать их сертификатом, будет создано хранилище (в данной ЛР файл </w:t>
+      </w:r>
+      <w:proofErr w:type="spellStart"/>
+      <w:r>
+        <w:rPr>
+          <w:lang w:val="en-US"/>
+        </w:rPr>
+        <w:t>jmxserverkeystore</w:t>
+      </w:r>
+      <w:proofErr w:type="spellEnd"/>
+      <w:r>
+        <w:rPr>
+          <w:lang w:val="ru-RU"/>
+        </w:rPr>
+        <w:t xml:space="preserve">, он </w:t>
+      </w:r>
+      <w:proofErr w:type="spellStart"/>
+      <w:r>
+        <w:rPr>
+          <w:lang w:val="ru-RU"/>
+        </w:rPr>
+        <w:t>долден</w:t>
+      </w:r>
+      <w:proofErr w:type="spellEnd"/>
+      <w:r>
+        <w:rPr>
+          <w:lang w:val="ru-RU"/>
+        </w:rPr>
+        <w:t xml:space="preserve"> быть </w:t>
+      </w:r>
+      <w:proofErr w:type="spellStart"/>
+      <w:r>
+        <w:rPr>
+          <w:lang w:val="ru-RU"/>
+        </w:rPr>
+        <w:t>размёщен</w:t>
+      </w:r>
+      <w:proofErr w:type="spellEnd"/>
+      <w:r>
+        <w:rPr>
+          <w:lang w:val="ru-RU"/>
+        </w:rPr>
+        <w:t xml:space="preserve"> в контейнере\на удалённом устройстве). Тогда </w:t>
+      </w:r>
+      <w:r>
+        <w:rPr>
+          <w:lang w:val="en-US"/>
+        </w:rPr>
+        <w:t>JVM</w:t>
+      </w:r>
+      <w:r>
+        <w:rPr>
+          <w:lang w:val="ru-RU"/>
+        </w:rPr>
+        <w:t xml:space="preserve"> </w:t>
+      </w:r>
+      <w:r>
+        <w:rPr>
+          <w:lang w:val="ru-RU"/>
+        </w:rPr>
+        <w:t>запускается со следующими параметрами:</w:t>
+      </w:r>
+    </w:p>
+    <w:p>
+      <w:pPr>
         <w:pStyle w:val="ae"/>
+        <w:numPr>
+          <w:ilvl w:val="0"/>
+          <w:numId w:val="29"/>
+        </w:numPr>
+        <w:jc w:val="left"/>
+      </w:pPr>
+      <w:proofErr w:type="gramStart"/>
+      <w:r>
+        <w:t>-</w:t>
+      </w:r>
+      <w:proofErr w:type="spellStart"/>
+      <w:r>
+        <w:rPr>
+          <w:lang w:val="en-US"/>
+        </w:rPr>
+        <w:t>Dcom</w:t>
+      </w:r>
+      <w:proofErr w:type="spellEnd"/>
+      <w:r>
+        <w:t>.</w:t>
+      </w:r>
+      <w:r>
+        <w:rPr>
+          <w:lang w:val="en-US"/>
+        </w:rPr>
+        <w:t>sun</w:t>
+      </w:r>
+      <w:r>
+        <w:t>.</w:t>
+      </w:r>
+      <w:r>
+        <w:rPr>
+          <w:lang w:val="en-US"/>
+        </w:rPr>
+        <w:t>management</w:t>
+      </w:r>
+      <w:r>
+        <w:t>.</w:t>
+      </w:r>
+      <w:proofErr w:type="spellStart"/>
+      <w:r>
+        <w:rPr>
+          <w:lang w:val="en-US"/>
+        </w:rPr>
+        <w:t>jmxremote</w:t>
+      </w:r>
+      <w:proofErr w:type="spellEnd"/>
+      <w:proofErr w:type="gramEnd"/>
+      <w:r>
+        <w:t>.</w:t>
+      </w:r>
+      <w:r>
+        <w:rPr>
+          <w:lang w:val="en-US"/>
+        </w:rPr>
+        <w:t>port</w:t>
+      </w:r>
+      <w:r>
+        <w:t xml:space="preserve">=8888 </w:t>
+      </w:r>
+      <w:r>
+        <w:t>порт</w:t>
+      </w:r>
+      <w:r>
+        <w:t xml:space="preserve"> </w:t>
+      </w:r>
+      <w:r>
+        <w:t xml:space="preserve">реестра для получения коннектора </w:t>
+      </w:r>
+      <w:proofErr w:type="spellStart"/>
+      <w:r>
+        <w:rPr>
+          <w:lang w:val="en-US"/>
+        </w:rPr>
+        <w:t>jmxrmi</w:t>
+      </w:r>
+      <w:proofErr w:type="spellEnd"/>
+    </w:p>
+    <w:p>
+      <w:pPr>
+        <w:pStyle w:val="ae"/>
+        <w:numPr>
+          <w:ilvl w:val="0"/>
+          <w:numId w:val="29"/>
+        </w:numPr>
+        <w:jc w:val="left"/>
+      </w:pPr>
+      <w:r>
+        <w:t>-</w:t>
+      </w:r>
+      <w:proofErr w:type="spellStart"/>
+      <w:r>
+        <w:rPr>
+          <w:lang w:val="en-US"/>
+        </w:rPr>
+        <w:t>Dcom</w:t>
+      </w:r>
+      <w:proofErr w:type="spellEnd"/>
+      <w:r>
+        <w:t>.</w:t>
+      </w:r>
+      <w:r>
+        <w:rPr>
+          <w:lang w:val="en-US"/>
+        </w:rPr>
+        <w:t>sun</w:t>
+      </w:r>
+      <w:r>
+        <w:t>.</w:t>
+      </w:r>
+      <w:r>
+        <w:rPr>
+          <w:lang w:val="en-US"/>
+        </w:rPr>
+        <w:t>management</w:t>
+      </w:r>
+      <w:r>
+        <w:t>.</w:t>
+      </w:r>
+      <w:proofErr w:type="spellStart"/>
+      <w:r>
+        <w:rPr>
+          <w:lang w:val="en-US"/>
+        </w:rPr>
+        <w:t>jmxremote</w:t>
+      </w:r>
+      <w:proofErr w:type="spellEnd"/>
+      <w:r>
+        <w:t>.</w:t>
+      </w:r>
+      <w:proofErr w:type="spellStart"/>
+      <w:r>
+        <w:rPr>
+          <w:lang w:val="en-US"/>
+        </w:rPr>
+        <w:t>rmi</w:t>
+      </w:r>
+      <w:proofErr w:type="spellEnd"/>
+      <w:r>
+        <w:t>.</w:t>
+      </w:r>
+      <w:r>
+        <w:rPr>
+          <w:lang w:val="en-US"/>
+        </w:rPr>
+        <w:t>port</w:t>
+      </w:r>
+      <w:r>
+        <w:t xml:space="preserve">=8889 </w:t>
+      </w:r>
+      <w:r>
+        <w:t>порт для обмена данными</w:t>
+      </w:r>
+      <w:r>
+        <w:t xml:space="preserve"> </w:t>
+      </w:r>
+      <w:proofErr w:type="spellStart"/>
+      <w:r>
+        <w:rPr>
+          <w:lang w:val="en-US"/>
+        </w:rPr>
+        <w:t>rmi</w:t>
+      </w:r>
+      <w:proofErr w:type="spellEnd"/>
+      <w:r>
+        <w:t xml:space="preserve"> </w:t>
+      </w:r>
+      <w:r>
+        <w:rPr>
+          <w:lang w:val="en-US"/>
+        </w:rPr>
+        <w:t>connector</w:t>
+      </w:r>
+    </w:p>
+    <w:p>
+      <w:pPr>
+        <w:pStyle w:val="ae"/>
+        <w:numPr>
+          <w:ilvl w:val="0"/>
+          <w:numId w:val="29"/>
+        </w:numPr>
+        <w:jc w:val="left"/>
+      </w:pPr>
+      <w:proofErr w:type="gramStart"/>
+      <w:r>
+        <w:t>-</w:t>
+      </w:r>
+      <w:proofErr w:type="spellStart"/>
+      <w:r>
+        <w:rPr>
+          <w:lang w:val="en-US"/>
+        </w:rPr>
+        <w:t>Djava</w:t>
+      </w:r>
+      <w:proofErr w:type="spellEnd"/>
+      <w:r>
+        <w:t>.</w:t>
+      </w:r>
+      <w:proofErr w:type="spellStart"/>
+      <w:r>
+        <w:rPr>
+          <w:lang w:val="en-US"/>
+        </w:rPr>
+        <w:t>rmi</w:t>
+      </w:r>
+      <w:proofErr w:type="spellEnd"/>
+      <w:r>
+        <w:t>.</w:t>
+      </w:r>
+      <w:r>
+        <w:rPr>
+          <w:lang w:val="en-US"/>
+        </w:rPr>
+        <w:t>server</w:t>
+      </w:r>
+      <w:r>
+        <w:t>.</w:t>
+      </w:r>
+      <w:r>
+        <w:rPr>
+          <w:lang w:val="en-US"/>
+        </w:rPr>
+        <w:t>hostname</w:t>
+      </w:r>
+      <w:proofErr w:type="gramEnd"/>
+      <w:r>
+        <w:t xml:space="preserve">=127.0.0.1 </w:t>
+      </w:r>
+      <w:r>
+        <w:t xml:space="preserve">указание реального адреса для </w:t>
+      </w:r>
+      <w:r>
+        <w:rPr>
+          <w:lang w:val="en-US"/>
+        </w:rPr>
+        <w:t>remote</w:t>
+      </w:r>
+      <w:r>
+        <w:t xml:space="preserve"> </w:t>
+      </w:r>
+      <w:r>
+        <w:rPr>
+          <w:lang w:val="en-US"/>
+        </w:rPr>
+        <w:t>stub</w:t>
+      </w:r>
+      <w:r>
+        <w:t xml:space="preserve"> во избежание указание адреса сети </w:t>
+      </w:r>
+      <w:r>
+        <w:rPr>
+          <w:lang w:val="en-US"/>
+        </w:rPr>
+        <w:t>Docker</w:t>
+      </w:r>
+    </w:p>
+    <w:p>
+      <w:pPr>
+        <w:pStyle w:val="ae"/>
+        <w:numPr>
+          <w:ilvl w:val="0"/>
+          <w:numId w:val="29"/>
+        </w:numPr>
+      </w:pPr>
+      <w:proofErr w:type="gramStart"/>
+      <w:r>
+        <w:t>-</w:t>
+      </w:r>
+      <w:r>
+        <w:rPr>
+          <w:lang w:val="en-US"/>
+        </w:rPr>
+        <w:t>D</w:t>
+      </w:r>
+      <w:proofErr w:type="spellStart"/>
+      <w:r>
+        <w:t>com.sun.management.jmxremote</w:t>
+      </w:r>
+      <w:proofErr w:type="gramEnd"/>
+      <w:r>
+        <w:t>.</w:t>
+      </w:r>
+      <w:proofErr w:type="gramStart"/>
+      <w:r>
+        <w:t>password.file</w:t>
+      </w:r>
+      <w:proofErr w:type="spellEnd"/>
+      <w:proofErr w:type="gramEnd"/>
+      <w:r>
+        <w:t>=</w:t>
+      </w:r>
+      <w:proofErr w:type="spellStart"/>
+      <w:proofErr w:type="gramStart"/>
+      <w:r>
+        <w:t>jmxremote.password</w:t>
+      </w:r>
+      <w:proofErr w:type="spellEnd"/>
+      <w:proofErr w:type="gramEnd"/>
+      <w:r>
+        <w:t xml:space="preserve"> </w:t>
+      </w:r>
+      <w:r>
+        <w:t>указание адреса файла с паролями</w:t>
+      </w:r>
+    </w:p>
+    <w:p>
+      <w:pPr>
+        <w:pStyle w:val="ae"/>
+        <w:numPr>
+          <w:ilvl w:val="0"/>
+          <w:numId w:val="29"/>
+        </w:numPr>
+      </w:pPr>
+      <w:proofErr w:type="spellStart"/>
+      <w:r>
+        <w:rPr>
+          <w:lang w:val="en-US"/>
+        </w:rPr>
+        <w:t>Djavax</w:t>
+      </w:r>
+      <w:proofErr w:type="spellEnd"/>
+      <w:r>
+        <w:t>.</w:t>
+      </w:r>
+      <w:r>
+        <w:rPr>
+          <w:lang w:val="en-US"/>
+        </w:rPr>
+        <w:t>net</w:t>
+      </w:r>
+      <w:r>
+        <w:t>.</w:t>
+      </w:r>
+      <w:proofErr w:type="spellStart"/>
+      <w:r>
+        <w:rPr>
+          <w:lang w:val="en-US"/>
+        </w:rPr>
+        <w:t>sslKeyStore</w:t>
+      </w:r>
+      <w:proofErr w:type="spellEnd"/>
+      <w:r>
+        <w:t>=</w:t>
+      </w:r>
+      <w:proofErr w:type="spellStart"/>
+      <w:r>
+        <w:rPr>
+          <w:lang w:val="en-US"/>
+        </w:rPr>
+        <w:t>jmxserverkeystore</w:t>
+      </w:r>
+      <w:proofErr w:type="spellEnd"/>
+      <w:r>
+        <w:t xml:space="preserve"> </w:t>
+      </w:r>
+      <w:r>
+        <w:t>путь</w:t>
+      </w:r>
+      <w:r>
+        <w:t xml:space="preserve"> </w:t>
+      </w:r>
+      <w:r>
+        <w:t>до</w:t>
+      </w:r>
+      <w:r>
+        <w:t xml:space="preserve"> </w:t>
+      </w:r>
+      <w:r>
+        <w:t>хранилища подписанных ключей</w:t>
+      </w:r>
+    </w:p>
+    <w:p>
+      <w:pPr>
+        <w:pStyle w:val="ae"/>
+        <w:numPr>
+          <w:ilvl w:val="0"/>
+          <w:numId w:val="29"/>
+        </w:numPr>
+      </w:pPr>
+      <w:proofErr w:type="spellStart"/>
+      <w:r>
+        <w:rPr>
+          <w:lang w:val="en-US"/>
+        </w:rPr>
+        <w:t>Djavax</w:t>
+      </w:r>
+      <w:proofErr w:type="spellEnd"/>
+      <w:r>
+        <w:t>.</w:t>
+      </w:r>
+      <w:r>
+        <w:rPr>
+          <w:lang w:val="en-US"/>
+        </w:rPr>
+        <w:t>net</w:t>
+      </w:r>
+      <w:r>
+        <w:t>.</w:t>
+      </w:r>
+      <w:proofErr w:type="spellStart"/>
+      <w:r>
+        <w:rPr>
+          <w:lang w:val="en-US"/>
+        </w:rPr>
+        <w:t>sslKeyStorePassword</w:t>
+      </w:r>
+      <w:proofErr w:type="spellEnd"/>
+      <w:r>
+        <w:t>=</w:t>
+      </w:r>
+      <w:r>
+        <w:rPr>
+          <w:lang w:val="en-US"/>
+        </w:rPr>
+        <w:t>password</w:t>
+      </w:r>
+      <w:r>
+        <w:t xml:space="preserve"> – </w:t>
+      </w:r>
+      <w:r>
+        <w:t>ручной ввод</w:t>
+      </w:r>
+      <w:r>
+        <w:t xml:space="preserve"> </w:t>
+      </w:r>
+      <w:r>
+        <w:t>пароля при удалённом запуске затруднителен</w:t>
+      </w:r>
+    </w:p>
+    <w:p>
+      <w:pPr>
+        <w:rPr>
+          <w:lang w:val="ru-RU"/>
+        </w:rPr>
+      </w:pPr>
+      <w:r>
+        <w:rPr>
+          <w:lang w:val="ru-RU"/>
+        </w:rPr>
+        <w:t xml:space="preserve">Также необходимо будет передать параметры при запуске </w:t>
+      </w:r>
+      <w:proofErr w:type="spellStart"/>
+      <w:r>
+        <w:rPr>
+          <w:lang w:val="en-US"/>
+        </w:rPr>
+        <w:t>jconsole</w:t>
+      </w:r>
+      <w:proofErr w:type="spellEnd"/>
+      <w:r>
+        <w:rPr>
+          <w:lang w:val="ru-RU"/>
+        </w:rPr>
+        <w:t xml:space="preserve"> для аутентификации</w:t>
+      </w:r>
+    </w:p>
+    <w:p>
+      <w:pPr>
+        <w:pStyle w:val="a5"/>
+        <w:numPr>
+          <w:ilvl w:val="0"/>
+          <w:numId w:val="30"/>
+        </w:numPr>
+        <w:rPr>
+          <w:lang w:val="en-US"/>
+        </w:rPr>
+      </w:pPr>
+      <w:r>
+        <w:rPr>
+          <w:lang w:val="en-US"/>
+        </w:rPr>
+        <w:t>-J-</w:t>
+      </w:r>
+      <w:proofErr w:type="spellStart"/>
+      <w:r>
+        <w:rPr>
+          <w:lang w:val="en-US"/>
+        </w:rPr>
+        <w:t>Djavax.net.ssl.trustStore</w:t>
+      </w:r>
+      <w:proofErr w:type="spellEnd"/>
+      <w:r>
+        <w:rPr>
+          <w:lang w:val="en-US"/>
+        </w:rPr>
+        <w:t>=</w:t>
+      </w:r>
+      <w:proofErr w:type="spellStart"/>
+      <w:r>
+        <w:rPr>
+          <w:lang w:val="en-US"/>
+        </w:rPr>
+        <w:t>jmxserverkeystore</w:t>
+      </w:r>
+      <w:proofErr w:type="spellEnd"/>
+    </w:p>
+    <w:p>
+      <w:pPr>
+        <w:pStyle w:val="a5"/>
+        <w:numPr>
+          <w:ilvl w:val="0"/>
+          <w:numId w:val="30"/>
+        </w:numPr>
+        <w:rPr>
+          <w:lang w:val="en-US"/>
+        </w:rPr>
+      </w:pPr>
+      <w:r>
+        <w:rPr>
+          <w:lang w:val="en-US"/>
+        </w:rPr>
+        <w:t>-J-</w:t>
+      </w:r>
+      <w:proofErr w:type="spellStart"/>
+      <w:r>
+        <w:rPr>
+          <w:lang w:val="en-US"/>
+        </w:rPr>
+        <w:t>Djavax.net.ssl.trustStorePassword</w:t>
+      </w:r>
+      <w:proofErr w:type="spellEnd"/>
+      <w:r>
+        <w:rPr>
+          <w:lang w:val="en-US"/>
+        </w:rPr>
+        <w:t>=password</w:t>
+      </w:r>
+    </w:p>
+    <w:p>
+      <w:pPr>
+        <w:ind w:left="567" w:firstLine="0"/>
+        <w:rPr>
+          <w:lang w:val="ru-RU"/>
+        </w:rPr>
+      </w:pPr>
+      <w:r>
+        <w:rPr>
+          <w:lang w:val="ru-RU"/>
+        </w:rPr>
+        <w:t xml:space="preserve">Надо отметить, что здесь </w:t>
+      </w:r>
+      <w:proofErr w:type="gramStart"/>
+      <w:r>
+        <w:rPr>
+          <w:lang w:val="ru-RU"/>
+        </w:rPr>
+        <w:t>имеется ввиду</w:t>
+      </w:r>
+      <w:proofErr w:type="gramEnd"/>
+      <w:r>
+        <w:rPr>
+          <w:lang w:val="ru-RU"/>
+        </w:rPr>
+        <w:t xml:space="preserve"> одностороннее </w:t>
+      </w:r>
+      <w:r>
+        <w:rPr>
+          <w:lang w:val="en-US"/>
+        </w:rPr>
+        <w:t>SSL</w:t>
+      </w:r>
+      <w:r>
+        <w:rPr>
+          <w:lang w:val="ru-RU"/>
+        </w:rPr>
+        <w:t xml:space="preserve"> </w:t>
+      </w:r>
+      <w:r>
+        <w:rPr>
+          <w:lang w:val="ru-RU"/>
+        </w:rPr>
+        <w:t>подключение и свою подлинность подтверждает только сервер, но не клиент</w:t>
+      </w:r>
+      <w:r>
+        <w:rPr>
+          <w:lang w:val="ru-RU"/>
+        </w:rPr>
+        <w:t>, а клиент подтверждает свою подлинность паролем.</w:t>
+      </w:r>
+    </w:p>
+    <w:p>
+      <w:pPr>
+        <w:pStyle w:val="ae"/>
+        <w:ind w:firstLine="0"/>
         <w:rPr>
           <w:sz w:val="48"/>
           <w:szCs w:val="48"/>
@@ -7078,24 +7894,7 @@
         <w:br w:type="page"/>
       </w:r>
     </w:p>
-    <w:p>
-      <w:pPr>
-        <w:pStyle w:val="1"/>
-        <w:rPr>
-          <w:lang w:val="ru-RU"/>
-        </w:rPr>
-      </w:pPr>
-      <w:bookmarkStart w:id="10" w:name="_Toc237943191"/>
-      <w:r>
-        <w:rPr>
-          <w:lang w:val="ru-RU"/>
-        </w:rPr>
-        <w:lastRenderedPageBreak/>
-        <w:t>Источники</w:t>
-      </w:r>
-      <w:bookmarkEnd w:id="10"/>
-    </w:p>
-    <w:bookmarkStart w:id="11" w:name="_Toc237943192" w:displacedByCustomXml="next"/>
+    <w:bookmarkStart w:id="11" w:name="_Toc237951999" w:displacedByCustomXml="next"/>
     <w:sdt>
       <w:sdtPr>
         <w:rPr>
@@ -7172,7 +7971,7 @@
               </w:tblGrid>
               <w:tr>
                 <w:trPr>
-                  <w:divId w:val="68774500"/>
+                  <w:divId w:val="1994798379"/>
                   <w:tblCellSpacing w:w="15" w:type="dxa"/>
                 </w:trPr>
                 <w:tc>
@@ -7247,7 +8046,7 @@
               </w:tr>
               <w:tr>
                 <w:trPr>
-                  <w:divId w:val="68774500"/>
+                  <w:divId w:val="1994798379"/>
                   <w:tblCellSpacing w:w="15" w:type="dxa"/>
                 </w:trPr>
                 <w:tc>
@@ -7326,7 +8125,7 @@
               </w:tr>
               <w:tr>
                 <w:trPr>
-                  <w:divId w:val="68774500"/>
+                  <w:divId w:val="1994798379"/>
                   <w:tblCellSpacing w:w="15" w:type="dxa"/>
                 </w:trPr>
                 <w:tc>
@@ -7405,7 +8204,7 @@
               </w:tr>
               <w:tr>
                 <w:trPr>
-                  <w:divId w:val="68774500"/>
+                  <w:divId w:val="1994798379"/>
                   <w:tblCellSpacing w:w="15" w:type="dxa"/>
                 </w:trPr>
                 <w:tc>
@@ -7484,7 +8283,7 @@
               </w:tr>
               <w:tr>
                 <w:trPr>
-                  <w:divId w:val="68774500"/>
+                  <w:divId w:val="1994798379"/>
                   <w:tblCellSpacing w:w="15" w:type="dxa"/>
                 </w:trPr>
                 <w:tc>
@@ -7558,7 +8357,7 @@
               </w:tr>
               <w:tr>
                 <w:trPr>
-                  <w:divId w:val="68774500"/>
+                  <w:divId w:val="1994798379"/>
                   <w:tblCellSpacing w:w="15" w:type="dxa"/>
                 </w:trPr>
                 <w:tc>
@@ -7632,7 +8431,7 @@
               </w:tr>
               <w:tr>
                 <w:trPr>
-                  <w:divId w:val="68774500"/>
+                  <w:divId w:val="1994798379"/>
                   <w:tblCellSpacing w:w="15" w:type="dxa"/>
                 </w:trPr>
                 <w:tc>
@@ -7676,10 +8475,89 @@
                   </w:p>
                 </w:tc>
               </w:tr>
+              <w:tr>
+                <w:trPr>
+                  <w:divId w:val="1994798379"/>
+                  <w:tblCellSpacing w:w="15" w:type="dxa"/>
+                </w:trPr>
+                <w:tc>
+                  <w:tcPr>
+                    <w:tcW w:w="50" w:type="pct"/>
+                    <w:hideMark/>
+                  </w:tcPr>
+                  <w:p>
+                    <w:pPr>
+                      <w:pStyle w:val="a9"/>
+                      <w:rPr>
+                        <w:noProof/>
+                      </w:rPr>
+                    </w:pPr>
+                    <w:r>
+                      <w:rPr>
+                        <w:noProof/>
+                      </w:rPr>
+                      <w:t xml:space="preserve">[8] </w:t>
+                    </w:r>
+                  </w:p>
+                </w:tc>
+                <w:tc>
+                  <w:tcPr>
+                    <w:tcW w:w="0" w:type="auto"/>
+                    <w:hideMark/>
+                  </w:tcPr>
+                  <w:p>
+                    <w:pPr>
+                      <w:pStyle w:val="a9"/>
+                      <w:rPr>
+                        <w:noProof/>
+                      </w:rPr>
+                    </w:pPr>
+                    <w:r>
+                      <w:rPr>
+                        <w:noProof/>
+                        <w:lang w:val="en-US"/>
+                      </w:rPr>
+                      <w:t>Oracle, «Monitoring and Management using JConsole,» [</w:t>
+                    </w:r>
+                    <w:r>
+                      <w:rPr>
+                        <w:noProof/>
+                      </w:rPr>
+                      <w:t>В</w:t>
+                    </w:r>
+                    <w:r>
+                      <w:rPr>
+                        <w:noProof/>
+                        <w:lang w:val="en-US"/>
+                      </w:rPr>
+                      <w:t xml:space="preserve"> </w:t>
+                    </w:r>
+                    <w:r>
+                      <w:rPr>
+                        <w:noProof/>
+                      </w:rPr>
+                      <w:t>Интернете</w:t>
+                    </w:r>
+                    <w:r>
+                      <w:rPr>
+                        <w:noProof/>
+                        <w:lang w:val="en-US"/>
+                      </w:rPr>
+                      <w:t xml:space="preserve">]. Available: https://docs.oracle.com/en/java/javase/17/management/monitoring-and-management-using-jmx-technology.html#GUID-096EA656-4D07-4B09-A493-9EDEF83ABF28. </w:t>
+                    </w:r>
+                    <w:r>
+                      <w:rPr>
+                        <w:noProof/>
+                      </w:rPr>
+                      <w:t>[Дата обращения: 17 Август 2026].</w:t>
+                    </w:r>
+                  </w:p>
+                </w:tc>
+              </w:tr>
             </w:tbl>
             <w:p>
               <w:pPr>
-                <w:divId w:val="68774500"/>
+                <w:divId w:val="1994798379"/>
                 <w:rPr>
                   <w:rFonts w:eastAsia="Times New Roman"/>
                   <w:noProof/>
@@ -8025,6 +8903,119 @@
     </w:lvl>
   </w:abstractNum>
   <w:abstractNum w:abstractNumId="2" w15:restartNumberingAfterBreak="0">
+    <w:nsid w:val="0B7533DC"/>
+    <w:multiLevelType w:val="hybridMultilevel"/>
+    <w:tmpl w:val="682C01C6"/>
+    <w:lvl w:ilvl="0" w:tplc="04190001">
+      <w:start w:val="1"/>
+      <w:numFmt w:val="bullet"/>
+      <w:lvlText w:val=""/>
+      <w:lvlJc w:val="left"/>
+      <w:pPr>
+        <w:ind w:left="1287" w:hanging="360"/>
+      </w:pPr>
+      <w:rPr>
+        <w:rFonts w:ascii="Symbol" w:hAnsi="Symbol" w:hint="default"/>
+      </w:rPr>
+    </w:lvl>
+    <w:lvl w:ilvl="1" w:tplc="04190003" w:tentative="1">
+      <w:start w:val="1"/>
+      <w:numFmt w:val="bullet"/>
+      <w:lvlText w:val="o"/>
+      <w:lvlJc w:val="left"/>
+      <w:pPr>
+        <w:ind w:left="2007" w:hanging="360"/>
+      </w:pPr>
+      <w:rPr>
+        <w:rFonts w:ascii="Courier New" w:hAnsi="Courier New" w:cs="Courier New" w:hint="default"/>
+      </w:rPr>
+    </w:lvl>
+    <w:lvl w:ilvl="2" w:tplc="04190005" w:tentative="1">
+      <w:start w:val="1"/>
+      <w:numFmt w:val="bullet"/>
+      <w:lvlText w:val=""/>
+      <w:lvlJc w:val="left"/>
+      <w:pPr>
+        <w:ind w:left="2727" w:hanging="360"/>
+      </w:pPr>
+      <w:rPr>
+        <w:rFonts w:ascii="Wingdings" w:hAnsi="Wingdings" w:hint="default"/>
+      </w:rPr>
+    </w:lvl>
+    <w:lvl w:ilvl="3" w:tplc="04190001" w:tentative="1">
+      <w:start w:val="1"/>
+      <w:numFmt w:val="bullet"/>
+      <w:lvlText w:val=""/>
+      <w:lvlJc w:val="left"/>
+      <w:pPr>
+        <w:ind w:left="3447" w:hanging="360"/>
+      </w:pPr>
+      <w:rPr>
+        <w:rFonts w:ascii="Symbol" w:hAnsi="Symbol" w:hint="default"/>
+      </w:rPr>
+    </w:lvl>
+    <w:lvl w:ilvl="4" w:tplc="04190003" w:tentative="1">
+      <w:start w:val="1"/>
+      <w:numFmt w:val="bullet"/>
+      <w:lvlText w:val="o"/>
+      <w:lvlJc w:val="left"/>
+      <w:pPr>
+        <w:ind w:left="4167" w:hanging="360"/>
+      </w:pPr>
+      <w:rPr>
+        <w:rFonts w:ascii="Courier New" w:hAnsi="Courier New" w:cs="Courier New" w:hint="default"/>
+      </w:rPr>
+    </w:lvl>
+    <w:lvl w:ilvl="5" w:tplc="04190005" w:tentative="1">
+      <w:start w:val="1"/>
+      <w:numFmt w:val="bullet"/>
+      <w:lvlText w:val=""/>
+      <w:lvlJc w:val="left"/>
+      <w:pPr>
+        <w:ind w:left="4887" w:hanging="360"/>
+      </w:pPr>
+      <w:rPr>
+        <w:rFonts w:ascii="Wingdings" w:hAnsi="Wingdings" w:hint="default"/>
+      </w:rPr>
+    </w:lvl>
+    <w:lvl w:ilvl="6" w:tplc="04190001" w:tentative="1">
+      <w:start w:val="1"/>
+      <w:numFmt w:val="bullet"/>
+      <w:lvlText w:val=""/>
+      <w:lvlJc w:val="left"/>
+      <w:pPr>
+        <w:ind w:left="5607" w:hanging="360"/>
+      </w:pPr>
+      <w:rPr>
+        <w:rFonts w:ascii="Symbol" w:hAnsi="Symbol" w:hint="default"/>
+      </w:rPr>
+    </w:lvl>
+    <w:lvl w:ilvl="7" w:tplc="04190003" w:tentative="1">
+      <w:start w:val="1"/>
+      <w:numFmt w:val="bullet"/>
+      <w:lvlText w:val="o"/>
+      <w:lvlJc w:val="left"/>
+      <w:pPr>
+        <w:ind w:left="6327" w:hanging="360"/>
+      </w:pPr>
+      <w:rPr>
+        <w:rFonts w:ascii="Courier New" w:hAnsi="Courier New" w:cs="Courier New" w:hint="default"/>
+      </w:rPr>
+    </w:lvl>
+    <w:lvl w:ilvl="8" w:tplc="04190005" w:tentative="1">
+      <w:start w:val="1"/>
+      <w:numFmt w:val="bullet"/>
+      <w:lvlText w:val=""/>
+      <w:lvlJc w:val="left"/>
+      <w:pPr>
+        <w:ind w:left="7047" w:hanging="360"/>
+      </w:pPr>
+      <w:rPr>
+        <w:rFonts w:ascii="Wingdings" w:hAnsi="Wingdings" w:hint="default"/>
+      </w:rPr>
+    </w:lvl>
+  </w:abstractNum>
+  <w:abstractNum w:abstractNumId="3" w15:restartNumberingAfterBreak="0">
     <w:nsid w:val="11397932"/>
     <w:multiLevelType w:val="multilevel"/>
     <w:tmpl w:val="B10CA3E6"/>
@@ -8155,7 +9146,7 @@
       </w:rPr>
     </w:lvl>
   </w:abstractNum>
-  <w:abstractNum w:abstractNumId="3" w15:restartNumberingAfterBreak="0">
+  <w:abstractNum w:abstractNumId="4" w15:restartNumberingAfterBreak="0">
     <w:nsid w:val="1EC94D7D"/>
     <w:multiLevelType w:val="multilevel"/>
     <w:tmpl w:val="0144F3FA"/>
@@ -8286,7 +9277,7 @@
       </w:rPr>
     </w:lvl>
   </w:abstractNum>
-  <w:abstractNum w:abstractNumId="4" w15:restartNumberingAfterBreak="0">
+  <w:abstractNum w:abstractNumId="5" w15:restartNumberingAfterBreak="0">
     <w:nsid w:val="2BAB7FEF"/>
     <w:multiLevelType w:val="hybridMultilevel"/>
     <w:tmpl w:val="38FC9714"/>
@@ -8375,7 +9366,7 @@
       </w:pPr>
     </w:lvl>
   </w:abstractNum>
-  <w:abstractNum w:abstractNumId="5" w15:restartNumberingAfterBreak="0">
+  <w:abstractNum w:abstractNumId="6" w15:restartNumberingAfterBreak="0">
     <w:nsid w:val="300B47DB"/>
     <w:multiLevelType w:val="hybridMultilevel"/>
     <w:tmpl w:val="3DC4189C"/>
@@ -8464,7 +9455,7 @@
       </w:pPr>
     </w:lvl>
   </w:abstractNum>
-  <w:abstractNum w:abstractNumId="6" w15:restartNumberingAfterBreak="0">
+  <w:abstractNum w:abstractNumId="7" w15:restartNumberingAfterBreak="0">
     <w:nsid w:val="35BA51E8"/>
     <w:multiLevelType w:val="hybridMultilevel"/>
     <w:tmpl w:val="4F8E75C4"/>
@@ -8553,7 +9544,7 @@
       </w:pPr>
     </w:lvl>
   </w:abstractNum>
-  <w:abstractNum w:abstractNumId="7" w15:restartNumberingAfterBreak="0">
+  <w:abstractNum w:abstractNumId="8" w15:restartNumberingAfterBreak="0">
     <w:nsid w:val="37796EF3"/>
     <w:multiLevelType w:val="multilevel"/>
     <w:tmpl w:val="617EB1BA"/>
@@ -8684,7 +9675,7 @@
       </w:rPr>
     </w:lvl>
   </w:abstractNum>
-  <w:abstractNum w:abstractNumId="8" w15:restartNumberingAfterBreak="0">
+  <w:abstractNum w:abstractNumId="9" w15:restartNumberingAfterBreak="0">
     <w:nsid w:val="3846092D"/>
     <w:multiLevelType w:val="multilevel"/>
     <w:tmpl w:val="87264ECC"/>
@@ -8815,7 +9806,7 @@
       </w:rPr>
     </w:lvl>
   </w:abstractNum>
-  <w:abstractNum w:abstractNumId="9" w15:restartNumberingAfterBreak="0">
+  <w:abstractNum w:abstractNumId="10" w15:restartNumberingAfterBreak="0">
     <w:nsid w:val="38C10720"/>
     <w:multiLevelType w:val="multilevel"/>
     <w:tmpl w:val="0AACC87C"/>
@@ -8946,7 +9937,7 @@
       </w:rPr>
     </w:lvl>
   </w:abstractNum>
-  <w:abstractNum w:abstractNumId="10" w15:restartNumberingAfterBreak="0">
+  <w:abstractNum w:abstractNumId="11" w15:restartNumberingAfterBreak="0">
     <w:nsid w:val="3D261AE2"/>
     <w:multiLevelType w:val="multilevel"/>
     <w:tmpl w:val="F9D28B48"/>
@@ -9077,7 +10068,7 @@
       </w:rPr>
     </w:lvl>
   </w:abstractNum>
-  <w:abstractNum w:abstractNumId="11" w15:restartNumberingAfterBreak="0">
+  <w:abstractNum w:abstractNumId="12" w15:restartNumberingAfterBreak="0">
     <w:nsid w:val="423661A6"/>
     <w:multiLevelType w:val="hybridMultilevel"/>
     <w:tmpl w:val="C7823DF2"/>
@@ -9190,7 +10181,7 @@
       </w:rPr>
     </w:lvl>
   </w:abstractNum>
-  <w:abstractNum w:abstractNumId="12" w15:restartNumberingAfterBreak="0">
+  <w:abstractNum w:abstractNumId="13" w15:restartNumberingAfterBreak="0">
     <w:nsid w:val="538150BF"/>
     <w:multiLevelType w:val="multilevel"/>
     <w:tmpl w:val="0BF4CB60"/>
@@ -9321,7 +10312,7 @@
       </w:rPr>
     </w:lvl>
   </w:abstractNum>
-  <w:abstractNum w:abstractNumId="13" w15:restartNumberingAfterBreak="0">
+  <w:abstractNum w:abstractNumId="14" w15:restartNumberingAfterBreak="0">
     <w:nsid w:val="55F96F06"/>
     <w:multiLevelType w:val="multilevel"/>
     <w:tmpl w:val="2A58F858"/>
@@ -9452,7 +10443,7 @@
       </w:rPr>
     </w:lvl>
   </w:abstractNum>
-  <w:abstractNum w:abstractNumId="14" w15:restartNumberingAfterBreak="0">
+  <w:abstractNum w:abstractNumId="15" w15:restartNumberingAfterBreak="0">
     <w:nsid w:val="5C230728"/>
     <w:multiLevelType w:val="multilevel"/>
     <w:tmpl w:val="6F1602FC"/>
@@ -9583,7 +10574,7 @@
       </w:rPr>
     </w:lvl>
   </w:abstractNum>
-  <w:abstractNum w:abstractNumId="15" w15:restartNumberingAfterBreak="0">
+  <w:abstractNum w:abstractNumId="16" w15:restartNumberingAfterBreak="0">
     <w:nsid w:val="5D624DE7"/>
     <w:multiLevelType w:val="hybridMultilevel"/>
     <w:tmpl w:val="D2302FE0"/>
@@ -9672,7 +10663,7 @@
       </w:pPr>
     </w:lvl>
   </w:abstractNum>
-  <w:abstractNum w:abstractNumId="16" w15:restartNumberingAfterBreak="0">
+  <w:abstractNum w:abstractNumId="17" w15:restartNumberingAfterBreak="0">
     <w:nsid w:val="5E4D76F0"/>
     <w:multiLevelType w:val="hybridMultilevel"/>
     <w:tmpl w:val="830A7DEC"/>
@@ -9761,7 +10752,7 @@
       </w:pPr>
     </w:lvl>
   </w:abstractNum>
-  <w:abstractNum w:abstractNumId="17" w15:restartNumberingAfterBreak="0">
+  <w:abstractNum w:abstractNumId="18" w15:restartNumberingAfterBreak="0">
     <w:nsid w:val="600C73CC"/>
     <w:multiLevelType w:val="hybridMultilevel"/>
     <w:tmpl w:val="27C2C122"/>
@@ -9847,7 +10838,7 @@
       </w:pPr>
     </w:lvl>
   </w:abstractNum>
-  <w:abstractNum w:abstractNumId="18" w15:restartNumberingAfterBreak="0">
+  <w:abstractNum w:abstractNumId="19" w15:restartNumberingAfterBreak="0">
     <w:nsid w:val="654146B1"/>
     <w:multiLevelType w:val="multilevel"/>
     <w:tmpl w:val="5F222CA2"/>
@@ -9978,7 +10969,7 @@
       </w:rPr>
     </w:lvl>
   </w:abstractNum>
-  <w:abstractNum w:abstractNumId="19" w15:restartNumberingAfterBreak="0">
+  <w:abstractNum w:abstractNumId="20" w15:restartNumberingAfterBreak="0">
     <w:nsid w:val="669A5D30"/>
     <w:multiLevelType w:val="multilevel"/>
     <w:tmpl w:val="65F8530A"/>
@@ -10109,7 +11100,7 @@
       </w:rPr>
     </w:lvl>
   </w:abstractNum>
-  <w:abstractNum w:abstractNumId="20" w15:restartNumberingAfterBreak="0">
+  <w:abstractNum w:abstractNumId="21" w15:restartNumberingAfterBreak="0">
     <w:nsid w:val="681A03BB"/>
     <w:multiLevelType w:val="hybridMultilevel"/>
     <w:tmpl w:val="27C2C122"/>
@@ -10195,7 +11186,7 @@
       </w:pPr>
     </w:lvl>
   </w:abstractNum>
-  <w:abstractNum w:abstractNumId="21" w15:restartNumberingAfterBreak="0">
+  <w:abstractNum w:abstractNumId="22" w15:restartNumberingAfterBreak="0">
     <w:nsid w:val="6841526B"/>
     <w:multiLevelType w:val="hybridMultilevel"/>
     <w:tmpl w:val="0AD2897A"/>
@@ -10308,7 +11299,7 @@
       </w:rPr>
     </w:lvl>
   </w:abstractNum>
-  <w:abstractNum w:abstractNumId="22" w15:restartNumberingAfterBreak="0">
+  <w:abstractNum w:abstractNumId="23" w15:restartNumberingAfterBreak="0">
     <w:nsid w:val="69007247"/>
     <w:multiLevelType w:val="hybridMultilevel"/>
     <w:tmpl w:val="DD98B71A"/>
@@ -10397,7 +11388,7 @@
       </w:pPr>
     </w:lvl>
   </w:abstractNum>
-  <w:abstractNum w:abstractNumId="23" w15:restartNumberingAfterBreak="0">
+  <w:abstractNum w:abstractNumId="24" w15:restartNumberingAfterBreak="0">
     <w:nsid w:val="699E2746"/>
     <w:multiLevelType w:val="multilevel"/>
     <w:tmpl w:val="CA18793C"/>
@@ -10528,7 +11519,7 @@
       </w:rPr>
     </w:lvl>
   </w:abstractNum>
-  <w:abstractNum w:abstractNumId="24" w15:restartNumberingAfterBreak="0">
+  <w:abstractNum w:abstractNumId="25" w15:restartNumberingAfterBreak="0">
     <w:nsid w:val="6A946B74"/>
     <w:multiLevelType w:val="hybridMultilevel"/>
     <w:tmpl w:val="07E656A4"/>
@@ -10617,7 +11608,7 @@
       </w:pPr>
     </w:lvl>
   </w:abstractNum>
-  <w:abstractNum w:abstractNumId="25" w15:restartNumberingAfterBreak="0">
+  <w:abstractNum w:abstractNumId="26" w15:restartNumberingAfterBreak="0">
     <w:nsid w:val="6D76215D"/>
     <w:multiLevelType w:val="hybridMultilevel"/>
     <w:tmpl w:val="4D4AA414"/>
@@ -10706,7 +11697,7 @@
       </w:pPr>
     </w:lvl>
   </w:abstractNum>
-  <w:abstractNum w:abstractNumId="26" w15:restartNumberingAfterBreak="0">
+  <w:abstractNum w:abstractNumId="27" w15:restartNumberingAfterBreak="0">
     <w:nsid w:val="74C62E50"/>
     <w:multiLevelType w:val="multilevel"/>
     <w:tmpl w:val="F87A2104"/>
@@ -10819,7 +11810,7 @@
       </w:pPr>
     </w:lvl>
   </w:abstractNum>
-  <w:abstractNum w:abstractNumId="27" w15:restartNumberingAfterBreak="0">
+  <w:abstractNum w:abstractNumId="28" w15:restartNumberingAfterBreak="0">
     <w:nsid w:val="7A5F5611"/>
     <w:multiLevelType w:val="hybridMultilevel"/>
     <w:tmpl w:val="7856ECB6"/>
@@ -10908,7 +11899,7 @@
       </w:pPr>
     </w:lvl>
   </w:abstractNum>
-  <w:abstractNum w:abstractNumId="28" w15:restartNumberingAfterBreak="0">
+  <w:abstractNum w:abstractNumId="29" w15:restartNumberingAfterBreak="0">
     <w:nsid w:val="7FA249F5"/>
     <w:multiLevelType w:val="multilevel"/>
     <w:tmpl w:val="CCC0A192"/>
@@ -11040,91 +12031,94 @@
     </w:lvl>
   </w:abstractNum>
   <w:num w:numId="1" w16cid:durableId="1999378837">
-    <w:abstractNumId w:val="28"/>
+    <w:abstractNumId w:val="29"/>
   </w:num>
   <w:num w:numId="2" w16cid:durableId="560865871">
-    <w:abstractNumId w:val="7"/>
+    <w:abstractNumId w:val="8"/>
   </w:num>
   <w:num w:numId="3" w16cid:durableId="96944711">
-    <w:abstractNumId w:val="18"/>
+    <w:abstractNumId w:val="19"/>
   </w:num>
   <w:num w:numId="4" w16cid:durableId="765734255">
-    <w:abstractNumId w:val="19"/>
+    <w:abstractNumId w:val="20"/>
   </w:num>
   <w:num w:numId="5" w16cid:durableId="364214395">
-    <w:abstractNumId w:val="23"/>
+    <w:abstractNumId w:val="24"/>
   </w:num>
   <w:num w:numId="6" w16cid:durableId="983006827">
-    <w:abstractNumId w:val="14"/>
+    <w:abstractNumId w:val="15"/>
   </w:num>
   <w:num w:numId="7" w16cid:durableId="40449276">
-    <w:abstractNumId w:val="2"/>
+    <w:abstractNumId w:val="3"/>
   </w:num>
   <w:num w:numId="8" w16cid:durableId="1622570543">
-    <w:abstractNumId w:val="12"/>
+    <w:abstractNumId w:val="13"/>
   </w:num>
   <w:num w:numId="9" w16cid:durableId="1945454787">
+    <w:abstractNumId w:val="10"/>
+  </w:num>
+  <w:num w:numId="10" w16cid:durableId="1007556122">
     <w:abstractNumId w:val="9"/>
   </w:num>
-  <w:num w:numId="10" w16cid:durableId="1007556122">
-    <w:abstractNumId w:val="8"/>
-  </w:num>
   <w:num w:numId="11" w16cid:durableId="1731616298">
-    <w:abstractNumId w:val="10"/>
+    <w:abstractNumId w:val="11"/>
   </w:num>
   <w:num w:numId="12" w16cid:durableId="1973826615">
     <w:abstractNumId w:val="0"/>
   </w:num>
   <w:num w:numId="13" w16cid:durableId="1488548846">
-    <w:abstractNumId w:val="3"/>
+    <w:abstractNumId w:val="4"/>
   </w:num>
   <w:num w:numId="14" w16cid:durableId="252321112">
-    <w:abstractNumId w:val="13"/>
+    <w:abstractNumId w:val="14"/>
   </w:num>
   <w:num w:numId="15" w16cid:durableId="1133449001">
     <w:abstractNumId w:val="1"/>
   </w:num>
   <w:num w:numId="16" w16cid:durableId="2045400755">
+    <w:abstractNumId w:val="18"/>
+  </w:num>
+  <w:num w:numId="17" w16cid:durableId="14042416">
+    <w:abstractNumId w:val="27"/>
+  </w:num>
+  <w:num w:numId="18" w16cid:durableId="1325234939">
+    <w:abstractNumId w:val="21"/>
+  </w:num>
+  <w:num w:numId="19" w16cid:durableId="1436248162">
+    <w:abstractNumId w:val="28"/>
+  </w:num>
+  <w:num w:numId="20" w16cid:durableId="1917131090">
+    <w:abstractNumId w:val="6"/>
+  </w:num>
+  <w:num w:numId="21" w16cid:durableId="1229653726">
+    <w:abstractNumId w:val="5"/>
+  </w:num>
+  <w:num w:numId="22" w16cid:durableId="1553617140">
+    <w:abstractNumId w:val="16"/>
+  </w:num>
+  <w:num w:numId="23" w16cid:durableId="1617638332">
+    <w:abstractNumId w:val="23"/>
+  </w:num>
+  <w:num w:numId="24" w16cid:durableId="1908373224">
+    <w:abstractNumId w:val="25"/>
+  </w:num>
+  <w:num w:numId="25" w16cid:durableId="1564485418">
+    <w:abstractNumId w:val="7"/>
+  </w:num>
+  <w:num w:numId="26" w16cid:durableId="169492261">
+    <w:abstractNumId w:val="26"/>
+  </w:num>
+  <w:num w:numId="27" w16cid:durableId="1590576651">
     <w:abstractNumId w:val="17"/>
   </w:num>
-  <w:num w:numId="17" w16cid:durableId="14042416">
-    <w:abstractNumId w:val="26"/>
+  <w:num w:numId="28" w16cid:durableId="916786424">
+    <w:abstractNumId w:val="12"/>
   </w:num>
-  <w:num w:numId="18" w16cid:durableId="1325234939">
-    <w:abstractNumId w:val="20"/>
-  </w:num>
-  <w:num w:numId="19" w16cid:durableId="1436248162">
-    <w:abstractNumId w:val="27"/>
-  </w:num>
-  <w:num w:numId="20" w16cid:durableId="1917131090">
-    <w:abstractNumId w:val="5"/>
-  </w:num>
-  <w:num w:numId="21" w16cid:durableId="1229653726">
-    <w:abstractNumId w:val="4"/>
-  </w:num>
-  <w:num w:numId="22" w16cid:durableId="1553617140">
-    <w:abstractNumId w:val="15"/>
-  </w:num>
-  <w:num w:numId="23" w16cid:durableId="1617638332">
+  <w:num w:numId="29" w16cid:durableId="906647289">
     <w:abstractNumId w:val="22"/>
   </w:num>
-  <w:num w:numId="24" w16cid:durableId="1908373224">
-    <w:abstractNumId w:val="24"/>
-  </w:num>
-  <w:num w:numId="25" w16cid:durableId="1564485418">
-    <w:abstractNumId w:val="6"/>
-  </w:num>
-  <w:num w:numId="26" w16cid:durableId="169492261">
-    <w:abstractNumId w:val="25"/>
-  </w:num>
-  <w:num w:numId="27" w16cid:durableId="1590576651">
-    <w:abstractNumId w:val="16"/>
-  </w:num>
-  <w:num w:numId="28" w16cid:durableId="916786424">
-    <w:abstractNumId w:val="11"/>
-  </w:num>
-  <w:num w:numId="29" w16cid:durableId="906647289">
-    <w:abstractNumId w:val="21"/>
+  <w:num w:numId="30" w16cid:durableId="984620774">
+    <w:abstractNumId w:val="2"/>
   </w:num>
 </w:numbering>
 </file>
@@ -11579,6 +12573,7 @@
     <w:name w:val="heading 3"/>
     <w:basedOn w:val="a"/>
     <w:next w:val="a"/>
+    <w:link w:val="30"/>
     <w:uiPriority w:val="9"/>
     <w:unhideWhenUsed/>
     <w:qFormat/>
@@ -11659,6 +12654,7 @@
   <w:style w:type="character" w:default="1" w:styleId="a0">
     <w:name w:val="Default Paragraph Font"/>
     <w:uiPriority w:val="1"/>
+    <w:semiHidden/>
     <w:unhideWhenUsed/>
   </w:style>
   <w:style w:type="table" w:default="1" w:styleId="a1">
@@ -11933,7 +12929,7 @@
       <w:rFonts w:ascii="Consolas" w:hAnsi="Consolas"/>
     </w:rPr>
   </w:style>
-  <w:style w:type="paragraph" w:styleId="30">
+  <w:style w:type="paragraph" w:styleId="31">
     <w:name w:val="toc 3"/>
     <w:basedOn w:val="a"/>
     <w:next w:val="a"/>
@@ -11945,6 +12941,20 @@
       <w:spacing w:after="100"/>
       <w:ind w:left="480"/>
     </w:pPr>
+  </w:style>
+  <w:style w:type="character" w:customStyle="1" w:styleId="30">
+    <w:name w:val="Заголовок 3 Знак"/>
+    <w:basedOn w:val="a0"/>
+    <w:link w:val="3"/>
+    <w:uiPriority w:val="9"/>
+    <w:rsid w:val="00EC70FB"/>
+    <w:rPr>
+      <w:rFonts w:ascii="Times New Roman" w:hAnsi="Times New Roman"/>
+      <w:b/>
+      <w:bCs/>
+      <w:sz w:val="28"/>
+      <w:szCs w:val="28"/>
+    </w:rPr>
   </w:style>
 </w:styles>
 </file>
@@ -12270,12 +13280,6 @@
 </file>
 
 <file path=customXml/item1.xml><?xml version="1.0" encoding="utf-8"?>
-<go:gDocsCustomXmlDataStorage xmlns:go="http://customooxmlschemas.google.com/" xmlns:r="http://schemas.openxmlformats.org/officeDocument/2006/relationships" uri="GoogleDocsCustomDataVersion2">
-  <go:docsCustomData xmlns:go="http://customooxmlschemas.google.com/" roundtripDataSignature="AMtx7mjP1okz7Ui6Y3xV14nF1n6ZHVRn0A==">CgMxLjAyDmguYjNwcXZoaHJpcjd6Mg5oLjY3dzdjZ2pmMjRpYjIOaC55ZGptY2Yzc2NubzgyDmguanRwd2M3MmlvNXRxMg1oLjN2dWplMzFmd2NlMg5oLndmbDE4NWRvZ3kycjgAciExd19QLU9BTFl4Sm5yME9tTEdPUlVsTzVkTjVrMC1JeWE=</go:docsCustomData>
-</go:gDocsCustomXmlDataStorage>
-</file>
-
-<file path=customXml/item2.xml><?xml version="1.0" encoding="utf-8"?>
 <b:Sources xmlns:b="http://schemas.openxmlformats.org/officeDocument/2006/bibliography" xmlns="http://schemas.openxmlformats.org/officeDocument/2006/bibliography" SelectedStyle="\IEEE2006OfficeOnline.xsl" StyleName="IEEE" Version="2006">
   <b:Source>
     <b:Tag>Mon26</b:Tag>
@@ -12395,19 +13399,25 @@
 </b:Sources>
 </file>
 
+<file path=customXml/item2.xml><?xml version="1.0" encoding="utf-8"?>
+<go:gDocsCustomXmlDataStorage xmlns:go="http://customooxmlschemas.google.com/" xmlns:r="http://schemas.openxmlformats.org/officeDocument/2006/relationships" uri="GoogleDocsCustomDataVersion2">
+  <go:docsCustomData xmlns:go="http://customooxmlschemas.google.com/" roundtripDataSignature="AMtx7mjP1okz7Ui6Y3xV14nF1n6ZHVRn0A==">CgMxLjAyDmguYjNwcXZoaHJpcjd6Mg5oLjY3dzdjZ2pmMjRpYjIOaC55ZGptY2Yzc2NubzgyDmguanRwd2M3MmlvNXRxMg1oLjN2dWplMzFmd2NlMg5oLndmbDE4NWRvZ3kycjgAciExd19QLU9BTFl4Sm5yME9tTEdPUlVsTzVkTjVrMC1JeWE=</go:docsCustomData>
+</go:gDocsCustomXmlDataStorage>
+</file>
+
 <file path=customXml/itemProps1.xml><?xml version="1.0" encoding="utf-8"?>
+<ds:datastoreItem xmlns:ds="http://schemas.openxmlformats.org/officeDocument/2006/customXml" ds:itemID="{0BF69276-862B-45F9-A83E-E30FB959E766}">
+  <ds:schemaRefs>
+    <ds:schemaRef ds:uri="http://schemas.openxmlformats.org/officeDocument/2006/bibliography"/>
+  </ds:schemaRefs>
+</ds:datastoreItem>
+</file>
+
+<file path=customXml/itemProps2.xml><?xml version="1.0" encoding="utf-8"?>
 <ds:datastoreItem xmlns:ds="http://schemas.openxmlformats.org/officeDocument/2006/customXml" ds:itemID="{11111111-1234-1234-1234-123412341234}">
   <ds:schemaRefs>
     <ds:schemaRef ds:uri="http://customooxmlschemas.google.com/"/>
     <ds:schemaRef ds:uri="http://schemas.openxmlformats.org/officeDocument/2006/relationships"/>
   </ds:schemaRefs>
 </ds:datastoreItem>
-</file>
-
-<file path=customXml/itemProps2.xml><?xml version="1.0" encoding="utf-8"?>
-<ds:datastoreItem xmlns:ds="http://schemas.openxmlformats.org/officeDocument/2006/customXml" ds:itemID="{0BF69276-862B-45F9-A83E-E30FB959E766}">
-  <ds:schemaRefs>
-    <ds:schemaRef ds:uri="http://schemas.openxmlformats.org/officeDocument/2006/bibliography"/>
-  </ds:schemaRefs>
-</ds:datastoreItem>
 </file>
</xml_diff>